<commit_message>
Tutorial 4 about JSX compeleted.
</commit_message>
<xml_diff>
--- a/Code With Harry Tutorials.docx
+++ b/Code With Harry Tutorials.docx
@@ -430,6 +430,29 @@
         </w:rPr>
         <w:t xml:space="preserve"> </w:t>
       </w:r>
+      <w:r>
+        <w:rPr>
+          <w:sz w:val="28"/>
+          <w:szCs w:val="28"/>
+        </w:rPr>
+        <w:t>(javascript xml)</w:t>
+      </w:r>
+    </w:p>
+    <w:p>
+      <w:pPr>
+        <w:pStyle w:val="ListParagraph"/>
+        <w:rPr>
+          <w:sz w:val="28"/>
+          <w:szCs w:val="28"/>
+        </w:rPr>
+      </w:pPr>
+      <w:r>
+        <w:rPr>
+          <w:sz w:val="28"/>
+          <w:szCs w:val="28"/>
+        </w:rPr>
+        <w:t>https://reactjs.org/docs/introducing-jsx.html</w:t>
+      </w:r>
     </w:p>
     <w:p>
       <w:pPr>
@@ -548,6 +571,7 @@
           <w:sz w:val="28"/>
           <w:szCs w:val="28"/>
         </w:rPr>
+        <w:lastRenderedPageBreak/>
         <w:t>&lt;&gt;</w:t>
       </w:r>
     </w:p>
@@ -568,7 +592,6 @@
           <w:sz w:val="28"/>
           <w:szCs w:val="28"/>
         </w:rPr>
-        <w:lastRenderedPageBreak/>
         <w:t>&lt;h1&gt;Hello&lt;/h1&gt;</w:t>
       </w:r>
     </w:p>
@@ -696,7 +719,304 @@
           <w:sz w:val="28"/>
           <w:szCs w:val="28"/>
         </w:rPr>
-        <w:t>-note that : if you want to open this in your phone, you can do this just give this ip address in phone.</w:t>
+        <w:t>note that : if you want to open this in your phone, you can do this just give this ip address in phone.</w:t>
+      </w:r>
+    </w:p>
+    <w:p>
+      <w:pPr>
+        <w:spacing w:after="0" w:line="240" w:lineRule="auto"/>
+        <w:outlineLvl w:val="2"/>
+        <w:rPr>
+          <w:rFonts w:ascii="Segoe UI" w:eastAsia="Times New Roman" w:hAnsi="Segoe UI" w:cs="Segoe UI"/>
+          <w:b/>
+          <w:bCs/>
+          <w:color w:val="000000"/>
+          <w:sz w:val="38"/>
+          <w:szCs w:val="38"/>
+        </w:rPr>
+      </w:pPr>
+      <w:r>
+        <w:rPr>
+          <w:rFonts w:ascii="Segoe UI" w:eastAsia="Times New Roman" w:hAnsi="Segoe UI" w:cs="Segoe UI"/>
+          <w:b/>
+          <w:bCs/>
+          <w:color w:val="000000"/>
+          <w:sz w:val="38"/>
+          <w:szCs w:val="38"/>
+        </w:rPr>
+        <w:t>Embedding Expressions in JSX</w:t>
+      </w:r>
+    </w:p>
+    <w:p>
+      <w:pPr>
+        <w:tabs>
+          <w:tab w:val="left" w:pos="916"/>
+          <w:tab w:val="left" w:pos="1832"/>
+          <w:tab w:val="left" w:pos="2748"/>
+          <w:tab w:val="left" w:pos="3664"/>
+          <w:tab w:val="left" w:pos="4580"/>
+          <w:tab w:val="left" w:pos="5496"/>
+          <w:tab w:val="left" w:pos="6412"/>
+          <w:tab w:val="left" w:pos="7328"/>
+          <w:tab w:val="left" w:pos="8244"/>
+          <w:tab w:val="left" w:pos="9160"/>
+          <w:tab w:val="left" w:pos="10076"/>
+          <w:tab w:val="left" w:pos="10992"/>
+          <w:tab w:val="left" w:pos="11908"/>
+          <w:tab w:val="left" w:pos="12824"/>
+          <w:tab w:val="left" w:pos="13740"/>
+          <w:tab w:val="left" w:pos="14656"/>
+        </w:tabs>
+        <w:spacing w:after="0" w:line="300" w:lineRule="atLeast"/>
+        <w:rPr>
+          <w:rFonts w:ascii="Consolas" w:eastAsia="Times New Roman" w:hAnsi="Consolas" w:cs="Courier New"/>
+          <w:color w:val="88C6BE"/>
+          <w:sz w:val="21"/>
+          <w:szCs w:val="21"/>
+          <w:shd w:val="clear" w:color="auto" w:fill="353B45"/>
+        </w:rPr>
+      </w:pPr>
+      <w:r>
+        <w:rPr>
+          <w:rFonts w:ascii="Consolas" w:eastAsia="Times New Roman" w:hAnsi="Consolas" w:cs="Courier New"/>
+          <w:color w:val="C5A5C5"/>
+          <w:sz w:val="21"/>
+          <w:szCs w:val="21"/>
+          <w:shd w:val="clear" w:color="auto" w:fill="353B45"/>
+        </w:rPr>
+        <w:t>const</w:t>
+      </w:r>
+      <w:r>
+        <w:rPr>
+          <w:rFonts w:ascii="Consolas" w:eastAsia="Times New Roman" w:hAnsi="Consolas" w:cs="Courier New"/>
+          <w:color w:val="FFFFFF"/>
+          <w:sz w:val="21"/>
+          <w:szCs w:val="21"/>
+          <w:shd w:val="clear" w:color="auto" w:fill="353B45"/>
+        </w:rPr>
+        <w:t xml:space="preserve"> name </w:t>
+      </w:r>
+      <w:r>
+        <w:rPr>
+          <w:rFonts w:ascii="Consolas" w:eastAsia="Times New Roman" w:hAnsi="Consolas" w:cs="Courier New"/>
+          <w:color w:val="D7DEEA"/>
+          <w:sz w:val="21"/>
+          <w:szCs w:val="21"/>
+          <w:shd w:val="clear" w:color="auto" w:fill="353B45"/>
+        </w:rPr>
+        <w:t>=</w:t>
+      </w:r>
+      <w:r>
+        <w:rPr>
+          <w:rFonts w:ascii="Consolas" w:eastAsia="Times New Roman" w:hAnsi="Consolas" w:cs="Courier New"/>
+          <w:color w:val="FFFFFF"/>
+          <w:sz w:val="21"/>
+          <w:szCs w:val="21"/>
+          <w:shd w:val="clear" w:color="auto" w:fill="353B45"/>
+        </w:rPr>
+        <w:t xml:space="preserve"> </w:t>
+      </w:r>
+      <w:r>
+        <w:rPr>
+          <w:rFonts w:ascii="Consolas" w:eastAsia="Times New Roman" w:hAnsi="Consolas" w:cs="Courier New"/>
+          <w:color w:val="8DC891"/>
+          <w:sz w:val="21"/>
+          <w:szCs w:val="21"/>
+          <w:shd w:val="clear" w:color="auto" w:fill="353B45"/>
+        </w:rPr>
+        <w:t>'Josh Perez'</w:t>
+      </w:r>
+      <w:r>
+        <w:rPr>
+          <w:rFonts w:ascii="Consolas" w:eastAsia="Times New Roman" w:hAnsi="Consolas" w:cs="Courier New"/>
+          <w:color w:val="88C6BE"/>
+          <w:sz w:val="21"/>
+          <w:szCs w:val="21"/>
+          <w:shd w:val="clear" w:color="auto" w:fill="353B45"/>
+        </w:rPr>
+        <w:t>;</w:t>
+      </w:r>
+    </w:p>
+    <w:p>
+      <w:pPr>
+        <w:tabs>
+          <w:tab w:val="left" w:pos="916"/>
+          <w:tab w:val="left" w:pos="1832"/>
+          <w:tab w:val="left" w:pos="2748"/>
+          <w:tab w:val="left" w:pos="3664"/>
+          <w:tab w:val="left" w:pos="4580"/>
+          <w:tab w:val="left" w:pos="5496"/>
+          <w:tab w:val="left" w:pos="6412"/>
+          <w:tab w:val="left" w:pos="7328"/>
+          <w:tab w:val="left" w:pos="8244"/>
+          <w:tab w:val="left" w:pos="9160"/>
+          <w:tab w:val="left" w:pos="10076"/>
+          <w:tab w:val="left" w:pos="10992"/>
+          <w:tab w:val="left" w:pos="11908"/>
+          <w:tab w:val="left" w:pos="12824"/>
+          <w:tab w:val="left" w:pos="13740"/>
+          <w:tab w:val="left" w:pos="14656"/>
+        </w:tabs>
+        <w:spacing w:after="0" w:line="300" w:lineRule="atLeast"/>
+        <w:rPr>
+          <w:rFonts w:ascii="Consolas" w:eastAsia="Times New Roman" w:hAnsi="Consolas" w:cs="Courier New"/>
+          <w:color w:val="FFFFFF"/>
+          <w:sz w:val="21"/>
+          <w:szCs w:val="21"/>
+        </w:rPr>
+      </w:pPr>
+      <w:r>
+        <w:rPr>
+          <w:rFonts w:ascii="Consolas" w:eastAsia="Times New Roman" w:hAnsi="Consolas" w:cs="Courier New"/>
+          <w:color w:val="C5A5C5"/>
+          <w:sz w:val="21"/>
+          <w:szCs w:val="21"/>
+          <w:shd w:val="clear" w:color="auto" w:fill="353B45"/>
+        </w:rPr>
+        <w:t>const</w:t>
+      </w:r>
+      <w:r>
+        <w:rPr>
+          <w:rFonts w:ascii="Consolas" w:eastAsia="Times New Roman" w:hAnsi="Consolas" w:cs="Courier New"/>
+          <w:color w:val="FFFFFF"/>
+          <w:sz w:val="21"/>
+          <w:szCs w:val="21"/>
+          <w:shd w:val="clear" w:color="auto" w:fill="353B45"/>
+        </w:rPr>
+        <w:t xml:space="preserve"> element </w:t>
+      </w:r>
+      <w:r>
+        <w:rPr>
+          <w:rFonts w:ascii="Consolas" w:eastAsia="Times New Roman" w:hAnsi="Consolas" w:cs="Courier New"/>
+          <w:color w:val="D7DEEA"/>
+          <w:sz w:val="21"/>
+          <w:szCs w:val="21"/>
+          <w:shd w:val="clear" w:color="auto" w:fill="353B45"/>
+        </w:rPr>
+        <w:t>=</w:t>
+      </w:r>
+      <w:r>
+        <w:rPr>
+          <w:rFonts w:ascii="Consolas" w:eastAsia="Times New Roman" w:hAnsi="Consolas" w:cs="Courier New"/>
+          <w:color w:val="FFFFFF"/>
+          <w:sz w:val="21"/>
+          <w:szCs w:val="21"/>
+          <w:shd w:val="clear" w:color="auto" w:fill="353B45"/>
+        </w:rPr>
+        <w:t xml:space="preserve"> </w:t>
+      </w:r>
+      <w:r>
+        <w:rPr>
+          <w:rFonts w:ascii="Consolas" w:eastAsia="Times New Roman" w:hAnsi="Consolas" w:cs="Courier New"/>
+          <w:color w:val="88C6BE"/>
+          <w:sz w:val="21"/>
+          <w:szCs w:val="21"/>
+          <w:shd w:val="clear" w:color="auto" w:fill="353B45"/>
+        </w:rPr>
+        <w:t>&lt;</w:t>
+      </w:r>
+      <w:r>
+        <w:rPr>
+          <w:rFonts w:ascii="Consolas" w:eastAsia="Times New Roman" w:hAnsi="Consolas" w:cs="Courier New"/>
+          <w:color w:val="FC929E"/>
+          <w:sz w:val="21"/>
+          <w:szCs w:val="21"/>
+          <w:shd w:val="clear" w:color="auto" w:fill="353B45"/>
+        </w:rPr>
+        <w:t>h1</w:t>
+      </w:r>
+      <w:r>
+        <w:rPr>
+          <w:rFonts w:ascii="Consolas" w:eastAsia="Times New Roman" w:hAnsi="Consolas" w:cs="Courier New"/>
+          <w:color w:val="88C6BE"/>
+          <w:sz w:val="21"/>
+          <w:szCs w:val="21"/>
+          <w:shd w:val="clear" w:color="auto" w:fill="353B45"/>
+        </w:rPr>
+        <w:t>&gt;</w:t>
+      </w:r>
+      <w:r>
+        <w:rPr>
+          <w:rFonts w:ascii="Consolas" w:eastAsia="Times New Roman" w:hAnsi="Consolas" w:cs="Courier New"/>
+          <w:color w:val="FFFFFF"/>
+          <w:sz w:val="21"/>
+          <w:szCs w:val="21"/>
+          <w:shd w:val="clear" w:color="auto" w:fill="353B45"/>
+        </w:rPr>
+        <w:t xml:space="preserve">Hello, </w:t>
+      </w:r>
+      <w:r>
+        <w:rPr>
+          <w:rFonts w:ascii="Consolas" w:eastAsia="Times New Roman" w:hAnsi="Consolas" w:cs="Courier New"/>
+          <w:color w:val="88C6BE"/>
+          <w:sz w:val="21"/>
+          <w:szCs w:val="21"/>
+          <w:shd w:val="clear" w:color="auto" w:fill="353B45"/>
+        </w:rPr>
+        <w:t>{</w:t>
+      </w:r>
+      <w:r>
+        <w:rPr>
+          <w:rFonts w:ascii="Consolas" w:eastAsia="Times New Roman" w:hAnsi="Consolas" w:cs="Courier New"/>
+          <w:color w:val="FFFFFF"/>
+          <w:sz w:val="21"/>
+          <w:szCs w:val="21"/>
+          <w:shd w:val="clear" w:color="auto" w:fill="353B45"/>
+        </w:rPr>
+        <w:t>name</w:t>
+      </w:r>
+      <w:r>
+        <w:rPr>
+          <w:rFonts w:ascii="Consolas" w:eastAsia="Times New Roman" w:hAnsi="Consolas" w:cs="Courier New"/>
+          <w:color w:val="88C6BE"/>
+          <w:sz w:val="21"/>
+          <w:szCs w:val="21"/>
+          <w:shd w:val="clear" w:color="auto" w:fill="353B45"/>
+        </w:rPr>
+        <w:t>}&lt;/</w:t>
+      </w:r>
+      <w:r>
+        <w:rPr>
+          <w:rFonts w:ascii="Consolas" w:eastAsia="Times New Roman" w:hAnsi="Consolas" w:cs="Courier New"/>
+          <w:color w:val="FC929E"/>
+          <w:sz w:val="21"/>
+          <w:szCs w:val="21"/>
+          <w:shd w:val="clear" w:color="auto" w:fill="353B45"/>
+        </w:rPr>
+        <w:t>h1</w:t>
+      </w:r>
+      <w:r>
+        <w:rPr>
+          <w:rFonts w:ascii="Consolas" w:eastAsia="Times New Roman" w:hAnsi="Consolas" w:cs="Courier New"/>
+          <w:color w:val="88C6BE"/>
+          <w:sz w:val="21"/>
+          <w:szCs w:val="21"/>
+          <w:shd w:val="clear" w:color="auto" w:fill="353B45"/>
+        </w:rPr>
+        <w:t>&gt;;</w:t>
+      </w:r>
+    </w:p>
+    <w:p>
+      <w:pPr>
+        <w:rPr>
+          <w:sz w:val="28"/>
+          <w:szCs w:val="28"/>
+        </w:rPr>
+      </w:pPr>
+    </w:p>
+    <w:p>
+      <w:pPr>
+        <w:rPr>
+          <w:sz w:val="28"/>
+          <w:szCs w:val="28"/>
+        </w:rPr>
+      </w:pPr>
+      <w:r>
+        <w:rPr>
+          <w:sz w:val="28"/>
+          <w:szCs w:val="28"/>
+        </w:rPr>
+        <w:t>Note that always close the tag at the end. It’s compalsar in JSX.</w:t>
       </w:r>
     </w:p>
     <w:sectPr>
@@ -1321,6 +1641,25 @@
     <w:qFormat/>
     <w:rsid w:val="00433FB9"/>
   </w:style>
+  <w:style w:type="paragraph" w:styleId="Heading3">
+    <w:name w:val="heading 3"/>
+    <w:basedOn w:val="Normal"/>
+    <w:link w:val="Heading3Char"/>
+    <w:uiPriority w:val="9"/>
+    <w:qFormat/>
+    <w:rsid w:val="00851BF0"/>
+    <w:pPr>
+      <w:spacing w:before="100" w:beforeAutospacing="1" w:after="100" w:afterAutospacing="1" w:line="240" w:lineRule="auto"/>
+      <w:outlineLvl w:val="2"/>
+    </w:pPr>
+    <w:rPr>
+      <w:rFonts w:ascii="Times New Roman" w:eastAsia="Times New Roman" w:hAnsi="Times New Roman" w:cs="Times New Roman"/>
+      <w:b/>
+      <w:bCs/>
+      <w:sz w:val="27"/>
+      <w:szCs w:val="27"/>
+    </w:rPr>
+  </w:style>
   <w:style w:type="character" w:default="1" w:styleId="DefaultParagraphFont">
     <w:name w:val="Default Paragraph Font"/>
     <w:uiPriority w:val="1"/>
@@ -1358,6 +1697,78 @@
       <w:ind w:left="720"/>
       <w:contextualSpacing/>
     </w:pPr>
+  </w:style>
+  <w:style w:type="character" w:customStyle="1" w:styleId="Heading3Char">
+    <w:name w:val="Heading 3 Char"/>
+    <w:basedOn w:val="DefaultParagraphFont"/>
+    <w:link w:val="Heading3"/>
+    <w:uiPriority w:val="9"/>
+    <w:rsid w:val="00851BF0"/>
+    <w:rPr>
+      <w:rFonts w:ascii="Times New Roman" w:eastAsia="Times New Roman" w:hAnsi="Times New Roman" w:cs="Times New Roman"/>
+      <w:b/>
+      <w:bCs/>
+      <w:sz w:val="27"/>
+      <w:szCs w:val="27"/>
+    </w:rPr>
+  </w:style>
+  <w:style w:type="paragraph" w:styleId="HTMLPreformatted">
+    <w:name w:val="HTML Preformatted"/>
+    <w:basedOn w:val="Normal"/>
+    <w:link w:val="HTMLPreformattedChar"/>
+    <w:uiPriority w:val="99"/>
+    <w:semiHidden/>
+    <w:unhideWhenUsed/>
+    <w:rsid w:val="00851BF0"/>
+    <w:pPr>
+      <w:tabs>
+        <w:tab w:val="left" w:pos="916"/>
+        <w:tab w:val="left" w:pos="1832"/>
+        <w:tab w:val="left" w:pos="2748"/>
+        <w:tab w:val="left" w:pos="3664"/>
+        <w:tab w:val="left" w:pos="4580"/>
+        <w:tab w:val="left" w:pos="5496"/>
+        <w:tab w:val="left" w:pos="6412"/>
+        <w:tab w:val="left" w:pos="7328"/>
+        <w:tab w:val="left" w:pos="8244"/>
+        <w:tab w:val="left" w:pos="9160"/>
+        <w:tab w:val="left" w:pos="10076"/>
+        <w:tab w:val="left" w:pos="10992"/>
+        <w:tab w:val="left" w:pos="11908"/>
+        <w:tab w:val="left" w:pos="12824"/>
+        <w:tab w:val="left" w:pos="13740"/>
+        <w:tab w:val="left" w:pos="14656"/>
+      </w:tabs>
+      <w:spacing w:after="0" w:line="240" w:lineRule="auto"/>
+    </w:pPr>
+    <w:rPr>
+      <w:rFonts w:ascii="Courier New" w:eastAsia="Times New Roman" w:hAnsi="Courier New" w:cs="Courier New"/>
+      <w:sz w:val="20"/>
+      <w:szCs w:val="20"/>
+    </w:rPr>
+  </w:style>
+  <w:style w:type="character" w:customStyle="1" w:styleId="HTMLPreformattedChar">
+    <w:name w:val="HTML Preformatted Char"/>
+    <w:basedOn w:val="DefaultParagraphFont"/>
+    <w:link w:val="HTMLPreformatted"/>
+    <w:uiPriority w:val="99"/>
+    <w:semiHidden/>
+    <w:rsid w:val="00851BF0"/>
+    <w:rPr>
+      <w:rFonts w:ascii="Courier New" w:eastAsia="Times New Roman" w:hAnsi="Courier New" w:cs="Courier New"/>
+      <w:sz w:val="20"/>
+      <w:szCs w:val="20"/>
+    </w:rPr>
+  </w:style>
+  <w:style w:type="character" w:customStyle="1" w:styleId="gatsby-highlight-code-line">
+    <w:name w:val="gatsby-highlight-code-line"/>
+    <w:basedOn w:val="DefaultParagraphFont"/>
+    <w:rsid w:val="00851BF0"/>
+  </w:style>
+  <w:style w:type="character" w:customStyle="1" w:styleId="token">
+    <w:name w:val="token"/>
+    <w:basedOn w:val="DefaultParagraphFont"/>
+    <w:rsid w:val="00851BF0"/>
   </w:style>
 </w:styles>
 </file>

</xml_diff>

<commit_message>
Tutorial 4, Adding Bootstrap, crating TestUtils Project Start
</commit_message>
<xml_diff>
--- a/Code With Harry Tutorials.docx
+++ b/Code With Harry Tutorials.docx
@@ -81,7 +81,35 @@
           <w:sz w:val="28"/>
           <w:szCs w:val="28"/>
         </w:rPr>
-        <w:t>In src folder index.js is entry point and you can note &lt;App /&gt; there. In the bigning of the code you can see import statement also that imports app component.</w:t>
+        <w:t xml:space="preserve">In src folder index.js is entry point and you can note &lt;App /&gt; there. In the </w:t>
+      </w:r>
+      <w:r>
+        <w:rPr>
+          <w:sz w:val="28"/>
+          <w:szCs w:val="28"/>
+        </w:rPr>
+        <w:t>beginning</w:t>
+      </w:r>
+      <w:r>
+        <w:rPr>
+          <w:sz w:val="28"/>
+          <w:szCs w:val="28"/>
+        </w:rPr>
+        <w:t xml:space="preserve"> of the </w:t>
+      </w:r>
+      <w:r>
+        <w:rPr>
+          <w:sz w:val="28"/>
+          <w:szCs w:val="28"/>
+        </w:rPr>
+        <w:t>code,</w:t>
+      </w:r>
+      <w:r>
+        <w:rPr>
+          <w:sz w:val="28"/>
+          <w:szCs w:val="28"/>
+        </w:rPr>
+        <w:t xml:space="preserve"> you can see import statement also that imports app component.</w:t>
       </w:r>
     </w:p>
     <w:p>
@@ -379,7 +407,14 @@
           <w:sz w:val="28"/>
           <w:szCs w:val="28"/>
         </w:rPr>
-        <w:t>Promices New :::: Doing something and as soon as I will complete this I will do this. If resolved or rejected.</w:t>
+        <w:t>Promises</w:t>
+      </w:r>
+      <w:r>
+        <w:rPr>
+          <w:sz w:val="28"/>
+          <w:szCs w:val="28"/>
+        </w:rPr>
+        <w:t xml:space="preserve"> New :::: Doing something and as soon as I will complete this I will do this. If resolved or rejected.</w:t>
       </w:r>
     </w:p>
     <w:p>
@@ -435,7 +470,21 @@
           <w:sz w:val="28"/>
           <w:szCs w:val="28"/>
         </w:rPr>
-        <w:t>(javascript xml)</w:t>
+        <w:t>(</w:t>
+      </w:r>
+      <w:r>
+        <w:rPr>
+          <w:sz w:val="28"/>
+          <w:szCs w:val="28"/>
+        </w:rPr>
+        <w:t>JavaScript</w:t>
+      </w:r>
+      <w:r>
+        <w:rPr>
+          <w:sz w:val="28"/>
+          <w:szCs w:val="28"/>
+        </w:rPr>
+        <w:t xml:space="preserve"> xml)</w:t>
       </w:r>
     </w:p>
     <w:p>
@@ -719,7 +768,21 @@
           <w:sz w:val="28"/>
           <w:szCs w:val="28"/>
         </w:rPr>
-        <w:t>note that : if you want to open this in your phone, you can do this just give this ip address in phone.</w:t>
+        <w:t xml:space="preserve">note that : if you want to open this in your phone, you can do this just give this </w:t>
+      </w:r>
+      <w:r>
+        <w:rPr>
+          <w:sz w:val="28"/>
+          <w:szCs w:val="28"/>
+        </w:rPr>
+        <w:t>Ip</w:t>
+      </w:r>
+      <w:r>
+        <w:rPr>
+          <w:sz w:val="28"/>
+          <w:szCs w:val="28"/>
+        </w:rPr>
+        <w:t xml:space="preserve"> address in phone.</w:t>
       </w:r>
     </w:p>
     <w:p>
@@ -728,21 +791,13 @@
         <w:outlineLvl w:val="2"/>
         <w:rPr>
           <w:rFonts w:ascii="Segoe UI" w:eastAsia="Times New Roman" w:hAnsi="Segoe UI" w:cs="Segoe UI"/>
-          <w:b/>
-          <w:bCs/>
           <w:color w:val="000000"/>
-          <w:sz w:val="38"/>
-          <w:szCs w:val="38"/>
         </w:rPr>
       </w:pPr>
       <w:r>
         <w:rPr>
           <w:rFonts w:ascii="Segoe UI" w:eastAsia="Times New Roman" w:hAnsi="Segoe UI" w:cs="Segoe UI"/>
-          <w:b/>
-          <w:bCs/>
           <w:color w:val="000000"/>
-          <w:sz w:val="38"/>
-          <w:szCs w:val="38"/>
         </w:rPr>
         <w:t>Embedding Expressions in JSX</w:t>
       </w:r>
@@ -1006,17 +1061,152 @@
     </w:p>
     <w:p>
       <w:pPr>
-        <w:rPr>
-          <w:sz w:val="28"/>
-          <w:szCs w:val="28"/>
-        </w:rPr>
-      </w:pPr>
-      <w:r>
-        <w:rPr>
-          <w:sz w:val="28"/>
-          <w:szCs w:val="28"/>
-        </w:rPr>
-        <w:t>Note that always close the tag at the end. It’s compalsar in JSX.</w:t>
+        <w:pBdr>
+          <w:bottom w:val="double" w:sz="6" w:space="1" w:color="auto"/>
+        </w:pBdr>
+        <w:rPr>
+          <w:sz w:val="28"/>
+          <w:szCs w:val="28"/>
+        </w:rPr>
+      </w:pPr>
+      <w:r>
+        <w:rPr>
+          <w:sz w:val="28"/>
+          <w:szCs w:val="28"/>
+        </w:rPr>
+        <w:t xml:space="preserve">Note that always close the tag at the end. It’s </w:t>
+      </w:r>
+      <w:r>
+        <w:rPr>
+          <w:sz w:val="28"/>
+          <w:szCs w:val="28"/>
+        </w:rPr>
+        <w:t>compulsory</w:t>
+      </w:r>
+      <w:r>
+        <w:rPr>
+          <w:sz w:val="28"/>
+          <w:szCs w:val="28"/>
+        </w:rPr>
+        <w:t xml:space="preserve"> in JSX.</w:t>
+      </w:r>
+    </w:p>
+    <w:p>
+      <w:pPr>
+        <w:pBdr>
+          <w:bottom w:val="double" w:sz="6" w:space="1" w:color="auto"/>
+        </w:pBdr>
+        <w:rPr>
+          <w:sz w:val="28"/>
+          <w:szCs w:val="28"/>
+        </w:rPr>
+      </w:pPr>
+    </w:p>
+    <w:p>
+      <w:pPr>
+        <w:rPr>
+          <w:sz w:val="28"/>
+          <w:szCs w:val="28"/>
+        </w:rPr>
+      </w:pPr>
+    </w:p>
+    <w:p>
+      <w:pPr>
+        <w:pBdr>
+          <w:bottom w:val="double" w:sz="6" w:space="1" w:color="auto"/>
+        </w:pBdr>
+        <w:rPr>
+          <w:sz w:val="28"/>
+          <w:szCs w:val="28"/>
+        </w:rPr>
+      </w:pPr>
+      <w:r>
+        <w:rPr>
+          <w:sz w:val="28"/>
+          <w:szCs w:val="28"/>
+        </w:rPr>
+        <w:t>Tutorial 5: // Adding Bootstrap and Textutils project</w:t>
+      </w:r>
+    </w:p>
+    <w:p>
+      <w:r>
+        <w:rPr>
+          <w:sz w:val="28"/>
+          <w:szCs w:val="28"/>
+        </w:rPr>
+        <w:t xml:space="preserve">Note: </w:t>
+      </w:r>
+      <w:r>
+        <w:t xml:space="preserve">there is node modules folder that contains all the packages and libraries we need. We can delete it because we already have that all details in </w:t>
+      </w:r>
+      <w:proofErr w:type="spellStart"/>
+      <w:r>
+        <w:t>package.json</w:t>
+      </w:r>
+      <w:proofErr w:type="spellEnd"/>
+      <w:r>
+        <w:t xml:space="preserve"> …    we can install all the dependency using following command</w:t>
+      </w:r>
+    </w:p>
+    <w:p>
+      <w:pPr>
+        <w:pStyle w:val="ListParagraph"/>
+        <w:numPr>
+          <w:ilvl w:val="0"/>
+          <w:numId w:val="1"/>
+        </w:numPr>
+      </w:pPr>
+      <w:proofErr w:type="spellStart"/>
+      <w:r>
+        <w:t>npm</w:t>
+      </w:r>
+      <w:proofErr w:type="spellEnd"/>
+      <w:r>
+        <w:t xml:space="preserve"> </w:t>
+      </w:r>
+      <w:proofErr w:type="spellStart"/>
+      <w:r>
+        <w:t>istall</w:t>
+      </w:r>
+      <w:proofErr w:type="spellEnd"/>
+      <w:r>
+        <w:t xml:space="preserve"> / </w:t>
+      </w:r>
+      <w:proofErr w:type="spellStart"/>
+      <w:r>
+        <w:t>npm</w:t>
+      </w:r>
+      <w:proofErr w:type="spellEnd"/>
+      <w:r>
+        <w:t xml:space="preserve"> </w:t>
+      </w:r>
+      <w:proofErr w:type="spellStart"/>
+      <w:r>
+        <w:t>i</w:t>
+      </w:r>
+      <w:proofErr w:type="spellEnd"/>
+    </w:p>
+    <w:p>
+      <w:r>
+        <w:t xml:space="preserve">Adding Bootstrap: </w:t>
+      </w:r>
+    </w:p>
+    <w:p>
+      <w:r>
+        <w:t>We can add CDN of bootstrap in public/index.html.</w:t>
+      </w:r>
+    </w:p>
+    <w:p>
+      <w:r>
+        <w:rPr>
+          <w:sz w:val="28"/>
+          <w:szCs w:val="28"/>
+          <w:u w:val="single"/>
+        </w:rPr>
+        <w:t>Creating Textutils project</w:t>
+      </w:r>
+      <w:r>
+        <w:t>.</w:t>
       </w:r>
     </w:p>
     <w:sectPr>

</xml_diff>

<commit_message>
understandig props, default props and .mjs import and export the names and components
</commit_message>
<xml_diff>
--- a/Code With Harry Tutorials.docx
+++ b/Code With Harry Tutorials.docx
@@ -36,12 +36,21 @@
           <w:szCs w:val="28"/>
         </w:rPr>
       </w:pPr>
-      <w:r>
-        <w:rPr>
-          <w:sz w:val="28"/>
-          <w:szCs w:val="28"/>
-        </w:rPr>
-        <w:t>npx create-react-app app-name</w:t>
+      <w:proofErr w:type="spellStart"/>
+      <w:r>
+        <w:rPr>
+          <w:sz w:val="28"/>
+          <w:szCs w:val="28"/>
+        </w:rPr>
+        <w:t>npx</w:t>
+      </w:r>
+      <w:proofErr w:type="spellEnd"/>
+      <w:r>
+        <w:rPr>
+          <w:sz w:val="28"/>
+          <w:szCs w:val="28"/>
+        </w:rPr>
+        <w:t xml:space="preserve"> create-react-app app-name</w:t>
       </w:r>
     </w:p>
     <w:p>
@@ -61,7 +70,23 @@
           <w:sz w:val="28"/>
           <w:szCs w:val="28"/>
         </w:rPr>
-        <w:t>Play with Files in of src and public Folder, to get handy.</w:t>
+        <w:t xml:space="preserve">Play with Files in of </w:t>
+      </w:r>
+      <w:proofErr w:type="spellStart"/>
+      <w:r>
+        <w:rPr>
+          <w:sz w:val="28"/>
+          <w:szCs w:val="28"/>
+        </w:rPr>
+        <w:t>src</w:t>
+      </w:r>
+      <w:proofErr w:type="spellEnd"/>
+      <w:r>
+        <w:rPr>
+          <w:sz w:val="28"/>
+          <w:szCs w:val="28"/>
+        </w:rPr>
+        <w:t xml:space="preserve"> and public Folder, to get handy.</w:t>
       </w:r>
     </w:p>
     <w:p>
@@ -81,7 +106,23 @@
           <w:sz w:val="28"/>
           <w:szCs w:val="28"/>
         </w:rPr>
-        <w:t xml:space="preserve">In src folder index.js is entry point and you can note &lt;App /&gt; there. In the </w:t>
+        <w:t xml:space="preserve">In </w:t>
+      </w:r>
+      <w:proofErr w:type="spellStart"/>
+      <w:r>
+        <w:rPr>
+          <w:sz w:val="28"/>
+          <w:szCs w:val="28"/>
+        </w:rPr>
+        <w:t>src</w:t>
+      </w:r>
+      <w:proofErr w:type="spellEnd"/>
+      <w:r>
+        <w:rPr>
+          <w:sz w:val="28"/>
+          <w:szCs w:val="28"/>
+        </w:rPr>
+        <w:t xml:space="preserve"> folder index.js is entry point and you can note &lt;App /&gt; there. In the </w:t>
       </w:r>
       <w:r>
         <w:rPr>
@@ -580,7 +621,23 @@
           <w:sz w:val="28"/>
           <w:szCs w:val="28"/>
         </w:rPr>
-        <w:t>&lt;div&gt;aaa&lt;/div&gt;</w:t>
+        <w:t>&lt;div&gt;</w:t>
+      </w:r>
+      <w:proofErr w:type="spellStart"/>
+      <w:r>
+        <w:rPr>
+          <w:sz w:val="28"/>
+          <w:szCs w:val="28"/>
+        </w:rPr>
+        <w:t>aaa</w:t>
+      </w:r>
+      <w:proofErr w:type="spellEnd"/>
+      <w:r>
+        <w:rPr>
+          <w:sz w:val="28"/>
+          <w:szCs w:val="28"/>
+        </w:rPr>
+        <w:t>&lt;/div&gt;</w:t>
       </w:r>
     </w:p>
     <w:p>
@@ -661,7 +718,23 @@
           <w:sz w:val="28"/>
           <w:szCs w:val="28"/>
         </w:rPr>
-        <w:t>&lt;div&gt;aaa&lt;/div&gt;</w:t>
+        <w:t>&lt;div&gt;</w:t>
+      </w:r>
+      <w:proofErr w:type="spellStart"/>
+      <w:r>
+        <w:rPr>
+          <w:sz w:val="28"/>
+          <w:szCs w:val="28"/>
+        </w:rPr>
+        <w:t>aaa</w:t>
+      </w:r>
+      <w:proofErr w:type="spellEnd"/>
+      <w:r>
+        <w:rPr>
+          <w:sz w:val="28"/>
+          <w:szCs w:val="28"/>
+        </w:rPr>
+        <w:t>&lt;/div&gt;</w:t>
       </w:r>
     </w:p>
     <w:p>
@@ -708,12 +781,21 @@
           <w:szCs w:val="28"/>
         </w:rPr>
       </w:pPr>
-      <w:r>
-        <w:rPr>
-          <w:sz w:val="28"/>
-          <w:szCs w:val="28"/>
-        </w:rPr>
-        <w:t>className instead of class</w:t>
+      <w:proofErr w:type="spellStart"/>
+      <w:r>
+        <w:rPr>
+          <w:sz w:val="28"/>
+          <w:szCs w:val="28"/>
+        </w:rPr>
+        <w:t>className</w:t>
+      </w:r>
+      <w:proofErr w:type="spellEnd"/>
+      <w:r>
+        <w:rPr>
+          <w:sz w:val="28"/>
+          <w:szCs w:val="28"/>
+        </w:rPr>
+        <w:t xml:space="preserve"> instead of class</w:t>
       </w:r>
     </w:p>
     <w:p>
@@ -728,12 +810,21 @@
           <w:szCs w:val="28"/>
         </w:rPr>
       </w:pPr>
-      <w:r>
-        <w:rPr>
-          <w:sz w:val="28"/>
-          <w:szCs w:val="28"/>
-        </w:rPr>
-        <w:t>htmlFor instead of for</w:t>
+      <w:proofErr w:type="spellStart"/>
+      <w:r>
+        <w:rPr>
+          <w:sz w:val="28"/>
+          <w:szCs w:val="28"/>
+        </w:rPr>
+        <w:t>htmlFor</w:t>
+      </w:r>
+      <w:proofErr w:type="spellEnd"/>
+      <w:r>
+        <w:rPr>
+          <w:sz w:val="28"/>
+          <w:szCs w:val="28"/>
+        </w:rPr>
+        <w:t xml:space="preserve"> instead of for</w:t>
       </w:r>
     </w:p>
     <w:p>
@@ -748,6 +839,7 @@
           <w:szCs w:val="28"/>
         </w:rPr>
       </w:pPr>
+      <w:proofErr w:type="spellStart"/>
       <w:r>
         <w:rPr>
           <w:sz w:val="28"/>
@@ -755,6 +847,7 @@
         </w:rPr>
         <w:t>tabIndex</w:t>
       </w:r>
+      <w:proofErr w:type="spellEnd"/>
     </w:p>
     <w:p>
       <w:pPr>
@@ -1125,7 +1218,23 @@
           <w:sz w:val="28"/>
           <w:szCs w:val="28"/>
         </w:rPr>
-        <w:t>Tutorial 5: // Adding Bootstrap and Textutils project</w:t>
+        <w:t xml:space="preserve">Tutorial 5: // Adding Bootstrap and </w:t>
+      </w:r>
+      <w:proofErr w:type="spellStart"/>
+      <w:r>
+        <w:rPr>
+          <w:sz w:val="28"/>
+          <w:szCs w:val="28"/>
+        </w:rPr>
+        <w:t>Textutils</w:t>
+      </w:r>
+      <w:proofErr w:type="spellEnd"/>
+      <w:r>
+        <w:rPr>
+          <w:sz w:val="28"/>
+          <w:szCs w:val="28"/>
+        </w:rPr>
+        <w:t xml:space="preserve"> project</w:t>
       </w:r>
     </w:p>
     <w:p>
@@ -1197,17 +1306,1170 @@
       </w:r>
     </w:p>
     <w:p>
+      <w:pPr>
+        <w:tabs>
+          <w:tab w:val="left" w:pos="3540"/>
+        </w:tabs>
+      </w:pPr>
       <w:r>
         <w:rPr>
           <w:sz w:val="28"/>
           <w:szCs w:val="28"/>
           <w:u w:val="single"/>
         </w:rPr>
-        <w:t>Creating Textutils project</w:t>
+        <w:t xml:space="preserve">Creating </w:t>
+      </w:r>
+      <w:proofErr w:type="spellStart"/>
+      <w:r>
+        <w:rPr>
+          <w:sz w:val="28"/>
+          <w:szCs w:val="28"/>
+          <w:u w:val="single"/>
+        </w:rPr>
+        <w:t>Textutils</w:t>
+      </w:r>
+      <w:proofErr w:type="spellEnd"/>
+      <w:r>
+        <w:rPr>
+          <w:sz w:val="28"/>
+          <w:szCs w:val="28"/>
+          <w:u w:val="single"/>
+        </w:rPr>
+        <w:t xml:space="preserve"> project</w:t>
       </w:r>
       <w:r>
         <w:t>.</w:t>
       </w:r>
+      <w:r>
+        <w:tab/>
+      </w:r>
+    </w:p>
+    <w:p>
+      <w:pPr>
+        <w:tabs>
+          <w:tab w:val="left" w:pos="3540"/>
+        </w:tabs>
+      </w:pPr>
+    </w:p>
+    <w:p>
+      <w:pPr>
+        <w:pBdr>
+          <w:top w:val="double" w:sz="6" w:space="1" w:color="auto"/>
+          <w:bottom w:val="double" w:sz="6" w:space="1" w:color="auto"/>
+        </w:pBdr>
+        <w:tabs>
+          <w:tab w:val="left" w:pos="3540"/>
+        </w:tabs>
+        <w:rPr>
+          <w:sz w:val="28"/>
+          <w:szCs w:val="28"/>
+        </w:rPr>
+      </w:pPr>
+      <w:r>
+        <w:rPr>
+          <w:sz w:val="28"/>
+          <w:szCs w:val="28"/>
+        </w:rPr>
+        <w:t xml:space="preserve">Tutorial 6: Understanding Props and </w:t>
+      </w:r>
+      <w:proofErr w:type="spellStart"/>
+      <w:r>
+        <w:rPr>
+          <w:sz w:val="28"/>
+          <w:szCs w:val="28"/>
+        </w:rPr>
+        <w:t>PropTypes</w:t>
+      </w:r>
+      <w:proofErr w:type="spellEnd"/>
+    </w:p>
+    <w:p>
+      <w:pPr>
+        <w:tabs>
+          <w:tab w:val="left" w:pos="3540"/>
+        </w:tabs>
+      </w:pPr>
+      <w:r>
+        <w:t xml:space="preserve">JavaScript default import and export </w:t>
+      </w:r>
+      <w:r>
+        <w:t xml:space="preserve">default </w:t>
+      </w:r>
+      <w:r>
+        <w:t>names.</w:t>
+      </w:r>
+    </w:p>
+    <w:p>
+      <w:pPr>
+        <w:tabs>
+          <w:tab w:val="left" w:pos="3540"/>
+        </w:tabs>
+      </w:pPr>
+      <w:r>
+        <w:lastRenderedPageBreak/>
+        <w:t xml:space="preserve">Suppose we create module1.js, then to </w:t>
+      </w:r>
+      <w:r>
+        <w:t>r</w:t>
+      </w:r>
+      <w:r>
+        <w:t xml:space="preserve">un it we can write: </w:t>
+      </w:r>
+    </w:p>
+    <w:p>
+      <w:pPr>
+        <w:pStyle w:val="ListParagraph"/>
+        <w:numPr>
+          <w:ilvl w:val="0"/>
+          <w:numId w:val="1"/>
+        </w:numPr>
+        <w:tabs>
+          <w:tab w:val="left" w:pos="3540"/>
+        </w:tabs>
+      </w:pPr>
+      <w:r>
+        <w:t>node .\module1.js</w:t>
+      </w:r>
+    </w:p>
+    <w:p>
+      <w:pPr>
+        <w:tabs>
+          <w:tab w:val="left" w:pos="3540"/>
+        </w:tabs>
+      </w:pPr>
+      <w:r>
+        <w:t xml:space="preserve">Keep in mind that it says any error then </w:t>
+      </w:r>
+      <w:r>
+        <w:t>,</w:t>
+      </w:r>
+      <w:r>
+        <w:t xml:space="preserve">we can add ‘m’ before </w:t>
+      </w:r>
+      <w:proofErr w:type="spellStart"/>
+      <w:r>
+        <w:t>js</w:t>
+      </w:r>
+      <w:proofErr w:type="spellEnd"/>
+      <w:r>
+        <w:t xml:space="preserve"> </w:t>
+      </w:r>
+      <w:proofErr w:type="spellStart"/>
+      <w:r>
+        <w:t>extention</w:t>
+      </w:r>
+      <w:proofErr w:type="spellEnd"/>
+      <w:r>
+        <w:t xml:space="preserve"> like following:</w:t>
+      </w:r>
+    </w:p>
+    <w:p>
+      <w:pPr>
+        <w:tabs>
+          <w:tab w:val="left" w:pos="3540"/>
+        </w:tabs>
+      </w:pPr>
+      <w:r>
+        <w:t>(module1.mjs)</w:t>
+      </w:r>
+    </w:p>
+    <w:p>
+      <w:pPr>
+        <w:tabs>
+          <w:tab w:val="left" w:pos="3540"/>
+        </w:tabs>
+      </w:pPr>
+      <w:r>
+        <w:t xml:space="preserve">We can create component in another folder inside </w:t>
+      </w:r>
+      <w:proofErr w:type="spellStart"/>
+      <w:r>
+        <w:t>src</w:t>
+      </w:r>
+      <w:proofErr w:type="spellEnd"/>
+      <w:r>
+        <w:t xml:space="preserve"> folder and use them in our Apps.js</w:t>
+      </w:r>
+    </w:p>
+    <w:p>
+      <w:pPr>
+        <w:tabs>
+          <w:tab w:val="left" w:pos="3540"/>
+        </w:tabs>
+      </w:pPr>
+      <w:r>
+        <w:t xml:space="preserve">We can pass props in </w:t>
+      </w:r>
+      <w:proofErr w:type="spellStart"/>
+      <w:r>
+        <w:t>fuction</w:t>
+      </w:r>
+      <w:proofErr w:type="spellEnd"/>
+      <w:r>
+        <w:t xml:space="preserve"> based component like parameter in </w:t>
+      </w:r>
+      <w:proofErr w:type="spellStart"/>
+      <w:r>
+        <w:t>fuction</w:t>
+      </w:r>
+      <w:proofErr w:type="spellEnd"/>
+      <w:r>
+        <w:t>. Now we can pass the arguments from the Apps.js by adding them like following:</w:t>
+      </w:r>
+    </w:p>
+    <w:p>
+      <w:pPr>
+        <w:shd w:val="clear" w:color="auto" w:fill="1E1E1E"/>
+        <w:spacing w:after="0" w:line="285" w:lineRule="atLeast"/>
+        <w:rPr>
+          <w:rFonts w:ascii="Consolas" w:eastAsia="Times New Roman" w:hAnsi="Consolas" w:cs="Times New Roman"/>
+          <w:color w:val="D4D4D4"/>
+          <w:sz w:val="21"/>
+          <w:szCs w:val="21"/>
+        </w:rPr>
+      </w:pPr>
+      <w:r>
+        <w:rPr>
+          <w:rFonts w:ascii="Consolas" w:eastAsia="Times New Roman" w:hAnsi="Consolas" w:cs="Times New Roman"/>
+          <w:color w:val="808080"/>
+          <w:sz w:val="21"/>
+          <w:szCs w:val="21"/>
+        </w:rPr>
+        <w:t>&lt;</w:t>
+      </w:r>
+      <w:r>
+        <w:rPr>
+          <w:rFonts w:ascii="Consolas" w:eastAsia="Times New Roman" w:hAnsi="Consolas" w:cs="Times New Roman"/>
+          <w:color w:val="569CD6"/>
+          <w:sz w:val="21"/>
+          <w:szCs w:val="21"/>
+        </w:rPr>
+        <w:t>Navbar</w:t>
+      </w:r>
+      <w:r>
+        <w:rPr>
+          <w:rFonts w:ascii="Consolas" w:eastAsia="Times New Roman" w:hAnsi="Consolas" w:cs="Times New Roman"/>
+          <w:color w:val="D4D4D4"/>
+          <w:sz w:val="21"/>
+          <w:szCs w:val="21"/>
+        </w:rPr>
+        <w:t xml:space="preserve"> </w:t>
+      </w:r>
+      <w:r>
+        <w:rPr>
+          <w:rFonts w:ascii="Consolas" w:eastAsia="Times New Roman" w:hAnsi="Consolas" w:cs="Times New Roman"/>
+          <w:color w:val="9CDCFE"/>
+          <w:sz w:val="21"/>
+          <w:szCs w:val="21"/>
+        </w:rPr>
+        <w:t>title</w:t>
+      </w:r>
+      <w:r>
+        <w:rPr>
+          <w:rFonts w:ascii="Consolas" w:eastAsia="Times New Roman" w:hAnsi="Consolas" w:cs="Times New Roman"/>
+          <w:color w:val="D4D4D4"/>
+          <w:sz w:val="21"/>
+          <w:szCs w:val="21"/>
+        </w:rPr>
+        <w:t>=</w:t>
+      </w:r>
+      <w:r>
+        <w:rPr>
+          <w:rFonts w:ascii="Consolas" w:eastAsia="Times New Roman" w:hAnsi="Consolas" w:cs="Times New Roman"/>
+          <w:color w:val="CE9178"/>
+          <w:sz w:val="21"/>
+          <w:szCs w:val="21"/>
+        </w:rPr>
+        <w:t>"</w:t>
+      </w:r>
+      <w:proofErr w:type="spellStart"/>
+      <w:r>
+        <w:rPr>
+          <w:rFonts w:ascii="Consolas" w:eastAsia="Times New Roman" w:hAnsi="Consolas" w:cs="Times New Roman"/>
+          <w:color w:val="CE9178"/>
+          <w:sz w:val="21"/>
+          <w:szCs w:val="21"/>
+        </w:rPr>
+        <w:t>TextUtils</w:t>
+      </w:r>
+      <w:proofErr w:type="spellEnd"/>
+      <w:r>
+        <w:rPr>
+          <w:rFonts w:ascii="Consolas" w:eastAsia="Times New Roman" w:hAnsi="Consolas" w:cs="Times New Roman"/>
+          <w:color w:val="CE9178"/>
+          <w:sz w:val="21"/>
+          <w:szCs w:val="21"/>
+        </w:rPr>
+        <w:t>"</w:t>
+      </w:r>
+      <w:r>
+        <w:rPr>
+          <w:rFonts w:ascii="Consolas" w:eastAsia="Times New Roman" w:hAnsi="Consolas" w:cs="Times New Roman"/>
+          <w:color w:val="D4D4D4"/>
+          <w:sz w:val="21"/>
+          <w:szCs w:val="21"/>
+        </w:rPr>
+        <w:t xml:space="preserve"> </w:t>
+      </w:r>
+      <w:r>
+        <w:rPr>
+          <w:rFonts w:ascii="Consolas" w:eastAsia="Times New Roman" w:hAnsi="Consolas" w:cs="Times New Roman"/>
+          <w:color w:val="808080"/>
+          <w:sz w:val="21"/>
+          <w:szCs w:val="21"/>
+        </w:rPr>
+        <w:t>/&gt;</w:t>
+      </w:r>
+    </w:p>
+    <w:p>
+      <w:pPr>
+        <w:tabs>
+          <w:tab w:val="left" w:pos="3540"/>
+        </w:tabs>
+      </w:pPr>
+      <w:r>
+        <w:t>Here title is argument pass in props. We can use if by {</w:t>
+      </w:r>
+      <w:proofErr w:type="spellStart"/>
+      <w:r>
+        <w:t>props.title</w:t>
+      </w:r>
+      <w:proofErr w:type="spellEnd"/>
+      <w:r>
+        <w:t>}</w:t>
+      </w:r>
+    </w:p>
+    <w:p>
+      <w:pPr>
+        <w:tabs>
+          <w:tab w:val="left" w:pos="3540"/>
+        </w:tabs>
+      </w:pPr>
+      <w:r>
+        <w:t xml:space="preserve">We can make </w:t>
+      </w:r>
+      <w:proofErr w:type="spellStart"/>
+      <w:r>
+        <w:t>proptype</w:t>
+      </w:r>
+      <w:proofErr w:type="spellEnd"/>
+      <w:r>
+        <w:t xml:space="preserve"> fix and also make it require by importing and using props-type.</w:t>
+      </w:r>
+    </w:p>
+    <w:p>
+      <w:pPr>
+        <w:shd w:val="clear" w:color="auto" w:fill="1E1E1E"/>
+        <w:spacing w:after="0" w:line="285" w:lineRule="atLeast"/>
+        <w:rPr>
+          <w:rFonts w:ascii="Consolas" w:eastAsia="Times New Roman" w:hAnsi="Consolas" w:cs="Times New Roman"/>
+          <w:color w:val="D4D4D4"/>
+          <w:sz w:val="21"/>
+          <w:szCs w:val="21"/>
+        </w:rPr>
+      </w:pPr>
+      <w:r>
+        <w:rPr>
+          <w:rFonts w:ascii="Consolas" w:eastAsia="Times New Roman" w:hAnsi="Consolas" w:cs="Times New Roman"/>
+          <w:color w:val="569CD6"/>
+          <w:sz w:val="21"/>
+          <w:szCs w:val="21"/>
+        </w:rPr>
+        <w:t>import</w:t>
+      </w:r>
+      <w:r>
+        <w:rPr>
+          <w:rFonts w:ascii="Consolas" w:eastAsia="Times New Roman" w:hAnsi="Consolas" w:cs="Times New Roman"/>
+          <w:color w:val="D4D4D4"/>
+          <w:sz w:val="21"/>
+          <w:szCs w:val="21"/>
+        </w:rPr>
+        <w:t xml:space="preserve"> </w:t>
+      </w:r>
+      <w:proofErr w:type="spellStart"/>
+      <w:r>
+        <w:rPr>
+          <w:rFonts w:ascii="Consolas" w:eastAsia="Times New Roman" w:hAnsi="Consolas" w:cs="Times New Roman"/>
+          <w:color w:val="D4D4D4"/>
+          <w:sz w:val="21"/>
+          <w:szCs w:val="21"/>
+        </w:rPr>
+        <w:t>PropTypes</w:t>
+      </w:r>
+      <w:proofErr w:type="spellEnd"/>
+      <w:r>
+        <w:rPr>
+          <w:rFonts w:ascii="Consolas" w:eastAsia="Times New Roman" w:hAnsi="Consolas" w:cs="Times New Roman"/>
+          <w:color w:val="D4D4D4"/>
+          <w:sz w:val="21"/>
+          <w:szCs w:val="21"/>
+        </w:rPr>
+        <w:t xml:space="preserve"> </w:t>
+      </w:r>
+      <w:r>
+        <w:rPr>
+          <w:rFonts w:ascii="Consolas" w:eastAsia="Times New Roman" w:hAnsi="Consolas" w:cs="Times New Roman"/>
+          <w:color w:val="569CD6"/>
+          <w:sz w:val="21"/>
+          <w:szCs w:val="21"/>
+        </w:rPr>
+        <w:t>from</w:t>
+      </w:r>
+      <w:r>
+        <w:rPr>
+          <w:rFonts w:ascii="Consolas" w:eastAsia="Times New Roman" w:hAnsi="Consolas" w:cs="Times New Roman"/>
+          <w:color w:val="D4D4D4"/>
+          <w:sz w:val="21"/>
+          <w:szCs w:val="21"/>
+        </w:rPr>
+        <w:t xml:space="preserve"> </w:t>
+      </w:r>
+      <w:r>
+        <w:rPr>
+          <w:rFonts w:ascii="Consolas" w:eastAsia="Times New Roman" w:hAnsi="Consolas" w:cs="Times New Roman"/>
+          <w:color w:val="CE9178"/>
+          <w:sz w:val="21"/>
+          <w:szCs w:val="21"/>
+        </w:rPr>
+        <w:t>'prop-types'</w:t>
+      </w:r>
+      <w:r>
+        <w:rPr>
+          <w:rFonts w:ascii="Consolas" w:eastAsia="Times New Roman" w:hAnsi="Consolas" w:cs="Times New Roman"/>
+          <w:color w:val="D4D4D4"/>
+          <w:sz w:val="21"/>
+          <w:szCs w:val="21"/>
+        </w:rPr>
+        <w:t>;</w:t>
+      </w:r>
+    </w:p>
+    <w:p>
+      <w:pPr>
+        <w:shd w:val="clear" w:color="auto" w:fill="1E1E1E"/>
+        <w:spacing w:after="0" w:line="285" w:lineRule="atLeast"/>
+        <w:rPr>
+          <w:rFonts w:ascii="Consolas" w:eastAsia="Times New Roman" w:hAnsi="Consolas" w:cs="Times New Roman"/>
+          <w:color w:val="D4D4D4"/>
+          <w:sz w:val="21"/>
+          <w:szCs w:val="21"/>
+        </w:rPr>
+      </w:pPr>
+      <w:proofErr w:type="spellStart"/>
+      <w:r>
+        <w:rPr>
+          <w:rFonts w:ascii="Consolas" w:eastAsia="Times New Roman" w:hAnsi="Consolas" w:cs="Times New Roman"/>
+          <w:color w:val="D4D4D4"/>
+          <w:sz w:val="21"/>
+          <w:szCs w:val="21"/>
+        </w:rPr>
+        <w:t>Navbar.prototype</w:t>
+      </w:r>
+      <w:proofErr w:type="spellEnd"/>
+      <w:r>
+        <w:rPr>
+          <w:rFonts w:ascii="Consolas" w:eastAsia="Times New Roman" w:hAnsi="Consolas" w:cs="Times New Roman"/>
+          <w:color w:val="D4D4D4"/>
+          <w:sz w:val="21"/>
+          <w:szCs w:val="21"/>
+        </w:rPr>
+        <w:t xml:space="preserve"> = {</w:t>
+      </w:r>
+    </w:p>
+    <w:p>
+      <w:pPr>
+        <w:shd w:val="clear" w:color="auto" w:fill="1E1E1E"/>
+        <w:spacing w:after="0" w:line="285" w:lineRule="atLeast"/>
+        <w:rPr>
+          <w:rFonts w:ascii="Consolas" w:eastAsia="Times New Roman" w:hAnsi="Consolas" w:cs="Times New Roman"/>
+          <w:color w:val="D4D4D4"/>
+          <w:sz w:val="21"/>
+          <w:szCs w:val="21"/>
+        </w:rPr>
+      </w:pPr>
+      <w:r>
+        <w:rPr>
+          <w:rFonts w:ascii="Consolas" w:eastAsia="Times New Roman" w:hAnsi="Consolas" w:cs="Times New Roman"/>
+          <w:color w:val="D4D4D4"/>
+          <w:sz w:val="21"/>
+          <w:szCs w:val="21"/>
+        </w:rPr>
+        <w:t xml:space="preserve">    title: </w:t>
+      </w:r>
+      <w:proofErr w:type="spellStart"/>
+      <w:r>
+        <w:rPr>
+          <w:rFonts w:ascii="Consolas" w:eastAsia="Times New Roman" w:hAnsi="Consolas" w:cs="Times New Roman"/>
+          <w:color w:val="D4D4D4"/>
+          <w:sz w:val="21"/>
+          <w:szCs w:val="21"/>
+        </w:rPr>
+        <w:t>PropTypes.string.isRequired</w:t>
+      </w:r>
+      <w:proofErr w:type="spellEnd"/>
+    </w:p>
+    <w:p>
+      <w:pPr>
+        <w:shd w:val="clear" w:color="auto" w:fill="1E1E1E"/>
+        <w:spacing w:after="0" w:line="285" w:lineRule="atLeast"/>
+        <w:rPr>
+          <w:rFonts w:ascii="Consolas" w:eastAsia="Times New Roman" w:hAnsi="Consolas" w:cs="Times New Roman"/>
+          <w:color w:val="D4D4D4"/>
+          <w:sz w:val="21"/>
+          <w:szCs w:val="21"/>
+        </w:rPr>
+      </w:pPr>
+      <w:r>
+        <w:rPr>
+          <w:rFonts w:ascii="Consolas" w:eastAsia="Times New Roman" w:hAnsi="Consolas" w:cs="Times New Roman"/>
+          <w:color w:val="D4D4D4"/>
+          <w:sz w:val="21"/>
+          <w:szCs w:val="21"/>
+        </w:rPr>
+        <w:t>}</w:t>
+      </w:r>
+    </w:p>
+    <w:p>
+      <w:pPr>
+        <w:tabs>
+          <w:tab w:val="left" w:pos="3540"/>
+        </w:tabs>
+      </w:pPr>
+      <w:r>
+        <w:t>I have created module1.mjs and module2.mjs to understand the concept of named and default import and export of names.</w:t>
+      </w:r>
+    </w:p>
+    <w:p>
+      <w:pPr>
+        <w:tabs>
+          <w:tab w:val="left" w:pos="3540"/>
+        </w:tabs>
+      </w:pPr>
+    </w:p>
+    <w:p>
+      <w:pPr>
+        <w:pBdr>
+          <w:bottom w:val="single" w:sz="6" w:space="1" w:color="auto"/>
+        </w:pBdr>
+        <w:tabs>
+          <w:tab w:val="left" w:pos="3540"/>
+        </w:tabs>
+      </w:pPr>
+      <w:r>
+        <w:t>Here note that if we use .</w:t>
+      </w:r>
+      <w:proofErr w:type="spellStart"/>
+      <w:r>
+        <w:t>js</w:t>
+      </w:r>
+      <w:proofErr w:type="spellEnd"/>
+      <w:r>
+        <w:t xml:space="preserve"> </w:t>
+      </w:r>
+      <w:proofErr w:type="spellStart"/>
+      <w:r>
+        <w:t>extention</w:t>
+      </w:r>
+      <w:proofErr w:type="spellEnd"/>
+      <w:r>
+        <w:t xml:space="preserve"> then we will get the following error</w:t>
+      </w:r>
+    </w:p>
+    <w:p>
+      <w:pPr>
+        <w:tabs>
+          <w:tab w:val="left" w:pos="3540"/>
+        </w:tabs>
+      </w:pPr>
+    </w:p>
+    <w:p>
+      <w:pPr>
+        <w:tabs>
+          <w:tab w:val="left" w:pos="3540"/>
+        </w:tabs>
+      </w:pPr>
+      <w:r>
+        <w:t>PS C:\Users\Dell\OneDrive\Desktop\React-with-Git&gt; node .\react-learning\</w:t>
+      </w:r>
+      <w:proofErr w:type="spellStart"/>
+      <w:r>
+        <w:t>src</w:t>
+      </w:r>
+      <w:proofErr w:type="spellEnd"/>
+      <w:r>
+        <w:t>\components\module1.js</w:t>
+      </w:r>
+    </w:p>
+    <w:p>
+      <w:pPr>
+        <w:tabs>
+          <w:tab w:val="left" w:pos="3540"/>
+        </w:tabs>
+      </w:pPr>
+      <w:r>
+        <w:t>(</w:t>
+      </w:r>
+      <w:proofErr w:type="gramStart"/>
+      <w:r>
+        <w:t>node</w:t>
+      </w:r>
+      <w:proofErr w:type="gramEnd"/>
+      <w:r>
+        <w:t xml:space="preserve">:10376) Warning: To load an ES module, set "type": "module" in the </w:t>
+      </w:r>
+      <w:proofErr w:type="spellStart"/>
+      <w:r>
+        <w:t>package.json</w:t>
+      </w:r>
+      <w:proofErr w:type="spellEnd"/>
+      <w:r>
+        <w:t xml:space="preserve"> or use the .</w:t>
+      </w:r>
+      <w:proofErr w:type="spellStart"/>
+      <w:r>
+        <w:t>mjs</w:t>
+      </w:r>
+      <w:proofErr w:type="spellEnd"/>
+      <w:r>
+        <w:t xml:space="preserve"> extension.</w:t>
+      </w:r>
+    </w:p>
+    <w:p>
+      <w:pPr>
+        <w:tabs>
+          <w:tab w:val="left" w:pos="3540"/>
+        </w:tabs>
+      </w:pPr>
+      <w:r>
+        <w:t>(Use `node --trace-warnings ...` to show where the warning was created)</w:t>
+      </w:r>
+    </w:p>
+    <w:p>
+      <w:pPr>
+        <w:tabs>
+          <w:tab w:val="left" w:pos="3540"/>
+        </w:tabs>
+      </w:pPr>
+      <w:r>
+        <w:t>C:\Users\Dell\OneDrive\Desktop\React-with-Git\react-learning\src\components\module1.js:1</w:t>
+      </w:r>
+    </w:p>
+    <w:p>
+      <w:pPr>
+        <w:tabs>
+          <w:tab w:val="left" w:pos="3540"/>
+        </w:tabs>
+      </w:pPr>
+      <w:r>
+        <w:t>import aa from './module2.js';</w:t>
+      </w:r>
+    </w:p>
+    <w:p>
+      <w:pPr>
+        <w:tabs>
+          <w:tab w:val="left" w:pos="3540"/>
+        </w:tabs>
+      </w:pPr>
+      <w:r>
+        <w:t>^^^^^^</w:t>
+      </w:r>
+    </w:p>
+    <w:p>
+      <w:pPr>
+        <w:tabs>
+          <w:tab w:val="left" w:pos="3540"/>
+        </w:tabs>
+      </w:pPr>
+    </w:p>
+    <w:p>
+      <w:pPr>
+        <w:tabs>
+          <w:tab w:val="left" w:pos="3540"/>
+        </w:tabs>
+      </w:pPr>
+      <w:proofErr w:type="spellStart"/>
+      <w:r>
+        <w:t>SyntaxError</w:t>
+      </w:r>
+      <w:proofErr w:type="spellEnd"/>
+      <w:r>
+        <w:t>: Cannot use import statement outside a module</w:t>
+      </w:r>
+    </w:p>
+    <w:p>
+      <w:pPr>
+        <w:tabs>
+          <w:tab w:val="left" w:pos="3540"/>
+        </w:tabs>
+      </w:pPr>
+      <w:r>
+        <w:t xml:space="preserve">    at </w:t>
+      </w:r>
+      <w:proofErr w:type="spellStart"/>
+      <w:r>
+        <w:t>Object.compileFunction</w:t>
+      </w:r>
+      <w:proofErr w:type="spellEnd"/>
+      <w:r>
+        <w:t xml:space="preserve"> (node:vm:352:18)</w:t>
+      </w:r>
+    </w:p>
+    <w:p>
+      <w:pPr>
+        <w:tabs>
+          <w:tab w:val="left" w:pos="3540"/>
+        </w:tabs>
+      </w:pPr>
+      <w:r>
+        <w:t xml:space="preserve">    at </w:t>
+      </w:r>
+      <w:proofErr w:type="spellStart"/>
+      <w:r>
+        <w:t>wrapSafe</w:t>
+      </w:r>
+      <w:proofErr w:type="spellEnd"/>
+      <w:r>
+        <w:t xml:space="preserve"> (</w:t>
+      </w:r>
+      <w:proofErr w:type="spellStart"/>
+      <w:r>
+        <w:t>node:internal</w:t>
+      </w:r>
+      <w:proofErr w:type="spellEnd"/>
+      <w:r>
+        <w:t>/modules/</w:t>
+      </w:r>
+      <w:proofErr w:type="spellStart"/>
+      <w:r>
+        <w:t>cjs</w:t>
+      </w:r>
+      <w:proofErr w:type="spellEnd"/>
+      <w:r>
+        <w:t>/loader:1027:15)</w:t>
+      </w:r>
+    </w:p>
+    <w:p>
+      <w:pPr>
+        <w:tabs>
+          <w:tab w:val="left" w:pos="3540"/>
+        </w:tabs>
+      </w:pPr>
+      <w:r>
+        <w:t xml:space="preserve">    at </w:t>
+      </w:r>
+      <w:proofErr w:type="spellStart"/>
+      <w:r>
+        <w:t>Module._compile</w:t>
+      </w:r>
+      <w:proofErr w:type="spellEnd"/>
+      <w:r>
+        <w:t xml:space="preserve"> (</w:t>
+      </w:r>
+      <w:proofErr w:type="spellStart"/>
+      <w:r>
+        <w:t>node:internal</w:t>
+      </w:r>
+      <w:proofErr w:type="spellEnd"/>
+      <w:r>
+        <w:t>/modules/</w:t>
+      </w:r>
+      <w:proofErr w:type="spellStart"/>
+      <w:r>
+        <w:t>cjs</w:t>
+      </w:r>
+      <w:proofErr w:type="spellEnd"/>
+      <w:r>
+        <w:t>/loader:1063:27)</w:t>
+      </w:r>
+    </w:p>
+    <w:p>
+      <w:pPr>
+        <w:tabs>
+          <w:tab w:val="left" w:pos="3540"/>
+        </w:tabs>
+      </w:pPr>
+      <w:r>
+        <w:t xml:space="preserve">    at Object.Module._</w:t>
+      </w:r>
+      <w:proofErr w:type="gramStart"/>
+      <w:r>
+        <w:t>extensions..</w:t>
+      </w:r>
+      <w:proofErr w:type="spellStart"/>
+      <w:proofErr w:type="gramEnd"/>
+      <w:r>
+        <w:t>js</w:t>
+      </w:r>
+      <w:proofErr w:type="spellEnd"/>
+      <w:r>
+        <w:t xml:space="preserve"> (</w:t>
+      </w:r>
+      <w:proofErr w:type="spellStart"/>
+      <w:r>
+        <w:t>node:internal</w:t>
+      </w:r>
+      <w:proofErr w:type="spellEnd"/>
+      <w:r>
+        <w:t>/modules/</w:t>
+      </w:r>
+      <w:proofErr w:type="spellStart"/>
+      <w:r>
+        <w:t>cjs</w:t>
+      </w:r>
+      <w:proofErr w:type="spellEnd"/>
+      <w:r>
+        <w:t xml:space="preserve">/loader:1153:10)    </w:t>
+      </w:r>
+    </w:p>
+    <w:p>
+      <w:pPr>
+        <w:tabs>
+          <w:tab w:val="left" w:pos="3540"/>
+        </w:tabs>
+      </w:pPr>
+      <w:r>
+        <w:lastRenderedPageBreak/>
+        <w:t xml:space="preserve">    at </w:t>
+      </w:r>
+      <w:proofErr w:type="spellStart"/>
+      <w:r>
+        <w:t>Module.load</w:t>
+      </w:r>
+      <w:proofErr w:type="spellEnd"/>
+      <w:r>
+        <w:t xml:space="preserve"> (</w:t>
+      </w:r>
+      <w:proofErr w:type="spellStart"/>
+      <w:r>
+        <w:t>node:internal</w:t>
+      </w:r>
+      <w:proofErr w:type="spellEnd"/>
+      <w:r>
+        <w:t>/modules/</w:t>
+      </w:r>
+      <w:proofErr w:type="spellStart"/>
+      <w:r>
+        <w:t>cjs</w:t>
+      </w:r>
+      <w:proofErr w:type="spellEnd"/>
+      <w:r>
+        <w:t>/loader:975:32)</w:t>
+      </w:r>
+    </w:p>
+    <w:p>
+      <w:pPr>
+        <w:tabs>
+          <w:tab w:val="left" w:pos="3540"/>
+        </w:tabs>
+      </w:pPr>
+      <w:r>
+        <w:t xml:space="preserve">    at </w:t>
+      </w:r>
+      <w:proofErr w:type="spellStart"/>
+      <w:r>
+        <w:t>Function.Module._load</w:t>
+      </w:r>
+      <w:proofErr w:type="spellEnd"/>
+      <w:r>
+        <w:t xml:space="preserve"> (</w:t>
+      </w:r>
+      <w:proofErr w:type="spellStart"/>
+      <w:r>
+        <w:t>node:internal</w:t>
+      </w:r>
+      <w:proofErr w:type="spellEnd"/>
+      <w:r>
+        <w:t>/modules/</w:t>
+      </w:r>
+      <w:proofErr w:type="spellStart"/>
+      <w:r>
+        <w:t>cjs</w:t>
+      </w:r>
+      <w:proofErr w:type="spellEnd"/>
+      <w:r>
+        <w:t>/loader:822:12)</w:t>
+      </w:r>
+    </w:p>
+    <w:p>
+      <w:pPr>
+        <w:tabs>
+          <w:tab w:val="left" w:pos="3540"/>
+        </w:tabs>
+      </w:pPr>
+      <w:r>
+        <w:t xml:space="preserve">    at </w:t>
+      </w:r>
+      <w:proofErr w:type="spellStart"/>
+      <w:r>
+        <w:t>Function.executeUserEntryPoint</w:t>
+      </w:r>
+      <w:proofErr w:type="spellEnd"/>
+      <w:r>
+        <w:t xml:space="preserve"> [as </w:t>
+      </w:r>
+      <w:proofErr w:type="spellStart"/>
+      <w:r>
+        <w:t>runMain</w:t>
+      </w:r>
+      <w:proofErr w:type="spellEnd"/>
+      <w:r>
+        <w:t>] (</w:t>
+      </w:r>
+      <w:proofErr w:type="spellStart"/>
+      <w:r>
+        <w:t>node:internal</w:t>
+      </w:r>
+      <w:proofErr w:type="spellEnd"/>
+      <w:r>
+        <w:t>/modules/run_main:77:12)</w:t>
+      </w:r>
+    </w:p>
+    <w:p>
+      <w:pPr>
+        <w:pBdr>
+          <w:bottom w:val="single" w:sz="6" w:space="1" w:color="auto"/>
+        </w:pBdr>
+        <w:tabs>
+          <w:tab w:val="left" w:pos="3540"/>
+        </w:tabs>
+      </w:pPr>
+      <w:r>
+        <w:t xml:space="preserve">    at </w:t>
+      </w:r>
+      <w:proofErr w:type="spellStart"/>
+      <w:r>
+        <w:t>node:internal</w:t>
+      </w:r>
+      <w:proofErr w:type="spellEnd"/>
+      <w:r>
+        <w:t>/main/run_main_module:17:47</w:t>
+      </w:r>
+    </w:p>
+    <w:p>
+      <w:pPr>
+        <w:tabs>
+          <w:tab w:val="left" w:pos="3540"/>
+        </w:tabs>
+      </w:pPr>
+    </w:p>
+    <w:p>
+      <w:pPr>
+        <w:tabs>
+          <w:tab w:val="left" w:pos="3540"/>
+        </w:tabs>
+      </w:pPr>
+      <w:r>
+        <w:t xml:space="preserve">To solve </w:t>
+      </w:r>
+      <w:proofErr w:type="gramStart"/>
+      <w:r>
+        <w:t>this</w:t>
+      </w:r>
+      <w:proofErr w:type="gramEnd"/>
+      <w:r>
+        <w:t xml:space="preserve"> we use .</w:t>
+      </w:r>
+      <w:proofErr w:type="spellStart"/>
+      <w:r>
+        <w:t>mjs</w:t>
+      </w:r>
+      <w:proofErr w:type="spellEnd"/>
+      <w:r>
+        <w:t xml:space="preserve"> </w:t>
+      </w:r>
+      <w:proofErr w:type="spellStart"/>
+      <w:r>
+        <w:t>extention</w:t>
+      </w:r>
+      <w:proofErr w:type="spellEnd"/>
+      <w:r>
+        <w:t xml:space="preserve"> instead of .</w:t>
+      </w:r>
+      <w:proofErr w:type="spellStart"/>
+      <w:r>
+        <w:t>js</w:t>
+      </w:r>
+      <w:proofErr w:type="spellEnd"/>
+    </w:p>
+    <w:p>
+      <w:pPr>
+        <w:tabs>
+          <w:tab w:val="left" w:pos="3540"/>
+        </w:tabs>
+        <w:rPr>
+          <w:b/>
+          <w:bCs/>
+          <w:sz w:val="32"/>
+          <w:szCs w:val="32"/>
+          <w:u w:val="single"/>
+        </w:rPr>
+      </w:pPr>
+      <w:r>
+        <w:t xml:space="preserve">Note that we can not have multiple defaults for </w:t>
+      </w:r>
+      <w:proofErr w:type="spellStart"/>
+      <w:r>
+        <w:t>expoer</w:t>
+      </w:r>
+      <w:proofErr w:type="spellEnd"/>
+      <w:r>
+        <w:t xml:space="preserve"> </w:t>
+      </w:r>
+      <w:proofErr w:type="spellStart"/>
+      <w:r>
+        <w:t>satatement</w:t>
+      </w:r>
+      <w:proofErr w:type="spellEnd"/>
+      <w:r>
+        <w:t>.</w:t>
+      </w:r>
+      <w:r>
+        <w:t xml:space="preserve"> </w:t>
+      </w:r>
+      <w:r>
+        <w:rPr>
+          <w:b/>
+          <w:bCs/>
+          <w:sz w:val="32"/>
+          <w:szCs w:val="32"/>
+          <w:u w:val="single"/>
+        </w:rPr>
+        <w:t xml:space="preserve">One more thing to be noted is props are Read only, we </w:t>
+      </w:r>
+      <w:proofErr w:type="spellStart"/>
+      <w:r>
+        <w:rPr>
+          <w:b/>
+          <w:bCs/>
+          <w:sz w:val="32"/>
+          <w:szCs w:val="32"/>
+          <w:u w:val="single"/>
+        </w:rPr>
+        <w:t>can not</w:t>
+      </w:r>
+      <w:proofErr w:type="spellEnd"/>
+      <w:r>
+        <w:rPr>
+          <w:b/>
+          <w:bCs/>
+          <w:sz w:val="32"/>
+          <w:szCs w:val="32"/>
+          <w:u w:val="single"/>
+        </w:rPr>
+        <w:t xml:space="preserve"> change them.</w:t>
+      </w:r>
+    </w:p>
+    <w:p>
+      <w:pPr>
+        <w:tabs>
+          <w:tab w:val="left" w:pos="3540"/>
+        </w:tabs>
+        <w:rPr>
+          <w:b/>
+          <w:bCs/>
+          <w:sz w:val="32"/>
+          <w:szCs w:val="32"/>
+          <w:u w:val="single"/>
+        </w:rPr>
+      </w:pPr>
+    </w:p>
+    <w:p>
+      <w:pPr>
+        <w:tabs>
+          <w:tab w:val="left" w:pos="3540"/>
+        </w:tabs>
+      </w:pPr>
+      <w:r>
+        <w:t>Default Props:</w:t>
+      </w:r>
+    </w:p>
+    <w:p>
+      <w:pPr>
+        <w:shd w:val="clear" w:color="auto" w:fill="1E1E1E"/>
+        <w:spacing w:after="0" w:line="285" w:lineRule="atLeast"/>
+        <w:rPr>
+          <w:rFonts w:ascii="Consolas" w:eastAsia="Times New Roman" w:hAnsi="Consolas" w:cs="Times New Roman"/>
+          <w:color w:val="D4D4D4"/>
+          <w:sz w:val="21"/>
+          <w:szCs w:val="21"/>
+        </w:rPr>
+      </w:pPr>
+      <w:proofErr w:type="spellStart"/>
+      <w:r>
+        <w:rPr>
+          <w:rFonts w:ascii="Consolas" w:eastAsia="Times New Roman" w:hAnsi="Consolas" w:cs="Times New Roman"/>
+          <w:color w:val="D4D4D4"/>
+          <w:sz w:val="21"/>
+          <w:szCs w:val="21"/>
+        </w:rPr>
+        <w:t>Navbar.defaultProps</w:t>
+      </w:r>
+      <w:proofErr w:type="spellEnd"/>
+      <w:r>
+        <w:rPr>
+          <w:rFonts w:ascii="Consolas" w:eastAsia="Times New Roman" w:hAnsi="Consolas" w:cs="Times New Roman"/>
+          <w:color w:val="D4D4D4"/>
+          <w:sz w:val="21"/>
+          <w:szCs w:val="21"/>
+        </w:rPr>
+        <w:t xml:space="preserve"> = {</w:t>
+      </w:r>
+    </w:p>
+    <w:p>
+      <w:pPr>
+        <w:shd w:val="clear" w:color="auto" w:fill="1E1E1E"/>
+        <w:spacing w:after="0" w:line="285" w:lineRule="atLeast"/>
+        <w:rPr>
+          <w:rFonts w:ascii="Consolas" w:eastAsia="Times New Roman" w:hAnsi="Consolas" w:cs="Times New Roman"/>
+          <w:color w:val="D4D4D4"/>
+          <w:sz w:val="21"/>
+          <w:szCs w:val="21"/>
+        </w:rPr>
+      </w:pPr>
+      <w:r>
+        <w:rPr>
+          <w:rFonts w:ascii="Consolas" w:eastAsia="Times New Roman" w:hAnsi="Consolas" w:cs="Times New Roman"/>
+          <w:color w:val="D4D4D4"/>
+          <w:sz w:val="21"/>
+          <w:szCs w:val="21"/>
+        </w:rPr>
+        <w:t xml:space="preserve">    title: </w:t>
+      </w:r>
+      <w:r>
+        <w:rPr>
+          <w:rFonts w:ascii="Consolas" w:eastAsia="Times New Roman" w:hAnsi="Consolas" w:cs="Times New Roman"/>
+          <w:color w:val="CE9178"/>
+          <w:sz w:val="21"/>
+          <w:szCs w:val="21"/>
+        </w:rPr>
+        <w:t>"I am Good Title"</w:t>
+      </w:r>
+    </w:p>
+    <w:p>
+      <w:pPr>
+        <w:shd w:val="clear" w:color="auto" w:fill="1E1E1E"/>
+        <w:spacing w:after="0" w:line="285" w:lineRule="atLeast"/>
+        <w:rPr>
+          <w:rFonts w:ascii="Consolas" w:eastAsia="Times New Roman" w:hAnsi="Consolas" w:cs="Times New Roman"/>
+          <w:color w:val="D4D4D4"/>
+          <w:sz w:val="21"/>
+          <w:szCs w:val="21"/>
+        </w:rPr>
+      </w:pPr>
+      <w:r>
+        <w:rPr>
+          <w:rFonts w:ascii="Consolas" w:eastAsia="Times New Roman" w:hAnsi="Consolas" w:cs="Times New Roman"/>
+          <w:color w:val="D4D4D4"/>
+          <w:sz w:val="21"/>
+          <w:szCs w:val="21"/>
+        </w:rPr>
+        <w:t>}</w:t>
+      </w:r>
+    </w:p>
+    <w:p>
+      <w:pPr>
+        <w:tabs>
+          <w:tab w:val="left" w:pos="3540"/>
+        </w:tabs>
+      </w:pPr>
     </w:p>
     <w:sectPr>
       <w:pgSz w:w="12240" w:h="15840"/>

</xml_diff>

<commit_message>
Form crated To convert Texts of Textarea
</commit_message>
<xml_diff>
--- a/Code With Harry Tutorials.docx
+++ b/Code With Harry Tutorials.docx
@@ -36,21 +36,12 @@
           <w:szCs w:val="28"/>
         </w:rPr>
       </w:pPr>
-      <w:proofErr w:type="spellStart"/>
-      <w:r>
-        <w:rPr>
-          <w:sz w:val="28"/>
-          <w:szCs w:val="28"/>
-        </w:rPr>
-        <w:t>npx</w:t>
-      </w:r>
-      <w:proofErr w:type="spellEnd"/>
-      <w:r>
-        <w:rPr>
-          <w:sz w:val="28"/>
-          <w:szCs w:val="28"/>
-        </w:rPr>
-        <w:t xml:space="preserve"> create-react-app app-name</w:t>
+      <w:r>
+        <w:rPr>
+          <w:sz w:val="28"/>
+          <w:szCs w:val="28"/>
+        </w:rPr>
+        <w:t>npx create-react-app app-name</w:t>
       </w:r>
     </w:p>
     <w:p>
@@ -70,23 +61,7 @@
           <w:sz w:val="28"/>
           <w:szCs w:val="28"/>
         </w:rPr>
-        <w:t xml:space="preserve">Play with Files in of </w:t>
-      </w:r>
-      <w:proofErr w:type="spellStart"/>
-      <w:r>
-        <w:rPr>
-          <w:sz w:val="28"/>
-          <w:szCs w:val="28"/>
-        </w:rPr>
-        <w:t>src</w:t>
-      </w:r>
-      <w:proofErr w:type="spellEnd"/>
-      <w:r>
-        <w:rPr>
-          <w:sz w:val="28"/>
-          <w:szCs w:val="28"/>
-        </w:rPr>
-        <w:t xml:space="preserve"> and public Folder, to get handy.</w:t>
+        <w:t>Play with Files in of src and public Folder, to get handy.</w:t>
       </w:r>
     </w:p>
     <w:p>
@@ -106,23 +81,7 @@
           <w:sz w:val="28"/>
           <w:szCs w:val="28"/>
         </w:rPr>
-        <w:t xml:space="preserve">In </w:t>
-      </w:r>
-      <w:proofErr w:type="spellStart"/>
-      <w:r>
-        <w:rPr>
-          <w:sz w:val="28"/>
-          <w:szCs w:val="28"/>
-        </w:rPr>
-        <w:t>src</w:t>
-      </w:r>
-      <w:proofErr w:type="spellEnd"/>
-      <w:r>
-        <w:rPr>
-          <w:sz w:val="28"/>
-          <w:szCs w:val="28"/>
-        </w:rPr>
-        <w:t xml:space="preserve"> folder index.js is entry point and you can note &lt;App /&gt; there. In the </w:t>
+        <w:t xml:space="preserve">In src folder index.js is entry point and you can note &lt;App /&gt; there. In the </w:t>
       </w:r>
       <w:r>
         <w:rPr>
@@ -621,23 +580,7 @@
           <w:sz w:val="28"/>
           <w:szCs w:val="28"/>
         </w:rPr>
-        <w:t>&lt;div&gt;</w:t>
-      </w:r>
-      <w:proofErr w:type="spellStart"/>
-      <w:r>
-        <w:rPr>
-          <w:sz w:val="28"/>
-          <w:szCs w:val="28"/>
-        </w:rPr>
-        <w:t>aaa</w:t>
-      </w:r>
-      <w:proofErr w:type="spellEnd"/>
-      <w:r>
-        <w:rPr>
-          <w:sz w:val="28"/>
-          <w:szCs w:val="28"/>
-        </w:rPr>
-        <w:t>&lt;/div&gt;</w:t>
+        <w:t>&lt;div&gt;aaa&lt;/div&gt;</w:t>
       </w:r>
     </w:p>
     <w:p>
@@ -718,23 +661,7 @@
           <w:sz w:val="28"/>
           <w:szCs w:val="28"/>
         </w:rPr>
-        <w:t>&lt;div&gt;</w:t>
-      </w:r>
-      <w:proofErr w:type="spellStart"/>
-      <w:r>
-        <w:rPr>
-          <w:sz w:val="28"/>
-          <w:szCs w:val="28"/>
-        </w:rPr>
-        <w:t>aaa</w:t>
-      </w:r>
-      <w:proofErr w:type="spellEnd"/>
-      <w:r>
-        <w:rPr>
-          <w:sz w:val="28"/>
-          <w:szCs w:val="28"/>
-        </w:rPr>
-        <w:t>&lt;/div&gt;</w:t>
+        <w:t>&lt;div&gt;aaa&lt;/div&gt;</w:t>
       </w:r>
     </w:p>
     <w:p>
@@ -781,21 +708,12 @@
           <w:szCs w:val="28"/>
         </w:rPr>
       </w:pPr>
-      <w:proofErr w:type="spellStart"/>
-      <w:r>
-        <w:rPr>
-          <w:sz w:val="28"/>
-          <w:szCs w:val="28"/>
-        </w:rPr>
-        <w:t>className</w:t>
-      </w:r>
-      <w:proofErr w:type="spellEnd"/>
-      <w:r>
-        <w:rPr>
-          <w:sz w:val="28"/>
-          <w:szCs w:val="28"/>
-        </w:rPr>
-        <w:t xml:space="preserve"> instead of class</w:t>
+      <w:r>
+        <w:rPr>
+          <w:sz w:val="28"/>
+          <w:szCs w:val="28"/>
+        </w:rPr>
+        <w:t>className instead of class</w:t>
       </w:r>
     </w:p>
     <w:p>
@@ -810,21 +728,12 @@
           <w:szCs w:val="28"/>
         </w:rPr>
       </w:pPr>
-      <w:proofErr w:type="spellStart"/>
-      <w:r>
-        <w:rPr>
-          <w:sz w:val="28"/>
-          <w:szCs w:val="28"/>
-        </w:rPr>
-        <w:t>htmlFor</w:t>
-      </w:r>
-      <w:proofErr w:type="spellEnd"/>
-      <w:r>
-        <w:rPr>
-          <w:sz w:val="28"/>
-          <w:szCs w:val="28"/>
-        </w:rPr>
-        <w:t xml:space="preserve"> instead of for</w:t>
+      <w:r>
+        <w:rPr>
+          <w:sz w:val="28"/>
+          <w:szCs w:val="28"/>
+        </w:rPr>
+        <w:t>htmlFor instead of for</w:t>
       </w:r>
     </w:p>
     <w:p>
@@ -839,7 +748,6 @@
           <w:szCs w:val="28"/>
         </w:rPr>
       </w:pPr>
-      <w:proofErr w:type="spellStart"/>
       <w:r>
         <w:rPr>
           <w:sz w:val="28"/>
@@ -847,7 +755,6 @@
         </w:rPr>
         <w:t>tabIndex</w:t>
       </w:r>
-      <w:proofErr w:type="spellEnd"/>
     </w:p>
     <w:p>
       <w:pPr>
@@ -1218,23 +1125,7 @@
           <w:sz w:val="28"/>
           <w:szCs w:val="28"/>
         </w:rPr>
-        <w:t xml:space="preserve">Tutorial 5: // Adding Bootstrap and </w:t>
-      </w:r>
-      <w:proofErr w:type="spellStart"/>
-      <w:r>
-        <w:rPr>
-          <w:sz w:val="28"/>
-          <w:szCs w:val="28"/>
-        </w:rPr>
-        <w:t>Textutils</w:t>
-      </w:r>
-      <w:proofErr w:type="spellEnd"/>
-      <w:r>
-        <w:rPr>
-          <w:sz w:val="28"/>
-          <w:szCs w:val="28"/>
-        </w:rPr>
-        <w:t xml:space="preserve"> project</w:t>
+        <w:t>Tutorial 5: // Adding Bootstrap and Textutils project</w:t>
       </w:r>
     </w:p>
     <w:p>
@@ -1246,15 +1137,7 @@
         <w:t xml:space="preserve">Note: </w:t>
       </w:r>
       <w:r>
-        <w:t xml:space="preserve">there is node modules folder that contains all the packages and libraries we need. We can delete it because we already have that all details in </w:t>
-      </w:r>
-      <w:proofErr w:type="spellStart"/>
-      <w:r>
-        <w:t>package.json</w:t>
-      </w:r>
-      <w:proofErr w:type="spellEnd"/>
-      <w:r>
-        <w:t xml:space="preserve"> …    we can install all the dependency using following command</w:t>
+        <w:t>there is node modules folder that contains all the packages and libraries we need. We can delete it because we already have that all details in package.json …    we can install all the dependency using following command</w:t>
       </w:r>
     </w:p>
     <w:p>
@@ -1265,35 +1148,15 @@
           <w:numId w:val="1"/>
         </w:numPr>
       </w:pPr>
-      <w:proofErr w:type="spellStart"/>
-      <w:r>
-        <w:t>npm</w:t>
-      </w:r>
-      <w:proofErr w:type="spellEnd"/>
-      <w:r>
-        <w:t xml:space="preserve"> </w:t>
-      </w:r>
-      <w:proofErr w:type="spellStart"/>
-      <w:r>
-        <w:t>istall</w:t>
-      </w:r>
-      <w:proofErr w:type="spellEnd"/>
-      <w:r>
-        <w:t xml:space="preserve"> / </w:t>
-      </w:r>
-      <w:proofErr w:type="spellStart"/>
-      <w:r>
-        <w:t>npm</w:t>
-      </w:r>
-      <w:proofErr w:type="spellEnd"/>
-      <w:r>
-        <w:t xml:space="preserve"> </w:t>
-      </w:r>
-      <w:proofErr w:type="spellStart"/>
-      <w:r>
-        <w:t>i</w:t>
-      </w:r>
-      <w:proofErr w:type="spellEnd"/>
+      <w:r>
+        <w:t xml:space="preserve">npm </w:t>
+      </w:r>
+      <w:r>
+        <w:t>install</w:t>
+      </w:r>
+      <w:r>
+        <w:t xml:space="preserve"> / npm i</w:t>
+      </w:r>
     </w:p>
     <w:p>
       <w:r>
@@ -1317,25 +1180,7 @@
           <w:szCs w:val="28"/>
           <w:u w:val="single"/>
         </w:rPr>
-        <w:t xml:space="preserve">Creating </w:t>
-      </w:r>
-      <w:proofErr w:type="spellStart"/>
-      <w:r>
-        <w:rPr>
-          <w:sz w:val="28"/>
-          <w:szCs w:val="28"/>
-          <w:u w:val="single"/>
-        </w:rPr>
-        <w:t>Textutils</w:t>
-      </w:r>
-      <w:proofErr w:type="spellEnd"/>
-      <w:r>
-        <w:rPr>
-          <w:sz w:val="28"/>
-          <w:szCs w:val="28"/>
-          <w:u w:val="single"/>
-        </w:rPr>
-        <w:t xml:space="preserve"> project</w:t>
+        <w:t>Creating Textutils project</w:t>
       </w:r>
       <w:r>
         <w:t>.</w:t>
@@ -1370,17 +1215,8 @@
           <w:sz w:val="28"/>
           <w:szCs w:val="28"/>
         </w:rPr>
-        <w:t xml:space="preserve">Tutorial 6: Understanding Props and </w:t>
-      </w:r>
-      <w:proofErr w:type="spellStart"/>
-      <w:r>
-        <w:rPr>
-          <w:sz w:val="28"/>
-          <w:szCs w:val="28"/>
-        </w:rPr>
-        <w:t>PropTypes</w:t>
-      </w:r>
-      <w:proofErr w:type="spellEnd"/>
+        <w:t>Tutorial 6: Understanding Props and PropTypes</w:t>
+      </w:r>
     </w:p>
     <w:p>
       <w:pPr>
@@ -1443,21 +1279,11 @@
         <w:t>,</w:t>
       </w:r>
       <w:r>
-        <w:t xml:space="preserve">we can add ‘m’ before </w:t>
-      </w:r>
-      <w:proofErr w:type="spellStart"/>
-      <w:r>
-        <w:t>js</w:t>
-      </w:r>
-      <w:proofErr w:type="spellEnd"/>
-      <w:r>
-        <w:t xml:space="preserve"> </w:t>
-      </w:r>
-      <w:proofErr w:type="spellStart"/>
-      <w:r>
-        <w:t>extention</w:t>
-      </w:r>
-      <w:proofErr w:type="spellEnd"/>
+        <w:t xml:space="preserve">we can add ‘m’ before js </w:t>
+      </w:r>
+      <w:r>
+        <w:t>extension</w:t>
+      </w:r>
       <w:r>
         <w:t xml:space="preserve"> like following:</w:t>
       </w:r>
@@ -1479,15 +1305,7 @@
         </w:tabs>
       </w:pPr>
       <w:r>
-        <w:t xml:space="preserve">We can create component in another folder inside </w:t>
-      </w:r>
-      <w:proofErr w:type="spellStart"/>
-      <w:r>
-        <w:t>src</w:t>
-      </w:r>
-      <w:proofErr w:type="spellEnd"/>
-      <w:r>
-        <w:t xml:space="preserve"> folder and use them in our Apps.js</w:t>
+        <w:t>We can create component in another folder inside src folder and use them in our Apps.js</w:t>
       </w:r>
     </w:p>
     <w:p>
@@ -1499,19 +1317,15 @@
       <w:r>
         <w:t xml:space="preserve">We can pass props in </w:t>
       </w:r>
-      <w:proofErr w:type="spellStart"/>
-      <w:r>
-        <w:t>fuction</w:t>
-      </w:r>
-      <w:proofErr w:type="spellEnd"/>
-      <w:r>
-        <w:t xml:space="preserve"> based component like parameter in </w:t>
-      </w:r>
-      <w:proofErr w:type="spellStart"/>
-      <w:r>
-        <w:t>fuction</w:t>
-      </w:r>
-      <w:proofErr w:type="spellEnd"/>
+      <w:r>
+        <w:t>function-based</w:t>
+      </w:r>
+      <w:r>
+        <w:t xml:space="preserve"> component like parameter in </w:t>
+      </w:r>
+      <w:r>
+        <w:t>function</w:t>
+      </w:r>
       <w:r>
         <w:t>. Now we can pass the arguments from the Apps.js by adding them like following:</w:t>
       </w:r>
@@ -1579,9 +1393,94 @@
           <w:sz w:val="21"/>
           <w:szCs w:val="21"/>
         </w:rPr>
-        <w:t>"</w:t>
-      </w:r>
-      <w:proofErr w:type="spellStart"/>
+        <w:t>"TextUtils"</w:t>
+      </w:r>
+      <w:r>
+        <w:rPr>
+          <w:rFonts w:ascii="Consolas" w:eastAsia="Times New Roman" w:hAnsi="Consolas" w:cs="Times New Roman"/>
+          <w:color w:val="D4D4D4"/>
+          <w:sz w:val="21"/>
+          <w:szCs w:val="21"/>
+        </w:rPr>
+        <w:t xml:space="preserve"> </w:t>
+      </w:r>
+      <w:r>
+        <w:rPr>
+          <w:rFonts w:ascii="Consolas" w:eastAsia="Times New Roman" w:hAnsi="Consolas" w:cs="Times New Roman"/>
+          <w:color w:val="808080"/>
+          <w:sz w:val="21"/>
+          <w:szCs w:val="21"/>
+        </w:rPr>
+        <w:t>/&gt;</w:t>
+      </w:r>
+    </w:p>
+    <w:p>
+      <w:pPr>
+        <w:tabs>
+          <w:tab w:val="left" w:pos="3540"/>
+        </w:tabs>
+      </w:pPr>
+      <w:r>
+        <w:t>Here title is argument pass in props. We can use if by {props.title}</w:t>
+      </w:r>
+    </w:p>
+    <w:p>
+      <w:pPr>
+        <w:tabs>
+          <w:tab w:val="left" w:pos="3540"/>
+        </w:tabs>
+      </w:pPr>
+      <w:r>
+        <w:t>We can make proptype fix and also make it require by importing and using props-type.</w:t>
+      </w:r>
+    </w:p>
+    <w:p>
+      <w:pPr>
+        <w:shd w:val="clear" w:color="auto" w:fill="1E1E1E"/>
+        <w:spacing w:after="0" w:line="285" w:lineRule="atLeast"/>
+        <w:rPr>
+          <w:rFonts w:ascii="Consolas" w:eastAsia="Times New Roman" w:hAnsi="Consolas" w:cs="Times New Roman"/>
+          <w:color w:val="D4D4D4"/>
+          <w:sz w:val="21"/>
+          <w:szCs w:val="21"/>
+        </w:rPr>
+      </w:pPr>
+      <w:r>
+        <w:rPr>
+          <w:rFonts w:ascii="Consolas" w:eastAsia="Times New Roman" w:hAnsi="Consolas" w:cs="Times New Roman"/>
+          <w:color w:val="569CD6"/>
+          <w:sz w:val="21"/>
+          <w:szCs w:val="21"/>
+        </w:rPr>
+        <w:t>import</w:t>
+      </w:r>
+      <w:r>
+        <w:rPr>
+          <w:rFonts w:ascii="Consolas" w:eastAsia="Times New Roman" w:hAnsi="Consolas" w:cs="Times New Roman"/>
+          <w:color w:val="D4D4D4"/>
+          <w:sz w:val="21"/>
+          <w:szCs w:val="21"/>
+        </w:rPr>
+        <w:t xml:space="preserve"> PropTypes </w:t>
+      </w:r>
+      <w:r>
+        <w:rPr>
+          <w:rFonts w:ascii="Consolas" w:eastAsia="Times New Roman" w:hAnsi="Consolas" w:cs="Times New Roman"/>
+          <w:color w:val="569CD6"/>
+          <w:sz w:val="21"/>
+          <w:szCs w:val="21"/>
+        </w:rPr>
+        <w:t>from</w:t>
+      </w:r>
+      <w:r>
+        <w:rPr>
+          <w:rFonts w:ascii="Consolas" w:eastAsia="Times New Roman" w:hAnsi="Consolas" w:cs="Times New Roman"/>
+          <w:color w:val="D4D4D4"/>
+          <w:sz w:val="21"/>
+          <w:szCs w:val="21"/>
+        </w:rPr>
+        <w:t xml:space="preserve"> </w:t>
+      </w:r>
       <w:r>
         <w:rPr>
           <w:rFonts w:ascii="Consolas" w:eastAsia="Times New Roman" w:hAnsi="Consolas" w:cs="Times New Roman"/>
@@ -1589,17 +1488,7 @@
           <w:sz w:val="21"/>
           <w:szCs w:val="21"/>
         </w:rPr>
-        <w:t>TextUtils</w:t>
-      </w:r>
-      <w:proofErr w:type="spellEnd"/>
-      <w:r>
-        <w:rPr>
-          <w:rFonts w:ascii="Consolas" w:eastAsia="Times New Roman" w:hAnsi="Consolas" w:cs="Times New Roman"/>
-          <w:color w:val="CE9178"/>
-          <w:sz w:val="21"/>
-          <w:szCs w:val="21"/>
-        </w:rPr>
-        <w:t>"</w:t>
+        <w:t>'prop-types'</w:t>
       </w:r>
       <w:r>
         <w:rPr>
@@ -1608,52 +1497,7 @@
           <w:sz w:val="21"/>
           <w:szCs w:val="21"/>
         </w:rPr>
-        <w:t xml:space="preserve"> </w:t>
-      </w:r>
-      <w:r>
-        <w:rPr>
-          <w:rFonts w:ascii="Consolas" w:eastAsia="Times New Roman" w:hAnsi="Consolas" w:cs="Times New Roman"/>
-          <w:color w:val="808080"/>
-          <w:sz w:val="21"/>
-          <w:szCs w:val="21"/>
-        </w:rPr>
-        <w:t>/&gt;</w:t>
-      </w:r>
-    </w:p>
-    <w:p>
-      <w:pPr>
-        <w:tabs>
-          <w:tab w:val="left" w:pos="3540"/>
-        </w:tabs>
-      </w:pPr>
-      <w:r>
-        <w:t>Here title is argument pass in props. We can use if by {</w:t>
-      </w:r>
-      <w:proofErr w:type="spellStart"/>
-      <w:r>
-        <w:t>props.title</w:t>
-      </w:r>
-      <w:proofErr w:type="spellEnd"/>
-      <w:r>
-        <w:t>}</w:t>
-      </w:r>
-    </w:p>
-    <w:p>
-      <w:pPr>
-        <w:tabs>
-          <w:tab w:val="left" w:pos="3540"/>
-        </w:tabs>
-      </w:pPr>
-      <w:r>
-        <w:t xml:space="preserve">We can make </w:t>
-      </w:r>
-      <w:proofErr w:type="spellStart"/>
-      <w:r>
-        <w:t>proptype</w:t>
-      </w:r>
-      <w:proofErr w:type="spellEnd"/>
-      <w:r>
-        <w:t xml:space="preserve"> fix and also make it require by importing and using props-type.</w:t>
+        <w:t>;</w:t>
       </w:r>
     </w:p>
     <w:p>
@@ -1670,22 +1514,24 @@
       <w:r>
         <w:rPr>
           <w:rFonts w:ascii="Consolas" w:eastAsia="Times New Roman" w:hAnsi="Consolas" w:cs="Times New Roman"/>
-          <w:color w:val="569CD6"/>
-          <w:sz w:val="21"/>
-          <w:szCs w:val="21"/>
-        </w:rPr>
-        <w:t>import</w:t>
-      </w:r>
-      <w:r>
+          <w:color w:val="D4D4D4"/>
+          <w:sz w:val="21"/>
+          <w:szCs w:val="21"/>
+        </w:rPr>
+        <w:t>Navbar.prototype = {</w:t>
+      </w:r>
+    </w:p>
+    <w:p>
+      <w:pPr>
+        <w:shd w:val="clear" w:color="auto" w:fill="1E1E1E"/>
+        <w:spacing w:after="0" w:line="285" w:lineRule="atLeast"/>
         <w:rPr>
           <w:rFonts w:ascii="Consolas" w:eastAsia="Times New Roman" w:hAnsi="Consolas" w:cs="Times New Roman"/>
           <w:color w:val="D4D4D4"/>
           <w:sz w:val="21"/>
           <w:szCs w:val="21"/>
         </w:rPr>
-        <w:t xml:space="preserve"> </w:t>
-      </w:r>
-      <w:proofErr w:type="spellStart"/>
+      </w:pPr>
       <w:r>
         <w:rPr>
           <w:rFonts w:ascii="Consolas" w:eastAsia="Times New Roman" w:hAnsi="Consolas" w:cs="Times New Roman"/>
@@ -1693,118 +1539,8 @@
           <w:sz w:val="21"/>
           <w:szCs w:val="21"/>
         </w:rPr>
-        <w:t>PropTypes</w:t>
-      </w:r>
-      <w:proofErr w:type="spellEnd"/>
-      <w:r>
-        <w:rPr>
-          <w:rFonts w:ascii="Consolas" w:eastAsia="Times New Roman" w:hAnsi="Consolas" w:cs="Times New Roman"/>
-          <w:color w:val="D4D4D4"/>
-          <w:sz w:val="21"/>
-          <w:szCs w:val="21"/>
-        </w:rPr>
-        <w:t xml:space="preserve"> </w:t>
-      </w:r>
-      <w:r>
-        <w:rPr>
-          <w:rFonts w:ascii="Consolas" w:eastAsia="Times New Roman" w:hAnsi="Consolas" w:cs="Times New Roman"/>
-          <w:color w:val="569CD6"/>
-          <w:sz w:val="21"/>
-          <w:szCs w:val="21"/>
-        </w:rPr>
-        <w:t>from</w:t>
-      </w:r>
-      <w:r>
-        <w:rPr>
-          <w:rFonts w:ascii="Consolas" w:eastAsia="Times New Roman" w:hAnsi="Consolas" w:cs="Times New Roman"/>
-          <w:color w:val="D4D4D4"/>
-          <w:sz w:val="21"/>
-          <w:szCs w:val="21"/>
-        </w:rPr>
-        <w:t xml:space="preserve"> </w:t>
-      </w:r>
-      <w:r>
-        <w:rPr>
-          <w:rFonts w:ascii="Consolas" w:eastAsia="Times New Roman" w:hAnsi="Consolas" w:cs="Times New Roman"/>
-          <w:color w:val="CE9178"/>
-          <w:sz w:val="21"/>
-          <w:szCs w:val="21"/>
-        </w:rPr>
-        <w:t>'prop-types'</w:t>
-      </w:r>
-      <w:r>
-        <w:rPr>
-          <w:rFonts w:ascii="Consolas" w:eastAsia="Times New Roman" w:hAnsi="Consolas" w:cs="Times New Roman"/>
-          <w:color w:val="D4D4D4"/>
-          <w:sz w:val="21"/>
-          <w:szCs w:val="21"/>
-        </w:rPr>
-        <w:t>;</w:t>
-      </w:r>
-    </w:p>
-    <w:p>
-      <w:pPr>
-        <w:shd w:val="clear" w:color="auto" w:fill="1E1E1E"/>
-        <w:spacing w:after="0" w:line="285" w:lineRule="atLeast"/>
-        <w:rPr>
-          <w:rFonts w:ascii="Consolas" w:eastAsia="Times New Roman" w:hAnsi="Consolas" w:cs="Times New Roman"/>
-          <w:color w:val="D4D4D4"/>
-          <w:sz w:val="21"/>
-          <w:szCs w:val="21"/>
-        </w:rPr>
-      </w:pPr>
-      <w:proofErr w:type="spellStart"/>
-      <w:r>
-        <w:rPr>
-          <w:rFonts w:ascii="Consolas" w:eastAsia="Times New Roman" w:hAnsi="Consolas" w:cs="Times New Roman"/>
-          <w:color w:val="D4D4D4"/>
-          <w:sz w:val="21"/>
-          <w:szCs w:val="21"/>
-        </w:rPr>
-        <w:t>Navbar.prototype</w:t>
-      </w:r>
-      <w:proofErr w:type="spellEnd"/>
-      <w:r>
-        <w:rPr>
-          <w:rFonts w:ascii="Consolas" w:eastAsia="Times New Roman" w:hAnsi="Consolas" w:cs="Times New Roman"/>
-          <w:color w:val="D4D4D4"/>
-          <w:sz w:val="21"/>
-          <w:szCs w:val="21"/>
-        </w:rPr>
-        <w:t xml:space="preserve"> = {</w:t>
-      </w:r>
-    </w:p>
-    <w:p>
-      <w:pPr>
-        <w:shd w:val="clear" w:color="auto" w:fill="1E1E1E"/>
-        <w:spacing w:after="0" w:line="285" w:lineRule="atLeast"/>
-        <w:rPr>
-          <w:rFonts w:ascii="Consolas" w:eastAsia="Times New Roman" w:hAnsi="Consolas" w:cs="Times New Roman"/>
-          <w:color w:val="D4D4D4"/>
-          <w:sz w:val="21"/>
-          <w:szCs w:val="21"/>
-        </w:rPr>
-      </w:pPr>
-      <w:r>
-        <w:rPr>
-          <w:rFonts w:ascii="Consolas" w:eastAsia="Times New Roman" w:hAnsi="Consolas" w:cs="Times New Roman"/>
-          <w:color w:val="D4D4D4"/>
-          <w:sz w:val="21"/>
-          <w:szCs w:val="21"/>
-        </w:rPr>
-        <w:t xml:space="preserve">    title: </w:t>
-      </w:r>
-      <w:proofErr w:type="spellStart"/>
-      <w:r>
-        <w:rPr>
-          <w:rFonts w:ascii="Consolas" w:eastAsia="Times New Roman" w:hAnsi="Consolas" w:cs="Times New Roman"/>
-          <w:color w:val="D4D4D4"/>
-          <w:sz w:val="21"/>
-          <w:szCs w:val="21"/>
-        </w:rPr>
-        <w:t>PropTypes.string.isRequired</w:t>
-      </w:r>
-      <w:proofErr w:type="spellEnd"/>
+        <w:t>    title: PropTypes.string.isRequired</w:t>
+      </w:r>
     </w:p>
     <w:p>
       <w:pPr>
@@ -1854,21 +1590,11 @@
         </w:tabs>
       </w:pPr>
       <w:r>
-        <w:t>Here note that if we use .</w:t>
-      </w:r>
-      <w:proofErr w:type="spellStart"/>
-      <w:r>
-        <w:t>js</w:t>
-      </w:r>
-      <w:proofErr w:type="spellEnd"/>
-      <w:r>
-        <w:t xml:space="preserve"> </w:t>
-      </w:r>
-      <w:proofErr w:type="spellStart"/>
-      <w:r>
-        <w:t>extention</w:t>
-      </w:r>
-      <w:proofErr w:type="spellEnd"/>
+        <w:t xml:space="preserve">Here note that if we use .js </w:t>
+      </w:r>
+      <w:r>
+        <w:t>extension</w:t>
+      </w:r>
       <w:r>
         <w:t xml:space="preserve"> then we will get the following error</w:t>
       </w:r>
@@ -1887,49 +1613,17 @@
         </w:tabs>
       </w:pPr>
       <w:r>
-        <w:t>PS C:\Users\Dell\OneDrive\Desktop\React-with-Git&gt; node .\react-learning\</w:t>
-      </w:r>
-      <w:proofErr w:type="spellStart"/>
-      <w:r>
-        <w:t>src</w:t>
-      </w:r>
-      <w:proofErr w:type="spellEnd"/>
-      <w:r>
-        <w:t>\components\module1.js</w:t>
-      </w:r>
-    </w:p>
-    <w:p>
-      <w:pPr>
-        <w:tabs>
-          <w:tab w:val="left" w:pos="3540"/>
-        </w:tabs>
-      </w:pPr>
-      <w:r>
-        <w:t>(</w:t>
-      </w:r>
-      <w:proofErr w:type="gramStart"/>
-      <w:r>
-        <w:t>node</w:t>
-      </w:r>
-      <w:proofErr w:type="gramEnd"/>
-      <w:r>
-        <w:t xml:space="preserve">:10376) Warning: To load an ES module, set "type": "module" in the </w:t>
-      </w:r>
-      <w:proofErr w:type="spellStart"/>
-      <w:r>
-        <w:t>package.json</w:t>
-      </w:r>
-      <w:proofErr w:type="spellEnd"/>
-      <w:r>
-        <w:t xml:space="preserve"> or use the .</w:t>
-      </w:r>
-      <w:proofErr w:type="spellStart"/>
-      <w:r>
-        <w:t>mjs</w:t>
-      </w:r>
-      <w:proofErr w:type="spellEnd"/>
-      <w:r>
-        <w:t xml:space="preserve"> extension.</w:t>
+        <w:t>PS C:\Users\Dell\OneDrive\Desktop\React-with-Git&gt; node .\react-learning\src\components\module1.js</w:t>
+      </w:r>
+    </w:p>
+    <w:p>
+      <w:pPr>
+        <w:tabs>
+          <w:tab w:val="left" w:pos="3540"/>
+        </w:tabs>
+      </w:pPr>
+      <w:r>
+        <w:t>(node:10376) Warning: To load an ES module, set "type": "module" in the package.json or use the .mjs extension.</w:t>
       </w:r>
     </w:p>
     <w:p>
@@ -1985,138 +1679,48 @@
           <w:tab w:val="left" w:pos="3540"/>
         </w:tabs>
       </w:pPr>
-      <w:proofErr w:type="spellStart"/>
-      <w:r>
-        <w:t>SyntaxError</w:t>
-      </w:r>
-      <w:proofErr w:type="spellEnd"/>
-      <w:r>
-        <w:t>: Cannot use import statement outside a module</w:t>
-      </w:r>
-    </w:p>
-    <w:p>
-      <w:pPr>
-        <w:tabs>
-          <w:tab w:val="left" w:pos="3540"/>
-        </w:tabs>
-      </w:pPr>
-      <w:r>
-        <w:t xml:space="preserve">    at </w:t>
-      </w:r>
-      <w:proofErr w:type="spellStart"/>
-      <w:r>
-        <w:t>Object.compileFunction</w:t>
-      </w:r>
-      <w:proofErr w:type="spellEnd"/>
-      <w:r>
-        <w:t xml:space="preserve"> (node:vm:352:18)</w:t>
-      </w:r>
-    </w:p>
-    <w:p>
-      <w:pPr>
-        <w:tabs>
-          <w:tab w:val="left" w:pos="3540"/>
-        </w:tabs>
-      </w:pPr>
-      <w:r>
-        <w:t xml:space="preserve">    at </w:t>
-      </w:r>
-      <w:proofErr w:type="spellStart"/>
-      <w:r>
-        <w:t>wrapSafe</w:t>
-      </w:r>
-      <w:proofErr w:type="spellEnd"/>
-      <w:r>
-        <w:t xml:space="preserve"> (</w:t>
-      </w:r>
-      <w:proofErr w:type="spellStart"/>
-      <w:r>
-        <w:t>node:internal</w:t>
-      </w:r>
-      <w:proofErr w:type="spellEnd"/>
-      <w:r>
-        <w:t>/modules/</w:t>
-      </w:r>
-      <w:proofErr w:type="spellStart"/>
-      <w:r>
-        <w:t>cjs</w:t>
-      </w:r>
-      <w:proofErr w:type="spellEnd"/>
-      <w:r>
-        <w:t>/loader:1027:15)</w:t>
-      </w:r>
-    </w:p>
-    <w:p>
-      <w:pPr>
-        <w:tabs>
-          <w:tab w:val="left" w:pos="3540"/>
-        </w:tabs>
-      </w:pPr>
-      <w:r>
-        <w:t xml:space="preserve">    at </w:t>
-      </w:r>
-      <w:proofErr w:type="spellStart"/>
-      <w:r>
-        <w:t>Module._compile</w:t>
-      </w:r>
-      <w:proofErr w:type="spellEnd"/>
-      <w:r>
-        <w:t xml:space="preserve"> (</w:t>
-      </w:r>
-      <w:proofErr w:type="spellStart"/>
-      <w:r>
-        <w:t>node:internal</w:t>
-      </w:r>
-      <w:proofErr w:type="spellEnd"/>
-      <w:r>
-        <w:t>/modules/</w:t>
-      </w:r>
-      <w:proofErr w:type="spellStart"/>
-      <w:r>
-        <w:t>cjs</w:t>
-      </w:r>
-      <w:proofErr w:type="spellEnd"/>
-      <w:r>
-        <w:t>/loader:1063:27)</w:t>
-      </w:r>
-    </w:p>
-    <w:p>
-      <w:pPr>
-        <w:tabs>
-          <w:tab w:val="left" w:pos="3540"/>
-        </w:tabs>
-      </w:pPr>
-      <w:r>
-        <w:t xml:space="preserve">    at Object.Module._</w:t>
-      </w:r>
-      <w:proofErr w:type="gramStart"/>
-      <w:r>
-        <w:t>extensions..</w:t>
-      </w:r>
-      <w:proofErr w:type="spellStart"/>
-      <w:proofErr w:type="gramEnd"/>
-      <w:r>
-        <w:t>js</w:t>
-      </w:r>
-      <w:proofErr w:type="spellEnd"/>
-      <w:r>
-        <w:t xml:space="preserve"> (</w:t>
-      </w:r>
-      <w:proofErr w:type="spellStart"/>
-      <w:r>
-        <w:t>node:internal</w:t>
-      </w:r>
-      <w:proofErr w:type="spellEnd"/>
-      <w:r>
-        <w:t>/modules/</w:t>
-      </w:r>
-      <w:proofErr w:type="spellStart"/>
-      <w:r>
-        <w:t>cjs</w:t>
-      </w:r>
-      <w:proofErr w:type="spellEnd"/>
-      <w:r>
-        <w:t xml:space="preserve">/loader:1153:10)    </w:t>
+      <w:r>
+        <w:t>SyntaxError: Cannot use import statement outside a module</w:t>
+      </w:r>
+    </w:p>
+    <w:p>
+      <w:pPr>
+        <w:tabs>
+          <w:tab w:val="left" w:pos="3540"/>
+        </w:tabs>
+      </w:pPr>
+      <w:r>
+        <w:t xml:space="preserve">    at Object.compileFunction (node:vm:352:18)</w:t>
+      </w:r>
+    </w:p>
+    <w:p>
+      <w:pPr>
+        <w:tabs>
+          <w:tab w:val="left" w:pos="3540"/>
+        </w:tabs>
+      </w:pPr>
+      <w:r>
+        <w:t xml:space="preserve">    at wrapSafe (node:internal/modules/cjs/loader:1027:15)</w:t>
+      </w:r>
+    </w:p>
+    <w:p>
+      <w:pPr>
+        <w:tabs>
+          <w:tab w:val="left" w:pos="3540"/>
+        </w:tabs>
+      </w:pPr>
+      <w:r>
+        <w:t xml:space="preserve">    at Module._compile (node:internal/modules/cjs/loader:1063:27)</w:t>
+      </w:r>
+    </w:p>
+    <w:p>
+      <w:pPr>
+        <w:tabs>
+          <w:tab w:val="left" w:pos="3540"/>
+        </w:tabs>
+      </w:pPr>
+      <w:r>
+        <w:t xml:space="preserve">    at Object.Module._extensions..js (node:internal/modules/cjs/loader:1153:10)    </w:t>
       </w:r>
     </w:p>
     <w:p>
@@ -2127,99 +1731,27 @@
       </w:pPr>
       <w:r>
         <w:lastRenderedPageBreak/>
-        <w:t xml:space="preserve">    at </w:t>
-      </w:r>
-      <w:proofErr w:type="spellStart"/>
-      <w:r>
-        <w:t>Module.load</w:t>
-      </w:r>
-      <w:proofErr w:type="spellEnd"/>
-      <w:r>
-        <w:t xml:space="preserve"> (</w:t>
-      </w:r>
-      <w:proofErr w:type="spellStart"/>
-      <w:r>
-        <w:t>node:internal</w:t>
-      </w:r>
-      <w:proofErr w:type="spellEnd"/>
-      <w:r>
-        <w:t>/modules/</w:t>
-      </w:r>
-      <w:proofErr w:type="spellStart"/>
-      <w:r>
-        <w:t>cjs</w:t>
-      </w:r>
-      <w:proofErr w:type="spellEnd"/>
-      <w:r>
-        <w:t>/loader:975:32)</w:t>
-      </w:r>
-    </w:p>
-    <w:p>
-      <w:pPr>
-        <w:tabs>
-          <w:tab w:val="left" w:pos="3540"/>
-        </w:tabs>
-      </w:pPr>
-      <w:r>
-        <w:t xml:space="preserve">    at </w:t>
-      </w:r>
-      <w:proofErr w:type="spellStart"/>
-      <w:r>
-        <w:t>Function.Module._load</w:t>
-      </w:r>
-      <w:proofErr w:type="spellEnd"/>
-      <w:r>
-        <w:t xml:space="preserve"> (</w:t>
-      </w:r>
-      <w:proofErr w:type="spellStart"/>
-      <w:r>
-        <w:t>node:internal</w:t>
-      </w:r>
-      <w:proofErr w:type="spellEnd"/>
-      <w:r>
-        <w:t>/modules/</w:t>
-      </w:r>
-      <w:proofErr w:type="spellStart"/>
-      <w:r>
-        <w:t>cjs</w:t>
-      </w:r>
-      <w:proofErr w:type="spellEnd"/>
-      <w:r>
-        <w:t>/loader:822:12)</w:t>
-      </w:r>
-    </w:p>
-    <w:p>
-      <w:pPr>
-        <w:tabs>
-          <w:tab w:val="left" w:pos="3540"/>
-        </w:tabs>
-      </w:pPr>
-      <w:r>
-        <w:t xml:space="preserve">    at </w:t>
-      </w:r>
-      <w:proofErr w:type="spellStart"/>
-      <w:r>
-        <w:t>Function.executeUserEntryPoint</w:t>
-      </w:r>
-      <w:proofErr w:type="spellEnd"/>
-      <w:r>
-        <w:t xml:space="preserve"> [as </w:t>
-      </w:r>
-      <w:proofErr w:type="spellStart"/>
-      <w:r>
-        <w:t>runMain</w:t>
-      </w:r>
-      <w:proofErr w:type="spellEnd"/>
-      <w:r>
-        <w:t>] (</w:t>
-      </w:r>
-      <w:proofErr w:type="spellStart"/>
-      <w:r>
-        <w:t>node:internal</w:t>
-      </w:r>
-      <w:proofErr w:type="spellEnd"/>
-      <w:r>
-        <w:t>/modules/run_main:77:12)</w:t>
+        <w:t xml:space="preserve">    at Module.load (node:internal/modules/cjs/loader:975:32)</w:t>
+      </w:r>
+    </w:p>
+    <w:p>
+      <w:pPr>
+        <w:tabs>
+          <w:tab w:val="left" w:pos="3540"/>
+        </w:tabs>
+      </w:pPr>
+      <w:r>
+        <w:t xml:space="preserve">    at Function.Module._load (node:internal/modules/cjs/loader:822:12)</w:t>
+      </w:r>
+    </w:p>
+    <w:p>
+      <w:pPr>
+        <w:tabs>
+          <w:tab w:val="left" w:pos="3540"/>
+        </w:tabs>
+      </w:pPr>
+      <w:r>
+        <w:t xml:space="preserve">    at Function.executeUserEntryPoint [as runMain] (node:internal/modules/run_main:77:12)</w:t>
       </w:r>
     </w:p>
     <w:p>
@@ -2232,15 +1764,7 @@
         </w:tabs>
       </w:pPr>
       <w:r>
-        <w:t xml:space="preserve">    at </w:t>
-      </w:r>
-      <w:proofErr w:type="spellStart"/>
-      <w:r>
-        <w:t>node:internal</w:t>
-      </w:r>
-      <w:proofErr w:type="spellEnd"/>
-      <w:r>
-        <w:t>/main/run_main_module:17:47</w:t>
+        <w:t xml:space="preserve">    at node:internal/main/run_main_module:17:47</w:t>
       </w:r>
     </w:p>
     <w:p>
@@ -2259,35 +1783,18 @@
       <w:r>
         <w:t xml:space="preserve">To solve </w:t>
       </w:r>
-      <w:proofErr w:type="gramStart"/>
-      <w:r>
-        <w:t>this</w:t>
-      </w:r>
-      <w:proofErr w:type="gramEnd"/>
-      <w:r>
-        <w:t xml:space="preserve"> we use .</w:t>
-      </w:r>
-      <w:proofErr w:type="spellStart"/>
-      <w:r>
-        <w:t>mjs</w:t>
-      </w:r>
-      <w:proofErr w:type="spellEnd"/>
-      <w:r>
-        <w:t xml:space="preserve"> </w:t>
-      </w:r>
-      <w:proofErr w:type="spellStart"/>
-      <w:r>
-        <w:t>extention</w:t>
-      </w:r>
-      <w:proofErr w:type="spellEnd"/>
-      <w:r>
-        <w:t xml:space="preserve"> instead of .</w:t>
-      </w:r>
-      <w:proofErr w:type="spellStart"/>
-      <w:r>
-        <w:t>js</w:t>
-      </w:r>
-      <w:proofErr w:type="spellEnd"/>
+      <w:r>
+        <w:t>this,</w:t>
+      </w:r>
+      <w:r>
+        <w:t xml:space="preserve"> we use .mjs </w:t>
+      </w:r>
+      <w:r>
+        <w:t>extension</w:t>
+      </w:r>
+      <w:r>
+        <w:t xml:space="preserve"> instead of .js</w:t>
+      </w:r>
     </w:p>
     <w:p>
       <w:pPr>
@@ -2305,19 +1812,15 @@
       <w:r>
         <w:t xml:space="preserve">Note that we can not have multiple defaults for </w:t>
       </w:r>
-      <w:proofErr w:type="spellStart"/>
-      <w:r>
-        <w:t>expoer</w:t>
-      </w:r>
-      <w:proofErr w:type="spellEnd"/>
+      <w:r>
+        <w:t>export</w:t>
+      </w:r>
       <w:r>
         <w:t xml:space="preserve"> </w:t>
       </w:r>
-      <w:proofErr w:type="spellStart"/>
-      <w:r>
-        <w:t>satatement</w:t>
-      </w:r>
-      <w:proofErr w:type="spellEnd"/>
+      <w:r>
+        <w:t>statements</w:t>
+      </w:r>
       <w:r>
         <w:t>.</w:t>
       </w:r>
@@ -2334,7 +1837,6 @@
         </w:rPr>
         <w:t xml:space="preserve">One more thing to be noted is props are Read only, we </w:t>
       </w:r>
-      <w:proofErr w:type="spellStart"/>
       <w:r>
         <w:rPr>
           <w:b/>
@@ -2343,9 +1845,8 @@
           <w:szCs w:val="32"/>
           <w:u w:val="single"/>
         </w:rPr>
-        <w:t>can not</w:t>
-      </w:r>
-      <w:proofErr w:type="spellEnd"/>
+        <w:t>cannot</w:t>
+      </w:r>
       <w:r>
         <w:rPr>
           <w:b/>
@@ -2392,7 +1893,6 @@
           <w:szCs w:val="21"/>
         </w:rPr>
       </w:pPr>
-      <w:proofErr w:type="spellStart"/>
       <w:r>
         <w:rPr>
           <w:rFonts w:ascii="Consolas" w:eastAsia="Times New Roman" w:hAnsi="Consolas" w:cs="Times New Roman"/>
@@ -2400,17 +1900,37 @@
           <w:sz w:val="21"/>
           <w:szCs w:val="21"/>
         </w:rPr>
-        <w:t>Navbar.defaultProps</w:t>
-      </w:r>
-      <w:proofErr w:type="spellEnd"/>
-      <w:r>
+        <w:t>Navbar.defaultProps = {</w:t>
+      </w:r>
+    </w:p>
+    <w:p>
+      <w:pPr>
+        <w:shd w:val="clear" w:color="auto" w:fill="1E1E1E"/>
+        <w:spacing w:after="0" w:line="285" w:lineRule="atLeast"/>
         <w:rPr>
           <w:rFonts w:ascii="Consolas" w:eastAsia="Times New Roman" w:hAnsi="Consolas" w:cs="Times New Roman"/>
           <w:color w:val="D4D4D4"/>
           <w:sz w:val="21"/>
           <w:szCs w:val="21"/>
         </w:rPr>
-        <w:t xml:space="preserve"> = {</w:t>
+      </w:pPr>
+      <w:r>
+        <w:rPr>
+          <w:rFonts w:ascii="Consolas" w:eastAsia="Times New Roman" w:hAnsi="Consolas" w:cs="Times New Roman"/>
+          <w:color w:val="D4D4D4"/>
+          <w:sz w:val="21"/>
+          <w:szCs w:val="21"/>
+        </w:rPr>
+        <w:t xml:space="preserve">    title: </w:t>
+      </w:r>
+      <w:r>
+        <w:rPr>
+          <w:rFonts w:ascii="Consolas" w:eastAsia="Times New Roman" w:hAnsi="Consolas" w:cs="Times New Roman"/>
+          <w:color w:val="CE9178"/>
+          <w:sz w:val="21"/>
+          <w:szCs w:val="21"/>
+        </w:rPr>
+        <w:t>"I am Good Title"</w:t>
       </w:r>
     </w:p>
     <w:p>
@@ -2431,36 +1951,6 @@
           <w:sz w:val="21"/>
           <w:szCs w:val="21"/>
         </w:rPr>
-        <w:t xml:space="preserve">    title: </w:t>
-      </w:r>
-      <w:r>
-        <w:rPr>
-          <w:rFonts w:ascii="Consolas" w:eastAsia="Times New Roman" w:hAnsi="Consolas" w:cs="Times New Roman"/>
-          <w:color w:val="CE9178"/>
-          <w:sz w:val="21"/>
-          <w:szCs w:val="21"/>
-        </w:rPr>
-        <w:t>"I am Good Title"</w:t>
-      </w:r>
-    </w:p>
-    <w:p>
-      <w:pPr>
-        <w:shd w:val="clear" w:color="auto" w:fill="1E1E1E"/>
-        <w:spacing w:after="0" w:line="285" w:lineRule="atLeast"/>
-        <w:rPr>
-          <w:rFonts w:ascii="Consolas" w:eastAsia="Times New Roman" w:hAnsi="Consolas" w:cs="Times New Roman"/>
-          <w:color w:val="D4D4D4"/>
-          <w:sz w:val="21"/>
-          <w:szCs w:val="21"/>
-        </w:rPr>
-      </w:pPr>
-      <w:r>
-        <w:rPr>
-          <w:rFonts w:ascii="Consolas" w:eastAsia="Times New Roman" w:hAnsi="Consolas" w:cs="Times New Roman"/>
-          <w:color w:val="D4D4D4"/>
-          <w:sz w:val="21"/>
-          <w:szCs w:val="21"/>
-        </w:rPr>
         <w:t>}</w:t>
       </w:r>
     </w:p>
@@ -2470,6 +1960,148 @@
           <w:tab w:val="left" w:pos="3540"/>
         </w:tabs>
       </w:pPr>
+    </w:p>
+    <w:p>
+      <w:pPr>
+        <w:tabs>
+          <w:tab w:val="left" w:pos="3540"/>
+        </w:tabs>
+        <w:rPr>
+          <w:b/>
+          <w:bCs/>
+          <w:sz w:val="40"/>
+          <w:szCs w:val="40"/>
+        </w:rPr>
+      </w:pPr>
+      <w:r>
+        <w:rPr>
+          <w:b/>
+          <w:bCs/>
+          <w:sz w:val="40"/>
+          <w:szCs w:val="40"/>
+        </w:rPr>
+        <w:t>React Hooks</w:t>
+      </w:r>
+      <w:r>
+        <w:rPr>
+          <w:b/>
+          <w:bCs/>
+          <w:sz w:val="40"/>
+          <w:szCs w:val="40"/>
+        </w:rPr>
+        <w:t xml:space="preserve">: React Hooks are that something that let us use the react class </w:t>
+      </w:r>
+      <w:r>
+        <w:rPr>
+          <w:b/>
+          <w:bCs/>
+          <w:sz w:val="40"/>
+          <w:szCs w:val="40"/>
+        </w:rPr>
+        <w:t>component-based</w:t>
+      </w:r>
+      <w:r>
+        <w:rPr>
+          <w:b/>
+          <w:bCs/>
+          <w:sz w:val="40"/>
+          <w:szCs w:val="40"/>
+        </w:rPr>
+        <w:t xml:space="preserve"> features in </w:t>
+      </w:r>
+      <w:r>
+        <w:rPr>
+          <w:b/>
+          <w:bCs/>
+          <w:sz w:val="40"/>
+          <w:szCs w:val="40"/>
+        </w:rPr>
+        <w:t>function-based</w:t>
+      </w:r>
+      <w:r>
+        <w:rPr>
+          <w:b/>
+          <w:bCs/>
+          <w:sz w:val="40"/>
+          <w:szCs w:val="40"/>
+        </w:rPr>
+        <w:t xml:space="preserve"> components.</w:t>
+      </w:r>
+    </w:p>
+    <w:p>
+      <w:pPr>
+        <w:tabs>
+          <w:tab w:val="left" w:pos="3540"/>
+        </w:tabs>
+        <w:rPr>
+          <w:sz w:val="28"/>
+          <w:szCs w:val="28"/>
+        </w:rPr>
+      </w:pPr>
+      <w:r>
+        <w:rPr>
+          <w:b/>
+          <w:bCs/>
+          <w:sz w:val="28"/>
+          <w:szCs w:val="28"/>
+        </w:rPr>
+        <w:t xml:space="preserve">State: </w:t>
+      </w:r>
+      <w:r>
+        <w:rPr>
+          <w:sz w:val="28"/>
+          <w:szCs w:val="28"/>
+        </w:rPr>
+        <w:t xml:space="preserve">this is </w:t>
+      </w:r>
+      <w:r>
+        <w:rPr>
+          <w:sz w:val="28"/>
+          <w:szCs w:val="28"/>
+        </w:rPr>
+        <w:t>class-based</w:t>
+      </w:r>
+      <w:r>
+        <w:rPr>
+          <w:sz w:val="28"/>
+          <w:szCs w:val="28"/>
+        </w:rPr>
+        <w:t xml:space="preserve"> feature, to use this in </w:t>
+      </w:r>
+      <w:r>
+        <w:rPr>
+          <w:sz w:val="28"/>
+          <w:szCs w:val="28"/>
+        </w:rPr>
+        <w:t>function-based</w:t>
+      </w:r>
+      <w:r>
+        <w:rPr>
+          <w:sz w:val="28"/>
+          <w:szCs w:val="28"/>
+        </w:rPr>
+        <w:t xml:space="preserve"> component we need hook which is useState.</w:t>
+      </w:r>
+    </w:p>
+    <w:p>
+      <w:pPr>
+        <w:tabs>
+          <w:tab w:val="left" w:pos="3540"/>
+        </w:tabs>
+        <w:rPr>
+          <w:sz w:val="28"/>
+          <w:szCs w:val="28"/>
+        </w:rPr>
+      </w:pPr>
+      <w:r>
+        <w:rPr>
+          <w:rFonts w:ascii="Segoe UI" w:hAnsi="Segoe UI" w:cs="Segoe UI"/>
+          <w:color w:val="000000"/>
+          <w:sz w:val="26"/>
+          <w:szCs w:val="26"/>
+        </w:rPr>
+        <w:t>Normally, variables “disappear” when the function exits but state variables are preserved by React.</w:t>
+      </w:r>
     </w:p>
     <w:sectPr>
       <w:pgSz w:w="12240" w:h="15840"/>

</xml_diff>

<commit_message>
Change the text of textarea into UpperCase, Learning State and Handling Event plus Hooks.
</commit_message>
<xml_diff>
--- a/Code With Harry Tutorials.docx
+++ b/Code With Harry Tutorials.docx
@@ -1215,7 +1215,21 @@
           <w:sz w:val="28"/>
           <w:szCs w:val="28"/>
         </w:rPr>
-        <w:t>Tutorial 6: Understanding Props and PropTypes</w:t>
+        <w:t xml:space="preserve">Tutorial </w:t>
+      </w:r>
+      <w:r>
+        <w:rPr>
+          <w:sz w:val="28"/>
+          <w:szCs w:val="28"/>
+        </w:rPr>
+        <w:t>7</w:t>
+      </w:r>
+      <w:r>
+        <w:rPr>
+          <w:sz w:val="28"/>
+          <w:szCs w:val="28"/>
+        </w:rPr>
+        <w:t>: Understanding Props and PropTypes</w:t>
       </w:r>
     </w:p>
     <w:p>
@@ -2089,18 +2103,106 @@
           <w:tab w:val="left" w:pos="3540"/>
         </w:tabs>
         <w:rPr>
-          <w:sz w:val="28"/>
-          <w:szCs w:val="28"/>
-        </w:rPr>
-      </w:pPr>
-      <w:r>
-        <w:rPr>
           <w:rFonts w:ascii="Segoe UI" w:hAnsi="Segoe UI" w:cs="Segoe UI"/>
           <w:color w:val="000000"/>
           <w:sz w:val="26"/>
           <w:szCs w:val="26"/>
         </w:rPr>
+      </w:pPr>
+      <w:r>
+        <w:rPr>
+          <w:rFonts w:ascii="Segoe UI" w:hAnsi="Segoe UI" w:cs="Segoe UI"/>
+          <w:color w:val="000000"/>
+          <w:sz w:val="26"/>
+          <w:szCs w:val="26"/>
+        </w:rPr>
         <w:t>Normally, variables “disappear” when the function exits but state variables are preserved by React.</w:t>
+      </w:r>
+    </w:p>
+    <w:p>
+      <w:pPr>
+        <w:tabs>
+          <w:tab w:val="left" w:pos="3540"/>
+        </w:tabs>
+        <w:rPr>
+          <w:rFonts w:ascii="Segoe UI" w:hAnsi="Segoe UI" w:cs="Segoe UI"/>
+          <w:color w:val="000000"/>
+          <w:sz w:val="26"/>
+          <w:szCs w:val="26"/>
+        </w:rPr>
+      </w:pPr>
+      <w:r>
+        <w:rPr>
+          <w:rFonts w:ascii="Segoe UI" w:hAnsi="Segoe UI" w:cs="Segoe UI"/>
+          <w:color w:val="000000"/>
+          <w:sz w:val="26"/>
+          <w:szCs w:val="26"/>
+        </w:rPr>
+        <w:t>You will note that if you add onclick event on button and changing the text value that is contained inside textarea that will theow an error in console that you should add onchange event in textarea.</w:t>
+      </w:r>
+    </w:p>
+    <w:p>
+      <w:pPr>
+        <w:tabs>
+          <w:tab w:val="left" w:pos="3540"/>
+        </w:tabs>
+        <w:rPr>
+          <w:rFonts w:ascii="Segoe UI" w:hAnsi="Segoe UI" w:cs="Segoe UI"/>
+          <w:color w:val="000000"/>
+          <w:sz w:val="26"/>
+          <w:szCs w:val="26"/>
+        </w:rPr>
+      </w:pPr>
+      <w:r>
+        <w:rPr>
+          <w:rFonts w:ascii="Segoe UI" w:hAnsi="Segoe UI" w:cs="Segoe UI"/>
+          <w:color w:val="000000"/>
+          <w:sz w:val="26"/>
+          <w:szCs w:val="26"/>
+        </w:rPr>
+        <w:t>State is One type of variable that can be changed using setvar like of.</w:t>
+      </w:r>
+    </w:p>
+    <w:p>
+      <w:pPr>
+        <w:tabs>
+          <w:tab w:val="left" w:pos="3540"/>
+        </w:tabs>
+        <w:rPr>
+          <w:rFonts w:ascii="Segoe UI" w:hAnsi="Segoe UI" w:cs="Segoe UI"/>
+          <w:color w:val="000000"/>
+          <w:sz w:val="26"/>
+          <w:szCs w:val="26"/>
+        </w:rPr>
+      </w:pPr>
+    </w:p>
+    <w:p>
+      <w:pPr>
+        <w:tabs>
+          <w:tab w:val="left" w:pos="3540"/>
+        </w:tabs>
+        <w:rPr>
+          <w:sz w:val="28"/>
+          <w:szCs w:val="28"/>
+        </w:rPr>
+      </w:pPr>
+      <w:r>
+        <w:rPr>
+          <w:rFonts w:ascii="Segoe UI" w:hAnsi="Segoe UI" w:cs="Segoe UI"/>
+          <w:color w:val="000000"/>
+          <w:sz w:val="26"/>
+          <w:szCs w:val="26"/>
+        </w:rPr>
+        <w:t>Handling Event.</w:t>
+      </w:r>
+      <w:r>
+        <w:rPr>
+          <w:rFonts w:ascii="Segoe UI" w:hAnsi="Segoe UI" w:cs="Segoe UI"/>
+          <w:color w:val="000000"/>
+          <w:sz w:val="26"/>
+          <w:szCs w:val="26"/>
+        </w:rPr>
+        <w:t xml:space="preserve"> We can watch the commit online.</w:t>
       </w:r>
     </w:p>
     <w:sectPr>

</xml_diff>

<commit_message>
i have added lowecase, preview , word and characters counters also i this Textutils app
</commit_message>
<xml_diff>
--- a/Code With Harry Tutorials.docx
+++ b/Code With Harry Tutorials.docx
@@ -2182,19 +2182,12 @@
           <w:tab w:val="left" w:pos="3540"/>
         </w:tabs>
         <w:rPr>
-          <w:sz w:val="28"/>
-          <w:szCs w:val="28"/>
-        </w:rPr>
-      </w:pPr>
-      <w:r>
-        <w:rPr>
           <w:rFonts w:ascii="Segoe UI" w:hAnsi="Segoe UI" w:cs="Segoe UI"/>
           <w:color w:val="000000"/>
           <w:sz w:val="26"/>
           <w:szCs w:val="26"/>
         </w:rPr>
-        <w:t>Handling Event.</w:t>
-      </w:r>
+      </w:pPr>
       <w:r>
         <w:rPr>
           <w:rFonts w:ascii="Segoe UI" w:hAnsi="Segoe UI" w:cs="Segoe UI"/>
@@ -2202,7 +2195,59 @@
           <w:sz w:val="26"/>
           <w:szCs w:val="26"/>
         </w:rPr>
+        <w:t>Handling Event.</w:t>
+      </w:r>
+      <w:r>
+        <w:rPr>
+          <w:rFonts w:ascii="Segoe UI" w:hAnsi="Segoe UI" w:cs="Segoe UI"/>
+          <w:color w:val="000000"/>
+          <w:sz w:val="26"/>
+          <w:szCs w:val="26"/>
+        </w:rPr>
         <w:t xml:space="preserve"> We can watch the commit online.</w:t>
+      </w:r>
+    </w:p>
+    <w:p>
+      <w:pPr>
+        <w:tabs>
+          <w:tab w:val="left" w:pos="3540"/>
+        </w:tabs>
+        <w:rPr>
+          <w:rFonts w:ascii="Segoe UI" w:hAnsi="Segoe UI" w:cs="Segoe UI"/>
+          <w:color w:val="000000"/>
+          <w:sz w:val="26"/>
+          <w:szCs w:val="26"/>
+        </w:rPr>
+      </w:pPr>
+      <w:r>
+        <w:rPr>
+          <w:rFonts w:ascii="Segoe UI" w:hAnsi="Segoe UI" w:cs="Segoe UI"/>
+          <w:color w:val="000000"/>
+          <w:sz w:val="26"/>
+          <w:szCs w:val="26"/>
+        </w:rPr>
+        <w:lastRenderedPageBreak/>
+        <w:t>Noted Point: I have noted that in react also if button type is submit then the page will surly realoded. If you want that your page should not reload then remove type=”submit” form the button tag.</w:t>
+      </w:r>
+    </w:p>
+    <w:p>
+      <w:pPr>
+        <w:tabs>
+          <w:tab w:val="left" w:pos="3540"/>
+        </w:tabs>
+        <w:rPr>
+          <w:sz w:val="28"/>
+          <w:szCs w:val="28"/>
+        </w:rPr>
+      </w:pPr>
+      <w:r>
+        <w:rPr>
+          <w:rFonts w:ascii="Segoe UI" w:hAnsi="Segoe UI" w:cs="Segoe UI"/>
+          <w:color w:val="000000"/>
+          <w:sz w:val="26"/>
+          <w:szCs w:val="26"/>
+        </w:rPr>
+        <w:t>I have learned to make the text area writable. If we are using the value form another variable.</w:t>
       </w:r>
     </w:p>
     <w:sectPr>

</xml_diff>

<commit_message>
Adding about section as well as beautiful Dark mode in Home Opetion.
</commit_message>
<xml_diff>
--- a/Code With Harry Tutorials.docx
+++ b/Code With Harry Tutorials.docx
@@ -36,21 +36,12 @@
           <w:szCs w:val="28"/>
         </w:rPr>
       </w:pPr>
-      <w:proofErr w:type="spellStart"/>
-      <w:r>
-        <w:rPr>
-          <w:sz w:val="28"/>
-          <w:szCs w:val="28"/>
-        </w:rPr>
-        <w:t>npx</w:t>
-      </w:r>
-      <w:proofErr w:type="spellEnd"/>
-      <w:r>
-        <w:rPr>
-          <w:sz w:val="28"/>
-          <w:szCs w:val="28"/>
-        </w:rPr>
-        <w:t xml:space="preserve"> create-react-app app-name</w:t>
+      <w:r>
+        <w:rPr>
+          <w:sz w:val="28"/>
+          <w:szCs w:val="28"/>
+        </w:rPr>
+        <w:t>npx create-react-app app-name</w:t>
       </w:r>
     </w:p>
     <w:p>
@@ -70,23 +61,7 @@
           <w:sz w:val="28"/>
           <w:szCs w:val="28"/>
         </w:rPr>
-        <w:t xml:space="preserve">Play with Files in of </w:t>
-      </w:r>
-      <w:proofErr w:type="spellStart"/>
-      <w:r>
-        <w:rPr>
-          <w:sz w:val="28"/>
-          <w:szCs w:val="28"/>
-        </w:rPr>
-        <w:t>src</w:t>
-      </w:r>
-      <w:proofErr w:type="spellEnd"/>
-      <w:r>
-        <w:rPr>
-          <w:sz w:val="28"/>
-          <w:szCs w:val="28"/>
-        </w:rPr>
-        <w:t xml:space="preserve"> and public Folder, to get handy.</w:t>
+        <w:t>Play with Files in of src and public Folder, to get handy.</w:t>
       </w:r>
     </w:p>
     <w:p>
@@ -106,23 +81,7 @@
           <w:sz w:val="28"/>
           <w:szCs w:val="28"/>
         </w:rPr>
-        <w:t xml:space="preserve">In </w:t>
-      </w:r>
-      <w:proofErr w:type="spellStart"/>
-      <w:r>
-        <w:rPr>
-          <w:sz w:val="28"/>
-          <w:szCs w:val="28"/>
-        </w:rPr>
-        <w:t>src</w:t>
-      </w:r>
-      <w:proofErr w:type="spellEnd"/>
-      <w:r>
-        <w:rPr>
-          <w:sz w:val="28"/>
-          <w:szCs w:val="28"/>
-        </w:rPr>
-        <w:t xml:space="preserve"> folder index.js is entry point and you can note &lt;App /&gt; there. In the </w:t>
+        <w:t xml:space="preserve">In src folder index.js is entry point and you can note &lt;App /&gt; there. In the </w:t>
       </w:r>
       <w:r>
         <w:rPr>
@@ -621,23 +580,7 @@
           <w:sz w:val="28"/>
           <w:szCs w:val="28"/>
         </w:rPr>
-        <w:t>&lt;div&gt;</w:t>
-      </w:r>
-      <w:proofErr w:type="spellStart"/>
-      <w:r>
-        <w:rPr>
-          <w:sz w:val="28"/>
-          <w:szCs w:val="28"/>
-        </w:rPr>
-        <w:t>aaa</w:t>
-      </w:r>
-      <w:proofErr w:type="spellEnd"/>
-      <w:r>
-        <w:rPr>
-          <w:sz w:val="28"/>
-          <w:szCs w:val="28"/>
-        </w:rPr>
-        <w:t>&lt;/div&gt;</w:t>
+        <w:t>&lt;div&gt;aaa&lt;/div&gt;</w:t>
       </w:r>
     </w:p>
     <w:p>
@@ -718,23 +661,7 @@
           <w:sz w:val="28"/>
           <w:szCs w:val="28"/>
         </w:rPr>
-        <w:t>&lt;div&gt;</w:t>
-      </w:r>
-      <w:proofErr w:type="spellStart"/>
-      <w:r>
-        <w:rPr>
-          <w:sz w:val="28"/>
-          <w:szCs w:val="28"/>
-        </w:rPr>
-        <w:t>aaa</w:t>
-      </w:r>
-      <w:proofErr w:type="spellEnd"/>
-      <w:r>
-        <w:rPr>
-          <w:sz w:val="28"/>
-          <w:szCs w:val="28"/>
-        </w:rPr>
-        <w:t>&lt;/div&gt;</w:t>
+        <w:t>&lt;div&gt;aaa&lt;/div&gt;</w:t>
       </w:r>
     </w:p>
     <w:p>
@@ -781,21 +708,12 @@
           <w:szCs w:val="28"/>
         </w:rPr>
       </w:pPr>
-      <w:proofErr w:type="spellStart"/>
-      <w:r>
-        <w:rPr>
-          <w:sz w:val="28"/>
-          <w:szCs w:val="28"/>
-        </w:rPr>
-        <w:t>className</w:t>
-      </w:r>
-      <w:proofErr w:type="spellEnd"/>
-      <w:r>
-        <w:rPr>
-          <w:sz w:val="28"/>
-          <w:szCs w:val="28"/>
-        </w:rPr>
-        <w:t xml:space="preserve"> instead of class</w:t>
+      <w:r>
+        <w:rPr>
+          <w:sz w:val="28"/>
+          <w:szCs w:val="28"/>
+        </w:rPr>
+        <w:t>className instead of class</w:t>
       </w:r>
     </w:p>
     <w:p>
@@ -810,21 +728,12 @@
           <w:szCs w:val="28"/>
         </w:rPr>
       </w:pPr>
-      <w:proofErr w:type="spellStart"/>
-      <w:r>
-        <w:rPr>
-          <w:sz w:val="28"/>
-          <w:szCs w:val="28"/>
-        </w:rPr>
-        <w:t>htmlFor</w:t>
-      </w:r>
-      <w:proofErr w:type="spellEnd"/>
-      <w:r>
-        <w:rPr>
-          <w:sz w:val="28"/>
-          <w:szCs w:val="28"/>
-        </w:rPr>
-        <w:t xml:space="preserve"> instead of for</w:t>
+      <w:r>
+        <w:rPr>
+          <w:sz w:val="28"/>
+          <w:szCs w:val="28"/>
+        </w:rPr>
+        <w:t>htmlFor instead of for</w:t>
       </w:r>
     </w:p>
     <w:p>
@@ -839,7 +748,6 @@
           <w:szCs w:val="28"/>
         </w:rPr>
       </w:pPr>
-      <w:proofErr w:type="spellStart"/>
       <w:r>
         <w:rPr>
           <w:sz w:val="28"/>
@@ -847,7 +755,6 @@
         </w:rPr>
         <w:t>tabIndex</w:t>
       </w:r>
-      <w:proofErr w:type="spellEnd"/>
     </w:p>
     <w:p>
       <w:pPr>
@@ -1218,23 +1125,7 @@
           <w:sz w:val="28"/>
           <w:szCs w:val="28"/>
         </w:rPr>
-        <w:t xml:space="preserve">Tutorial 5: // Adding Bootstrap and </w:t>
-      </w:r>
-      <w:proofErr w:type="spellStart"/>
-      <w:r>
-        <w:rPr>
-          <w:sz w:val="28"/>
-          <w:szCs w:val="28"/>
-        </w:rPr>
-        <w:t>Textutils</w:t>
-      </w:r>
-      <w:proofErr w:type="spellEnd"/>
-      <w:r>
-        <w:rPr>
-          <w:sz w:val="28"/>
-          <w:szCs w:val="28"/>
-        </w:rPr>
-        <w:t xml:space="preserve"> project</w:t>
+        <w:t>Tutorial 5: // Adding Bootstrap and Textutils project</w:t>
       </w:r>
     </w:p>
     <w:p>
@@ -1246,15 +1137,7 @@
         <w:t xml:space="preserve">Note: </w:t>
       </w:r>
       <w:r>
-        <w:t xml:space="preserve">there is node modules folder that contains all the packages and libraries we need. We can delete it because we already have that all details in </w:t>
-      </w:r>
-      <w:proofErr w:type="spellStart"/>
-      <w:r>
-        <w:t>package.json</w:t>
-      </w:r>
-      <w:proofErr w:type="spellEnd"/>
-      <w:r>
-        <w:t xml:space="preserve"> …    we can install all the dependency using following command</w:t>
+        <w:t>there is node modules folder that contains all the packages and libraries we need. We can delete it because we already have that all details in package.json …    we can install all the dependency using following command</w:t>
       </w:r>
     </w:p>
     <w:p>
@@ -1265,33 +1148,15 @@
           <w:numId w:val="1"/>
         </w:numPr>
       </w:pPr>
-      <w:proofErr w:type="spellStart"/>
-      <w:r>
-        <w:t>npm</w:t>
-      </w:r>
-      <w:proofErr w:type="spellEnd"/>
-      <w:r>
-        <w:t xml:space="preserve"> </w:t>
+      <w:r>
+        <w:t xml:space="preserve">npm </w:t>
       </w:r>
       <w:r>
         <w:t>install</w:t>
       </w:r>
       <w:r>
-        <w:t xml:space="preserve"> / </w:t>
-      </w:r>
-      <w:proofErr w:type="spellStart"/>
-      <w:r>
-        <w:t>npm</w:t>
-      </w:r>
-      <w:proofErr w:type="spellEnd"/>
-      <w:r>
-        <w:t xml:space="preserve"> </w:t>
-      </w:r>
-      <w:proofErr w:type="spellStart"/>
-      <w:r>
-        <w:t>i</w:t>
-      </w:r>
-      <w:proofErr w:type="spellEnd"/>
+        <w:t xml:space="preserve"> / npm i</w:t>
+      </w:r>
     </w:p>
     <w:p>
       <w:r>
@@ -1315,25 +1180,7 @@
           <w:szCs w:val="28"/>
           <w:u w:val="single"/>
         </w:rPr>
-        <w:t xml:space="preserve">Creating </w:t>
-      </w:r>
-      <w:proofErr w:type="spellStart"/>
-      <w:r>
-        <w:rPr>
-          <w:sz w:val="28"/>
-          <w:szCs w:val="28"/>
-          <w:u w:val="single"/>
-        </w:rPr>
-        <w:t>Textutils</w:t>
-      </w:r>
-      <w:proofErr w:type="spellEnd"/>
-      <w:r>
-        <w:rPr>
-          <w:sz w:val="28"/>
-          <w:szCs w:val="28"/>
-          <w:u w:val="single"/>
-        </w:rPr>
-        <w:t xml:space="preserve"> project</w:t>
+        <w:t>Creating Textutils project</w:t>
       </w:r>
       <w:r>
         <w:t>.</w:t>
@@ -1382,17 +1229,8 @@
           <w:sz w:val="28"/>
           <w:szCs w:val="28"/>
         </w:rPr>
-        <w:t xml:space="preserve">: Understanding Props and </w:t>
-      </w:r>
-      <w:proofErr w:type="spellStart"/>
-      <w:r>
-        <w:rPr>
-          <w:sz w:val="28"/>
-          <w:szCs w:val="28"/>
-        </w:rPr>
-        <w:t>PropTypes</w:t>
-      </w:r>
-      <w:proofErr w:type="spellEnd"/>
+        <w:t>: Understanding Props and PropTypes</w:t>
+      </w:r>
     </w:p>
     <w:p>
       <w:pPr>
@@ -1455,15 +1293,7 @@
         <w:t>,</w:t>
       </w:r>
       <w:r>
-        <w:t xml:space="preserve">we can add ‘m’ before </w:t>
-      </w:r>
-      <w:proofErr w:type="spellStart"/>
-      <w:r>
-        <w:t>js</w:t>
-      </w:r>
-      <w:proofErr w:type="spellEnd"/>
-      <w:r>
-        <w:t xml:space="preserve"> </w:t>
+        <w:t xml:space="preserve">we can add ‘m’ before js </w:t>
       </w:r>
       <w:r>
         <w:t>extension</w:t>
@@ -1489,15 +1319,7 @@
         </w:tabs>
       </w:pPr>
       <w:r>
-        <w:t xml:space="preserve">We can create component in another folder inside </w:t>
-      </w:r>
-      <w:proofErr w:type="spellStart"/>
-      <w:r>
-        <w:t>src</w:t>
-      </w:r>
-      <w:proofErr w:type="spellEnd"/>
-      <w:r>
-        <w:t xml:space="preserve"> folder and use them in our Apps.js</w:t>
+        <w:t>We can create component in another folder inside src folder and use them in our Apps.js</w:t>
       </w:r>
     </w:p>
     <w:p>
@@ -1585,9 +1407,94 @@
           <w:sz w:val="21"/>
           <w:szCs w:val="21"/>
         </w:rPr>
-        <w:t>"</w:t>
-      </w:r>
-      <w:proofErr w:type="spellStart"/>
+        <w:t>"TextUtils"</w:t>
+      </w:r>
+      <w:r>
+        <w:rPr>
+          <w:rFonts w:ascii="Consolas" w:eastAsia="Times New Roman" w:hAnsi="Consolas" w:cs="Times New Roman"/>
+          <w:color w:val="D4D4D4"/>
+          <w:sz w:val="21"/>
+          <w:szCs w:val="21"/>
+        </w:rPr>
+        <w:t xml:space="preserve"> </w:t>
+      </w:r>
+      <w:r>
+        <w:rPr>
+          <w:rFonts w:ascii="Consolas" w:eastAsia="Times New Roman" w:hAnsi="Consolas" w:cs="Times New Roman"/>
+          <w:color w:val="808080"/>
+          <w:sz w:val="21"/>
+          <w:szCs w:val="21"/>
+        </w:rPr>
+        <w:t>/&gt;</w:t>
+      </w:r>
+    </w:p>
+    <w:p>
+      <w:pPr>
+        <w:tabs>
+          <w:tab w:val="left" w:pos="3540"/>
+        </w:tabs>
+      </w:pPr>
+      <w:r>
+        <w:t>Here title is argument pass in props. We can use if by {props.title}</w:t>
+      </w:r>
+    </w:p>
+    <w:p>
+      <w:pPr>
+        <w:tabs>
+          <w:tab w:val="left" w:pos="3540"/>
+        </w:tabs>
+      </w:pPr>
+      <w:r>
+        <w:t>We can make proptype fix and also make it require by importing and using props-type.</w:t>
+      </w:r>
+    </w:p>
+    <w:p>
+      <w:pPr>
+        <w:shd w:val="clear" w:color="auto" w:fill="1E1E1E"/>
+        <w:spacing w:after="0" w:line="285" w:lineRule="atLeast"/>
+        <w:rPr>
+          <w:rFonts w:ascii="Consolas" w:eastAsia="Times New Roman" w:hAnsi="Consolas" w:cs="Times New Roman"/>
+          <w:color w:val="D4D4D4"/>
+          <w:sz w:val="21"/>
+          <w:szCs w:val="21"/>
+        </w:rPr>
+      </w:pPr>
+      <w:r>
+        <w:rPr>
+          <w:rFonts w:ascii="Consolas" w:eastAsia="Times New Roman" w:hAnsi="Consolas" w:cs="Times New Roman"/>
+          <w:color w:val="569CD6"/>
+          <w:sz w:val="21"/>
+          <w:szCs w:val="21"/>
+        </w:rPr>
+        <w:t>import</w:t>
+      </w:r>
+      <w:r>
+        <w:rPr>
+          <w:rFonts w:ascii="Consolas" w:eastAsia="Times New Roman" w:hAnsi="Consolas" w:cs="Times New Roman"/>
+          <w:color w:val="D4D4D4"/>
+          <w:sz w:val="21"/>
+          <w:szCs w:val="21"/>
+        </w:rPr>
+        <w:t xml:space="preserve"> PropTypes </w:t>
+      </w:r>
+      <w:r>
+        <w:rPr>
+          <w:rFonts w:ascii="Consolas" w:eastAsia="Times New Roman" w:hAnsi="Consolas" w:cs="Times New Roman"/>
+          <w:color w:val="569CD6"/>
+          <w:sz w:val="21"/>
+          <w:szCs w:val="21"/>
+        </w:rPr>
+        <w:t>from</w:t>
+      </w:r>
+      <w:r>
+        <w:rPr>
+          <w:rFonts w:ascii="Consolas" w:eastAsia="Times New Roman" w:hAnsi="Consolas" w:cs="Times New Roman"/>
+          <w:color w:val="D4D4D4"/>
+          <w:sz w:val="21"/>
+          <w:szCs w:val="21"/>
+        </w:rPr>
+        <w:t xml:space="preserve"> </w:t>
+      </w:r>
       <w:r>
         <w:rPr>
           <w:rFonts w:ascii="Consolas" w:eastAsia="Times New Roman" w:hAnsi="Consolas" w:cs="Times New Roman"/>
@@ -1595,17 +1502,7 @@
           <w:sz w:val="21"/>
           <w:szCs w:val="21"/>
         </w:rPr>
-        <w:t>TextUtils</w:t>
-      </w:r>
-      <w:proofErr w:type="spellEnd"/>
-      <w:r>
-        <w:rPr>
-          <w:rFonts w:ascii="Consolas" w:eastAsia="Times New Roman" w:hAnsi="Consolas" w:cs="Times New Roman"/>
-          <w:color w:val="CE9178"/>
-          <w:sz w:val="21"/>
-          <w:szCs w:val="21"/>
-        </w:rPr>
-        <w:t>"</w:t>
+        <w:t>'prop-types'</w:t>
       </w:r>
       <w:r>
         <w:rPr>
@@ -1614,52 +1511,7 @@
           <w:sz w:val="21"/>
           <w:szCs w:val="21"/>
         </w:rPr>
-        <w:t xml:space="preserve"> </w:t>
-      </w:r>
-      <w:r>
-        <w:rPr>
-          <w:rFonts w:ascii="Consolas" w:eastAsia="Times New Roman" w:hAnsi="Consolas" w:cs="Times New Roman"/>
-          <w:color w:val="808080"/>
-          <w:sz w:val="21"/>
-          <w:szCs w:val="21"/>
-        </w:rPr>
-        <w:t>/&gt;</w:t>
-      </w:r>
-    </w:p>
-    <w:p>
-      <w:pPr>
-        <w:tabs>
-          <w:tab w:val="left" w:pos="3540"/>
-        </w:tabs>
-      </w:pPr>
-      <w:r>
-        <w:t>Here title is argument pass in props. We can use if by {</w:t>
-      </w:r>
-      <w:proofErr w:type="spellStart"/>
-      <w:r>
-        <w:t>props.title</w:t>
-      </w:r>
-      <w:proofErr w:type="spellEnd"/>
-      <w:r>
-        <w:t>}</w:t>
-      </w:r>
-    </w:p>
-    <w:p>
-      <w:pPr>
-        <w:tabs>
-          <w:tab w:val="left" w:pos="3540"/>
-        </w:tabs>
-      </w:pPr>
-      <w:r>
-        <w:t xml:space="preserve">We can make </w:t>
-      </w:r>
-      <w:proofErr w:type="spellStart"/>
-      <w:r>
-        <w:t>proptype</w:t>
-      </w:r>
-      <w:proofErr w:type="spellEnd"/>
-      <w:r>
-        <w:t xml:space="preserve"> fix and also make it require by importing and using props-type.</w:t>
+        <w:t>;</w:t>
       </w:r>
     </w:p>
     <w:p>
@@ -1676,22 +1528,24 @@
       <w:r>
         <w:rPr>
           <w:rFonts w:ascii="Consolas" w:eastAsia="Times New Roman" w:hAnsi="Consolas" w:cs="Times New Roman"/>
-          <w:color w:val="569CD6"/>
-          <w:sz w:val="21"/>
-          <w:szCs w:val="21"/>
-        </w:rPr>
-        <w:t>import</w:t>
-      </w:r>
-      <w:r>
+          <w:color w:val="D4D4D4"/>
+          <w:sz w:val="21"/>
+          <w:szCs w:val="21"/>
+        </w:rPr>
+        <w:t>Navbar.prototype = {</w:t>
+      </w:r>
+    </w:p>
+    <w:p>
+      <w:pPr>
+        <w:shd w:val="clear" w:color="auto" w:fill="1E1E1E"/>
+        <w:spacing w:after="0" w:line="285" w:lineRule="atLeast"/>
         <w:rPr>
           <w:rFonts w:ascii="Consolas" w:eastAsia="Times New Roman" w:hAnsi="Consolas" w:cs="Times New Roman"/>
           <w:color w:val="D4D4D4"/>
           <w:sz w:val="21"/>
           <w:szCs w:val="21"/>
         </w:rPr>
-        <w:t xml:space="preserve"> </w:t>
-      </w:r>
-      <w:proofErr w:type="spellStart"/>
+      </w:pPr>
       <w:r>
         <w:rPr>
           <w:rFonts w:ascii="Consolas" w:eastAsia="Times New Roman" w:hAnsi="Consolas" w:cs="Times New Roman"/>
@@ -1699,118 +1553,8 @@
           <w:sz w:val="21"/>
           <w:szCs w:val="21"/>
         </w:rPr>
-        <w:t>PropTypes</w:t>
-      </w:r>
-      <w:proofErr w:type="spellEnd"/>
-      <w:r>
-        <w:rPr>
-          <w:rFonts w:ascii="Consolas" w:eastAsia="Times New Roman" w:hAnsi="Consolas" w:cs="Times New Roman"/>
-          <w:color w:val="D4D4D4"/>
-          <w:sz w:val="21"/>
-          <w:szCs w:val="21"/>
-        </w:rPr>
-        <w:t xml:space="preserve"> </w:t>
-      </w:r>
-      <w:r>
-        <w:rPr>
-          <w:rFonts w:ascii="Consolas" w:eastAsia="Times New Roman" w:hAnsi="Consolas" w:cs="Times New Roman"/>
-          <w:color w:val="569CD6"/>
-          <w:sz w:val="21"/>
-          <w:szCs w:val="21"/>
-        </w:rPr>
-        <w:t>from</w:t>
-      </w:r>
-      <w:r>
-        <w:rPr>
-          <w:rFonts w:ascii="Consolas" w:eastAsia="Times New Roman" w:hAnsi="Consolas" w:cs="Times New Roman"/>
-          <w:color w:val="D4D4D4"/>
-          <w:sz w:val="21"/>
-          <w:szCs w:val="21"/>
-        </w:rPr>
-        <w:t xml:space="preserve"> </w:t>
-      </w:r>
-      <w:r>
-        <w:rPr>
-          <w:rFonts w:ascii="Consolas" w:eastAsia="Times New Roman" w:hAnsi="Consolas" w:cs="Times New Roman"/>
-          <w:color w:val="CE9178"/>
-          <w:sz w:val="21"/>
-          <w:szCs w:val="21"/>
-        </w:rPr>
-        <w:t>'prop-types'</w:t>
-      </w:r>
-      <w:r>
-        <w:rPr>
-          <w:rFonts w:ascii="Consolas" w:eastAsia="Times New Roman" w:hAnsi="Consolas" w:cs="Times New Roman"/>
-          <w:color w:val="D4D4D4"/>
-          <w:sz w:val="21"/>
-          <w:szCs w:val="21"/>
-        </w:rPr>
-        <w:t>;</w:t>
-      </w:r>
-    </w:p>
-    <w:p>
-      <w:pPr>
-        <w:shd w:val="clear" w:color="auto" w:fill="1E1E1E"/>
-        <w:spacing w:after="0" w:line="285" w:lineRule="atLeast"/>
-        <w:rPr>
-          <w:rFonts w:ascii="Consolas" w:eastAsia="Times New Roman" w:hAnsi="Consolas" w:cs="Times New Roman"/>
-          <w:color w:val="D4D4D4"/>
-          <w:sz w:val="21"/>
-          <w:szCs w:val="21"/>
-        </w:rPr>
-      </w:pPr>
-      <w:proofErr w:type="spellStart"/>
-      <w:r>
-        <w:rPr>
-          <w:rFonts w:ascii="Consolas" w:eastAsia="Times New Roman" w:hAnsi="Consolas" w:cs="Times New Roman"/>
-          <w:color w:val="D4D4D4"/>
-          <w:sz w:val="21"/>
-          <w:szCs w:val="21"/>
-        </w:rPr>
-        <w:t>Navbar.prototype</w:t>
-      </w:r>
-      <w:proofErr w:type="spellEnd"/>
-      <w:r>
-        <w:rPr>
-          <w:rFonts w:ascii="Consolas" w:eastAsia="Times New Roman" w:hAnsi="Consolas" w:cs="Times New Roman"/>
-          <w:color w:val="D4D4D4"/>
-          <w:sz w:val="21"/>
-          <w:szCs w:val="21"/>
-        </w:rPr>
-        <w:t xml:space="preserve"> = {</w:t>
-      </w:r>
-    </w:p>
-    <w:p>
-      <w:pPr>
-        <w:shd w:val="clear" w:color="auto" w:fill="1E1E1E"/>
-        <w:spacing w:after="0" w:line="285" w:lineRule="atLeast"/>
-        <w:rPr>
-          <w:rFonts w:ascii="Consolas" w:eastAsia="Times New Roman" w:hAnsi="Consolas" w:cs="Times New Roman"/>
-          <w:color w:val="D4D4D4"/>
-          <w:sz w:val="21"/>
-          <w:szCs w:val="21"/>
-        </w:rPr>
-      </w:pPr>
-      <w:r>
-        <w:rPr>
-          <w:rFonts w:ascii="Consolas" w:eastAsia="Times New Roman" w:hAnsi="Consolas" w:cs="Times New Roman"/>
-          <w:color w:val="D4D4D4"/>
-          <w:sz w:val="21"/>
-          <w:szCs w:val="21"/>
-        </w:rPr>
-        <w:t xml:space="preserve">    title: </w:t>
-      </w:r>
-      <w:proofErr w:type="spellStart"/>
-      <w:r>
-        <w:rPr>
-          <w:rFonts w:ascii="Consolas" w:eastAsia="Times New Roman" w:hAnsi="Consolas" w:cs="Times New Roman"/>
-          <w:color w:val="D4D4D4"/>
-          <w:sz w:val="21"/>
-          <w:szCs w:val="21"/>
-        </w:rPr>
-        <w:t>PropTypes.string.isRequired</w:t>
-      </w:r>
-      <w:proofErr w:type="spellEnd"/>
+        <w:t>    title: PropTypes.string.isRequired</w:t>
+      </w:r>
     </w:p>
     <w:p>
       <w:pPr>
@@ -1860,15 +1604,7 @@
         </w:tabs>
       </w:pPr>
       <w:r>
-        <w:t>Here note that if we use .</w:t>
-      </w:r>
-      <w:proofErr w:type="spellStart"/>
-      <w:r>
-        <w:t>js</w:t>
-      </w:r>
-      <w:proofErr w:type="spellEnd"/>
-      <w:r>
-        <w:t xml:space="preserve"> </w:t>
+        <w:t xml:space="preserve">Here note that if we use .js </w:t>
       </w:r>
       <w:r>
         <w:t>extension</w:t>
@@ -1891,41 +1627,17 @@
         </w:tabs>
       </w:pPr>
       <w:r>
-        <w:t>PS C:\Users\Dell\OneDrive\Desktop\React-with-Git&gt; node .\react-learning\</w:t>
-      </w:r>
-      <w:proofErr w:type="spellStart"/>
-      <w:r>
-        <w:t>src</w:t>
-      </w:r>
-      <w:proofErr w:type="spellEnd"/>
-      <w:r>
-        <w:t>\components\module1.js</w:t>
-      </w:r>
-    </w:p>
-    <w:p>
-      <w:pPr>
-        <w:tabs>
-          <w:tab w:val="left" w:pos="3540"/>
-        </w:tabs>
-      </w:pPr>
-      <w:r>
-        <w:t xml:space="preserve">(node:10376) Warning: To load an ES module, set "type": "module" in the </w:t>
-      </w:r>
-      <w:proofErr w:type="spellStart"/>
-      <w:r>
-        <w:t>package.json</w:t>
-      </w:r>
-      <w:proofErr w:type="spellEnd"/>
-      <w:r>
-        <w:t xml:space="preserve"> or use the .</w:t>
-      </w:r>
-      <w:proofErr w:type="spellStart"/>
-      <w:r>
-        <w:t>mjs</w:t>
-      </w:r>
-      <w:proofErr w:type="spellEnd"/>
-      <w:r>
-        <w:t xml:space="preserve"> extension.</w:t>
+        <w:t>PS C:\Users\Dell\OneDrive\Desktop\React-with-Git&gt; node .\react-learning\src\components\module1.js</w:t>
+      </w:r>
+    </w:p>
+    <w:p>
+      <w:pPr>
+        <w:tabs>
+          <w:tab w:val="left" w:pos="3540"/>
+        </w:tabs>
+      </w:pPr>
+      <w:r>
+        <w:t>(node:10376) Warning: To load an ES module, set "type": "module" in the package.json or use the .mjs extension.</w:t>
       </w:r>
     </w:p>
     <w:p>
@@ -1981,133 +1693,48 @@
           <w:tab w:val="left" w:pos="3540"/>
         </w:tabs>
       </w:pPr>
-      <w:proofErr w:type="spellStart"/>
-      <w:r>
-        <w:t>SyntaxError</w:t>
-      </w:r>
-      <w:proofErr w:type="spellEnd"/>
-      <w:r>
-        <w:t>: Cannot use import statement outside a module</w:t>
-      </w:r>
-    </w:p>
-    <w:p>
-      <w:pPr>
-        <w:tabs>
-          <w:tab w:val="left" w:pos="3540"/>
-        </w:tabs>
-      </w:pPr>
-      <w:r>
-        <w:t xml:space="preserve">    at </w:t>
-      </w:r>
-      <w:proofErr w:type="spellStart"/>
-      <w:r>
-        <w:t>Object.compileFunction</w:t>
-      </w:r>
-      <w:proofErr w:type="spellEnd"/>
-      <w:r>
-        <w:t xml:space="preserve"> (node:vm:352:18)</w:t>
-      </w:r>
-    </w:p>
-    <w:p>
-      <w:pPr>
-        <w:tabs>
-          <w:tab w:val="left" w:pos="3540"/>
-        </w:tabs>
-      </w:pPr>
-      <w:r>
-        <w:t xml:space="preserve">    at </w:t>
-      </w:r>
-      <w:proofErr w:type="spellStart"/>
-      <w:r>
-        <w:t>wrapSafe</w:t>
-      </w:r>
-      <w:proofErr w:type="spellEnd"/>
-      <w:r>
-        <w:t xml:space="preserve"> (</w:t>
-      </w:r>
-      <w:proofErr w:type="spellStart"/>
-      <w:r>
-        <w:t>node:internal</w:t>
-      </w:r>
-      <w:proofErr w:type="spellEnd"/>
-      <w:r>
-        <w:t>/modules/</w:t>
-      </w:r>
-      <w:proofErr w:type="spellStart"/>
-      <w:r>
-        <w:t>cjs</w:t>
-      </w:r>
-      <w:proofErr w:type="spellEnd"/>
-      <w:r>
-        <w:t>/loader:1027:15)</w:t>
-      </w:r>
-    </w:p>
-    <w:p>
-      <w:pPr>
-        <w:tabs>
-          <w:tab w:val="left" w:pos="3540"/>
-        </w:tabs>
-      </w:pPr>
-      <w:r>
-        <w:t xml:space="preserve">    at </w:t>
-      </w:r>
-      <w:proofErr w:type="spellStart"/>
-      <w:r>
-        <w:t>Module._compile</w:t>
-      </w:r>
-      <w:proofErr w:type="spellEnd"/>
-      <w:r>
-        <w:t xml:space="preserve"> (</w:t>
-      </w:r>
-      <w:proofErr w:type="spellStart"/>
-      <w:r>
-        <w:t>node:internal</w:t>
-      </w:r>
-      <w:proofErr w:type="spellEnd"/>
-      <w:r>
-        <w:t>/modules/</w:t>
-      </w:r>
-      <w:proofErr w:type="spellStart"/>
-      <w:r>
-        <w:t>cjs</w:t>
-      </w:r>
-      <w:proofErr w:type="spellEnd"/>
-      <w:r>
-        <w:t>/loader:1063:27)</w:t>
-      </w:r>
-    </w:p>
-    <w:p>
-      <w:pPr>
-        <w:tabs>
-          <w:tab w:val="left" w:pos="3540"/>
-        </w:tabs>
-      </w:pPr>
-      <w:r>
-        <w:t xml:space="preserve">    at Object.Module._extensions..</w:t>
-      </w:r>
-      <w:proofErr w:type="spellStart"/>
-      <w:r>
-        <w:t>js</w:t>
-      </w:r>
-      <w:proofErr w:type="spellEnd"/>
-      <w:r>
-        <w:t xml:space="preserve"> (</w:t>
-      </w:r>
-      <w:proofErr w:type="spellStart"/>
-      <w:r>
-        <w:t>node:internal</w:t>
-      </w:r>
-      <w:proofErr w:type="spellEnd"/>
-      <w:r>
-        <w:t>/modules/</w:t>
-      </w:r>
-      <w:proofErr w:type="spellStart"/>
-      <w:r>
-        <w:t>cjs</w:t>
-      </w:r>
-      <w:proofErr w:type="spellEnd"/>
-      <w:r>
-        <w:t xml:space="preserve">/loader:1153:10)    </w:t>
+      <w:r>
+        <w:t>SyntaxError: Cannot use import statement outside a module</w:t>
+      </w:r>
+    </w:p>
+    <w:p>
+      <w:pPr>
+        <w:tabs>
+          <w:tab w:val="left" w:pos="3540"/>
+        </w:tabs>
+      </w:pPr>
+      <w:r>
+        <w:t xml:space="preserve">    at Object.compileFunction (node:vm:352:18)</w:t>
+      </w:r>
+    </w:p>
+    <w:p>
+      <w:pPr>
+        <w:tabs>
+          <w:tab w:val="left" w:pos="3540"/>
+        </w:tabs>
+      </w:pPr>
+      <w:r>
+        <w:t xml:space="preserve">    at wrapSafe (node:internal/modules/cjs/loader:1027:15)</w:t>
+      </w:r>
+    </w:p>
+    <w:p>
+      <w:pPr>
+        <w:tabs>
+          <w:tab w:val="left" w:pos="3540"/>
+        </w:tabs>
+      </w:pPr>
+      <w:r>
+        <w:t xml:space="preserve">    at Module._compile (node:internal/modules/cjs/loader:1063:27)</w:t>
+      </w:r>
+    </w:p>
+    <w:p>
+      <w:pPr>
+        <w:tabs>
+          <w:tab w:val="left" w:pos="3540"/>
+        </w:tabs>
+      </w:pPr>
+      <w:r>
+        <w:t xml:space="preserve">    at Object.Module._extensions..js (node:internal/modules/cjs/loader:1153:10)    </w:t>
       </w:r>
     </w:p>
     <w:p>
@@ -2118,99 +1745,27 @@
       </w:pPr>
       <w:r>
         <w:lastRenderedPageBreak/>
-        <w:t xml:space="preserve">    at </w:t>
-      </w:r>
-      <w:proofErr w:type="spellStart"/>
-      <w:r>
-        <w:t>Module.load</w:t>
-      </w:r>
-      <w:proofErr w:type="spellEnd"/>
-      <w:r>
-        <w:t xml:space="preserve"> (</w:t>
-      </w:r>
-      <w:proofErr w:type="spellStart"/>
-      <w:r>
-        <w:t>node:internal</w:t>
-      </w:r>
-      <w:proofErr w:type="spellEnd"/>
-      <w:r>
-        <w:t>/modules/</w:t>
-      </w:r>
-      <w:proofErr w:type="spellStart"/>
-      <w:r>
-        <w:t>cjs</w:t>
-      </w:r>
-      <w:proofErr w:type="spellEnd"/>
-      <w:r>
-        <w:t>/loader:975:32)</w:t>
-      </w:r>
-    </w:p>
-    <w:p>
-      <w:pPr>
-        <w:tabs>
-          <w:tab w:val="left" w:pos="3540"/>
-        </w:tabs>
-      </w:pPr>
-      <w:r>
-        <w:t xml:space="preserve">    at </w:t>
-      </w:r>
-      <w:proofErr w:type="spellStart"/>
-      <w:r>
-        <w:t>Function.Module._load</w:t>
-      </w:r>
-      <w:proofErr w:type="spellEnd"/>
-      <w:r>
-        <w:t xml:space="preserve"> (</w:t>
-      </w:r>
-      <w:proofErr w:type="spellStart"/>
-      <w:r>
-        <w:t>node:internal</w:t>
-      </w:r>
-      <w:proofErr w:type="spellEnd"/>
-      <w:r>
-        <w:t>/modules/</w:t>
-      </w:r>
-      <w:proofErr w:type="spellStart"/>
-      <w:r>
-        <w:t>cjs</w:t>
-      </w:r>
-      <w:proofErr w:type="spellEnd"/>
-      <w:r>
-        <w:t>/loader:822:12)</w:t>
-      </w:r>
-    </w:p>
-    <w:p>
-      <w:pPr>
-        <w:tabs>
-          <w:tab w:val="left" w:pos="3540"/>
-        </w:tabs>
-      </w:pPr>
-      <w:r>
-        <w:t xml:space="preserve">    at </w:t>
-      </w:r>
-      <w:proofErr w:type="spellStart"/>
-      <w:r>
-        <w:t>Function.executeUserEntryPoint</w:t>
-      </w:r>
-      <w:proofErr w:type="spellEnd"/>
-      <w:r>
-        <w:t xml:space="preserve"> [as </w:t>
-      </w:r>
-      <w:proofErr w:type="spellStart"/>
-      <w:r>
-        <w:t>runMain</w:t>
-      </w:r>
-      <w:proofErr w:type="spellEnd"/>
-      <w:r>
-        <w:t>] (</w:t>
-      </w:r>
-      <w:proofErr w:type="spellStart"/>
-      <w:r>
-        <w:t>node:internal</w:t>
-      </w:r>
-      <w:proofErr w:type="spellEnd"/>
-      <w:r>
-        <w:t>/modules/run_main:77:12)</w:t>
+        <w:t xml:space="preserve">    at Module.load (node:internal/modules/cjs/loader:975:32)</w:t>
+      </w:r>
+    </w:p>
+    <w:p>
+      <w:pPr>
+        <w:tabs>
+          <w:tab w:val="left" w:pos="3540"/>
+        </w:tabs>
+      </w:pPr>
+      <w:r>
+        <w:t xml:space="preserve">    at Function.Module._load (node:internal/modules/cjs/loader:822:12)</w:t>
+      </w:r>
+    </w:p>
+    <w:p>
+      <w:pPr>
+        <w:tabs>
+          <w:tab w:val="left" w:pos="3540"/>
+        </w:tabs>
+      </w:pPr>
+      <w:r>
+        <w:t xml:space="preserve">    at Function.executeUserEntryPoint [as runMain] (node:internal/modules/run_main:77:12)</w:t>
       </w:r>
     </w:p>
     <w:p>
@@ -2223,15 +1778,7 @@
         </w:tabs>
       </w:pPr>
       <w:r>
-        <w:t xml:space="preserve">    at </w:t>
-      </w:r>
-      <w:proofErr w:type="spellStart"/>
-      <w:r>
-        <w:t>node:internal</w:t>
-      </w:r>
-      <w:proofErr w:type="spellEnd"/>
-      <w:r>
-        <w:t>/main/run_main_module:17:47</w:t>
+        <w:t xml:space="preserve">    at node:internal/main/run_main_module:17:47</w:t>
       </w:r>
     </w:p>
     <w:p>
@@ -2254,27 +1801,14 @@
         <w:t>this,</w:t>
       </w:r>
       <w:r>
-        <w:t xml:space="preserve"> we use .</w:t>
-      </w:r>
-      <w:proofErr w:type="spellStart"/>
-      <w:r>
-        <w:t>mjs</w:t>
-      </w:r>
-      <w:proofErr w:type="spellEnd"/>
-      <w:r>
-        <w:t xml:space="preserve"> </w:t>
+        <w:t xml:space="preserve"> we use .mjs </w:t>
       </w:r>
       <w:r>
         <w:t>extension</w:t>
       </w:r>
       <w:r>
-        <w:t xml:space="preserve"> instead of .</w:t>
-      </w:r>
-      <w:proofErr w:type="spellStart"/>
-      <w:r>
-        <w:t>js</w:t>
-      </w:r>
-      <w:proofErr w:type="spellEnd"/>
+        <w:t xml:space="preserve"> instead of .js</w:t>
+      </w:r>
     </w:p>
     <w:p>
       <w:pPr>
@@ -2290,15 +1824,7 @@
         </w:rPr>
       </w:pPr>
       <w:r>
-        <w:t xml:space="preserve">Note that we </w:t>
-      </w:r>
-      <w:proofErr w:type="spellStart"/>
-      <w:r>
-        <w:t>can not</w:t>
-      </w:r>
-      <w:proofErr w:type="spellEnd"/>
-      <w:r>
-        <w:t xml:space="preserve"> have multiple defaults for </w:t>
+        <w:t xml:space="preserve">Note that we can not have multiple defaults for </w:t>
       </w:r>
       <w:r>
         <w:t>export</w:t>
@@ -2381,7 +1907,6 @@
           <w:szCs w:val="21"/>
         </w:rPr>
       </w:pPr>
-      <w:proofErr w:type="spellStart"/>
       <w:r>
         <w:rPr>
           <w:rFonts w:ascii="Consolas" w:eastAsia="Times New Roman" w:hAnsi="Consolas" w:cs="Times New Roman"/>
@@ -2389,17 +1914,37 @@
           <w:sz w:val="21"/>
           <w:szCs w:val="21"/>
         </w:rPr>
-        <w:t>Navbar.defaultProps</w:t>
-      </w:r>
-      <w:proofErr w:type="spellEnd"/>
-      <w:r>
+        <w:t>Navbar.defaultProps = {</w:t>
+      </w:r>
+    </w:p>
+    <w:p>
+      <w:pPr>
+        <w:shd w:val="clear" w:color="auto" w:fill="1E1E1E"/>
+        <w:spacing w:after="0" w:line="285" w:lineRule="atLeast"/>
         <w:rPr>
           <w:rFonts w:ascii="Consolas" w:eastAsia="Times New Roman" w:hAnsi="Consolas" w:cs="Times New Roman"/>
           <w:color w:val="D4D4D4"/>
           <w:sz w:val="21"/>
           <w:szCs w:val="21"/>
         </w:rPr>
-        <w:t xml:space="preserve"> = {</w:t>
+      </w:pPr>
+      <w:r>
+        <w:rPr>
+          <w:rFonts w:ascii="Consolas" w:eastAsia="Times New Roman" w:hAnsi="Consolas" w:cs="Times New Roman"/>
+          <w:color w:val="D4D4D4"/>
+          <w:sz w:val="21"/>
+          <w:szCs w:val="21"/>
+        </w:rPr>
+        <w:t xml:space="preserve">    title: </w:t>
+      </w:r>
+      <w:r>
+        <w:rPr>
+          <w:rFonts w:ascii="Consolas" w:eastAsia="Times New Roman" w:hAnsi="Consolas" w:cs="Times New Roman"/>
+          <w:color w:val="CE9178"/>
+          <w:sz w:val="21"/>
+          <w:szCs w:val="21"/>
+        </w:rPr>
+        <w:t>"I am Good Title"</w:t>
       </w:r>
     </w:p>
     <w:p>
@@ -2420,36 +1965,6 @@
           <w:sz w:val="21"/>
           <w:szCs w:val="21"/>
         </w:rPr>
-        <w:t xml:space="preserve">    title: </w:t>
-      </w:r>
-      <w:r>
-        <w:rPr>
-          <w:rFonts w:ascii="Consolas" w:eastAsia="Times New Roman" w:hAnsi="Consolas" w:cs="Times New Roman"/>
-          <w:color w:val="CE9178"/>
-          <w:sz w:val="21"/>
-          <w:szCs w:val="21"/>
-        </w:rPr>
-        <w:t>"I am Good Title"</w:t>
-      </w:r>
-    </w:p>
-    <w:p>
-      <w:pPr>
-        <w:shd w:val="clear" w:color="auto" w:fill="1E1E1E"/>
-        <w:spacing w:after="0" w:line="285" w:lineRule="atLeast"/>
-        <w:rPr>
-          <w:rFonts w:ascii="Consolas" w:eastAsia="Times New Roman" w:hAnsi="Consolas" w:cs="Times New Roman"/>
-          <w:color w:val="D4D4D4"/>
-          <w:sz w:val="21"/>
-          <w:szCs w:val="21"/>
-        </w:rPr>
-      </w:pPr>
-      <w:r>
-        <w:rPr>
-          <w:rFonts w:ascii="Consolas" w:eastAsia="Times New Roman" w:hAnsi="Consolas" w:cs="Times New Roman"/>
-          <w:color w:val="D4D4D4"/>
-          <w:sz w:val="21"/>
-          <w:szCs w:val="21"/>
-        </w:rPr>
         <w:t>}</w:t>
       </w:r>
     </w:p>
@@ -2579,23 +2094,7 @@
           <w:sz w:val="28"/>
           <w:szCs w:val="28"/>
         </w:rPr>
-        <w:t xml:space="preserve"> component we need hook which is </w:t>
-      </w:r>
-      <w:proofErr w:type="spellStart"/>
-      <w:r>
-        <w:rPr>
-          <w:sz w:val="28"/>
-          <w:szCs w:val="28"/>
-        </w:rPr>
-        <w:t>useState</w:t>
-      </w:r>
-      <w:proofErr w:type="spellEnd"/>
-      <w:r>
-        <w:rPr>
-          <w:sz w:val="28"/>
-          <w:szCs w:val="28"/>
-        </w:rPr>
-        <w:t>.</w:t>
+        <w:t xml:space="preserve"> component we need hook which is useState.</w:t>
       </w:r>
     </w:p>
     <w:p>
@@ -2639,19 +2138,21 @@
           <w:sz w:val="26"/>
           <w:szCs w:val="26"/>
         </w:rPr>
-        <w:t xml:space="preserve">You will note that if you add onclick event on button and changing the text value that is contained inside </w:t>
-      </w:r>
-      <w:proofErr w:type="spellStart"/>
-      <w:r>
+        <w:t>You will note that if you add onclick event on button and changing the text value that is contained inside textarea that will theow an error in console that you should add onchange event in textarea.</w:t>
+      </w:r>
+    </w:p>
+    <w:p>
+      <w:pPr>
+        <w:tabs>
+          <w:tab w:val="left" w:pos="3540"/>
+        </w:tabs>
         <w:rPr>
           <w:rFonts w:ascii="Segoe UI" w:hAnsi="Segoe UI" w:cs="Segoe UI"/>
           <w:color w:val="000000"/>
           <w:sz w:val="26"/>
           <w:szCs w:val="26"/>
         </w:rPr>
-        <w:t>textarea</w:t>
-      </w:r>
-      <w:proofErr w:type="spellEnd"/>
+      </w:pPr>
       <w:r>
         <w:rPr>
           <w:rFonts w:ascii="Segoe UI" w:hAnsi="Segoe UI" w:cs="Segoe UI"/>
@@ -2659,29 +2160,34 @@
           <w:sz w:val="26"/>
           <w:szCs w:val="26"/>
         </w:rPr>
-        <w:t xml:space="preserve"> that will theow an error in console that you should add </w:t>
-      </w:r>
-      <w:proofErr w:type="spellStart"/>
-      <w:r>
+        <w:t>State is One type of variable that can be changed using setvar like of.</w:t>
+      </w:r>
+    </w:p>
+    <w:p>
+      <w:pPr>
+        <w:tabs>
+          <w:tab w:val="left" w:pos="3540"/>
+        </w:tabs>
         <w:rPr>
           <w:rFonts w:ascii="Segoe UI" w:hAnsi="Segoe UI" w:cs="Segoe UI"/>
           <w:color w:val="000000"/>
           <w:sz w:val="26"/>
           <w:szCs w:val="26"/>
         </w:rPr>
-        <w:t>onchange</w:t>
-      </w:r>
-      <w:proofErr w:type="spellEnd"/>
-      <w:r>
+      </w:pPr>
+    </w:p>
+    <w:p>
+      <w:pPr>
+        <w:tabs>
+          <w:tab w:val="left" w:pos="3540"/>
+        </w:tabs>
         <w:rPr>
           <w:rFonts w:ascii="Segoe UI" w:hAnsi="Segoe UI" w:cs="Segoe UI"/>
           <w:color w:val="000000"/>
           <w:sz w:val="26"/>
           <w:szCs w:val="26"/>
         </w:rPr>
-        <w:t xml:space="preserve"> event in </w:t>
-      </w:r>
-      <w:proofErr w:type="spellStart"/>
+      </w:pPr>
       <w:r>
         <w:rPr>
           <w:rFonts w:ascii="Segoe UI" w:hAnsi="Segoe UI" w:cs="Segoe UI"/>
@@ -2689,9 +2195,8 @@
           <w:sz w:val="26"/>
           <w:szCs w:val="26"/>
         </w:rPr>
-        <w:t>textarea</w:t>
-      </w:r>
-      <w:proofErr w:type="spellEnd"/>
+        <w:t>Handling Event.</w:t>
+      </w:r>
       <w:r>
         <w:rPr>
           <w:rFonts w:ascii="Segoe UI" w:hAnsi="Segoe UI" w:cs="Segoe UI"/>
@@ -2699,7 +2204,7 @@
           <w:sz w:val="26"/>
           <w:szCs w:val="26"/>
         </w:rPr>
-        <w:t>.</w:t>
+        <w:t xml:space="preserve"> We can watch the commit online.</w:t>
       </w:r>
     </w:p>
     <w:p>
@@ -2721,134 +2226,8 @@
           <w:sz w:val="26"/>
           <w:szCs w:val="26"/>
         </w:rPr>
-        <w:t xml:space="preserve">State is One type of variable that can be changed using </w:t>
-      </w:r>
-      <w:proofErr w:type="spellStart"/>
-      <w:r>
-        <w:rPr>
-          <w:rFonts w:ascii="Segoe UI" w:hAnsi="Segoe UI" w:cs="Segoe UI"/>
-          <w:color w:val="000000"/>
-          <w:sz w:val="26"/>
-          <w:szCs w:val="26"/>
-        </w:rPr>
-        <w:t>setvar</w:t>
-      </w:r>
-      <w:proofErr w:type="spellEnd"/>
-      <w:r>
-        <w:rPr>
-          <w:rFonts w:ascii="Segoe UI" w:hAnsi="Segoe UI" w:cs="Segoe UI"/>
-          <w:color w:val="000000"/>
-          <w:sz w:val="26"/>
-          <w:szCs w:val="26"/>
-        </w:rPr>
-        <w:t xml:space="preserve"> like of.</w:t>
-      </w:r>
-    </w:p>
-    <w:p>
-      <w:pPr>
-        <w:tabs>
-          <w:tab w:val="left" w:pos="3540"/>
-        </w:tabs>
-        <w:rPr>
-          <w:rFonts w:ascii="Segoe UI" w:hAnsi="Segoe UI" w:cs="Segoe UI"/>
-          <w:color w:val="000000"/>
-          <w:sz w:val="26"/>
-          <w:szCs w:val="26"/>
-        </w:rPr>
-      </w:pPr>
-    </w:p>
-    <w:p>
-      <w:pPr>
-        <w:tabs>
-          <w:tab w:val="left" w:pos="3540"/>
-        </w:tabs>
-        <w:rPr>
-          <w:rFonts w:ascii="Segoe UI" w:hAnsi="Segoe UI" w:cs="Segoe UI"/>
-          <w:color w:val="000000"/>
-          <w:sz w:val="26"/>
-          <w:szCs w:val="26"/>
-        </w:rPr>
-      </w:pPr>
-      <w:r>
-        <w:rPr>
-          <w:rFonts w:ascii="Segoe UI" w:hAnsi="Segoe UI" w:cs="Segoe UI"/>
-          <w:color w:val="000000"/>
-          <w:sz w:val="26"/>
-          <w:szCs w:val="26"/>
-        </w:rPr>
-        <w:t>Handling Event.</w:t>
-      </w:r>
-      <w:r>
-        <w:rPr>
-          <w:rFonts w:ascii="Segoe UI" w:hAnsi="Segoe UI" w:cs="Segoe UI"/>
-          <w:color w:val="000000"/>
-          <w:sz w:val="26"/>
-          <w:szCs w:val="26"/>
-        </w:rPr>
-        <w:t xml:space="preserve"> We can watch the commit online.</w:t>
-      </w:r>
-    </w:p>
-    <w:p>
-      <w:pPr>
-        <w:tabs>
-          <w:tab w:val="left" w:pos="3540"/>
-        </w:tabs>
-        <w:rPr>
-          <w:rFonts w:ascii="Segoe UI" w:hAnsi="Segoe UI" w:cs="Segoe UI"/>
-          <w:color w:val="000000"/>
-          <w:sz w:val="26"/>
-          <w:szCs w:val="26"/>
-        </w:rPr>
-      </w:pPr>
-      <w:r>
-        <w:rPr>
-          <w:rFonts w:ascii="Segoe UI" w:hAnsi="Segoe UI" w:cs="Segoe UI"/>
-          <w:color w:val="000000"/>
-          <w:sz w:val="26"/>
-          <w:szCs w:val="26"/>
-        </w:rPr>
         <w:lastRenderedPageBreak/>
-        <w:t xml:space="preserve">Noted Point: I have noted that in react also if button type is </w:t>
-      </w:r>
-      <w:proofErr w:type="gramStart"/>
-      <w:r>
-        <w:rPr>
-          <w:rFonts w:ascii="Segoe UI" w:hAnsi="Segoe UI" w:cs="Segoe UI"/>
-          <w:color w:val="000000"/>
-          <w:sz w:val="26"/>
-          <w:szCs w:val="26"/>
-        </w:rPr>
-        <w:t>submit</w:t>
-      </w:r>
-      <w:proofErr w:type="gramEnd"/>
-      <w:r>
-        <w:rPr>
-          <w:rFonts w:ascii="Segoe UI" w:hAnsi="Segoe UI" w:cs="Segoe UI"/>
-          <w:color w:val="000000"/>
-          <w:sz w:val="26"/>
-          <w:szCs w:val="26"/>
-        </w:rPr>
-        <w:t xml:space="preserve"> then the page will surly </w:t>
-      </w:r>
-      <w:proofErr w:type="spellStart"/>
-      <w:r>
-        <w:rPr>
-          <w:rFonts w:ascii="Segoe UI" w:hAnsi="Segoe UI" w:cs="Segoe UI"/>
-          <w:color w:val="000000"/>
-          <w:sz w:val="26"/>
-          <w:szCs w:val="26"/>
-        </w:rPr>
-        <w:t>realoded</w:t>
-      </w:r>
-      <w:proofErr w:type="spellEnd"/>
-      <w:r>
-        <w:rPr>
-          <w:rFonts w:ascii="Segoe UI" w:hAnsi="Segoe UI" w:cs="Segoe UI"/>
-          <w:color w:val="000000"/>
-          <w:sz w:val="26"/>
-          <w:szCs w:val="26"/>
-        </w:rPr>
-        <w:t>. If you want that your page should not reload then remove type=”submit” form the button tag.</w:t>
+        <w:t>Noted Point: I have noted that in react also if button type is submit then the page will surly realoded. If you want that your page should not reload then remove type=”submit” form the button tag.</w:t>
       </w:r>
     </w:p>
     <w:p>
@@ -2921,19 +2300,21 @@
           <w:sz w:val="26"/>
           <w:szCs w:val="26"/>
         </w:rPr>
-        <w:t xml:space="preserve">I have </w:t>
-      </w:r>
-      <w:proofErr w:type="spellStart"/>
-      <w:r>
+        <w:t>I have desided to to add jquery in my react app to add copy functionality.</w:t>
+      </w:r>
+    </w:p>
+    <w:p>
+      <w:pPr>
+        <w:tabs>
+          <w:tab w:val="left" w:pos="3540"/>
+        </w:tabs>
         <w:rPr>
           <w:rFonts w:ascii="Segoe UI" w:hAnsi="Segoe UI" w:cs="Segoe UI"/>
           <w:color w:val="000000"/>
           <w:sz w:val="26"/>
           <w:szCs w:val="26"/>
         </w:rPr>
-        <w:t>desided</w:t>
-      </w:r>
-      <w:proofErr w:type="spellEnd"/>
+      </w:pPr>
       <w:r>
         <w:rPr>
           <w:rFonts w:ascii="Segoe UI" w:hAnsi="Segoe UI" w:cs="Segoe UI"/>
@@ -2941,109 +2322,7 @@
           <w:sz w:val="26"/>
           <w:szCs w:val="26"/>
         </w:rPr>
-        <w:t xml:space="preserve"> to </w:t>
-      </w:r>
-      <w:proofErr w:type="spellStart"/>
-      <w:r>
-        <w:rPr>
-          <w:rFonts w:ascii="Segoe UI" w:hAnsi="Segoe UI" w:cs="Segoe UI"/>
-          <w:color w:val="000000"/>
-          <w:sz w:val="26"/>
-          <w:szCs w:val="26"/>
-        </w:rPr>
-        <w:t>to</w:t>
-      </w:r>
-      <w:proofErr w:type="spellEnd"/>
-      <w:r>
-        <w:rPr>
-          <w:rFonts w:ascii="Segoe UI" w:hAnsi="Segoe UI" w:cs="Segoe UI"/>
-          <w:color w:val="000000"/>
-          <w:sz w:val="26"/>
-          <w:szCs w:val="26"/>
-        </w:rPr>
-        <w:t xml:space="preserve"> add </w:t>
-      </w:r>
-      <w:proofErr w:type="spellStart"/>
-      <w:r>
-        <w:rPr>
-          <w:rFonts w:ascii="Segoe UI" w:hAnsi="Segoe UI" w:cs="Segoe UI"/>
-          <w:color w:val="000000"/>
-          <w:sz w:val="26"/>
-          <w:szCs w:val="26"/>
-        </w:rPr>
-        <w:t>jquery</w:t>
-      </w:r>
-      <w:proofErr w:type="spellEnd"/>
-      <w:r>
-        <w:rPr>
-          <w:rFonts w:ascii="Segoe UI" w:hAnsi="Segoe UI" w:cs="Segoe UI"/>
-          <w:color w:val="000000"/>
-          <w:sz w:val="26"/>
-          <w:szCs w:val="26"/>
-        </w:rPr>
-        <w:t xml:space="preserve"> in </w:t>
-      </w:r>
-      <w:proofErr w:type="gramStart"/>
-      <w:r>
-        <w:rPr>
-          <w:rFonts w:ascii="Segoe UI" w:hAnsi="Segoe UI" w:cs="Segoe UI"/>
-          <w:color w:val="000000"/>
-          <w:sz w:val="26"/>
-          <w:szCs w:val="26"/>
-        </w:rPr>
-        <w:t>my</w:t>
-      </w:r>
-      <w:proofErr w:type="gramEnd"/>
-      <w:r>
-        <w:rPr>
-          <w:rFonts w:ascii="Segoe UI" w:hAnsi="Segoe UI" w:cs="Segoe UI"/>
-          <w:color w:val="000000"/>
-          <w:sz w:val="26"/>
-          <w:szCs w:val="26"/>
-        </w:rPr>
-        <w:t xml:space="preserve"> react app to add copy functionality.</w:t>
-      </w:r>
-    </w:p>
-    <w:p>
-      <w:pPr>
-        <w:tabs>
-          <w:tab w:val="left" w:pos="3540"/>
-        </w:tabs>
-        <w:rPr>
-          <w:rFonts w:ascii="Segoe UI" w:hAnsi="Segoe UI" w:cs="Segoe UI"/>
-          <w:color w:val="000000"/>
-          <w:sz w:val="26"/>
-          <w:szCs w:val="26"/>
-        </w:rPr>
-      </w:pPr>
-      <w:r>
-        <w:rPr>
-          <w:rFonts w:ascii="Segoe UI" w:hAnsi="Segoe UI" w:cs="Segoe UI"/>
-          <w:color w:val="000000"/>
-          <w:sz w:val="26"/>
-          <w:szCs w:val="26"/>
-        </w:rPr>
-        <w:t xml:space="preserve">To add the </w:t>
-      </w:r>
-      <w:proofErr w:type="spellStart"/>
-      <w:r>
-        <w:rPr>
-          <w:rFonts w:ascii="Segoe UI" w:hAnsi="Segoe UI" w:cs="Segoe UI"/>
-          <w:color w:val="000000"/>
-          <w:sz w:val="26"/>
-          <w:szCs w:val="26"/>
-        </w:rPr>
-        <w:t>Jquery</w:t>
-      </w:r>
-      <w:proofErr w:type="spellEnd"/>
-      <w:r>
-        <w:rPr>
-          <w:rFonts w:ascii="Segoe UI" w:hAnsi="Segoe UI" w:cs="Segoe UI"/>
-          <w:color w:val="000000"/>
-          <w:sz w:val="26"/>
-          <w:szCs w:val="26"/>
-        </w:rPr>
-        <w:t xml:space="preserve">, Following Steps only </w:t>
+        <w:t xml:space="preserve">To add the Jquery, Following Steps only </w:t>
       </w:r>
     </w:p>
     <w:p>
@@ -3063,7 +2342,6 @@
           <w:szCs w:val="26"/>
         </w:rPr>
       </w:pPr>
-      <w:proofErr w:type="spellStart"/>
       <w:r>
         <w:rPr>
           <w:rFonts w:ascii="Courier New" w:hAnsi="Courier New" w:cs="Courier New"/>
@@ -3071,55 +2349,7 @@
           <w:spacing w:val="-5"/>
           <w:shd w:val="clear" w:color="auto" w:fill="F2F2F2"/>
         </w:rPr>
-        <w:t>npm</w:t>
-      </w:r>
-      <w:proofErr w:type="spellEnd"/>
-      <w:r>
-        <w:rPr>
-          <w:rFonts w:ascii="Courier New" w:hAnsi="Courier New" w:cs="Courier New"/>
-          <w:color w:val="292929"/>
-          <w:spacing w:val="-5"/>
-          <w:shd w:val="clear" w:color="auto" w:fill="F2F2F2"/>
-        </w:rPr>
-        <w:t xml:space="preserve"> install </w:t>
-      </w:r>
-      <w:proofErr w:type="spellStart"/>
-      <w:r>
-        <w:rPr>
-          <w:rFonts w:ascii="Courier New" w:hAnsi="Courier New" w:cs="Courier New"/>
-          <w:color w:val="292929"/>
-          <w:spacing w:val="-5"/>
-          <w:shd w:val="clear" w:color="auto" w:fill="F2F2F2"/>
-        </w:rPr>
-        <w:t>jquery</w:t>
-      </w:r>
-      <w:proofErr w:type="spellEnd"/>
-      <w:r>
-        <w:rPr>
-          <w:rFonts w:ascii="Courier New" w:hAnsi="Courier New" w:cs="Courier New"/>
-          <w:color w:val="292929"/>
-          <w:spacing w:val="-5"/>
-          <w:shd w:val="clear" w:color="auto" w:fill="F2F2F2"/>
-        </w:rPr>
-        <w:t xml:space="preserve"> </w:t>
-      </w:r>
-      <w:r>
-        <w:rPr>
-          <w:rFonts w:ascii="Courier New" w:hAnsi="Courier New" w:cs="Courier New"/>
-          <w:color w:val="292929"/>
-          <w:spacing w:val="-5"/>
-          <w:shd w:val="clear" w:color="auto" w:fill="F2F2F2"/>
-        </w:rPr>
-        <w:t>–</w:t>
-      </w:r>
-      <w:r>
-        <w:rPr>
-          <w:rFonts w:ascii="Courier New" w:hAnsi="Courier New" w:cs="Courier New"/>
-          <w:color w:val="292929"/>
-          <w:spacing w:val="-5"/>
-          <w:shd w:val="clear" w:color="auto" w:fill="F2F2F2"/>
-        </w:rPr>
-        <w:t>save</w:t>
+        <w:t>npm install jquery –save</w:t>
       </w:r>
     </w:p>
     <w:p>
@@ -3147,29 +2377,7 @@
           <w:sz w:val="30"/>
           <w:szCs w:val="30"/>
         </w:rPr>
-        <w:t xml:space="preserve">2. Now open project in your favorite IDE and import </w:t>
-      </w:r>
-      <w:proofErr w:type="spellStart"/>
-      <w:r>
-        <w:rPr>
-          <w:rFonts w:ascii="Georgia" w:eastAsia="Times New Roman" w:hAnsi="Georgia" w:cs="Times New Roman"/>
-          <w:color w:val="292929"/>
-          <w:spacing w:val="-1"/>
-          <w:sz w:val="30"/>
-          <w:szCs w:val="30"/>
-        </w:rPr>
-        <w:t>jquery</w:t>
-      </w:r>
-      <w:proofErr w:type="spellEnd"/>
-      <w:r>
-        <w:rPr>
-          <w:rFonts w:ascii="Georgia" w:eastAsia="Times New Roman" w:hAnsi="Georgia" w:cs="Times New Roman"/>
-          <w:color w:val="292929"/>
-          <w:spacing w:val="-1"/>
-          <w:sz w:val="30"/>
-          <w:szCs w:val="30"/>
-        </w:rPr>
-        <w:t xml:space="preserve"> to the file where you want to manipulate DOM.</w:t>
+        <w:t>2. Now open project in your favorite IDE and import jquery to the file where you want to manipulate DOM.</w:t>
       </w:r>
     </w:p>
     <w:p>
@@ -3213,29 +2421,7 @@
           <w:sz w:val="24"/>
           <w:szCs w:val="24"/>
         </w:rPr>
-        <w:t>import $ from '</w:t>
-      </w:r>
-      <w:proofErr w:type="spellStart"/>
-      <w:r>
-        <w:rPr>
-          <w:rFonts w:ascii="Courier New" w:eastAsia="Times New Roman" w:hAnsi="Courier New" w:cs="Courier New"/>
-          <w:color w:val="292929"/>
-          <w:spacing w:val="-5"/>
-          <w:sz w:val="24"/>
-          <w:szCs w:val="24"/>
-        </w:rPr>
-        <w:t>jquery</w:t>
-      </w:r>
-      <w:proofErr w:type="spellEnd"/>
-      <w:r>
-        <w:rPr>
-          <w:rFonts w:ascii="Courier New" w:eastAsia="Times New Roman" w:hAnsi="Courier New" w:cs="Courier New"/>
-          <w:color w:val="292929"/>
-          <w:spacing w:val="-5"/>
-          <w:sz w:val="24"/>
-          <w:szCs w:val="24"/>
-        </w:rPr>
-        <w:t>'</w:t>
+        <w:t>import $ from 'jquery'</w:t>
       </w:r>
     </w:p>
     <w:p>
@@ -3251,6 +2437,384 @@
           <w:szCs w:val="26"/>
         </w:rPr>
       </w:pPr>
+    </w:p>
+    <w:p>
+      <w:pPr>
+        <w:pStyle w:val="ListParagraph"/>
+        <w:pBdr>
+          <w:bottom w:val="double" w:sz="6" w:space="1" w:color="auto"/>
+        </w:pBdr>
+        <w:tabs>
+          <w:tab w:val="left" w:pos="3540"/>
+        </w:tabs>
+        <w:rPr>
+          <w:rFonts w:ascii="Segoe UI" w:hAnsi="Segoe UI" w:cs="Segoe UI"/>
+          <w:color w:val="000000"/>
+          <w:sz w:val="26"/>
+          <w:szCs w:val="26"/>
+        </w:rPr>
+      </w:pPr>
+      <w:r>
+        <w:rPr>
+          <w:rFonts w:ascii="Segoe UI" w:hAnsi="Segoe UI" w:cs="Segoe UI"/>
+          <w:color w:val="000000"/>
+          <w:sz w:val="26"/>
+          <w:szCs w:val="26"/>
+        </w:rPr>
+        <w:t>Note that we can not change the props so we use state instead. The other thing is when we are using object of object then we should use the {{ }} “double curly braces”.</w:t>
+      </w:r>
+    </w:p>
+    <w:p>
+      <w:pPr>
+        <w:tabs>
+          <w:tab w:val="left" w:pos="3540"/>
+        </w:tabs>
+        <w:rPr>
+          <w:rFonts w:ascii="Segoe UI" w:hAnsi="Segoe UI" w:cs="Segoe UI"/>
+          <w:b/>
+          <w:bCs/>
+          <w:color w:val="000000"/>
+          <w:sz w:val="40"/>
+          <w:szCs w:val="40"/>
+        </w:rPr>
+      </w:pPr>
+      <w:r>
+        <w:rPr>
+          <w:rFonts w:ascii="Segoe UI" w:hAnsi="Segoe UI" w:cs="Segoe UI"/>
+          <w:b/>
+          <w:bCs/>
+          <w:color w:val="000000"/>
+          <w:sz w:val="40"/>
+          <w:szCs w:val="40"/>
+        </w:rPr>
+        <w:t xml:space="preserve">Tutorial 12: </w:t>
+      </w:r>
+    </w:p>
+    <w:p>
+      <w:pPr>
+        <w:pStyle w:val="ListParagraph"/>
+        <w:numPr>
+          <w:ilvl w:val="0"/>
+          <w:numId w:val="1"/>
+        </w:numPr>
+        <w:tabs>
+          <w:tab w:val="left" w:pos="3540"/>
+        </w:tabs>
+        <w:rPr>
+          <w:rFonts w:ascii="Segoe UI" w:hAnsi="Segoe UI" w:cs="Segoe UI"/>
+          <w:b/>
+          <w:bCs/>
+          <w:color w:val="000000"/>
+          <w:sz w:val="28"/>
+          <w:szCs w:val="28"/>
+        </w:rPr>
+      </w:pPr>
+      <w:r>
+        <w:rPr>
+          <w:rFonts w:ascii="Segoe UI" w:hAnsi="Segoe UI" w:cs="Segoe UI"/>
+          <w:color w:val="000000"/>
+          <w:sz w:val="28"/>
+          <w:szCs w:val="28"/>
+        </w:rPr>
+        <w:t>we can use “ ` ”, this is backtics under Esc, for templating. We can not use template strings inside string. To use templating, we have to use backtics.</w:t>
+      </w:r>
+    </w:p>
+    <w:p>
+      <w:pPr>
+        <w:pStyle w:val="ListParagraph"/>
+        <w:numPr>
+          <w:ilvl w:val="0"/>
+          <w:numId w:val="1"/>
+        </w:numPr>
+        <w:tabs>
+          <w:tab w:val="left" w:pos="3540"/>
+        </w:tabs>
+        <w:rPr>
+          <w:rFonts w:ascii="Segoe UI" w:hAnsi="Segoe UI" w:cs="Segoe UI"/>
+          <w:b/>
+          <w:bCs/>
+          <w:color w:val="000000"/>
+          <w:sz w:val="28"/>
+          <w:szCs w:val="28"/>
+        </w:rPr>
+      </w:pPr>
+      <w:r>
+        <w:rPr>
+          <w:rFonts w:ascii="Segoe UI" w:hAnsi="Segoe UI" w:cs="Segoe UI"/>
+          <w:color w:val="000000"/>
+        </w:rPr>
+        <w:t>We can set style by using {{ }}, That means object of object. Ex:</w:t>
+      </w:r>
+    </w:p>
+    <w:p>
+      <w:pPr>
+        <w:pStyle w:val="ListParagraph"/>
+        <w:numPr>
+          <w:ilvl w:val="1"/>
+          <w:numId w:val="1"/>
+        </w:numPr>
+        <w:tabs>
+          <w:tab w:val="left" w:pos="3540"/>
+        </w:tabs>
+        <w:rPr>
+          <w:rFonts w:ascii="Segoe UI" w:hAnsi="Segoe UI" w:cs="Segoe UI"/>
+          <w:b/>
+          <w:bCs/>
+          <w:color w:val="000000"/>
+          <w:sz w:val="28"/>
+          <w:szCs w:val="28"/>
+        </w:rPr>
+      </w:pPr>
+      <w:r>
+        <w:rPr>
+          <w:rFonts w:ascii="Segoe UI" w:hAnsi="Segoe UI" w:cs="Segoe UI"/>
+          <w:color w:val="000000"/>
+        </w:rPr>
+        <w:t>Style = {{backgroundColor: props.mode === ‘dark’ ? ‘grey’:’white’, color: props.mode === ‘dark’ ? ‘white’:’black’}}</w:t>
+      </w:r>
+    </w:p>
+    <w:p>
+      <w:pPr>
+        <w:pBdr>
+          <w:bottom w:val="double" w:sz="6" w:space="1" w:color="auto"/>
+        </w:pBdr>
+        <w:tabs>
+          <w:tab w:val="left" w:pos="3540"/>
+        </w:tabs>
+        <w:rPr>
+          <w:rFonts w:ascii="Segoe UI" w:hAnsi="Segoe UI" w:cs="Segoe UI"/>
+          <w:b/>
+          <w:bCs/>
+          <w:color w:val="000000"/>
+          <w:sz w:val="28"/>
+          <w:szCs w:val="28"/>
+        </w:rPr>
+      </w:pPr>
+      <w:r>
+        <w:rPr>
+          <w:rFonts w:ascii="Segoe UI" w:hAnsi="Segoe UI" w:cs="Segoe UI"/>
+          <w:b/>
+          <w:bCs/>
+          <w:color w:val="000000"/>
+          <w:sz w:val="28"/>
+          <w:szCs w:val="28"/>
+        </w:rPr>
+        <w:t>===============================================</w:t>
+      </w:r>
+    </w:p>
+    <w:p>
+      <w:pPr>
+        <w:tabs>
+          <w:tab w:val="left" w:pos="3540"/>
+        </w:tabs>
+        <w:rPr>
+          <w:rFonts w:ascii="Segoe UI" w:hAnsi="Segoe UI" w:cs="Segoe UI"/>
+          <w:b/>
+          <w:bCs/>
+          <w:color w:val="000000"/>
+          <w:sz w:val="28"/>
+          <w:szCs w:val="28"/>
+        </w:rPr>
+      </w:pPr>
+      <w:r>
+        <w:rPr>
+          <w:rFonts w:ascii="Segoe UI" w:hAnsi="Segoe UI" w:cs="Segoe UI"/>
+          <w:b/>
+          <w:bCs/>
+          <w:color w:val="000000"/>
+          <w:sz w:val="28"/>
+          <w:szCs w:val="28"/>
+        </w:rPr>
+        <w:t xml:space="preserve">Updating React component: </w:t>
+      </w:r>
+    </w:p>
+    <w:p>
+      <w:pPr>
+        <w:pStyle w:val="ListParagraph"/>
+        <w:numPr>
+          <w:ilvl w:val="0"/>
+          <w:numId w:val="1"/>
+        </w:numPr>
+        <w:tabs>
+          <w:tab w:val="left" w:pos="3540"/>
+        </w:tabs>
+        <w:rPr>
+          <w:rFonts w:ascii="Segoe UI" w:hAnsi="Segoe UI" w:cs="Segoe UI"/>
+          <w:b/>
+          <w:bCs/>
+          <w:color w:val="000000"/>
+          <w:sz w:val="28"/>
+          <w:szCs w:val="28"/>
+        </w:rPr>
+      </w:pPr>
+      <w:r>
+        <w:rPr>
+          <w:rFonts w:ascii="Segoe UI" w:hAnsi="Segoe UI" w:cs="Segoe UI"/>
+          <w:b/>
+          <w:bCs/>
+          <w:color w:val="000000"/>
+          <w:sz w:val="28"/>
+          <w:szCs w:val="28"/>
+        </w:rPr>
+        <w:t>npm install react@18 react-dom@18</w:t>
+      </w:r>
+    </w:p>
+    <w:p>
+      <w:pPr>
+        <w:tabs>
+          <w:tab w:val="left" w:pos="3540"/>
+        </w:tabs>
+        <w:rPr>
+          <w:rFonts w:ascii="Segoe UI" w:hAnsi="Segoe UI" w:cs="Segoe UI"/>
+          <w:b/>
+          <w:bCs/>
+          <w:color w:val="000000"/>
+          <w:sz w:val="28"/>
+          <w:szCs w:val="28"/>
+        </w:rPr>
+      </w:pPr>
+      <w:r>
+        <w:rPr>
+          <w:rFonts w:ascii="Segoe UI" w:hAnsi="Segoe UI" w:cs="Segoe UI"/>
+          <w:b/>
+          <w:bCs/>
+          <w:color w:val="000000"/>
+          <w:sz w:val="28"/>
+          <w:szCs w:val="28"/>
+        </w:rPr>
+        <w:t>Note that in react 18 we can not use ReactDom.render. (in index.html)</w:t>
+      </w:r>
+    </w:p>
+    <w:p>
+      <w:pPr>
+        <w:tabs>
+          <w:tab w:val="left" w:pos="3540"/>
+        </w:tabs>
+        <w:rPr>
+          <w:rFonts w:ascii="Segoe UI" w:hAnsi="Segoe UI" w:cs="Segoe UI"/>
+          <w:b/>
+          <w:bCs/>
+          <w:color w:val="000000"/>
+          <w:sz w:val="28"/>
+          <w:szCs w:val="28"/>
+        </w:rPr>
+      </w:pPr>
+      <w:r>
+        <w:rPr>
+          <w:rFonts w:ascii="Segoe UI" w:hAnsi="Segoe UI" w:cs="Segoe UI"/>
+          <w:b/>
+          <w:bCs/>
+          <w:color w:val="000000"/>
+          <w:sz w:val="28"/>
+          <w:szCs w:val="28"/>
+        </w:rPr>
+        <w:t xml:space="preserve">We can use as following: </w:t>
+      </w:r>
+    </w:p>
+    <w:p>
+      <w:pPr>
+        <w:tabs>
+          <w:tab w:val="left" w:pos="3540"/>
+        </w:tabs>
+        <w:rPr>
+          <w:rFonts w:ascii="Segoe UI" w:hAnsi="Segoe UI" w:cs="Segoe UI"/>
+          <w:b/>
+          <w:bCs/>
+          <w:color w:val="000000"/>
+          <w:sz w:val="28"/>
+          <w:szCs w:val="28"/>
+        </w:rPr>
+      </w:pPr>
+      <w:r>
+        <w:rPr>
+          <w:rFonts w:ascii="Segoe UI" w:hAnsi="Segoe UI" w:cs="Segoe UI"/>
+          <w:b/>
+          <w:bCs/>
+          <w:color w:val="000000"/>
+          <w:sz w:val="28"/>
+          <w:szCs w:val="28"/>
+        </w:rPr>
+        <w:lastRenderedPageBreak/>
+        <w:t>const root = ReactDom.createRoot(document.getelementId(‘root));</w:t>
+      </w:r>
+    </w:p>
+    <w:p>
+      <w:pPr>
+        <w:tabs>
+          <w:tab w:val="left" w:pos="3540"/>
+        </w:tabs>
+        <w:rPr>
+          <w:rFonts w:ascii="Segoe UI" w:hAnsi="Segoe UI" w:cs="Segoe UI"/>
+          <w:b/>
+          <w:bCs/>
+          <w:color w:val="000000"/>
+          <w:sz w:val="28"/>
+          <w:szCs w:val="28"/>
+        </w:rPr>
+      </w:pPr>
+      <w:r>
+        <w:rPr>
+          <w:rFonts w:ascii="Segoe UI" w:hAnsi="Segoe UI" w:cs="Segoe UI"/>
+          <w:b/>
+          <w:bCs/>
+          <w:color w:val="000000"/>
+          <w:sz w:val="28"/>
+          <w:szCs w:val="28"/>
+        </w:rPr>
+        <w:t>root.render(</w:t>
+      </w:r>
+    </w:p>
+    <w:p>
+      <w:pPr>
+        <w:tabs>
+          <w:tab w:val="left" w:pos="3540"/>
+        </w:tabs>
+        <w:rPr>
+          <w:rFonts w:ascii="Segoe UI" w:hAnsi="Segoe UI" w:cs="Segoe UI"/>
+          <w:b/>
+          <w:bCs/>
+          <w:color w:val="000000"/>
+          <w:sz w:val="28"/>
+          <w:szCs w:val="28"/>
+        </w:rPr>
+      </w:pPr>
+      <w:r>
+        <w:rPr>
+          <w:rFonts w:ascii="Segoe UI" w:hAnsi="Segoe UI" w:cs="Segoe UI"/>
+          <w:b/>
+          <w:bCs/>
+          <w:color w:val="000000"/>
+          <w:sz w:val="28"/>
+          <w:szCs w:val="28"/>
+        </w:rPr>
+        <w:t>&lt;App /&gt;; //component.</w:t>
+      </w:r>
+    </w:p>
+    <w:p>
+      <w:pPr>
+        <w:tabs>
+          <w:tab w:val="left" w:pos="3540"/>
+        </w:tabs>
+        <w:rPr>
+          <w:rFonts w:ascii="Segoe UI" w:hAnsi="Segoe UI" w:cs="Segoe UI"/>
+          <w:b/>
+          <w:bCs/>
+          <w:color w:val="000000"/>
+          <w:sz w:val="28"/>
+          <w:szCs w:val="28"/>
+        </w:rPr>
+      </w:pPr>
+      <w:r>
+        <w:rPr>
+          <w:rFonts w:ascii="Segoe UI" w:hAnsi="Segoe UI" w:cs="Segoe UI"/>
+          <w:b/>
+          <w:bCs/>
+          <w:color w:val="000000"/>
+          <w:sz w:val="28"/>
+          <w:szCs w:val="28"/>
+        </w:rPr>
+        <w:t>)</w:t>
+      </w:r>
     </w:p>
     <w:sectPr>
       <w:pgSz w:w="12240" w:h="15840"/>

</xml_diff>

<commit_message>
Custom theme plus Learning basic about react router of git.
</commit_message>
<xml_diff>
--- a/Code With Harry Tutorials.docx
+++ b/Code With Harry Tutorials.docx
@@ -2792,6 +2792,9 @@
     </w:p>
     <w:p>
       <w:pPr>
+        <w:pBdr>
+          <w:bottom w:val="double" w:sz="6" w:space="1" w:color="auto"/>
+        </w:pBdr>
         <w:tabs>
           <w:tab w:val="left" w:pos="3540"/>
         </w:tabs>
@@ -2814,6 +2817,1780 @@
           <w:szCs w:val="28"/>
         </w:rPr>
         <w:t>)</w:t>
+      </w:r>
+    </w:p>
+    <w:p>
+      <w:pPr>
+        <w:tabs>
+          <w:tab w:val="left" w:pos="3540"/>
+        </w:tabs>
+        <w:rPr>
+          <w:rFonts w:ascii="Segoe UI" w:hAnsi="Segoe UI" w:cs="Segoe UI"/>
+          <w:color w:val="000000"/>
+          <w:sz w:val="28"/>
+          <w:szCs w:val="28"/>
+        </w:rPr>
+      </w:pPr>
+    </w:p>
+    <w:p>
+      <w:pPr>
+        <w:tabs>
+          <w:tab w:val="left" w:pos="3540"/>
+        </w:tabs>
+        <w:rPr>
+          <w:rFonts w:ascii="Segoe UI" w:hAnsi="Segoe UI" w:cs="Segoe UI"/>
+          <w:b/>
+          <w:bCs/>
+          <w:color w:val="000000"/>
+          <w:sz w:val="52"/>
+          <w:szCs w:val="52"/>
+        </w:rPr>
+      </w:pPr>
+      <w:r>
+        <w:rPr>
+          <w:rFonts w:ascii="Segoe UI" w:hAnsi="Segoe UI" w:cs="Segoe UI"/>
+          <w:b/>
+          <w:bCs/>
+          <w:color w:val="000000"/>
+          <w:sz w:val="52"/>
+          <w:szCs w:val="52"/>
+        </w:rPr>
+        <w:t>React Router:</w:t>
+      </w:r>
+    </w:p>
+    <w:p>
+      <w:pPr>
+        <w:tabs>
+          <w:tab w:val="left" w:pos="3540"/>
+        </w:tabs>
+        <w:rPr>
+          <w:rFonts w:ascii="Segoe UI" w:hAnsi="Segoe UI" w:cs="Segoe UI"/>
+          <w:color w:val="000000"/>
+          <w:sz w:val="28"/>
+          <w:szCs w:val="28"/>
+        </w:rPr>
+      </w:pPr>
+      <w:r>
+        <w:rPr>
+          <w:rFonts w:ascii="Segoe UI" w:hAnsi="Segoe UI" w:cs="Segoe UI"/>
+          <w:color w:val="000000"/>
+          <w:sz w:val="28"/>
+          <w:szCs w:val="28"/>
+        </w:rPr>
+        <w:t>React router used to change the particular component without reloading the page. To install the router:</w:t>
+      </w:r>
+    </w:p>
+    <w:p>
+      <w:pPr>
+        <w:pStyle w:val="ListParagraph"/>
+        <w:numPr>
+          <w:ilvl w:val="0"/>
+          <w:numId w:val="1"/>
+        </w:numPr>
+        <w:tabs>
+          <w:tab w:val="left" w:pos="3540"/>
+        </w:tabs>
+        <w:rPr>
+          <w:rFonts w:ascii="Segoe UI" w:hAnsi="Segoe UI" w:cs="Segoe UI"/>
+          <w:color w:val="000000"/>
+          <w:sz w:val="28"/>
+          <w:szCs w:val="28"/>
+        </w:rPr>
+      </w:pPr>
+      <w:r>
+        <w:rPr>
+          <w:rFonts w:ascii="Consolas" w:hAnsi="Consolas"/>
+          <w:color w:val="B6B6B6"/>
+          <w:sz w:val="21"/>
+          <w:szCs w:val="21"/>
+          <w:shd w:val="clear" w:color="auto" w:fill="1E1E1E"/>
+        </w:rPr>
+        <w:t>npm install react-router-dom</w:t>
+      </w:r>
+    </w:p>
+    <w:p>
+      <w:pPr>
+        <w:tabs>
+          <w:tab w:val="left" w:pos="3540"/>
+        </w:tabs>
+        <w:rPr>
+          <w:rFonts w:ascii="Segoe UI" w:hAnsi="Segoe UI" w:cs="Segoe UI"/>
+          <w:color w:val="000000"/>
+          <w:sz w:val="28"/>
+          <w:szCs w:val="28"/>
+        </w:rPr>
+      </w:pPr>
+      <w:r>
+        <w:rPr>
+          <w:rFonts w:ascii="Segoe UI" w:hAnsi="Segoe UI" w:cs="Segoe UI"/>
+          <w:color w:val="000000"/>
+          <w:sz w:val="28"/>
+          <w:szCs w:val="28"/>
+        </w:rPr>
+        <w:t>In react Router we have to import it.</w:t>
+      </w:r>
+    </w:p>
+    <w:p>
+      <w:pPr>
+        <w:shd w:val="clear" w:color="auto" w:fill="1E1E1E"/>
+        <w:spacing w:after="0" w:line="285" w:lineRule="atLeast"/>
+        <w:rPr>
+          <w:rFonts w:ascii="Consolas" w:eastAsia="Times New Roman" w:hAnsi="Consolas" w:cs="Times New Roman"/>
+          <w:color w:val="D4D4D4"/>
+          <w:sz w:val="21"/>
+          <w:szCs w:val="21"/>
+        </w:rPr>
+      </w:pPr>
+      <w:r>
+        <w:rPr>
+          <w:rFonts w:ascii="Consolas" w:eastAsia="Times New Roman" w:hAnsi="Consolas" w:cs="Times New Roman"/>
+          <w:color w:val="569CD6"/>
+          <w:sz w:val="21"/>
+          <w:szCs w:val="21"/>
+        </w:rPr>
+        <w:t>import</w:t>
+      </w:r>
+      <w:r>
+        <w:rPr>
+          <w:rFonts w:ascii="Consolas" w:eastAsia="Times New Roman" w:hAnsi="Consolas" w:cs="Times New Roman"/>
+          <w:color w:val="D4D4D4"/>
+          <w:sz w:val="21"/>
+          <w:szCs w:val="21"/>
+        </w:rPr>
+        <w:t xml:space="preserve"> {</w:t>
+      </w:r>
+    </w:p>
+    <w:p>
+      <w:pPr>
+        <w:shd w:val="clear" w:color="auto" w:fill="1E1E1E"/>
+        <w:spacing w:after="0" w:line="285" w:lineRule="atLeast"/>
+        <w:rPr>
+          <w:rFonts w:ascii="Consolas" w:eastAsia="Times New Roman" w:hAnsi="Consolas" w:cs="Times New Roman"/>
+          <w:color w:val="D4D4D4"/>
+          <w:sz w:val="21"/>
+          <w:szCs w:val="21"/>
+        </w:rPr>
+      </w:pPr>
+      <w:r>
+        <w:rPr>
+          <w:rFonts w:ascii="Consolas" w:eastAsia="Times New Roman" w:hAnsi="Consolas" w:cs="Times New Roman"/>
+          <w:color w:val="D4D4D4"/>
+          <w:sz w:val="21"/>
+          <w:szCs w:val="21"/>
+        </w:rPr>
+        <w:t xml:space="preserve">  BrowserRouter </w:t>
+      </w:r>
+      <w:r>
+        <w:rPr>
+          <w:rFonts w:ascii="Consolas" w:eastAsia="Times New Roman" w:hAnsi="Consolas" w:cs="Times New Roman"/>
+          <w:color w:val="569CD6"/>
+          <w:sz w:val="21"/>
+          <w:szCs w:val="21"/>
+        </w:rPr>
+        <w:t>as</w:t>
+      </w:r>
+      <w:r>
+        <w:rPr>
+          <w:rFonts w:ascii="Consolas" w:eastAsia="Times New Roman" w:hAnsi="Consolas" w:cs="Times New Roman"/>
+          <w:color w:val="D4D4D4"/>
+          <w:sz w:val="21"/>
+          <w:szCs w:val="21"/>
+        </w:rPr>
+        <w:t xml:space="preserve"> Router,</w:t>
+      </w:r>
+    </w:p>
+    <w:p>
+      <w:pPr>
+        <w:shd w:val="clear" w:color="auto" w:fill="1E1E1E"/>
+        <w:spacing w:after="0" w:line="285" w:lineRule="atLeast"/>
+        <w:rPr>
+          <w:rFonts w:ascii="Consolas" w:eastAsia="Times New Roman" w:hAnsi="Consolas" w:cs="Times New Roman"/>
+          <w:color w:val="D4D4D4"/>
+          <w:sz w:val="21"/>
+          <w:szCs w:val="21"/>
+        </w:rPr>
+      </w:pPr>
+      <w:r>
+        <w:rPr>
+          <w:rFonts w:ascii="Consolas" w:eastAsia="Times New Roman" w:hAnsi="Consolas" w:cs="Times New Roman"/>
+          <w:color w:val="D4D4D4"/>
+          <w:sz w:val="21"/>
+          <w:szCs w:val="21"/>
+        </w:rPr>
+        <w:t>  Routes,</w:t>
+      </w:r>
+    </w:p>
+    <w:p>
+      <w:pPr>
+        <w:shd w:val="clear" w:color="auto" w:fill="1E1E1E"/>
+        <w:spacing w:after="0" w:line="285" w:lineRule="atLeast"/>
+        <w:rPr>
+          <w:rFonts w:ascii="Consolas" w:eastAsia="Times New Roman" w:hAnsi="Consolas" w:cs="Times New Roman"/>
+          <w:color w:val="D4D4D4"/>
+          <w:sz w:val="21"/>
+          <w:szCs w:val="21"/>
+        </w:rPr>
+      </w:pPr>
+      <w:r>
+        <w:rPr>
+          <w:rFonts w:ascii="Consolas" w:eastAsia="Times New Roman" w:hAnsi="Consolas" w:cs="Times New Roman"/>
+          <w:color w:val="D4D4D4"/>
+          <w:sz w:val="21"/>
+          <w:szCs w:val="21"/>
+        </w:rPr>
+        <w:t>  Route,</w:t>
+      </w:r>
+    </w:p>
+    <w:p>
+      <w:pPr>
+        <w:shd w:val="clear" w:color="auto" w:fill="1E1E1E"/>
+        <w:spacing w:after="0" w:line="285" w:lineRule="atLeast"/>
+        <w:rPr>
+          <w:rFonts w:ascii="Consolas" w:eastAsia="Times New Roman" w:hAnsi="Consolas" w:cs="Times New Roman"/>
+          <w:color w:val="D4D4D4"/>
+          <w:sz w:val="21"/>
+          <w:szCs w:val="21"/>
+        </w:rPr>
+      </w:pPr>
+      <w:r>
+        <w:rPr>
+          <w:rFonts w:ascii="Consolas" w:eastAsia="Times New Roman" w:hAnsi="Consolas" w:cs="Times New Roman"/>
+          <w:color w:val="D4D4D4"/>
+          <w:sz w:val="21"/>
+          <w:szCs w:val="21"/>
+        </w:rPr>
+        <w:t>  Link</w:t>
+      </w:r>
+    </w:p>
+    <w:p>
+      <w:pPr>
+        <w:shd w:val="clear" w:color="auto" w:fill="1E1E1E"/>
+        <w:spacing w:after="0" w:line="285" w:lineRule="atLeast"/>
+        <w:rPr>
+          <w:rFonts w:ascii="Consolas" w:eastAsia="Times New Roman" w:hAnsi="Consolas" w:cs="Times New Roman"/>
+          <w:color w:val="D4D4D4"/>
+          <w:sz w:val="21"/>
+          <w:szCs w:val="21"/>
+        </w:rPr>
+      </w:pPr>
+      <w:r>
+        <w:rPr>
+          <w:rFonts w:ascii="Consolas" w:eastAsia="Times New Roman" w:hAnsi="Consolas" w:cs="Times New Roman"/>
+          <w:color w:val="D4D4D4"/>
+          <w:sz w:val="21"/>
+          <w:szCs w:val="21"/>
+        </w:rPr>
+        <w:t xml:space="preserve">} </w:t>
+      </w:r>
+      <w:r>
+        <w:rPr>
+          <w:rFonts w:ascii="Consolas" w:eastAsia="Times New Roman" w:hAnsi="Consolas" w:cs="Times New Roman"/>
+          <w:color w:val="569CD6"/>
+          <w:sz w:val="21"/>
+          <w:szCs w:val="21"/>
+        </w:rPr>
+        <w:t>from</w:t>
+      </w:r>
+      <w:r>
+        <w:rPr>
+          <w:rFonts w:ascii="Consolas" w:eastAsia="Times New Roman" w:hAnsi="Consolas" w:cs="Times New Roman"/>
+          <w:color w:val="D4D4D4"/>
+          <w:sz w:val="21"/>
+          <w:szCs w:val="21"/>
+        </w:rPr>
+        <w:t xml:space="preserve"> </w:t>
+      </w:r>
+      <w:r>
+        <w:rPr>
+          <w:rFonts w:ascii="Consolas" w:eastAsia="Times New Roman" w:hAnsi="Consolas" w:cs="Times New Roman"/>
+          <w:color w:val="CE9178"/>
+          <w:sz w:val="21"/>
+          <w:szCs w:val="21"/>
+        </w:rPr>
+        <w:t>"react-router-dom"</w:t>
+      </w:r>
+      <w:r>
+        <w:rPr>
+          <w:rFonts w:ascii="Consolas" w:eastAsia="Times New Roman" w:hAnsi="Consolas" w:cs="Times New Roman"/>
+          <w:color w:val="D4D4D4"/>
+          <w:sz w:val="21"/>
+          <w:szCs w:val="21"/>
+        </w:rPr>
+        <w:t>;</w:t>
+      </w:r>
+    </w:p>
+    <w:p>
+      <w:pPr>
+        <w:tabs>
+          <w:tab w:val="left" w:pos="3540"/>
+        </w:tabs>
+        <w:rPr>
+          <w:rFonts w:ascii="Segoe UI" w:hAnsi="Segoe UI" w:cs="Segoe UI"/>
+          <w:color w:val="000000"/>
+          <w:sz w:val="28"/>
+          <w:szCs w:val="28"/>
+        </w:rPr>
+      </w:pPr>
+    </w:p>
+    <w:p>
+      <w:pPr>
+        <w:tabs>
+          <w:tab w:val="left" w:pos="3540"/>
+        </w:tabs>
+        <w:rPr>
+          <w:rFonts w:ascii="Segoe UI" w:hAnsi="Segoe UI" w:cs="Segoe UI"/>
+          <w:color w:val="000000"/>
+          <w:sz w:val="28"/>
+          <w:szCs w:val="28"/>
+        </w:rPr>
+      </w:pPr>
+    </w:p>
+    <w:p>
+      <w:pPr>
+        <w:shd w:val="clear" w:color="auto" w:fill="1E1E1E"/>
+        <w:spacing w:after="0" w:line="285" w:lineRule="atLeast"/>
+        <w:rPr>
+          <w:rFonts w:ascii="Consolas" w:eastAsia="Times New Roman" w:hAnsi="Consolas" w:cs="Times New Roman"/>
+          <w:color w:val="D4D4D4"/>
+          <w:sz w:val="21"/>
+          <w:szCs w:val="21"/>
+        </w:rPr>
+      </w:pPr>
+      <w:r>
+        <w:rPr>
+          <w:rFonts w:ascii="Consolas" w:eastAsia="Times New Roman" w:hAnsi="Consolas" w:cs="Times New Roman"/>
+          <w:color w:val="808080"/>
+          <w:sz w:val="21"/>
+          <w:szCs w:val="21"/>
+        </w:rPr>
+        <w:t>&lt;</w:t>
+      </w:r>
+      <w:r>
+        <w:rPr>
+          <w:rFonts w:ascii="Consolas" w:eastAsia="Times New Roman" w:hAnsi="Consolas" w:cs="Times New Roman"/>
+          <w:color w:val="569CD6"/>
+          <w:sz w:val="21"/>
+          <w:szCs w:val="21"/>
+        </w:rPr>
+        <w:t>Router</w:t>
+      </w:r>
+      <w:r>
+        <w:rPr>
+          <w:rFonts w:ascii="Consolas" w:eastAsia="Times New Roman" w:hAnsi="Consolas" w:cs="Times New Roman"/>
+          <w:color w:val="808080"/>
+          <w:sz w:val="21"/>
+          <w:szCs w:val="21"/>
+        </w:rPr>
+        <w:t>&gt;</w:t>
+      </w:r>
+    </w:p>
+    <w:p>
+      <w:pPr>
+        <w:shd w:val="clear" w:color="auto" w:fill="1E1E1E"/>
+        <w:spacing w:after="0" w:line="285" w:lineRule="atLeast"/>
+        <w:rPr>
+          <w:rFonts w:ascii="Consolas" w:eastAsia="Times New Roman" w:hAnsi="Consolas" w:cs="Times New Roman"/>
+          <w:color w:val="D4D4D4"/>
+          <w:sz w:val="21"/>
+          <w:szCs w:val="21"/>
+        </w:rPr>
+      </w:pPr>
+      <w:r>
+        <w:rPr>
+          <w:rFonts w:ascii="Consolas" w:eastAsia="Times New Roman" w:hAnsi="Consolas" w:cs="Times New Roman"/>
+          <w:color w:val="D4D4D4"/>
+          <w:sz w:val="21"/>
+          <w:szCs w:val="21"/>
+        </w:rPr>
+        <w:t xml:space="preserve">      </w:t>
+      </w:r>
+      <w:r>
+        <w:rPr>
+          <w:rFonts w:ascii="Consolas" w:eastAsia="Times New Roman" w:hAnsi="Consolas" w:cs="Times New Roman"/>
+          <w:color w:val="808080"/>
+          <w:sz w:val="21"/>
+          <w:szCs w:val="21"/>
+        </w:rPr>
+        <w:t>&lt;</w:t>
+      </w:r>
+      <w:r>
+        <w:rPr>
+          <w:rFonts w:ascii="Consolas" w:eastAsia="Times New Roman" w:hAnsi="Consolas" w:cs="Times New Roman"/>
+          <w:color w:val="569CD6"/>
+          <w:sz w:val="21"/>
+          <w:szCs w:val="21"/>
+        </w:rPr>
+        <w:t>Navbar</w:t>
+      </w:r>
+      <w:r>
+        <w:rPr>
+          <w:rFonts w:ascii="Consolas" w:eastAsia="Times New Roman" w:hAnsi="Consolas" w:cs="Times New Roman"/>
+          <w:color w:val="D4D4D4"/>
+          <w:sz w:val="21"/>
+          <w:szCs w:val="21"/>
+        </w:rPr>
+        <w:t xml:space="preserve"> </w:t>
+      </w:r>
+      <w:r>
+        <w:rPr>
+          <w:rFonts w:ascii="Consolas" w:eastAsia="Times New Roman" w:hAnsi="Consolas" w:cs="Times New Roman"/>
+          <w:color w:val="9CDCFE"/>
+          <w:sz w:val="21"/>
+          <w:szCs w:val="21"/>
+        </w:rPr>
+        <w:t>title</w:t>
+      </w:r>
+      <w:r>
+        <w:rPr>
+          <w:rFonts w:ascii="Consolas" w:eastAsia="Times New Roman" w:hAnsi="Consolas" w:cs="Times New Roman"/>
+          <w:color w:val="D4D4D4"/>
+          <w:sz w:val="21"/>
+          <w:szCs w:val="21"/>
+        </w:rPr>
+        <w:t>=</w:t>
+      </w:r>
+      <w:r>
+        <w:rPr>
+          <w:rFonts w:ascii="Consolas" w:eastAsia="Times New Roman" w:hAnsi="Consolas" w:cs="Times New Roman"/>
+          <w:color w:val="CE9178"/>
+          <w:sz w:val="21"/>
+          <w:szCs w:val="21"/>
+        </w:rPr>
+        <w:t>"TextUtils"</w:t>
+      </w:r>
+      <w:r>
+        <w:rPr>
+          <w:rFonts w:ascii="Consolas" w:eastAsia="Times New Roman" w:hAnsi="Consolas" w:cs="Times New Roman"/>
+          <w:color w:val="D4D4D4"/>
+          <w:sz w:val="21"/>
+          <w:szCs w:val="21"/>
+        </w:rPr>
+        <w:t xml:space="preserve"> </w:t>
+      </w:r>
+      <w:r>
+        <w:rPr>
+          <w:rFonts w:ascii="Consolas" w:eastAsia="Times New Roman" w:hAnsi="Consolas" w:cs="Times New Roman"/>
+          <w:color w:val="9CDCFE"/>
+          <w:sz w:val="21"/>
+          <w:szCs w:val="21"/>
+        </w:rPr>
+        <w:t>mode</w:t>
+      </w:r>
+      <w:r>
+        <w:rPr>
+          <w:rFonts w:ascii="Consolas" w:eastAsia="Times New Roman" w:hAnsi="Consolas" w:cs="Times New Roman"/>
+          <w:color w:val="D4D4D4"/>
+          <w:sz w:val="21"/>
+          <w:szCs w:val="21"/>
+        </w:rPr>
+        <w:t xml:space="preserve"> = </w:t>
+      </w:r>
+      <w:r>
+        <w:rPr>
+          <w:rFonts w:ascii="Consolas" w:eastAsia="Times New Roman" w:hAnsi="Consolas" w:cs="Times New Roman"/>
+          <w:color w:val="569CD6"/>
+          <w:sz w:val="21"/>
+          <w:szCs w:val="21"/>
+        </w:rPr>
+        <w:t>{</w:t>
+      </w:r>
+      <w:r>
+        <w:rPr>
+          <w:rFonts w:ascii="Consolas" w:eastAsia="Times New Roman" w:hAnsi="Consolas" w:cs="Times New Roman"/>
+          <w:color w:val="D4D4D4"/>
+          <w:sz w:val="21"/>
+          <w:szCs w:val="21"/>
+        </w:rPr>
+        <w:t>mode</w:t>
+      </w:r>
+      <w:r>
+        <w:rPr>
+          <w:rFonts w:ascii="Consolas" w:eastAsia="Times New Roman" w:hAnsi="Consolas" w:cs="Times New Roman"/>
+          <w:color w:val="569CD6"/>
+          <w:sz w:val="21"/>
+          <w:szCs w:val="21"/>
+        </w:rPr>
+        <w:t>}</w:t>
+      </w:r>
+      <w:r>
+        <w:rPr>
+          <w:rFonts w:ascii="Consolas" w:eastAsia="Times New Roman" w:hAnsi="Consolas" w:cs="Times New Roman"/>
+          <w:color w:val="D4D4D4"/>
+          <w:sz w:val="21"/>
+          <w:szCs w:val="21"/>
+        </w:rPr>
+        <w:t xml:space="preserve"> </w:t>
+      </w:r>
+      <w:r>
+        <w:rPr>
+          <w:rFonts w:ascii="Consolas" w:eastAsia="Times New Roman" w:hAnsi="Consolas" w:cs="Times New Roman"/>
+          <w:color w:val="9CDCFE"/>
+          <w:sz w:val="21"/>
+          <w:szCs w:val="21"/>
+        </w:rPr>
+        <w:t>toogleMode</w:t>
+      </w:r>
+      <w:r>
+        <w:rPr>
+          <w:rFonts w:ascii="Consolas" w:eastAsia="Times New Roman" w:hAnsi="Consolas" w:cs="Times New Roman"/>
+          <w:color w:val="D4D4D4"/>
+          <w:sz w:val="21"/>
+          <w:szCs w:val="21"/>
+        </w:rPr>
+        <w:t>=</w:t>
+      </w:r>
+      <w:r>
+        <w:rPr>
+          <w:rFonts w:ascii="Consolas" w:eastAsia="Times New Roman" w:hAnsi="Consolas" w:cs="Times New Roman"/>
+          <w:color w:val="569CD6"/>
+          <w:sz w:val="21"/>
+          <w:szCs w:val="21"/>
+        </w:rPr>
+        <w:t>{</w:t>
+      </w:r>
+      <w:r>
+        <w:rPr>
+          <w:rFonts w:ascii="Consolas" w:eastAsia="Times New Roman" w:hAnsi="Consolas" w:cs="Times New Roman"/>
+          <w:color w:val="D4D4D4"/>
+          <w:sz w:val="21"/>
+          <w:szCs w:val="21"/>
+        </w:rPr>
+        <w:t>tooglemode</w:t>
+      </w:r>
+      <w:r>
+        <w:rPr>
+          <w:rFonts w:ascii="Consolas" w:eastAsia="Times New Roman" w:hAnsi="Consolas" w:cs="Times New Roman"/>
+          <w:color w:val="569CD6"/>
+          <w:sz w:val="21"/>
+          <w:szCs w:val="21"/>
+        </w:rPr>
+        <w:t>}</w:t>
+      </w:r>
+      <w:r>
+        <w:rPr>
+          <w:rFonts w:ascii="Consolas" w:eastAsia="Times New Roman" w:hAnsi="Consolas" w:cs="Times New Roman"/>
+          <w:color w:val="D4D4D4"/>
+          <w:sz w:val="21"/>
+          <w:szCs w:val="21"/>
+        </w:rPr>
+        <w:t xml:space="preserve"> </w:t>
+      </w:r>
+      <w:r>
+        <w:rPr>
+          <w:rFonts w:ascii="Consolas" w:eastAsia="Times New Roman" w:hAnsi="Consolas" w:cs="Times New Roman"/>
+          <w:color w:val="9CDCFE"/>
+          <w:sz w:val="21"/>
+          <w:szCs w:val="21"/>
+        </w:rPr>
+        <w:t>switchMode</w:t>
+      </w:r>
+      <w:r>
+        <w:rPr>
+          <w:rFonts w:ascii="Consolas" w:eastAsia="Times New Roman" w:hAnsi="Consolas" w:cs="Times New Roman"/>
+          <w:color w:val="D4D4D4"/>
+          <w:sz w:val="21"/>
+          <w:szCs w:val="21"/>
+        </w:rPr>
+        <w:t>=</w:t>
+      </w:r>
+      <w:r>
+        <w:rPr>
+          <w:rFonts w:ascii="Consolas" w:eastAsia="Times New Roman" w:hAnsi="Consolas" w:cs="Times New Roman"/>
+          <w:color w:val="569CD6"/>
+          <w:sz w:val="21"/>
+          <w:szCs w:val="21"/>
+        </w:rPr>
+        <w:t>{</w:t>
+      </w:r>
+      <w:r>
+        <w:rPr>
+          <w:rFonts w:ascii="Consolas" w:eastAsia="Times New Roman" w:hAnsi="Consolas" w:cs="Times New Roman"/>
+          <w:color w:val="D4D4D4"/>
+          <w:sz w:val="21"/>
+          <w:szCs w:val="21"/>
+        </w:rPr>
+        <w:t>switchMode</w:t>
+      </w:r>
+      <w:r>
+        <w:rPr>
+          <w:rFonts w:ascii="Consolas" w:eastAsia="Times New Roman" w:hAnsi="Consolas" w:cs="Times New Roman"/>
+          <w:color w:val="569CD6"/>
+          <w:sz w:val="21"/>
+          <w:szCs w:val="21"/>
+        </w:rPr>
+        <w:t>}</w:t>
+      </w:r>
+      <w:r>
+        <w:rPr>
+          <w:rFonts w:ascii="Consolas" w:eastAsia="Times New Roman" w:hAnsi="Consolas" w:cs="Times New Roman"/>
+          <w:color w:val="808080"/>
+          <w:sz w:val="21"/>
+          <w:szCs w:val="21"/>
+        </w:rPr>
+        <w:t>/&gt;</w:t>
+      </w:r>
+    </w:p>
+    <w:p>
+      <w:pPr>
+        <w:shd w:val="clear" w:color="auto" w:fill="1E1E1E"/>
+        <w:spacing w:after="0" w:line="285" w:lineRule="atLeast"/>
+        <w:rPr>
+          <w:rFonts w:ascii="Consolas" w:eastAsia="Times New Roman" w:hAnsi="Consolas" w:cs="Times New Roman"/>
+          <w:color w:val="D4D4D4"/>
+          <w:sz w:val="21"/>
+          <w:szCs w:val="21"/>
+        </w:rPr>
+      </w:pPr>
+      <w:r>
+        <w:rPr>
+          <w:rFonts w:ascii="Consolas" w:eastAsia="Times New Roman" w:hAnsi="Consolas" w:cs="Times New Roman"/>
+          <w:color w:val="D4D4D4"/>
+          <w:sz w:val="21"/>
+          <w:szCs w:val="21"/>
+        </w:rPr>
+        <w:t xml:space="preserve">      </w:t>
+      </w:r>
+      <w:r>
+        <w:rPr>
+          <w:rFonts w:ascii="Consolas" w:eastAsia="Times New Roman" w:hAnsi="Consolas" w:cs="Times New Roman"/>
+          <w:color w:val="808080"/>
+          <w:sz w:val="21"/>
+          <w:szCs w:val="21"/>
+        </w:rPr>
+        <w:t>&lt;</w:t>
+      </w:r>
+      <w:r>
+        <w:rPr>
+          <w:rFonts w:ascii="Consolas" w:eastAsia="Times New Roman" w:hAnsi="Consolas" w:cs="Times New Roman"/>
+          <w:color w:val="569CD6"/>
+          <w:sz w:val="21"/>
+          <w:szCs w:val="21"/>
+        </w:rPr>
+        <w:t>Alert</w:t>
+      </w:r>
+      <w:r>
+        <w:rPr>
+          <w:rFonts w:ascii="Consolas" w:eastAsia="Times New Roman" w:hAnsi="Consolas" w:cs="Times New Roman"/>
+          <w:color w:val="D4D4D4"/>
+          <w:sz w:val="21"/>
+          <w:szCs w:val="21"/>
+        </w:rPr>
+        <w:t xml:space="preserve"> </w:t>
+      </w:r>
+      <w:r>
+        <w:rPr>
+          <w:rFonts w:ascii="Consolas" w:eastAsia="Times New Roman" w:hAnsi="Consolas" w:cs="Times New Roman"/>
+          <w:color w:val="9CDCFE"/>
+          <w:sz w:val="21"/>
+          <w:szCs w:val="21"/>
+        </w:rPr>
+        <w:t>alert</w:t>
+      </w:r>
+      <w:r>
+        <w:rPr>
+          <w:rFonts w:ascii="Consolas" w:eastAsia="Times New Roman" w:hAnsi="Consolas" w:cs="Times New Roman"/>
+          <w:color w:val="D4D4D4"/>
+          <w:sz w:val="21"/>
+          <w:szCs w:val="21"/>
+        </w:rPr>
+        <w:t>=</w:t>
+      </w:r>
+      <w:r>
+        <w:rPr>
+          <w:rFonts w:ascii="Consolas" w:eastAsia="Times New Roman" w:hAnsi="Consolas" w:cs="Times New Roman"/>
+          <w:color w:val="569CD6"/>
+          <w:sz w:val="21"/>
+          <w:szCs w:val="21"/>
+        </w:rPr>
+        <w:t>{</w:t>
+      </w:r>
+      <w:r>
+        <w:rPr>
+          <w:rFonts w:ascii="Consolas" w:eastAsia="Times New Roman" w:hAnsi="Consolas" w:cs="Times New Roman"/>
+          <w:color w:val="D4D4D4"/>
+          <w:sz w:val="21"/>
+          <w:szCs w:val="21"/>
+        </w:rPr>
+        <w:t>alert</w:t>
+      </w:r>
+      <w:r>
+        <w:rPr>
+          <w:rFonts w:ascii="Consolas" w:eastAsia="Times New Roman" w:hAnsi="Consolas" w:cs="Times New Roman"/>
+          <w:color w:val="569CD6"/>
+          <w:sz w:val="21"/>
+          <w:szCs w:val="21"/>
+        </w:rPr>
+        <w:t>}</w:t>
+      </w:r>
+      <w:r>
+        <w:rPr>
+          <w:rFonts w:ascii="Consolas" w:eastAsia="Times New Roman" w:hAnsi="Consolas" w:cs="Times New Roman"/>
+          <w:color w:val="808080"/>
+          <w:sz w:val="21"/>
+          <w:szCs w:val="21"/>
+        </w:rPr>
+        <w:t>/&gt;</w:t>
+      </w:r>
+    </w:p>
+    <w:p>
+      <w:pPr>
+        <w:shd w:val="clear" w:color="auto" w:fill="1E1E1E"/>
+        <w:spacing w:after="0" w:line="285" w:lineRule="atLeast"/>
+        <w:rPr>
+          <w:rFonts w:ascii="Consolas" w:eastAsia="Times New Roman" w:hAnsi="Consolas" w:cs="Times New Roman"/>
+          <w:color w:val="D4D4D4"/>
+          <w:sz w:val="21"/>
+          <w:szCs w:val="21"/>
+        </w:rPr>
+      </w:pPr>
+      <w:r>
+        <w:rPr>
+          <w:rFonts w:ascii="Consolas" w:eastAsia="Times New Roman" w:hAnsi="Consolas" w:cs="Times New Roman"/>
+          <w:color w:val="D4D4D4"/>
+          <w:sz w:val="21"/>
+          <w:szCs w:val="21"/>
+        </w:rPr>
+        <w:t xml:space="preserve">      </w:t>
+      </w:r>
+      <w:r>
+        <w:rPr>
+          <w:rFonts w:ascii="Consolas" w:eastAsia="Times New Roman" w:hAnsi="Consolas" w:cs="Times New Roman"/>
+          <w:color w:val="569CD6"/>
+          <w:sz w:val="21"/>
+          <w:szCs w:val="21"/>
+        </w:rPr>
+        <w:t>{</w:t>
+      </w:r>
+      <w:r>
+        <w:rPr>
+          <w:rFonts w:ascii="Consolas" w:eastAsia="Times New Roman" w:hAnsi="Consolas" w:cs="Times New Roman"/>
+          <w:color w:val="6A9955"/>
+          <w:sz w:val="21"/>
+          <w:szCs w:val="21"/>
+        </w:rPr>
+        <w:t>/* I am trying to use Router For better user experience.  */</w:t>
+      </w:r>
+      <w:r>
+        <w:rPr>
+          <w:rFonts w:ascii="Consolas" w:eastAsia="Times New Roman" w:hAnsi="Consolas" w:cs="Times New Roman"/>
+          <w:color w:val="569CD6"/>
+          <w:sz w:val="21"/>
+          <w:szCs w:val="21"/>
+        </w:rPr>
+        <w:t>}</w:t>
+      </w:r>
+    </w:p>
+    <w:p>
+      <w:pPr>
+        <w:shd w:val="clear" w:color="auto" w:fill="1E1E1E"/>
+        <w:spacing w:after="0" w:line="285" w:lineRule="atLeast"/>
+        <w:rPr>
+          <w:rFonts w:ascii="Consolas" w:eastAsia="Times New Roman" w:hAnsi="Consolas" w:cs="Times New Roman"/>
+          <w:color w:val="D4D4D4"/>
+          <w:sz w:val="21"/>
+          <w:szCs w:val="21"/>
+        </w:rPr>
+      </w:pPr>
+      <w:r>
+        <w:rPr>
+          <w:rFonts w:ascii="Consolas" w:eastAsia="Times New Roman" w:hAnsi="Consolas" w:cs="Times New Roman"/>
+          <w:color w:val="D4D4D4"/>
+          <w:sz w:val="21"/>
+          <w:szCs w:val="21"/>
+        </w:rPr>
+        <w:t xml:space="preserve">      </w:t>
+      </w:r>
+      <w:r>
+        <w:rPr>
+          <w:rFonts w:ascii="Consolas" w:eastAsia="Times New Roman" w:hAnsi="Consolas" w:cs="Times New Roman"/>
+          <w:color w:val="808080"/>
+          <w:sz w:val="21"/>
+          <w:szCs w:val="21"/>
+        </w:rPr>
+        <w:t>&lt;</w:t>
+      </w:r>
+      <w:r>
+        <w:rPr>
+          <w:rFonts w:ascii="Consolas" w:eastAsia="Times New Roman" w:hAnsi="Consolas" w:cs="Times New Roman"/>
+          <w:color w:val="569CD6"/>
+          <w:sz w:val="21"/>
+          <w:szCs w:val="21"/>
+        </w:rPr>
+        <w:t>Routes</w:t>
+      </w:r>
+      <w:r>
+        <w:rPr>
+          <w:rFonts w:ascii="Consolas" w:eastAsia="Times New Roman" w:hAnsi="Consolas" w:cs="Times New Roman"/>
+          <w:color w:val="808080"/>
+          <w:sz w:val="21"/>
+          <w:szCs w:val="21"/>
+        </w:rPr>
+        <w:t>&gt;</w:t>
+      </w:r>
+    </w:p>
+    <w:p>
+      <w:pPr>
+        <w:shd w:val="clear" w:color="auto" w:fill="1E1E1E"/>
+        <w:spacing w:after="0" w:line="285" w:lineRule="atLeast"/>
+        <w:rPr>
+          <w:rFonts w:ascii="Consolas" w:eastAsia="Times New Roman" w:hAnsi="Consolas" w:cs="Times New Roman"/>
+          <w:color w:val="D4D4D4"/>
+          <w:sz w:val="21"/>
+          <w:szCs w:val="21"/>
+        </w:rPr>
+      </w:pPr>
+      <w:r>
+        <w:rPr>
+          <w:rFonts w:ascii="Consolas" w:eastAsia="Times New Roman" w:hAnsi="Consolas" w:cs="Times New Roman"/>
+          <w:color w:val="D4D4D4"/>
+          <w:sz w:val="21"/>
+          <w:szCs w:val="21"/>
+        </w:rPr>
+        <w:t xml:space="preserve">            </w:t>
+      </w:r>
+      <w:r>
+        <w:rPr>
+          <w:rFonts w:ascii="Consolas" w:eastAsia="Times New Roman" w:hAnsi="Consolas" w:cs="Times New Roman"/>
+          <w:color w:val="569CD6"/>
+          <w:sz w:val="21"/>
+          <w:szCs w:val="21"/>
+        </w:rPr>
+        <w:t>{</w:t>
+      </w:r>
+      <w:r>
+        <w:rPr>
+          <w:rFonts w:ascii="Consolas" w:eastAsia="Times New Roman" w:hAnsi="Consolas" w:cs="Times New Roman"/>
+          <w:color w:val="6A9955"/>
+          <w:sz w:val="21"/>
+          <w:szCs w:val="21"/>
+        </w:rPr>
+        <w:t>/* &lt;Navbar title="TextUtils" mode = {mode} toogleMode={tooglemode} switchMode={switchMode}/&gt; */</w:t>
+      </w:r>
+      <w:r>
+        <w:rPr>
+          <w:rFonts w:ascii="Consolas" w:eastAsia="Times New Roman" w:hAnsi="Consolas" w:cs="Times New Roman"/>
+          <w:color w:val="569CD6"/>
+          <w:sz w:val="21"/>
+          <w:szCs w:val="21"/>
+        </w:rPr>
+        <w:t>}</w:t>
+      </w:r>
+    </w:p>
+    <w:p>
+      <w:pPr>
+        <w:shd w:val="clear" w:color="auto" w:fill="1E1E1E"/>
+        <w:spacing w:after="0" w:line="285" w:lineRule="atLeast"/>
+        <w:rPr>
+          <w:rFonts w:ascii="Consolas" w:eastAsia="Times New Roman" w:hAnsi="Consolas" w:cs="Times New Roman"/>
+          <w:color w:val="D4D4D4"/>
+          <w:sz w:val="21"/>
+          <w:szCs w:val="21"/>
+        </w:rPr>
+      </w:pPr>
+      <w:r>
+        <w:rPr>
+          <w:rFonts w:ascii="Consolas" w:eastAsia="Times New Roman" w:hAnsi="Consolas" w:cs="Times New Roman"/>
+          <w:color w:val="D4D4D4"/>
+          <w:sz w:val="21"/>
+          <w:szCs w:val="21"/>
+        </w:rPr>
+        <w:t xml:space="preserve">            </w:t>
+      </w:r>
+      <w:r>
+        <w:rPr>
+          <w:rFonts w:ascii="Consolas" w:eastAsia="Times New Roman" w:hAnsi="Consolas" w:cs="Times New Roman"/>
+          <w:color w:val="808080"/>
+          <w:sz w:val="21"/>
+          <w:szCs w:val="21"/>
+        </w:rPr>
+        <w:t>&lt;</w:t>
+      </w:r>
+      <w:r>
+        <w:rPr>
+          <w:rFonts w:ascii="Consolas" w:eastAsia="Times New Roman" w:hAnsi="Consolas" w:cs="Times New Roman"/>
+          <w:color w:val="569CD6"/>
+          <w:sz w:val="21"/>
+          <w:szCs w:val="21"/>
+        </w:rPr>
+        <w:t>Route</w:t>
+      </w:r>
+      <w:r>
+        <w:rPr>
+          <w:rFonts w:ascii="Consolas" w:eastAsia="Times New Roman" w:hAnsi="Consolas" w:cs="Times New Roman"/>
+          <w:color w:val="D4D4D4"/>
+          <w:sz w:val="21"/>
+          <w:szCs w:val="21"/>
+        </w:rPr>
+        <w:t xml:space="preserve"> </w:t>
+      </w:r>
+      <w:r>
+        <w:rPr>
+          <w:rFonts w:ascii="Consolas" w:eastAsia="Times New Roman" w:hAnsi="Consolas" w:cs="Times New Roman"/>
+          <w:color w:val="9CDCFE"/>
+          <w:sz w:val="21"/>
+          <w:szCs w:val="21"/>
+        </w:rPr>
+        <w:t>exact</w:t>
+      </w:r>
+      <w:r>
+        <w:rPr>
+          <w:rFonts w:ascii="Consolas" w:eastAsia="Times New Roman" w:hAnsi="Consolas" w:cs="Times New Roman"/>
+          <w:color w:val="D4D4D4"/>
+          <w:sz w:val="21"/>
+          <w:szCs w:val="21"/>
+        </w:rPr>
+        <w:t xml:space="preserve"> </w:t>
+      </w:r>
+      <w:r>
+        <w:rPr>
+          <w:rFonts w:ascii="Consolas" w:eastAsia="Times New Roman" w:hAnsi="Consolas" w:cs="Times New Roman"/>
+          <w:color w:val="9CDCFE"/>
+          <w:sz w:val="21"/>
+          <w:szCs w:val="21"/>
+        </w:rPr>
+        <w:t>path</w:t>
+      </w:r>
+      <w:r>
+        <w:rPr>
+          <w:rFonts w:ascii="Consolas" w:eastAsia="Times New Roman" w:hAnsi="Consolas" w:cs="Times New Roman"/>
+          <w:color w:val="D4D4D4"/>
+          <w:sz w:val="21"/>
+          <w:szCs w:val="21"/>
+        </w:rPr>
+        <w:t>=</w:t>
+      </w:r>
+      <w:r>
+        <w:rPr>
+          <w:rFonts w:ascii="Consolas" w:eastAsia="Times New Roman" w:hAnsi="Consolas" w:cs="Times New Roman"/>
+          <w:color w:val="CE9178"/>
+          <w:sz w:val="21"/>
+          <w:szCs w:val="21"/>
+        </w:rPr>
+        <w:t>'/'</w:t>
+      </w:r>
+      <w:r>
+        <w:rPr>
+          <w:rFonts w:ascii="Consolas" w:eastAsia="Times New Roman" w:hAnsi="Consolas" w:cs="Times New Roman"/>
+          <w:color w:val="D4D4D4"/>
+          <w:sz w:val="21"/>
+          <w:szCs w:val="21"/>
+        </w:rPr>
+        <w:t xml:space="preserve"> </w:t>
+      </w:r>
+      <w:r>
+        <w:rPr>
+          <w:rFonts w:ascii="Consolas" w:eastAsia="Times New Roman" w:hAnsi="Consolas" w:cs="Times New Roman"/>
+          <w:color w:val="9CDCFE"/>
+          <w:sz w:val="21"/>
+          <w:szCs w:val="21"/>
+        </w:rPr>
+        <w:t>element</w:t>
+      </w:r>
+      <w:r>
+        <w:rPr>
+          <w:rFonts w:ascii="Consolas" w:eastAsia="Times New Roman" w:hAnsi="Consolas" w:cs="Times New Roman"/>
+          <w:color w:val="D4D4D4"/>
+          <w:sz w:val="21"/>
+          <w:szCs w:val="21"/>
+        </w:rPr>
+        <w:t>=</w:t>
+      </w:r>
+      <w:r>
+        <w:rPr>
+          <w:rFonts w:ascii="Consolas" w:eastAsia="Times New Roman" w:hAnsi="Consolas" w:cs="Times New Roman"/>
+          <w:color w:val="569CD6"/>
+          <w:sz w:val="21"/>
+          <w:szCs w:val="21"/>
+        </w:rPr>
+        <w:t>{</w:t>
+      </w:r>
+      <w:r>
+        <w:rPr>
+          <w:rFonts w:ascii="Consolas" w:eastAsia="Times New Roman" w:hAnsi="Consolas" w:cs="Times New Roman"/>
+          <w:color w:val="808080"/>
+          <w:sz w:val="21"/>
+          <w:szCs w:val="21"/>
+        </w:rPr>
+        <w:t>&lt;</w:t>
+      </w:r>
+      <w:r>
+        <w:rPr>
+          <w:rFonts w:ascii="Consolas" w:eastAsia="Times New Roman" w:hAnsi="Consolas" w:cs="Times New Roman"/>
+          <w:color w:val="569CD6"/>
+          <w:sz w:val="21"/>
+          <w:szCs w:val="21"/>
+        </w:rPr>
+        <w:t>Form</w:t>
+      </w:r>
+      <w:r>
+        <w:rPr>
+          <w:rFonts w:ascii="Consolas" w:eastAsia="Times New Roman" w:hAnsi="Consolas" w:cs="Times New Roman"/>
+          <w:color w:val="D4D4D4"/>
+          <w:sz w:val="21"/>
+          <w:szCs w:val="21"/>
+        </w:rPr>
+        <w:t xml:space="preserve"> </w:t>
+      </w:r>
+      <w:r>
+        <w:rPr>
+          <w:rFonts w:ascii="Consolas" w:eastAsia="Times New Roman" w:hAnsi="Consolas" w:cs="Times New Roman"/>
+          <w:color w:val="9CDCFE"/>
+          <w:sz w:val="21"/>
+          <w:szCs w:val="21"/>
+        </w:rPr>
+        <w:t>heading</w:t>
+      </w:r>
+      <w:r>
+        <w:rPr>
+          <w:rFonts w:ascii="Consolas" w:eastAsia="Times New Roman" w:hAnsi="Consolas" w:cs="Times New Roman"/>
+          <w:color w:val="D4D4D4"/>
+          <w:sz w:val="21"/>
+          <w:szCs w:val="21"/>
+        </w:rPr>
+        <w:t>=</w:t>
+      </w:r>
+      <w:r>
+        <w:rPr>
+          <w:rFonts w:ascii="Consolas" w:eastAsia="Times New Roman" w:hAnsi="Consolas" w:cs="Times New Roman"/>
+          <w:color w:val="CE9178"/>
+          <w:sz w:val="21"/>
+          <w:szCs w:val="21"/>
+        </w:rPr>
+        <w:t>"Enter the Text to Analyze"</w:t>
+      </w:r>
+      <w:r>
+        <w:rPr>
+          <w:rFonts w:ascii="Consolas" w:eastAsia="Times New Roman" w:hAnsi="Consolas" w:cs="Times New Roman"/>
+          <w:color w:val="D4D4D4"/>
+          <w:sz w:val="21"/>
+          <w:szCs w:val="21"/>
+        </w:rPr>
+        <w:t xml:space="preserve"> </w:t>
+      </w:r>
+      <w:r>
+        <w:rPr>
+          <w:rFonts w:ascii="Consolas" w:eastAsia="Times New Roman" w:hAnsi="Consolas" w:cs="Times New Roman"/>
+          <w:color w:val="9CDCFE"/>
+          <w:sz w:val="21"/>
+          <w:szCs w:val="21"/>
+        </w:rPr>
+        <w:t>showAlert</w:t>
+      </w:r>
+      <w:r>
+        <w:rPr>
+          <w:rFonts w:ascii="Consolas" w:eastAsia="Times New Roman" w:hAnsi="Consolas" w:cs="Times New Roman"/>
+          <w:color w:val="D4D4D4"/>
+          <w:sz w:val="21"/>
+          <w:szCs w:val="21"/>
+        </w:rPr>
+        <w:t>=</w:t>
+      </w:r>
+      <w:r>
+        <w:rPr>
+          <w:rFonts w:ascii="Consolas" w:eastAsia="Times New Roman" w:hAnsi="Consolas" w:cs="Times New Roman"/>
+          <w:color w:val="569CD6"/>
+          <w:sz w:val="21"/>
+          <w:szCs w:val="21"/>
+        </w:rPr>
+        <w:t>{</w:t>
+      </w:r>
+      <w:r>
+        <w:rPr>
+          <w:rFonts w:ascii="Consolas" w:eastAsia="Times New Roman" w:hAnsi="Consolas" w:cs="Times New Roman"/>
+          <w:color w:val="D4D4D4"/>
+          <w:sz w:val="21"/>
+          <w:szCs w:val="21"/>
+        </w:rPr>
+        <w:t>showAlert</w:t>
+      </w:r>
+      <w:r>
+        <w:rPr>
+          <w:rFonts w:ascii="Consolas" w:eastAsia="Times New Roman" w:hAnsi="Consolas" w:cs="Times New Roman"/>
+          <w:color w:val="569CD6"/>
+          <w:sz w:val="21"/>
+          <w:szCs w:val="21"/>
+        </w:rPr>
+        <w:t>}</w:t>
+      </w:r>
+      <w:r>
+        <w:rPr>
+          <w:rFonts w:ascii="Consolas" w:eastAsia="Times New Roman" w:hAnsi="Consolas" w:cs="Times New Roman"/>
+          <w:color w:val="808080"/>
+          <w:sz w:val="21"/>
+          <w:szCs w:val="21"/>
+        </w:rPr>
+        <w:t>/&gt;</w:t>
+      </w:r>
+      <w:r>
+        <w:rPr>
+          <w:rFonts w:ascii="Consolas" w:eastAsia="Times New Roman" w:hAnsi="Consolas" w:cs="Times New Roman"/>
+          <w:color w:val="569CD6"/>
+          <w:sz w:val="21"/>
+          <w:szCs w:val="21"/>
+        </w:rPr>
+        <w:t>}</w:t>
+      </w:r>
+      <w:r>
+        <w:rPr>
+          <w:rFonts w:ascii="Consolas" w:eastAsia="Times New Roman" w:hAnsi="Consolas" w:cs="Times New Roman"/>
+          <w:color w:val="D4D4D4"/>
+          <w:sz w:val="21"/>
+          <w:szCs w:val="21"/>
+        </w:rPr>
+        <w:t xml:space="preserve"> </w:t>
+      </w:r>
+      <w:r>
+        <w:rPr>
+          <w:rFonts w:ascii="Consolas" w:eastAsia="Times New Roman" w:hAnsi="Consolas" w:cs="Times New Roman"/>
+          <w:color w:val="808080"/>
+          <w:sz w:val="21"/>
+          <w:szCs w:val="21"/>
+        </w:rPr>
+        <w:t>/&gt;</w:t>
+      </w:r>
+    </w:p>
+    <w:p>
+      <w:pPr>
+        <w:shd w:val="clear" w:color="auto" w:fill="1E1E1E"/>
+        <w:spacing w:after="0" w:line="285" w:lineRule="atLeast"/>
+        <w:rPr>
+          <w:rFonts w:ascii="Consolas" w:eastAsia="Times New Roman" w:hAnsi="Consolas" w:cs="Times New Roman"/>
+          <w:color w:val="D4D4D4"/>
+          <w:sz w:val="21"/>
+          <w:szCs w:val="21"/>
+        </w:rPr>
+      </w:pPr>
+      <w:r>
+        <w:rPr>
+          <w:rFonts w:ascii="Consolas" w:eastAsia="Times New Roman" w:hAnsi="Consolas" w:cs="Times New Roman"/>
+          <w:color w:val="D4D4D4"/>
+          <w:sz w:val="21"/>
+          <w:szCs w:val="21"/>
+        </w:rPr>
+        <w:t xml:space="preserve">            </w:t>
+      </w:r>
+      <w:r>
+        <w:rPr>
+          <w:rFonts w:ascii="Consolas" w:eastAsia="Times New Roman" w:hAnsi="Consolas" w:cs="Times New Roman"/>
+          <w:color w:val="808080"/>
+          <w:sz w:val="21"/>
+          <w:szCs w:val="21"/>
+        </w:rPr>
+        <w:t>&lt;</w:t>
+      </w:r>
+      <w:r>
+        <w:rPr>
+          <w:rFonts w:ascii="Consolas" w:eastAsia="Times New Roman" w:hAnsi="Consolas" w:cs="Times New Roman"/>
+          <w:color w:val="569CD6"/>
+          <w:sz w:val="21"/>
+          <w:szCs w:val="21"/>
+        </w:rPr>
+        <w:t>Route</w:t>
+      </w:r>
+      <w:r>
+        <w:rPr>
+          <w:rFonts w:ascii="Consolas" w:eastAsia="Times New Roman" w:hAnsi="Consolas" w:cs="Times New Roman"/>
+          <w:color w:val="D4D4D4"/>
+          <w:sz w:val="21"/>
+          <w:szCs w:val="21"/>
+        </w:rPr>
+        <w:t xml:space="preserve"> </w:t>
+      </w:r>
+      <w:r>
+        <w:rPr>
+          <w:rFonts w:ascii="Consolas" w:eastAsia="Times New Roman" w:hAnsi="Consolas" w:cs="Times New Roman"/>
+          <w:color w:val="9CDCFE"/>
+          <w:sz w:val="21"/>
+          <w:szCs w:val="21"/>
+        </w:rPr>
+        <w:t>exact</w:t>
+      </w:r>
+      <w:r>
+        <w:rPr>
+          <w:rFonts w:ascii="Consolas" w:eastAsia="Times New Roman" w:hAnsi="Consolas" w:cs="Times New Roman"/>
+          <w:color w:val="D4D4D4"/>
+          <w:sz w:val="21"/>
+          <w:szCs w:val="21"/>
+        </w:rPr>
+        <w:t xml:space="preserve"> </w:t>
+      </w:r>
+      <w:r>
+        <w:rPr>
+          <w:rFonts w:ascii="Consolas" w:eastAsia="Times New Roman" w:hAnsi="Consolas" w:cs="Times New Roman"/>
+          <w:color w:val="9CDCFE"/>
+          <w:sz w:val="21"/>
+          <w:szCs w:val="21"/>
+        </w:rPr>
+        <w:t>path</w:t>
+      </w:r>
+      <w:r>
+        <w:rPr>
+          <w:rFonts w:ascii="Consolas" w:eastAsia="Times New Roman" w:hAnsi="Consolas" w:cs="Times New Roman"/>
+          <w:color w:val="D4D4D4"/>
+          <w:sz w:val="21"/>
+          <w:szCs w:val="21"/>
+        </w:rPr>
+        <w:t>=</w:t>
+      </w:r>
+      <w:r>
+        <w:rPr>
+          <w:rFonts w:ascii="Consolas" w:eastAsia="Times New Roman" w:hAnsi="Consolas" w:cs="Times New Roman"/>
+          <w:color w:val="CE9178"/>
+          <w:sz w:val="21"/>
+          <w:szCs w:val="21"/>
+        </w:rPr>
+        <w:t>'/about'</w:t>
+      </w:r>
+      <w:r>
+        <w:rPr>
+          <w:rFonts w:ascii="Consolas" w:eastAsia="Times New Roman" w:hAnsi="Consolas" w:cs="Times New Roman"/>
+          <w:color w:val="D4D4D4"/>
+          <w:sz w:val="21"/>
+          <w:szCs w:val="21"/>
+        </w:rPr>
+        <w:t xml:space="preserve"> </w:t>
+      </w:r>
+      <w:r>
+        <w:rPr>
+          <w:rFonts w:ascii="Consolas" w:eastAsia="Times New Roman" w:hAnsi="Consolas" w:cs="Times New Roman"/>
+          <w:color w:val="9CDCFE"/>
+          <w:sz w:val="21"/>
+          <w:szCs w:val="21"/>
+        </w:rPr>
+        <w:t>element</w:t>
+      </w:r>
+      <w:r>
+        <w:rPr>
+          <w:rFonts w:ascii="Consolas" w:eastAsia="Times New Roman" w:hAnsi="Consolas" w:cs="Times New Roman"/>
+          <w:color w:val="D4D4D4"/>
+          <w:sz w:val="21"/>
+          <w:szCs w:val="21"/>
+        </w:rPr>
+        <w:t>=</w:t>
+      </w:r>
+      <w:r>
+        <w:rPr>
+          <w:rFonts w:ascii="Consolas" w:eastAsia="Times New Roman" w:hAnsi="Consolas" w:cs="Times New Roman"/>
+          <w:color w:val="569CD6"/>
+          <w:sz w:val="21"/>
+          <w:szCs w:val="21"/>
+        </w:rPr>
+        <w:t>{</w:t>
+      </w:r>
+      <w:r>
+        <w:rPr>
+          <w:rFonts w:ascii="Consolas" w:eastAsia="Times New Roman" w:hAnsi="Consolas" w:cs="Times New Roman"/>
+          <w:color w:val="808080"/>
+          <w:sz w:val="21"/>
+          <w:szCs w:val="21"/>
+        </w:rPr>
+        <w:t>&lt;</w:t>
+      </w:r>
+      <w:r>
+        <w:rPr>
+          <w:rFonts w:ascii="Consolas" w:eastAsia="Times New Roman" w:hAnsi="Consolas" w:cs="Times New Roman"/>
+          <w:color w:val="569CD6"/>
+          <w:sz w:val="21"/>
+          <w:szCs w:val="21"/>
+        </w:rPr>
+        <w:t>About</w:t>
+      </w:r>
+      <w:r>
+        <w:rPr>
+          <w:rFonts w:ascii="Consolas" w:eastAsia="Times New Roman" w:hAnsi="Consolas" w:cs="Times New Roman"/>
+          <w:color w:val="D4D4D4"/>
+          <w:sz w:val="21"/>
+          <w:szCs w:val="21"/>
+        </w:rPr>
+        <w:t xml:space="preserve"> </w:t>
+      </w:r>
+      <w:r>
+        <w:rPr>
+          <w:rFonts w:ascii="Consolas" w:eastAsia="Times New Roman" w:hAnsi="Consolas" w:cs="Times New Roman"/>
+          <w:color w:val="808080"/>
+          <w:sz w:val="21"/>
+          <w:szCs w:val="21"/>
+        </w:rPr>
+        <w:t>/&gt;</w:t>
+      </w:r>
+      <w:r>
+        <w:rPr>
+          <w:rFonts w:ascii="Consolas" w:eastAsia="Times New Roman" w:hAnsi="Consolas" w:cs="Times New Roman"/>
+          <w:color w:val="569CD6"/>
+          <w:sz w:val="21"/>
+          <w:szCs w:val="21"/>
+        </w:rPr>
+        <w:t>}</w:t>
+      </w:r>
+      <w:r>
+        <w:rPr>
+          <w:rFonts w:ascii="Consolas" w:eastAsia="Times New Roman" w:hAnsi="Consolas" w:cs="Times New Roman"/>
+          <w:color w:val="D4D4D4"/>
+          <w:sz w:val="21"/>
+          <w:szCs w:val="21"/>
+        </w:rPr>
+        <w:t xml:space="preserve"> </w:t>
+      </w:r>
+      <w:r>
+        <w:rPr>
+          <w:rFonts w:ascii="Consolas" w:eastAsia="Times New Roman" w:hAnsi="Consolas" w:cs="Times New Roman"/>
+          <w:color w:val="808080"/>
+          <w:sz w:val="21"/>
+          <w:szCs w:val="21"/>
+        </w:rPr>
+        <w:t>/&gt;</w:t>
+      </w:r>
+    </w:p>
+    <w:p>
+      <w:pPr>
+        <w:shd w:val="clear" w:color="auto" w:fill="1E1E1E"/>
+        <w:spacing w:after="0" w:line="285" w:lineRule="atLeast"/>
+        <w:rPr>
+          <w:rFonts w:ascii="Consolas" w:eastAsia="Times New Roman" w:hAnsi="Consolas" w:cs="Times New Roman"/>
+          <w:color w:val="D4D4D4"/>
+          <w:sz w:val="21"/>
+          <w:szCs w:val="21"/>
+        </w:rPr>
+      </w:pPr>
+      <w:r>
+        <w:rPr>
+          <w:rFonts w:ascii="Consolas" w:eastAsia="Times New Roman" w:hAnsi="Consolas" w:cs="Times New Roman"/>
+          <w:color w:val="D4D4D4"/>
+          <w:sz w:val="21"/>
+          <w:szCs w:val="21"/>
+        </w:rPr>
+        <w:t xml:space="preserve">      </w:t>
+      </w:r>
+      <w:r>
+        <w:rPr>
+          <w:rFonts w:ascii="Consolas" w:eastAsia="Times New Roman" w:hAnsi="Consolas" w:cs="Times New Roman"/>
+          <w:color w:val="808080"/>
+          <w:sz w:val="21"/>
+          <w:szCs w:val="21"/>
+        </w:rPr>
+        <w:t>&lt;/</w:t>
+      </w:r>
+      <w:r>
+        <w:rPr>
+          <w:rFonts w:ascii="Consolas" w:eastAsia="Times New Roman" w:hAnsi="Consolas" w:cs="Times New Roman"/>
+          <w:color w:val="569CD6"/>
+          <w:sz w:val="21"/>
+          <w:szCs w:val="21"/>
+        </w:rPr>
+        <w:t>Routes</w:t>
+      </w:r>
+      <w:r>
+        <w:rPr>
+          <w:rFonts w:ascii="Consolas" w:eastAsia="Times New Roman" w:hAnsi="Consolas" w:cs="Times New Roman"/>
+          <w:color w:val="808080"/>
+          <w:sz w:val="21"/>
+          <w:szCs w:val="21"/>
+        </w:rPr>
+        <w:t>&gt;</w:t>
+      </w:r>
+    </w:p>
+    <w:p>
+      <w:pPr>
+        <w:shd w:val="clear" w:color="auto" w:fill="1E1E1E"/>
+        <w:spacing w:after="0" w:line="285" w:lineRule="atLeast"/>
+        <w:rPr>
+          <w:rFonts w:ascii="Consolas" w:eastAsia="Times New Roman" w:hAnsi="Consolas" w:cs="Times New Roman"/>
+          <w:color w:val="D4D4D4"/>
+          <w:sz w:val="21"/>
+          <w:szCs w:val="21"/>
+        </w:rPr>
+      </w:pPr>
+      <w:r>
+        <w:rPr>
+          <w:rFonts w:ascii="Consolas" w:eastAsia="Times New Roman" w:hAnsi="Consolas" w:cs="Times New Roman"/>
+          <w:color w:val="D4D4D4"/>
+          <w:sz w:val="21"/>
+          <w:szCs w:val="21"/>
+        </w:rPr>
+        <w:t xml:space="preserve">    </w:t>
+      </w:r>
+      <w:r>
+        <w:rPr>
+          <w:rFonts w:ascii="Consolas" w:eastAsia="Times New Roman" w:hAnsi="Consolas" w:cs="Times New Roman"/>
+          <w:color w:val="808080"/>
+          <w:sz w:val="21"/>
+          <w:szCs w:val="21"/>
+        </w:rPr>
+        <w:t>&lt;/</w:t>
+      </w:r>
+      <w:r>
+        <w:rPr>
+          <w:rFonts w:ascii="Consolas" w:eastAsia="Times New Roman" w:hAnsi="Consolas" w:cs="Times New Roman"/>
+          <w:color w:val="569CD6"/>
+          <w:sz w:val="21"/>
+          <w:szCs w:val="21"/>
+        </w:rPr>
+        <w:t>Router</w:t>
+      </w:r>
+      <w:r>
+        <w:rPr>
+          <w:rFonts w:ascii="Consolas" w:eastAsia="Times New Roman" w:hAnsi="Consolas" w:cs="Times New Roman"/>
+          <w:color w:val="808080"/>
+          <w:sz w:val="21"/>
+          <w:szCs w:val="21"/>
+        </w:rPr>
+        <w:t>&gt;</w:t>
+      </w:r>
+    </w:p>
+    <w:p>
+      <w:pPr>
+        <w:tabs>
+          <w:tab w:val="left" w:pos="3540"/>
+        </w:tabs>
+        <w:rPr>
+          <w:rFonts w:ascii="Segoe UI" w:hAnsi="Segoe UI" w:cs="Segoe UI"/>
+          <w:color w:val="000000"/>
+          <w:sz w:val="28"/>
+          <w:szCs w:val="28"/>
+        </w:rPr>
+      </w:pPr>
+    </w:p>
+    <w:p>
+      <w:pPr>
+        <w:tabs>
+          <w:tab w:val="left" w:pos="3540"/>
+        </w:tabs>
+        <w:rPr>
+          <w:rFonts w:ascii="Segoe UI" w:hAnsi="Segoe UI" w:cs="Segoe UI"/>
+          <w:color w:val="000000"/>
+          <w:sz w:val="28"/>
+          <w:szCs w:val="28"/>
+        </w:rPr>
+      </w:pPr>
+      <w:r>
+        <w:rPr>
+          <w:rFonts w:ascii="Segoe UI" w:hAnsi="Segoe UI" w:cs="Segoe UI"/>
+          <w:color w:val="000000"/>
+          <w:sz w:val="28"/>
+          <w:szCs w:val="28"/>
+        </w:rPr>
+        <w:lastRenderedPageBreak/>
+        <w:t>Note in above code that Everything under Router, and we can use Routes tag to set paths n all like above</w:t>
+      </w:r>
+    </w:p>
+    <w:p>
+      <w:pPr>
+        <w:pStyle w:val="ListParagraph"/>
+        <w:numPr>
+          <w:ilvl w:val="0"/>
+          <w:numId w:val="1"/>
+        </w:numPr>
+        <w:tabs>
+          <w:tab w:val="left" w:pos="3540"/>
+        </w:tabs>
+        <w:rPr>
+          <w:rFonts w:ascii="Segoe UI" w:hAnsi="Segoe UI" w:cs="Segoe UI"/>
+          <w:color w:val="000000"/>
+          <w:sz w:val="28"/>
+          <w:szCs w:val="28"/>
+        </w:rPr>
+      </w:pPr>
+      <w:r>
+        <w:rPr>
+          <w:rFonts w:ascii="Segoe UI" w:hAnsi="Segoe UI" w:cs="Segoe UI"/>
+          <w:color w:val="000000"/>
+          <w:sz w:val="28"/>
+          <w:szCs w:val="28"/>
+        </w:rPr>
+        <w:t xml:space="preserve">Note “exact” keyword also here. This is because react do partial checking for url if we do not use exact keyword. </w:t>
+      </w:r>
+    </w:p>
+    <w:p>
+      <w:pPr>
+        <w:pStyle w:val="ListParagraph"/>
+        <w:numPr>
+          <w:ilvl w:val="0"/>
+          <w:numId w:val="1"/>
+        </w:numPr>
+        <w:tabs>
+          <w:tab w:val="left" w:pos="3540"/>
+        </w:tabs>
+        <w:rPr>
+          <w:rFonts w:ascii="Segoe UI" w:hAnsi="Segoe UI" w:cs="Segoe UI"/>
+          <w:color w:val="000000"/>
+          <w:sz w:val="28"/>
+          <w:szCs w:val="28"/>
+        </w:rPr>
+      </w:pPr>
+      <w:r>
+        <w:rPr>
+          <w:rFonts w:ascii="Segoe UI" w:hAnsi="Segoe UI" w:cs="Segoe UI"/>
+          <w:color w:val="000000"/>
+          <w:sz w:val="28"/>
+          <w:szCs w:val="28"/>
+        </w:rPr>
+        <w:t xml:space="preserve">For example there is : /users, and /users/home this two urls. And  now what react will do is if exact is not defined then for users/home it will go for /users inseted, by doing partial checking. So it’s important to use exact keyword here. </w:t>
+      </w:r>
+    </w:p>
+    <w:p>
+      <w:pPr>
+        <w:pStyle w:val="ListParagraph"/>
+        <w:numPr>
+          <w:ilvl w:val="0"/>
+          <w:numId w:val="1"/>
+        </w:numPr>
+        <w:tabs>
+          <w:tab w:val="left" w:pos="3540"/>
+        </w:tabs>
+        <w:rPr>
+          <w:rFonts w:ascii="Segoe UI" w:hAnsi="Segoe UI" w:cs="Segoe UI"/>
+          <w:color w:val="000000"/>
+          <w:sz w:val="28"/>
+          <w:szCs w:val="28"/>
+        </w:rPr>
+      </w:pPr>
+      <w:r>
+        <w:rPr>
+          <w:rFonts w:ascii="Segoe UI" w:hAnsi="Segoe UI" w:cs="Segoe UI"/>
+          <w:color w:val="000000"/>
+          <w:sz w:val="28"/>
+          <w:szCs w:val="28"/>
+        </w:rPr>
+        <w:t>Now we have to use Link and to instead of a and href.</w:t>
+      </w:r>
+    </w:p>
+    <w:p>
+      <w:pPr>
+        <w:pStyle w:val="ListParagraph"/>
+        <w:numPr>
+          <w:ilvl w:val="0"/>
+          <w:numId w:val="1"/>
+        </w:numPr>
+        <w:tabs>
+          <w:tab w:val="left" w:pos="3540"/>
+        </w:tabs>
+        <w:rPr>
+          <w:rFonts w:ascii="Segoe UI" w:hAnsi="Segoe UI" w:cs="Segoe UI"/>
+          <w:color w:val="000000"/>
+          <w:sz w:val="28"/>
+          <w:szCs w:val="28"/>
+        </w:rPr>
+      </w:pPr>
+      <w:r>
+        <w:rPr>
+          <w:rFonts w:ascii="Segoe UI" w:hAnsi="Segoe UI" w:cs="Segoe UI"/>
+          <w:color w:val="000000"/>
+          <w:sz w:val="28"/>
+          <w:szCs w:val="28"/>
+        </w:rPr>
+        <w:t>For suppose in Navbar there is about to set it,</w:t>
+      </w:r>
+    </w:p>
+    <w:p>
+      <w:pPr>
+        <w:pStyle w:val="ListParagraph"/>
+        <w:numPr>
+          <w:ilvl w:val="0"/>
+          <w:numId w:val="1"/>
+        </w:numPr>
+        <w:shd w:val="clear" w:color="auto" w:fill="1E1E1E"/>
+        <w:spacing w:after="0" w:line="285" w:lineRule="atLeast"/>
+        <w:rPr>
+          <w:rFonts w:ascii="Consolas" w:eastAsia="Times New Roman" w:hAnsi="Consolas" w:cs="Times New Roman"/>
+          <w:color w:val="D4D4D4"/>
+          <w:sz w:val="21"/>
+          <w:szCs w:val="21"/>
+        </w:rPr>
+      </w:pPr>
+      <w:r>
+        <w:rPr>
+          <w:rFonts w:ascii="Consolas" w:eastAsia="Times New Roman" w:hAnsi="Consolas" w:cs="Times New Roman"/>
+          <w:color w:val="808080"/>
+          <w:sz w:val="21"/>
+          <w:szCs w:val="21"/>
+        </w:rPr>
+        <w:t>&lt;</w:t>
+      </w:r>
+      <w:r>
+        <w:rPr>
+          <w:rFonts w:ascii="Consolas" w:eastAsia="Times New Roman" w:hAnsi="Consolas" w:cs="Times New Roman"/>
+          <w:color w:val="569CD6"/>
+          <w:sz w:val="21"/>
+          <w:szCs w:val="21"/>
+        </w:rPr>
+        <w:t>Link</w:t>
+      </w:r>
+      <w:r>
+        <w:rPr>
+          <w:rFonts w:ascii="Consolas" w:eastAsia="Times New Roman" w:hAnsi="Consolas" w:cs="Times New Roman"/>
+          <w:color w:val="D4D4D4"/>
+          <w:sz w:val="21"/>
+          <w:szCs w:val="21"/>
+        </w:rPr>
+        <w:t xml:space="preserve"> </w:t>
+      </w:r>
+      <w:r>
+        <w:rPr>
+          <w:rFonts w:ascii="Consolas" w:eastAsia="Times New Roman" w:hAnsi="Consolas" w:cs="Times New Roman"/>
+          <w:color w:val="9CDCFE"/>
+          <w:sz w:val="21"/>
+          <w:szCs w:val="21"/>
+        </w:rPr>
+        <w:t>className</w:t>
+      </w:r>
+      <w:r>
+        <w:rPr>
+          <w:rFonts w:ascii="Consolas" w:eastAsia="Times New Roman" w:hAnsi="Consolas" w:cs="Times New Roman"/>
+          <w:color w:val="D4D4D4"/>
+          <w:sz w:val="21"/>
+          <w:szCs w:val="21"/>
+        </w:rPr>
+        <w:t>=</w:t>
+      </w:r>
+      <w:r>
+        <w:rPr>
+          <w:rFonts w:ascii="Consolas" w:eastAsia="Times New Roman" w:hAnsi="Consolas" w:cs="Times New Roman"/>
+          <w:color w:val="CE9178"/>
+          <w:sz w:val="21"/>
+          <w:szCs w:val="21"/>
+        </w:rPr>
+        <w:t>"nav-link"</w:t>
+      </w:r>
+      <w:r>
+        <w:rPr>
+          <w:rFonts w:ascii="Consolas" w:eastAsia="Times New Roman" w:hAnsi="Consolas" w:cs="Times New Roman"/>
+          <w:color w:val="D4D4D4"/>
+          <w:sz w:val="21"/>
+          <w:szCs w:val="21"/>
+        </w:rPr>
+        <w:t xml:space="preserve"> </w:t>
+      </w:r>
+      <w:r>
+        <w:rPr>
+          <w:rFonts w:ascii="Consolas" w:eastAsia="Times New Roman" w:hAnsi="Consolas" w:cs="Times New Roman"/>
+          <w:color w:val="9CDCFE"/>
+          <w:sz w:val="21"/>
+          <w:szCs w:val="21"/>
+        </w:rPr>
+        <w:t>to</w:t>
+      </w:r>
+      <w:r>
+        <w:rPr>
+          <w:rFonts w:ascii="Consolas" w:eastAsia="Times New Roman" w:hAnsi="Consolas" w:cs="Times New Roman"/>
+          <w:color w:val="D4D4D4"/>
+          <w:sz w:val="21"/>
+          <w:szCs w:val="21"/>
+        </w:rPr>
+        <w:t>=</w:t>
+      </w:r>
+      <w:r>
+        <w:rPr>
+          <w:rFonts w:ascii="Consolas" w:eastAsia="Times New Roman" w:hAnsi="Consolas" w:cs="Times New Roman"/>
+          <w:color w:val="CE9178"/>
+          <w:sz w:val="21"/>
+          <w:szCs w:val="21"/>
+        </w:rPr>
+        <w:t>"/about"</w:t>
+      </w:r>
+      <w:r>
+        <w:rPr>
+          <w:rFonts w:ascii="Consolas" w:eastAsia="Times New Roman" w:hAnsi="Consolas" w:cs="Times New Roman"/>
+          <w:color w:val="808080"/>
+          <w:sz w:val="21"/>
+          <w:szCs w:val="21"/>
+        </w:rPr>
+        <w:t>&gt;</w:t>
+      </w:r>
+      <w:r>
+        <w:rPr>
+          <w:rFonts w:ascii="Consolas" w:eastAsia="Times New Roman" w:hAnsi="Consolas" w:cs="Times New Roman"/>
+          <w:color w:val="D4D4D4"/>
+          <w:sz w:val="21"/>
+          <w:szCs w:val="21"/>
+        </w:rPr>
+        <w:t>About</w:t>
+      </w:r>
+      <w:r>
+        <w:rPr>
+          <w:rFonts w:ascii="Consolas" w:eastAsia="Times New Roman" w:hAnsi="Consolas" w:cs="Times New Roman"/>
+          <w:color w:val="808080"/>
+          <w:sz w:val="21"/>
+          <w:szCs w:val="21"/>
+        </w:rPr>
+        <w:t>&lt;/</w:t>
+      </w:r>
+      <w:r>
+        <w:rPr>
+          <w:rFonts w:ascii="Consolas" w:eastAsia="Times New Roman" w:hAnsi="Consolas" w:cs="Times New Roman"/>
+          <w:color w:val="569CD6"/>
+          <w:sz w:val="21"/>
+          <w:szCs w:val="21"/>
+        </w:rPr>
+        <w:t>Link</w:t>
+      </w:r>
+      <w:r>
+        <w:rPr>
+          <w:rFonts w:ascii="Consolas" w:eastAsia="Times New Roman" w:hAnsi="Consolas" w:cs="Times New Roman"/>
+          <w:color w:val="808080"/>
+          <w:sz w:val="21"/>
+          <w:szCs w:val="21"/>
+        </w:rPr>
+        <w:t>&gt;</w:t>
+      </w:r>
+    </w:p>
+    <w:p>
+      <w:pPr>
+        <w:pStyle w:val="ListParagraph"/>
+        <w:tabs>
+          <w:tab w:val="left" w:pos="3540"/>
+        </w:tabs>
+        <w:rPr>
+          <w:rFonts w:ascii="Segoe UI" w:hAnsi="Segoe UI" w:cs="Segoe UI"/>
+          <w:color w:val="000000"/>
+          <w:sz w:val="28"/>
+          <w:szCs w:val="28"/>
+        </w:rPr>
+      </w:pPr>
+    </w:p>
+    <w:p>
+      <w:pPr>
+        <w:pStyle w:val="ListParagraph"/>
+        <w:tabs>
+          <w:tab w:val="left" w:pos="3540"/>
+        </w:tabs>
+        <w:rPr>
+          <w:rFonts w:ascii="Segoe UI" w:hAnsi="Segoe UI" w:cs="Segoe UI"/>
+          <w:color w:val="000000"/>
+          <w:sz w:val="28"/>
+          <w:szCs w:val="28"/>
+        </w:rPr>
+      </w:pPr>
+      <w:r>
+        <w:rPr>
+          <w:rFonts w:ascii="Segoe UI" w:hAnsi="Segoe UI" w:cs="Segoe UI"/>
+          <w:color w:val="000000"/>
+          <w:sz w:val="28"/>
+          <w:szCs w:val="28"/>
+        </w:rPr>
+        <w:t>Like this.</w:t>
+      </w:r>
+    </w:p>
+    <w:p>
+      <w:pPr>
+        <w:pStyle w:val="ListParagraph"/>
+        <w:tabs>
+          <w:tab w:val="left" w:pos="3540"/>
+        </w:tabs>
+        <w:rPr>
+          <w:rFonts w:ascii="Segoe UI" w:hAnsi="Segoe UI" w:cs="Segoe UI"/>
+          <w:color w:val="000000"/>
+          <w:sz w:val="28"/>
+          <w:szCs w:val="28"/>
+        </w:rPr>
+      </w:pPr>
+      <w:r>
+        <w:rPr>
+          <w:rFonts w:ascii="Segoe UI" w:hAnsi="Segoe UI" w:cs="Segoe UI"/>
+          <w:color w:val="000000"/>
+          <w:sz w:val="28"/>
+          <w:szCs w:val="28"/>
+        </w:rPr>
+        <w:t>We should know that if we are using link and to then the page will not reloding. We can use a, and href also but the page will reload dur to this, if want reloding then we can use a and href.</w:t>
       </w:r>
     </w:p>
     <w:sectPr>

</xml_diff>

<commit_message>
Custom theme Exersize Two added.
</commit_message>
<xml_diff>
--- a/Code With Harry Tutorials.docx
+++ b/Code With Harry Tutorials.docx
@@ -36,12 +36,21 @@
           <w:szCs w:val="28"/>
         </w:rPr>
       </w:pPr>
-      <w:r>
-        <w:rPr>
-          <w:sz w:val="28"/>
-          <w:szCs w:val="28"/>
-        </w:rPr>
-        <w:t>npx create-react-app app-name</w:t>
+      <w:proofErr w:type="spellStart"/>
+      <w:r>
+        <w:rPr>
+          <w:sz w:val="28"/>
+          <w:szCs w:val="28"/>
+        </w:rPr>
+        <w:t>npx</w:t>
+      </w:r>
+      <w:proofErr w:type="spellEnd"/>
+      <w:r>
+        <w:rPr>
+          <w:sz w:val="28"/>
+          <w:szCs w:val="28"/>
+        </w:rPr>
+        <w:t xml:space="preserve"> create-react-app app-name</w:t>
       </w:r>
     </w:p>
     <w:p>
@@ -61,7 +70,23 @@
           <w:sz w:val="28"/>
           <w:szCs w:val="28"/>
         </w:rPr>
-        <w:t>Play with Files in of src and public Folder, to get handy.</w:t>
+        <w:t xml:space="preserve">Play with Files in of </w:t>
+      </w:r>
+      <w:proofErr w:type="spellStart"/>
+      <w:r>
+        <w:rPr>
+          <w:sz w:val="28"/>
+          <w:szCs w:val="28"/>
+        </w:rPr>
+        <w:t>src</w:t>
+      </w:r>
+      <w:proofErr w:type="spellEnd"/>
+      <w:r>
+        <w:rPr>
+          <w:sz w:val="28"/>
+          <w:szCs w:val="28"/>
+        </w:rPr>
+        <w:t xml:space="preserve"> and public Folder, to get handy.</w:t>
       </w:r>
     </w:p>
     <w:p>
@@ -81,7 +106,23 @@
           <w:sz w:val="28"/>
           <w:szCs w:val="28"/>
         </w:rPr>
-        <w:t xml:space="preserve">In src folder index.js is entry point and you can note &lt;App /&gt; there. In the </w:t>
+        <w:t xml:space="preserve">In </w:t>
+      </w:r>
+      <w:proofErr w:type="spellStart"/>
+      <w:r>
+        <w:rPr>
+          <w:sz w:val="28"/>
+          <w:szCs w:val="28"/>
+        </w:rPr>
+        <w:t>src</w:t>
+      </w:r>
+      <w:proofErr w:type="spellEnd"/>
+      <w:r>
+        <w:rPr>
+          <w:sz w:val="28"/>
+          <w:szCs w:val="28"/>
+        </w:rPr>
+        <w:t xml:space="preserve"> folder index.js is entry point and you can note &lt;App /&gt; there. In the </w:t>
       </w:r>
       <w:r>
         <w:rPr>
@@ -580,7 +621,23 @@
           <w:sz w:val="28"/>
           <w:szCs w:val="28"/>
         </w:rPr>
-        <w:t>&lt;div&gt;aaa&lt;/div&gt;</w:t>
+        <w:t>&lt;div&gt;</w:t>
+      </w:r>
+      <w:proofErr w:type="spellStart"/>
+      <w:r>
+        <w:rPr>
+          <w:sz w:val="28"/>
+          <w:szCs w:val="28"/>
+        </w:rPr>
+        <w:t>aaa</w:t>
+      </w:r>
+      <w:proofErr w:type="spellEnd"/>
+      <w:r>
+        <w:rPr>
+          <w:sz w:val="28"/>
+          <w:szCs w:val="28"/>
+        </w:rPr>
+        <w:t>&lt;/div&gt;</w:t>
       </w:r>
     </w:p>
     <w:p>
@@ -661,7 +718,23 @@
           <w:sz w:val="28"/>
           <w:szCs w:val="28"/>
         </w:rPr>
-        <w:t>&lt;div&gt;aaa&lt;/div&gt;</w:t>
+        <w:t>&lt;div&gt;</w:t>
+      </w:r>
+      <w:proofErr w:type="spellStart"/>
+      <w:r>
+        <w:rPr>
+          <w:sz w:val="28"/>
+          <w:szCs w:val="28"/>
+        </w:rPr>
+        <w:t>aaa</w:t>
+      </w:r>
+      <w:proofErr w:type="spellEnd"/>
+      <w:r>
+        <w:rPr>
+          <w:sz w:val="28"/>
+          <w:szCs w:val="28"/>
+        </w:rPr>
+        <w:t>&lt;/div&gt;</w:t>
       </w:r>
     </w:p>
     <w:p>
@@ -708,12 +781,21 @@
           <w:szCs w:val="28"/>
         </w:rPr>
       </w:pPr>
-      <w:r>
-        <w:rPr>
-          <w:sz w:val="28"/>
-          <w:szCs w:val="28"/>
-        </w:rPr>
-        <w:t>className instead of class</w:t>
+      <w:proofErr w:type="spellStart"/>
+      <w:r>
+        <w:rPr>
+          <w:sz w:val="28"/>
+          <w:szCs w:val="28"/>
+        </w:rPr>
+        <w:t>className</w:t>
+      </w:r>
+      <w:proofErr w:type="spellEnd"/>
+      <w:r>
+        <w:rPr>
+          <w:sz w:val="28"/>
+          <w:szCs w:val="28"/>
+        </w:rPr>
+        <w:t xml:space="preserve"> instead of class</w:t>
       </w:r>
     </w:p>
     <w:p>
@@ -728,12 +810,21 @@
           <w:szCs w:val="28"/>
         </w:rPr>
       </w:pPr>
-      <w:r>
-        <w:rPr>
-          <w:sz w:val="28"/>
-          <w:szCs w:val="28"/>
-        </w:rPr>
-        <w:t>htmlFor instead of for</w:t>
+      <w:proofErr w:type="spellStart"/>
+      <w:r>
+        <w:rPr>
+          <w:sz w:val="28"/>
+          <w:szCs w:val="28"/>
+        </w:rPr>
+        <w:t>htmlFor</w:t>
+      </w:r>
+      <w:proofErr w:type="spellEnd"/>
+      <w:r>
+        <w:rPr>
+          <w:sz w:val="28"/>
+          <w:szCs w:val="28"/>
+        </w:rPr>
+        <w:t xml:space="preserve"> instead of for</w:t>
       </w:r>
     </w:p>
     <w:p>
@@ -748,6 +839,7 @@
           <w:szCs w:val="28"/>
         </w:rPr>
       </w:pPr>
+      <w:proofErr w:type="spellStart"/>
       <w:r>
         <w:rPr>
           <w:sz w:val="28"/>
@@ -755,6 +847,7 @@
         </w:rPr>
         <w:t>tabIndex</w:t>
       </w:r>
+      <w:proofErr w:type="spellEnd"/>
     </w:p>
     <w:p>
       <w:pPr>
@@ -1125,7 +1218,23 @@
           <w:sz w:val="28"/>
           <w:szCs w:val="28"/>
         </w:rPr>
-        <w:t>Tutorial 5: // Adding Bootstrap and Textutils project</w:t>
+        <w:t xml:space="preserve">Tutorial 5: // Adding Bootstrap and </w:t>
+      </w:r>
+      <w:proofErr w:type="spellStart"/>
+      <w:r>
+        <w:rPr>
+          <w:sz w:val="28"/>
+          <w:szCs w:val="28"/>
+        </w:rPr>
+        <w:t>Textutils</w:t>
+      </w:r>
+      <w:proofErr w:type="spellEnd"/>
+      <w:r>
+        <w:rPr>
+          <w:sz w:val="28"/>
+          <w:szCs w:val="28"/>
+        </w:rPr>
+        <w:t xml:space="preserve"> project</w:t>
       </w:r>
     </w:p>
     <w:p>
@@ -1137,7 +1246,15 @@
         <w:t xml:space="preserve">Note: </w:t>
       </w:r>
       <w:r>
-        <w:t>there is node modules folder that contains all the packages and libraries we need. We can delete it because we already have that all details in package.json …    we can install all the dependency using following command</w:t>
+        <w:t xml:space="preserve">there is node modules folder that contains all the packages and libraries we need. We can delete it because we already have that all details in </w:t>
+      </w:r>
+      <w:proofErr w:type="spellStart"/>
+      <w:r>
+        <w:t>package.json</w:t>
+      </w:r>
+      <w:proofErr w:type="spellEnd"/>
+      <w:r>
+        <w:t xml:space="preserve"> …    we can install all the dependency using following command</w:t>
       </w:r>
     </w:p>
     <w:p>
@@ -1148,15 +1265,33 @@
           <w:numId w:val="1"/>
         </w:numPr>
       </w:pPr>
-      <w:r>
-        <w:t xml:space="preserve">npm </w:t>
+      <w:proofErr w:type="spellStart"/>
+      <w:r>
+        <w:t>npm</w:t>
+      </w:r>
+      <w:proofErr w:type="spellEnd"/>
+      <w:r>
+        <w:t xml:space="preserve"> </w:t>
       </w:r>
       <w:r>
         <w:t>install</w:t>
       </w:r>
       <w:r>
-        <w:t xml:space="preserve"> / npm i</w:t>
-      </w:r>
+        <w:t xml:space="preserve"> / </w:t>
+      </w:r>
+      <w:proofErr w:type="spellStart"/>
+      <w:r>
+        <w:t>npm</w:t>
+      </w:r>
+      <w:proofErr w:type="spellEnd"/>
+      <w:r>
+        <w:t xml:space="preserve"> </w:t>
+      </w:r>
+      <w:proofErr w:type="spellStart"/>
+      <w:r>
+        <w:t>i</w:t>
+      </w:r>
+      <w:proofErr w:type="spellEnd"/>
     </w:p>
     <w:p>
       <w:r>
@@ -1180,7 +1315,25 @@
           <w:szCs w:val="28"/>
           <w:u w:val="single"/>
         </w:rPr>
-        <w:t>Creating Textutils project</w:t>
+        <w:t xml:space="preserve">Creating </w:t>
+      </w:r>
+      <w:proofErr w:type="spellStart"/>
+      <w:r>
+        <w:rPr>
+          <w:sz w:val="28"/>
+          <w:szCs w:val="28"/>
+          <w:u w:val="single"/>
+        </w:rPr>
+        <w:t>Textutils</w:t>
+      </w:r>
+      <w:proofErr w:type="spellEnd"/>
+      <w:r>
+        <w:rPr>
+          <w:sz w:val="28"/>
+          <w:szCs w:val="28"/>
+          <w:u w:val="single"/>
+        </w:rPr>
+        <w:t xml:space="preserve"> project</w:t>
       </w:r>
       <w:r>
         <w:t>.</w:t>
@@ -1229,8 +1382,17 @@
           <w:sz w:val="28"/>
           <w:szCs w:val="28"/>
         </w:rPr>
-        <w:t>: Understanding Props and PropTypes</w:t>
-      </w:r>
+        <w:t xml:space="preserve">: Understanding Props and </w:t>
+      </w:r>
+      <w:proofErr w:type="spellStart"/>
+      <w:r>
+        <w:rPr>
+          <w:sz w:val="28"/>
+          <w:szCs w:val="28"/>
+        </w:rPr>
+        <w:t>PropTypes</w:t>
+      </w:r>
+      <w:proofErr w:type="spellEnd"/>
     </w:p>
     <w:p>
       <w:pPr>
@@ -1293,7 +1455,15 @@
         <w:t>,</w:t>
       </w:r>
       <w:r>
-        <w:t xml:space="preserve">we can add ‘m’ before js </w:t>
+        <w:t xml:space="preserve">we can add ‘m’ before </w:t>
+      </w:r>
+      <w:proofErr w:type="spellStart"/>
+      <w:r>
+        <w:t>js</w:t>
+      </w:r>
+      <w:proofErr w:type="spellEnd"/>
+      <w:r>
+        <w:t xml:space="preserve"> </w:t>
       </w:r>
       <w:r>
         <w:t>extension</w:t>
@@ -1319,7 +1489,15 @@
         </w:tabs>
       </w:pPr>
       <w:r>
-        <w:t>We can create component in another folder inside src folder and use them in our Apps.js</w:t>
+        <w:t xml:space="preserve">We can create component in another folder inside </w:t>
+      </w:r>
+      <w:proofErr w:type="spellStart"/>
+      <w:r>
+        <w:t>src</w:t>
+      </w:r>
+      <w:proofErr w:type="spellEnd"/>
+      <w:r>
+        <w:t xml:space="preserve"> folder and use them in our Apps.js</w:t>
       </w:r>
     </w:p>
     <w:p>
@@ -1407,7 +1585,27 @@
           <w:sz w:val="21"/>
           <w:szCs w:val="21"/>
         </w:rPr>
-        <w:t>"TextUtils"</w:t>
+        <w:t>"</w:t>
+      </w:r>
+      <w:proofErr w:type="spellStart"/>
+      <w:r>
+        <w:rPr>
+          <w:rFonts w:ascii="Consolas" w:eastAsia="Times New Roman" w:hAnsi="Consolas" w:cs="Times New Roman"/>
+          <w:color w:val="CE9178"/>
+          <w:sz w:val="21"/>
+          <w:szCs w:val="21"/>
+        </w:rPr>
+        <w:t>TextUtils</w:t>
+      </w:r>
+      <w:proofErr w:type="spellEnd"/>
+      <w:r>
+        <w:rPr>
+          <w:rFonts w:ascii="Consolas" w:eastAsia="Times New Roman" w:hAnsi="Consolas" w:cs="Times New Roman"/>
+          <w:color w:val="CE9178"/>
+          <w:sz w:val="21"/>
+          <w:szCs w:val="21"/>
+        </w:rPr>
+        <w:t>"</w:t>
       </w:r>
       <w:r>
         <w:rPr>
@@ -1435,17 +1633,33 @@
         </w:tabs>
       </w:pPr>
       <w:r>
-        <w:t>Here title is argument pass in props. We can use if by {props.title}</w:t>
-      </w:r>
-    </w:p>
-    <w:p>
-      <w:pPr>
-        <w:tabs>
-          <w:tab w:val="left" w:pos="3540"/>
-        </w:tabs>
-      </w:pPr>
-      <w:r>
-        <w:t>We can make proptype fix and also make it require by importing and using props-type.</w:t>
+        <w:t>Here title is argument pass in props. We can use if by {</w:t>
+      </w:r>
+      <w:proofErr w:type="spellStart"/>
+      <w:r>
+        <w:t>props.title</w:t>
+      </w:r>
+      <w:proofErr w:type="spellEnd"/>
+      <w:r>
+        <w:t>}</w:t>
+      </w:r>
+    </w:p>
+    <w:p>
+      <w:pPr>
+        <w:tabs>
+          <w:tab w:val="left" w:pos="3540"/>
+        </w:tabs>
+      </w:pPr>
+      <w:r>
+        <w:t xml:space="preserve">We can make </w:t>
+      </w:r>
+      <w:proofErr w:type="spellStart"/>
+      <w:r>
+        <w:t>proptype</w:t>
+      </w:r>
+      <w:proofErr w:type="spellEnd"/>
+      <w:r>
+        <w:t xml:space="preserve"> fix and also make it require by importing and using props-type.</w:t>
       </w:r>
     </w:p>
     <w:p>
@@ -1475,7 +1689,27 @@
           <w:sz w:val="21"/>
           <w:szCs w:val="21"/>
         </w:rPr>
-        <w:t xml:space="preserve"> PropTypes </w:t>
+        <w:t xml:space="preserve"> </w:t>
+      </w:r>
+      <w:proofErr w:type="spellStart"/>
+      <w:r>
+        <w:rPr>
+          <w:rFonts w:ascii="Consolas" w:eastAsia="Times New Roman" w:hAnsi="Consolas" w:cs="Times New Roman"/>
+          <w:color w:val="D4D4D4"/>
+          <w:sz w:val="21"/>
+          <w:szCs w:val="21"/>
+        </w:rPr>
+        <w:t>PropTypes</w:t>
+      </w:r>
+      <w:proofErr w:type="spellEnd"/>
+      <w:r>
+        <w:rPr>
+          <w:rFonts w:ascii="Consolas" w:eastAsia="Times New Roman" w:hAnsi="Consolas" w:cs="Times New Roman"/>
+          <w:color w:val="D4D4D4"/>
+          <w:sz w:val="21"/>
+          <w:szCs w:val="21"/>
+        </w:rPr>
+        <w:t xml:space="preserve"> </w:t>
       </w:r>
       <w:r>
         <w:rPr>
@@ -1525,14 +1759,25 @@
           <w:szCs w:val="21"/>
         </w:rPr>
       </w:pPr>
-      <w:r>
-        <w:rPr>
-          <w:rFonts w:ascii="Consolas" w:eastAsia="Times New Roman" w:hAnsi="Consolas" w:cs="Times New Roman"/>
-          <w:color w:val="D4D4D4"/>
-          <w:sz w:val="21"/>
-          <w:szCs w:val="21"/>
-        </w:rPr>
-        <w:t>Navbar.prototype = {</w:t>
+      <w:proofErr w:type="spellStart"/>
+      <w:r>
+        <w:rPr>
+          <w:rFonts w:ascii="Consolas" w:eastAsia="Times New Roman" w:hAnsi="Consolas" w:cs="Times New Roman"/>
+          <w:color w:val="D4D4D4"/>
+          <w:sz w:val="21"/>
+          <w:szCs w:val="21"/>
+        </w:rPr>
+        <w:t>Navbar.prototype</w:t>
+      </w:r>
+      <w:proofErr w:type="spellEnd"/>
+      <w:r>
+        <w:rPr>
+          <w:rFonts w:ascii="Consolas" w:eastAsia="Times New Roman" w:hAnsi="Consolas" w:cs="Times New Roman"/>
+          <w:color w:val="D4D4D4"/>
+          <w:sz w:val="21"/>
+          <w:szCs w:val="21"/>
+        </w:rPr>
+        <w:t xml:space="preserve"> = {</w:t>
       </w:r>
     </w:p>
     <w:p>
@@ -1553,8 +1798,19 @@
           <w:sz w:val="21"/>
           <w:szCs w:val="21"/>
         </w:rPr>
-        <w:t>    title: PropTypes.string.isRequired</w:t>
-      </w:r>
+        <w:t xml:space="preserve">    title: </w:t>
+      </w:r>
+      <w:proofErr w:type="spellStart"/>
+      <w:r>
+        <w:rPr>
+          <w:rFonts w:ascii="Consolas" w:eastAsia="Times New Roman" w:hAnsi="Consolas" w:cs="Times New Roman"/>
+          <w:color w:val="D4D4D4"/>
+          <w:sz w:val="21"/>
+          <w:szCs w:val="21"/>
+        </w:rPr>
+        <w:t>PropTypes.string.isRequired</w:t>
+      </w:r>
+      <w:proofErr w:type="spellEnd"/>
     </w:p>
     <w:p>
       <w:pPr>
@@ -1604,7 +1860,15 @@
         </w:tabs>
       </w:pPr>
       <w:r>
-        <w:t xml:space="preserve">Here note that if we use .js </w:t>
+        <w:t>Here note that if we use .</w:t>
+      </w:r>
+      <w:proofErr w:type="spellStart"/>
+      <w:r>
+        <w:t>js</w:t>
+      </w:r>
+      <w:proofErr w:type="spellEnd"/>
+      <w:r>
+        <w:t xml:space="preserve"> </w:t>
       </w:r>
       <w:r>
         <w:t>extension</w:t>
@@ -1627,17 +1891,41 @@
         </w:tabs>
       </w:pPr>
       <w:r>
-        <w:t>PS C:\Users\Dell\OneDrive\Desktop\React-with-Git&gt; node .\react-learning\src\components\module1.js</w:t>
-      </w:r>
-    </w:p>
-    <w:p>
-      <w:pPr>
-        <w:tabs>
-          <w:tab w:val="left" w:pos="3540"/>
-        </w:tabs>
-      </w:pPr>
-      <w:r>
-        <w:t>(node:10376) Warning: To load an ES module, set "type": "module" in the package.json or use the .mjs extension.</w:t>
+        <w:t>PS C:\Users\Dell\OneDrive\Desktop\React-with-Git&gt; node .\react-learning\</w:t>
+      </w:r>
+      <w:proofErr w:type="spellStart"/>
+      <w:r>
+        <w:t>src</w:t>
+      </w:r>
+      <w:proofErr w:type="spellEnd"/>
+      <w:r>
+        <w:t>\components\module1.js</w:t>
+      </w:r>
+    </w:p>
+    <w:p>
+      <w:pPr>
+        <w:tabs>
+          <w:tab w:val="left" w:pos="3540"/>
+        </w:tabs>
+      </w:pPr>
+      <w:r>
+        <w:t xml:space="preserve">(node:10376) Warning: To load an ES module, set "type": "module" in the </w:t>
+      </w:r>
+      <w:proofErr w:type="spellStart"/>
+      <w:r>
+        <w:t>package.json</w:t>
+      </w:r>
+      <w:proofErr w:type="spellEnd"/>
+      <w:r>
+        <w:t xml:space="preserve"> or use the .</w:t>
+      </w:r>
+      <w:proofErr w:type="spellStart"/>
+      <w:r>
+        <w:t>mjs</w:t>
+      </w:r>
+      <w:proofErr w:type="spellEnd"/>
+      <w:r>
+        <w:t xml:space="preserve"> extension.</w:t>
       </w:r>
     </w:p>
     <w:p>
@@ -1693,48 +1981,133 @@
           <w:tab w:val="left" w:pos="3540"/>
         </w:tabs>
       </w:pPr>
-      <w:r>
-        <w:t>SyntaxError: Cannot use import statement outside a module</w:t>
-      </w:r>
-    </w:p>
-    <w:p>
-      <w:pPr>
-        <w:tabs>
-          <w:tab w:val="left" w:pos="3540"/>
-        </w:tabs>
-      </w:pPr>
-      <w:r>
-        <w:t xml:space="preserve">    at Object.compileFunction (node:vm:352:18)</w:t>
-      </w:r>
-    </w:p>
-    <w:p>
-      <w:pPr>
-        <w:tabs>
-          <w:tab w:val="left" w:pos="3540"/>
-        </w:tabs>
-      </w:pPr>
-      <w:r>
-        <w:t xml:space="preserve">    at wrapSafe (node:internal/modules/cjs/loader:1027:15)</w:t>
-      </w:r>
-    </w:p>
-    <w:p>
-      <w:pPr>
-        <w:tabs>
-          <w:tab w:val="left" w:pos="3540"/>
-        </w:tabs>
-      </w:pPr>
-      <w:r>
-        <w:t xml:space="preserve">    at Module._compile (node:internal/modules/cjs/loader:1063:27)</w:t>
-      </w:r>
-    </w:p>
-    <w:p>
-      <w:pPr>
-        <w:tabs>
-          <w:tab w:val="left" w:pos="3540"/>
-        </w:tabs>
-      </w:pPr>
-      <w:r>
-        <w:t xml:space="preserve">    at Object.Module._extensions..js (node:internal/modules/cjs/loader:1153:10)    </w:t>
+      <w:proofErr w:type="spellStart"/>
+      <w:r>
+        <w:t>SyntaxError</w:t>
+      </w:r>
+      <w:proofErr w:type="spellEnd"/>
+      <w:r>
+        <w:t>: Cannot use import statement outside a module</w:t>
+      </w:r>
+    </w:p>
+    <w:p>
+      <w:pPr>
+        <w:tabs>
+          <w:tab w:val="left" w:pos="3540"/>
+        </w:tabs>
+      </w:pPr>
+      <w:r>
+        <w:t xml:space="preserve">    at </w:t>
+      </w:r>
+      <w:proofErr w:type="spellStart"/>
+      <w:r>
+        <w:t>Object.compileFunction</w:t>
+      </w:r>
+      <w:proofErr w:type="spellEnd"/>
+      <w:r>
+        <w:t xml:space="preserve"> (node:vm:352:18)</w:t>
+      </w:r>
+    </w:p>
+    <w:p>
+      <w:pPr>
+        <w:tabs>
+          <w:tab w:val="left" w:pos="3540"/>
+        </w:tabs>
+      </w:pPr>
+      <w:r>
+        <w:t xml:space="preserve">    at </w:t>
+      </w:r>
+      <w:proofErr w:type="spellStart"/>
+      <w:r>
+        <w:t>wrapSafe</w:t>
+      </w:r>
+      <w:proofErr w:type="spellEnd"/>
+      <w:r>
+        <w:t xml:space="preserve"> (</w:t>
+      </w:r>
+      <w:proofErr w:type="spellStart"/>
+      <w:r>
+        <w:t>node:internal</w:t>
+      </w:r>
+      <w:proofErr w:type="spellEnd"/>
+      <w:r>
+        <w:t>/modules/</w:t>
+      </w:r>
+      <w:proofErr w:type="spellStart"/>
+      <w:r>
+        <w:t>cjs</w:t>
+      </w:r>
+      <w:proofErr w:type="spellEnd"/>
+      <w:r>
+        <w:t>/loader:1027:15)</w:t>
+      </w:r>
+    </w:p>
+    <w:p>
+      <w:pPr>
+        <w:tabs>
+          <w:tab w:val="left" w:pos="3540"/>
+        </w:tabs>
+      </w:pPr>
+      <w:r>
+        <w:t xml:space="preserve">    at </w:t>
+      </w:r>
+      <w:proofErr w:type="spellStart"/>
+      <w:r>
+        <w:t>Module._compile</w:t>
+      </w:r>
+      <w:proofErr w:type="spellEnd"/>
+      <w:r>
+        <w:t xml:space="preserve"> (</w:t>
+      </w:r>
+      <w:proofErr w:type="spellStart"/>
+      <w:r>
+        <w:t>node:internal</w:t>
+      </w:r>
+      <w:proofErr w:type="spellEnd"/>
+      <w:r>
+        <w:t>/modules/</w:t>
+      </w:r>
+      <w:proofErr w:type="spellStart"/>
+      <w:r>
+        <w:t>cjs</w:t>
+      </w:r>
+      <w:proofErr w:type="spellEnd"/>
+      <w:r>
+        <w:t>/loader:1063:27)</w:t>
+      </w:r>
+    </w:p>
+    <w:p>
+      <w:pPr>
+        <w:tabs>
+          <w:tab w:val="left" w:pos="3540"/>
+        </w:tabs>
+      </w:pPr>
+      <w:r>
+        <w:t xml:space="preserve">    at Object.Module._extensions..</w:t>
+      </w:r>
+      <w:proofErr w:type="spellStart"/>
+      <w:r>
+        <w:t>js</w:t>
+      </w:r>
+      <w:proofErr w:type="spellEnd"/>
+      <w:r>
+        <w:t xml:space="preserve"> (</w:t>
+      </w:r>
+      <w:proofErr w:type="spellStart"/>
+      <w:r>
+        <w:t>node:internal</w:t>
+      </w:r>
+      <w:proofErr w:type="spellEnd"/>
+      <w:r>
+        <w:t>/modules/</w:t>
+      </w:r>
+      <w:proofErr w:type="spellStart"/>
+      <w:r>
+        <w:t>cjs</w:t>
+      </w:r>
+      <w:proofErr w:type="spellEnd"/>
+      <w:r>
+        <w:t xml:space="preserve">/loader:1153:10)    </w:t>
       </w:r>
     </w:p>
     <w:p>
@@ -1745,27 +2118,99 @@
       </w:pPr>
       <w:r>
         <w:lastRenderedPageBreak/>
-        <w:t xml:space="preserve">    at Module.load (node:internal/modules/cjs/loader:975:32)</w:t>
-      </w:r>
-    </w:p>
-    <w:p>
-      <w:pPr>
-        <w:tabs>
-          <w:tab w:val="left" w:pos="3540"/>
-        </w:tabs>
-      </w:pPr>
-      <w:r>
-        <w:t xml:space="preserve">    at Function.Module._load (node:internal/modules/cjs/loader:822:12)</w:t>
-      </w:r>
-    </w:p>
-    <w:p>
-      <w:pPr>
-        <w:tabs>
-          <w:tab w:val="left" w:pos="3540"/>
-        </w:tabs>
-      </w:pPr>
-      <w:r>
-        <w:t xml:space="preserve">    at Function.executeUserEntryPoint [as runMain] (node:internal/modules/run_main:77:12)</w:t>
+        <w:t xml:space="preserve">    at </w:t>
+      </w:r>
+      <w:proofErr w:type="spellStart"/>
+      <w:r>
+        <w:t>Module.load</w:t>
+      </w:r>
+      <w:proofErr w:type="spellEnd"/>
+      <w:r>
+        <w:t xml:space="preserve"> (</w:t>
+      </w:r>
+      <w:proofErr w:type="spellStart"/>
+      <w:r>
+        <w:t>node:internal</w:t>
+      </w:r>
+      <w:proofErr w:type="spellEnd"/>
+      <w:r>
+        <w:t>/modules/</w:t>
+      </w:r>
+      <w:proofErr w:type="spellStart"/>
+      <w:r>
+        <w:t>cjs</w:t>
+      </w:r>
+      <w:proofErr w:type="spellEnd"/>
+      <w:r>
+        <w:t>/loader:975:32)</w:t>
+      </w:r>
+    </w:p>
+    <w:p>
+      <w:pPr>
+        <w:tabs>
+          <w:tab w:val="left" w:pos="3540"/>
+        </w:tabs>
+      </w:pPr>
+      <w:r>
+        <w:t xml:space="preserve">    at </w:t>
+      </w:r>
+      <w:proofErr w:type="spellStart"/>
+      <w:r>
+        <w:t>Function.Module._load</w:t>
+      </w:r>
+      <w:proofErr w:type="spellEnd"/>
+      <w:r>
+        <w:t xml:space="preserve"> (</w:t>
+      </w:r>
+      <w:proofErr w:type="spellStart"/>
+      <w:r>
+        <w:t>node:internal</w:t>
+      </w:r>
+      <w:proofErr w:type="spellEnd"/>
+      <w:r>
+        <w:t>/modules/</w:t>
+      </w:r>
+      <w:proofErr w:type="spellStart"/>
+      <w:r>
+        <w:t>cjs</w:t>
+      </w:r>
+      <w:proofErr w:type="spellEnd"/>
+      <w:r>
+        <w:t>/loader:822:12)</w:t>
+      </w:r>
+    </w:p>
+    <w:p>
+      <w:pPr>
+        <w:tabs>
+          <w:tab w:val="left" w:pos="3540"/>
+        </w:tabs>
+      </w:pPr>
+      <w:r>
+        <w:t xml:space="preserve">    at </w:t>
+      </w:r>
+      <w:proofErr w:type="spellStart"/>
+      <w:r>
+        <w:t>Function.executeUserEntryPoint</w:t>
+      </w:r>
+      <w:proofErr w:type="spellEnd"/>
+      <w:r>
+        <w:t xml:space="preserve"> [as </w:t>
+      </w:r>
+      <w:proofErr w:type="spellStart"/>
+      <w:r>
+        <w:t>runMain</w:t>
+      </w:r>
+      <w:proofErr w:type="spellEnd"/>
+      <w:r>
+        <w:t>] (</w:t>
+      </w:r>
+      <w:proofErr w:type="spellStart"/>
+      <w:r>
+        <w:t>node:internal</w:t>
+      </w:r>
+      <w:proofErr w:type="spellEnd"/>
+      <w:r>
+        <w:t>/modules/run_main:77:12)</w:t>
       </w:r>
     </w:p>
     <w:p>
@@ -1778,7 +2223,15 @@
         </w:tabs>
       </w:pPr>
       <w:r>
-        <w:t xml:space="preserve">    at node:internal/main/run_main_module:17:47</w:t>
+        <w:t xml:space="preserve">    at </w:t>
+      </w:r>
+      <w:proofErr w:type="spellStart"/>
+      <w:r>
+        <w:t>node:internal</w:t>
+      </w:r>
+      <w:proofErr w:type="spellEnd"/>
+      <w:r>
+        <w:t>/main/run_main_module:17:47</w:t>
       </w:r>
     </w:p>
     <w:p>
@@ -1801,14 +2254,27 @@
         <w:t>this,</w:t>
       </w:r>
       <w:r>
-        <w:t xml:space="preserve"> we use .mjs </w:t>
+        <w:t xml:space="preserve"> we use .</w:t>
+      </w:r>
+      <w:proofErr w:type="spellStart"/>
+      <w:r>
+        <w:t>mjs</w:t>
+      </w:r>
+      <w:proofErr w:type="spellEnd"/>
+      <w:r>
+        <w:t xml:space="preserve"> </w:t>
       </w:r>
       <w:r>
         <w:t>extension</w:t>
       </w:r>
       <w:r>
-        <w:t xml:space="preserve"> instead of .js</w:t>
-      </w:r>
+        <w:t xml:space="preserve"> instead of .</w:t>
+      </w:r>
+      <w:proofErr w:type="spellStart"/>
+      <w:r>
+        <w:t>js</w:t>
+      </w:r>
+      <w:proofErr w:type="spellEnd"/>
     </w:p>
     <w:p>
       <w:pPr>
@@ -1824,7 +2290,15 @@
         </w:rPr>
       </w:pPr>
       <w:r>
-        <w:t xml:space="preserve">Note that we can not have multiple defaults for </w:t>
+        <w:t xml:space="preserve">Note that we </w:t>
+      </w:r>
+      <w:proofErr w:type="spellStart"/>
+      <w:r>
+        <w:t>can not</w:t>
+      </w:r>
+      <w:proofErr w:type="spellEnd"/>
+      <w:r>
+        <w:t xml:space="preserve"> have multiple defaults for </w:t>
       </w:r>
       <w:r>
         <w:t>export</w:t>
@@ -1907,14 +2381,25 @@
           <w:szCs w:val="21"/>
         </w:rPr>
       </w:pPr>
-      <w:r>
-        <w:rPr>
-          <w:rFonts w:ascii="Consolas" w:eastAsia="Times New Roman" w:hAnsi="Consolas" w:cs="Times New Roman"/>
-          <w:color w:val="D4D4D4"/>
-          <w:sz w:val="21"/>
-          <w:szCs w:val="21"/>
-        </w:rPr>
-        <w:t>Navbar.defaultProps = {</w:t>
+      <w:proofErr w:type="spellStart"/>
+      <w:r>
+        <w:rPr>
+          <w:rFonts w:ascii="Consolas" w:eastAsia="Times New Roman" w:hAnsi="Consolas" w:cs="Times New Roman"/>
+          <w:color w:val="D4D4D4"/>
+          <w:sz w:val="21"/>
+          <w:szCs w:val="21"/>
+        </w:rPr>
+        <w:t>Navbar.defaultProps</w:t>
+      </w:r>
+      <w:proofErr w:type="spellEnd"/>
+      <w:r>
+        <w:rPr>
+          <w:rFonts w:ascii="Consolas" w:eastAsia="Times New Roman" w:hAnsi="Consolas" w:cs="Times New Roman"/>
+          <w:color w:val="D4D4D4"/>
+          <w:sz w:val="21"/>
+          <w:szCs w:val="21"/>
+        </w:rPr>
+        <w:t xml:space="preserve"> = {</w:t>
       </w:r>
     </w:p>
     <w:p>
@@ -2094,7 +2579,23 @@
           <w:sz w:val="28"/>
           <w:szCs w:val="28"/>
         </w:rPr>
-        <w:t xml:space="preserve"> component we need hook which is useState.</w:t>
+        <w:t xml:space="preserve"> component we need hook which is </w:t>
+      </w:r>
+      <w:proofErr w:type="spellStart"/>
+      <w:r>
+        <w:rPr>
+          <w:sz w:val="28"/>
+          <w:szCs w:val="28"/>
+        </w:rPr>
+        <w:t>useState</w:t>
+      </w:r>
+      <w:proofErr w:type="spellEnd"/>
+      <w:r>
+        <w:rPr>
+          <w:sz w:val="28"/>
+          <w:szCs w:val="28"/>
+        </w:rPr>
+        <w:t>.</w:t>
       </w:r>
     </w:p>
     <w:p>
@@ -2138,21 +2639,19 @@
           <w:sz w:val="26"/>
           <w:szCs w:val="26"/>
         </w:rPr>
-        <w:t>You will note that if you add onclick event on button and changing the text value that is contained inside textarea that will theow an error in console that you should add onchange event in textarea.</w:t>
-      </w:r>
-    </w:p>
-    <w:p>
-      <w:pPr>
-        <w:tabs>
-          <w:tab w:val="left" w:pos="3540"/>
-        </w:tabs>
+        <w:t xml:space="preserve">You will note that if you add onclick event on button and changing the text value that is contained inside </w:t>
+      </w:r>
+      <w:proofErr w:type="spellStart"/>
+      <w:r>
         <w:rPr>
           <w:rFonts w:ascii="Segoe UI" w:hAnsi="Segoe UI" w:cs="Segoe UI"/>
           <w:color w:val="000000"/>
           <w:sz w:val="26"/>
           <w:szCs w:val="26"/>
         </w:rPr>
-      </w:pPr>
+        <w:t>textarea</w:t>
+      </w:r>
+      <w:proofErr w:type="spellEnd"/>
       <w:r>
         <w:rPr>
           <w:rFonts w:ascii="Segoe UI" w:hAnsi="Segoe UI" w:cs="Segoe UI"/>
@@ -2160,34 +2659,29 @@
           <w:sz w:val="26"/>
           <w:szCs w:val="26"/>
         </w:rPr>
-        <w:t>State is One type of variable that can be changed using setvar like of.</w:t>
-      </w:r>
-    </w:p>
-    <w:p>
-      <w:pPr>
-        <w:tabs>
-          <w:tab w:val="left" w:pos="3540"/>
-        </w:tabs>
+        <w:t xml:space="preserve"> that will theow an error in console that you should add </w:t>
+      </w:r>
+      <w:proofErr w:type="spellStart"/>
+      <w:r>
         <w:rPr>
           <w:rFonts w:ascii="Segoe UI" w:hAnsi="Segoe UI" w:cs="Segoe UI"/>
           <w:color w:val="000000"/>
           <w:sz w:val="26"/>
           <w:szCs w:val="26"/>
         </w:rPr>
-      </w:pPr>
-    </w:p>
-    <w:p>
-      <w:pPr>
-        <w:tabs>
-          <w:tab w:val="left" w:pos="3540"/>
-        </w:tabs>
+        <w:t>onchange</w:t>
+      </w:r>
+      <w:proofErr w:type="spellEnd"/>
+      <w:r>
         <w:rPr>
           <w:rFonts w:ascii="Segoe UI" w:hAnsi="Segoe UI" w:cs="Segoe UI"/>
           <w:color w:val="000000"/>
           <w:sz w:val="26"/>
           <w:szCs w:val="26"/>
         </w:rPr>
-      </w:pPr>
+        <w:t xml:space="preserve"> event in </w:t>
+      </w:r>
+      <w:proofErr w:type="spellStart"/>
       <w:r>
         <w:rPr>
           <w:rFonts w:ascii="Segoe UI" w:hAnsi="Segoe UI" w:cs="Segoe UI"/>
@@ -2195,8 +2689,9 @@
           <w:sz w:val="26"/>
           <w:szCs w:val="26"/>
         </w:rPr>
-        <w:t>Handling Event.</w:t>
-      </w:r>
+        <w:t>textarea</w:t>
+      </w:r>
+      <w:proofErr w:type="spellEnd"/>
       <w:r>
         <w:rPr>
           <w:rFonts w:ascii="Segoe UI" w:hAnsi="Segoe UI" w:cs="Segoe UI"/>
@@ -2204,7 +2699,7 @@
           <w:sz w:val="26"/>
           <w:szCs w:val="26"/>
         </w:rPr>
-        <w:t xml:space="preserve"> We can watch the commit online.</w:t>
+        <w:t>.</w:t>
       </w:r>
     </w:p>
     <w:p>
@@ -2226,8 +2721,114 @@
           <w:sz w:val="26"/>
           <w:szCs w:val="26"/>
         </w:rPr>
+        <w:t xml:space="preserve">State is One type of variable that can be changed using </w:t>
+      </w:r>
+      <w:proofErr w:type="spellStart"/>
+      <w:r>
+        <w:rPr>
+          <w:rFonts w:ascii="Segoe UI" w:hAnsi="Segoe UI" w:cs="Segoe UI"/>
+          <w:color w:val="000000"/>
+          <w:sz w:val="26"/>
+          <w:szCs w:val="26"/>
+        </w:rPr>
+        <w:t>setvar</w:t>
+      </w:r>
+      <w:proofErr w:type="spellEnd"/>
+      <w:r>
+        <w:rPr>
+          <w:rFonts w:ascii="Segoe UI" w:hAnsi="Segoe UI" w:cs="Segoe UI"/>
+          <w:color w:val="000000"/>
+          <w:sz w:val="26"/>
+          <w:szCs w:val="26"/>
+        </w:rPr>
+        <w:t xml:space="preserve"> like of.</w:t>
+      </w:r>
+    </w:p>
+    <w:p>
+      <w:pPr>
+        <w:tabs>
+          <w:tab w:val="left" w:pos="3540"/>
+        </w:tabs>
+        <w:rPr>
+          <w:rFonts w:ascii="Segoe UI" w:hAnsi="Segoe UI" w:cs="Segoe UI"/>
+          <w:color w:val="000000"/>
+          <w:sz w:val="26"/>
+          <w:szCs w:val="26"/>
+        </w:rPr>
+      </w:pPr>
+    </w:p>
+    <w:p>
+      <w:pPr>
+        <w:tabs>
+          <w:tab w:val="left" w:pos="3540"/>
+        </w:tabs>
+        <w:rPr>
+          <w:rFonts w:ascii="Segoe UI" w:hAnsi="Segoe UI" w:cs="Segoe UI"/>
+          <w:color w:val="000000"/>
+          <w:sz w:val="26"/>
+          <w:szCs w:val="26"/>
+        </w:rPr>
+      </w:pPr>
+      <w:r>
+        <w:rPr>
+          <w:rFonts w:ascii="Segoe UI" w:hAnsi="Segoe UI" w:cs="Segoe UI"/>
+          <w:color w:val="000000"/>
+          <w:sz w:val="26"/>
+          <w:szCs w:val="26"/>
+        </w:rPr>
+        <w:t>Handling Event.</w:t>
+      </w:r>
+      <w:r>
+        <w:rPr>
+          <w:rFonts w:ascii="Segoe UI" w:hAnsi="Segoe UI" w:cs="Segoe UI"/>
+          <w:color w:val="000000"/>
+          <w:sz w:val="26"/>
+          <w:szCs w:val="26"/>
+        </w:rPr>
+        <w:t xml:space="preserve"> We can watch the commit online.</w:t>
+      </w:r>
+    </w:p>
+    <w:p>
+      <w:pPr>
+        <w:tabs>
+          <w:tab w:val="left" w:pos="3540"/>
+        </w:tabs>
+        <w:rPr>
+          <w:rFonts w:ascii="Segoe UI" w:hAnsi="Segoe UI" w:cs="Segoe UI"/>
+          <w:color w:val="000000"/>
+          <w:sz w:val="26"/>
+          <w:szCs w:val="26"/>
+        </w:rPr>
+      </w:pPr>
+      <w:r>
+        <w:rPr>
+          <w:rFonts w:ascii="Segoe UI" w:hAnsi="Segoe UI" w:cs="Segoe UI"/>
+          <w:color w:val="000000"/>
+          <w:sz w:val="26"/>
+          <w:szCs w:val="26"/>
+        </w:rPr>
         <w:lastRenderedPageBreak/>
-        <w:t>Noted Point: I have noted that in react also if button type is submit then the page will surly realoded. If you want that your page should not reload then remove type=”submit” form the button tag.</w:t>
+        <w:t xml:space="preserve">Noted Point: I have noted that in react also if button type is submit then the page will surly </w:t>
+      </w:r>
+      <w:proofErr w:type="spellStart"/>
+      <w:r>
+        <w:rPr>
+          <w:rFonts w:ascii="Segoe UI" w:hAnsi="Segoe UI" w:cs="Segoe UI"/>
+          <w:color w:val="000000"/>
+          <w:sz w:val="26"/>
+          <w:szCs w:val="26"/>
+        </w:rPr>
+        <w:t>realoded</w:t>
+      </w:r>
+      <w:proofErr w:type="spellEnd"/>
+      <w:r>
+        <w:rPr>
+          <w:rFonts w:ascii="Segoe UI" w:hAnsi="Segoe UI" w:cs="Segoe UI"/>
+          <w:color w:val="000000"/>
+          <w:sz w:val="26"/>
+          <w:szCs w:val="26"/>
+        </w:rPr>
+        <w:t>. If you want that your page should not reload then remove type=”submit” form the button tag.</w:t>
       </w:r>
     </w:p>
     <w:p>
@@ -2300,21 +2901,19 @@
           <w:sz w:val="26"/>
           <w:szCs w:val="26"/>
         </w:rPr>
-        <w:t>I have desided to to add jquery in my react app to add copy functionality.</w:t>
-      </w:r>
-    </w:p>
-    <w:p>
-      <w:pPr>
-        <w:tabs>
-          <w:tab w:val="left" w:pos="3540"/>
-        </w:tabs>
+        <w:t xml:space="preserve">I have </w:t>
+      </w:r>
+      <w:proofErr w:type="spellStart"/>
+      <w:r>
         <w:rPr>
           <w:rFonts w:ascii="Segoe UI" w:hAnsi="Segoe UI" w:cs="Segoe UI"/>
           <w:color w:val="000000"/>
           <w:sz w:val="26"/>
           <w:szCs w:val="26"/>
         </w:rPr>
-      </w:pPr>
+        <w:t>desided</w:t>
+      </w:r>
+      <w:proofErr w:type="spellEnd"/>
       <w:r>
         <w:rPr>
           <w:rFonts w:ascii="Segoe UI" w:hAnsi="Segoe UI" w:cs="Segoe UI"/>
@@ -2322,7 +2921,89 @@
           <w:sz w:val="26"/>
           <w:szCs w:val="26"/>
         </w:rPr>
-        <w:t xml:space="preserve">To add the Jquery, Following Steps only </w:t>
+        <w:t xml:space="preserve"> to </w:t>
+      </w:r>
+      <w:proofErr w:type="spellStart"/>
+      <w:r>
+        <w:rPr>
+          <w:rFonts w:ascii="Segoe UI" w:hAnsi="Segoe UI" w:cs="Segoe UI"/>
+          <w:color w:val="000000"/>
+          <w:sz w:val="26"/>
+          <w:szCs w:val="26"/>
+        </w:rPr>
+        <w:t>to</w:t>
+      </w:r>
+      <w:proofErr w:type="spellEnd"/>
+      <w:r>
+        <w:rPr>
+          <w:rFonts w:ascii="Segoe UI" w:hAnsi="Segoe UI" w:cs="Segoe UI"/>
+          <w:color w:val="000000"/>
+          <w:sz w:val="26"/>
+          <w:szCs w:val="26"/>
+        </w:rPr>
+        <w:t xml:space="preserve"> add </w:t>
+      </w:r>
+      <w:proofErr w:type="spellStart"/>
+      <w:r>
+        <w:rPr>
+          <w:rFonts w:ascii="Segoe UI" w:hAnsi="Segoe UI" w:cs="Segoe UI"/>
+          <w:color w:val="000000"/>
+          <w:sz w:val="26"/>
+          <w:szCs w:val="26"/>
+        </w:rPr>
+        <w:t>jquery</w:t>
+      </w:r>
+      <w:proofErr w:type="spellEnd"/>
+      <w:r>
+        <w:rPr>
+          <w:rFonts w:ascii="Segoe UI" w:hAnsi="Segoe UI" w:cs="Segoe UI"/>
+          <w:color w:val="000000"/>
+          <w:sz w:val="26"/>
+          <w:szCs w:val="26"/>
+        </w:rPr>
+        <w:t xml:space="preserve"> in my react app to add copy functionality.</w:t>
+      </w:r>
+    </w:p>
+    <w:p>
+      <w:pPr>
+        <w:tabs>
+          <w:tab w:val="left" w:pos="3540"/>
+        </w:tabs>
+        <w:rPr>
+          <w:rFonts w:ascii="Segoe UI" w:hAnsi="Segoe UI" w:cs="Segoe UI"/>
+          <w:color w:val="000000"/>
+          <w:sz w:val="26"/>
+          <w:szCs w:val="26"/>
+        </w:rPr>
+      </w:pPr>
+      <w:r>
+        <w:rPr>
+          <w:rFonts w:ascii="Segoe UI" w:hAnsi="Segoe UI" w:cs="Segoe UI"/>
+          <w:color w:val="000000"/>
+          <w:sz w:val="26"/>
+          <w:szCs w:val="26"/>
+        </w:rPr>
+        <w:t xml:space="preserve">To add the </w:t>
+      </w:r>
+      <w:proofErr w:type="spellStart"/>
+      <w:r>
+        <w:rPr>
+          <w:rFonts w:ascii="Segoe UI" w:hAnsi="Segoe UI" w:cs="Segoe UI"/>
+          <w:color w:val="000000"/>
+          <w:sz w:val="26"/>
+          <w:szCs w:val="26"/>
+        </w:rPr>
+        <w:t>Jquery</w:t>
+      </w:r>
+      <w:proofErr w:type="spellEnd"/>
+      <w:r>
+        <w:rPr>
+          <w:rFonts w:ascii="Segoe UI" w:hAnsi="Segoe UI" w:cs="Segoe UI"/>
+          <w:color w:val="000000"/>
+          <w:sz w:val="26"/>
+          <w:szCs w:val="26"/>
+        </w:rPr>
+        <w:t xml:space="preserve">, Following Steps only </w:t>
       </w:r>
     </w:p>
     <w:p>
@@ -2342,6 +3023,7 @@
           <w:szCs w:val="26"/>
         </w:rPr>
       </w:pPr>
+      <w:proofErr w:type="spellStart"/>
       <w:r>
         <w:rPr>
           <w:rFonts w:ascii="Courier New" w:hAnsi="Courier New" w:cs="Courier New"/>
@@ -2349,7 +3031,37 @@
           <w:spacing w:val="-5"/>
           <w:shd w:val="clear" w:color="auto" w:fill="F2F2F2"/>
         </w:rPr>
-        <w:t>npm install jquery –save</w:t>
+        <w:t>npm</w:t>
+      </w:r>
+      <w:proofErr w:type="spellEnd"/>
+      <w:r>
+        <w:rPr>
+          <w:rFonts w:ascii="Courier New" w:hAnsi="Courier New" w:cs="Courier New"/>
+          <w:color w:val="292929"/>
+          <w:spacing w:val="-5"/>
+          <w:shd w:val="clear" w:color="auto" w:fill="F2F2F2"/>
+        </w:rPr>
+        <w:t xml:space="preserve"> install </w:t>
+      </w:r>
+      <w:proofErr w:type="spellStart"/>
+      <w:r>
+        <w:rPr>
+          <w:rFonts w:ascii="Courier New" w:hAnsi="Courier New" w:cs="Courier New"/>
+          <w:color w:val="292929"/>
+          <w:spacing w:val="-5"/>
+          <w:shd w:val="clear" w:color="auto" w:fill="F2F2F2"/>
+        </w:rPr>
+        <w:t>jquery</w:t>
+      </w:r>
+      <w:proofErr w:type="spellEnd"/>
+      <w:r>
+        <w:rPr>
+          <w:rFonts w:ascii="Courier New" w:hAnsi="Courier New" w:cs="Courier New"/>
+          <w:color w:val="292929"/>
+          <w:spacing w:val="-5"/>
+          <w:shd w:val="clear" w:color="auto" w:fill="F2F2F2"/>
+        </w:rPr>
+        <w:t xml:space="preserve"> –save</w:t>
       </w:r>
     </w:p>
     <w:p>
@@ -2377,7 +3089,29 @@
           <w:sz w:val="30"/>
           <w:szCs w:val="30"/>
         </w:rPr>
-        <w:t>2. Now open project in your favorite IDE and import jquery to the file where you want to manipulate DOM.</w:t>
+        <w:t xml:space="preserve">2. Now open project in your favorite IDE and import </w:t>
+      </w:r>
+      <w:proofErr w:type="spellStart"/>
+      <w:r>
+        <w:rPr>
+          <w:rFonts w:ascii="Georgia" w:eastAsia="Times New Roman" w:hAnsi="Georgia" w:cs="Times New Roman"/>
+          <w:color w:val="292929"/>
+          <w:spacing w:val="-1"/>
+          <w:sz w:val="30"/>
+          <w:szCs w:val="30"/>
+        </w:rPr>
+        <w:t>jquery</w:t>
+      </w:r>
+      <w:proofErr w:type="spellEnd"/>
+      <w:r>
+        <w:rPr>
+          <w:rFonts w:ascii="Georgia" w:eastAsia="Times New Roman" w:hAnsi="Georgia" w:cs="Times New Roman"/>
+          <w:color w:val="292929"/>
+          <w:spacing w:val="-1"/>
+          <w:sz w:val="30"/>
+          <w:szCs w:val="30"/>
+        </w:rPr>
+        <w:t xml:space="preserve"> to the file where you want to manipulate DOM.</w:t>
       </w:r>
     </w:p>
     <w:p>
@@ -2421,7 +3155,29 @@
           <w:sz w:val="24"/>
           <w:szCs w:val="24"/>
         </w:rPr>
-        <w:t>import $ from 'jquery'</w:t>
+        <w:t>import $ from '</w:t>
+      </w:r>
+      <w:proofErr w:type="spellStart"/>
+      <w:r>
+        <w:rPr>
+          <w:rFonts w:ascii="Courier New" w:eastAsia="Times New Roman" w:hAnsi="Courier New" w:cs="Courier New"/>
+          <w:color w:val="292929"/>
+          <w:spacing w:val="-5"/>
+          <w:sz w:val="24"/>
+          <w:szCs w:val="24"/>
+        </w:rPr>
+        <w:t>jquery</w:t>
+      </w:r>
+      <w:proofErr w:type="spellEnd"/>
+      <w:r>
+        <w:rPr>
+          <w:rFonts w:ascii="Courier New" w:eastAsia="Times New Roman" w:hAnsi="Courier New" w:cs="Courier New"/>
+          <w:color w:val="292929"/>
+          <w:spacing w:val="-5"/>
+          <w:sz w:val="24"/>
+          <w:szCs w:val="24"/>
+        </w:rPr>
+        <w:t>'</w:t>
       </w:r>
     </w:p>
     <w:p>
@@ -2461,7 +3217,27 @@
           <w:sz w:val="26"/>
           <w:szCs w:val="26"/>
         </w:rPr>
-        <w:t>Note that we can not change the props so we use state instead. The other thing is when we are using object of object then we should use the {{ }} “double curly braces”.</w:t>
+        <w:t xml:space="preserve">Note that we </w:t>
+      </w:r>
+      <w:proofErr w:type="spellStart"/>
+      <w:r>
+        <w:rPr>
+          <w:rFonts w:ascii="Segoe UI" w:hAnsi="Segoe UI" w:cs="Segoe UI"/>
+          <w:color w:val="000000"/>
+          <w:sz w:val="26"/>
+          <w:szCs w:val="26"/>
+        </w:rPr>
+        <w:t>can not</w:t>
+      </w:r>
+      <w:proofErr w:type="spellEnd"/>
+      <w:r>
+        <w:rPr>
+          <w:rFonts w:ascii="Segoe UI" w:hAnsi="Segoe UI" w:cs="Segoe UI"/>
+          <w:color w:val="000000"/>
+          <w:sz w:val="26"/>
+          <w:szCs w:val="26"/>
+        </w:rPr>
+        <w:t xml:space="preserve"> change the props so we use state instead. The other thing is when we are using object of object then we should use the {{ }} “double curly braces”.</w:t>
       </w:r>
     </w:p>
     <w:p>
@@ -2516,7 +3292,67 @@
           <w:sz w:val="28"/>
           <w:szCs w:val="28"/>
         </w:rPr>
-        <w:t>we can use “ ` ”, this is backtics under Esc, for templating. We can not use template strings inside string. To use templating, we have to use backtics.</w:t>
+        <w:t xml:space="preserve">we can use “ ` ”, this is </w:t>
+      </w:r>
+      <w:proofErr w:type="spellStart"/>
+      <w:r>
+        <w:rPr>
+          <w:rFonts w:ascii="Segoe UI" w:hAnsi="Segoe UI" w:cs="Segoe UI"/>
+          <w:color w:val="000000"/>
+          <w:sz w:val="28"/>
+          <w:szCs w:val="28"/>
+        </w:rPr>
+        <w:t>backtics</w:t>
+      </w:r>
+      <w:proofErr w:type="spellEnd"/>
+      <w:r>
+        <w:rPr>
+          <w:rFonts w:ascii="Segoe UI" w:hAnsi="Segoe UI" w:cs="Segoe UI"/>
+          <w:color w:val="000000"/>
+          <w:sz w:val="28"/>
+          <w:szCs w:val="28"/>
+        </w:rPr>
+        <w:t xml:space="preserve"> under Esc, for templating. We </w:t>
+      </w:r>
+      <w:proofErr w:type="spellStart"/>
+      <w:r>
+        <w:rPr>
+          <w:rFonts w:ascii="Segoe UI" w:hAnsi="Segoe UI" w:cs="Segoe UI"/>
+          <w:color w:val="000000"/>
+          <w:sz w:val="28"/>
+          <w:szCs w:val="28"/>
+        </w:rPr>
+        <w:t>can not</w:t>
+      </w:r>
+      <w:proofErr w:type="spellEnd"/>
+      <w:r>
+        <w:rPr>
+          <w:rFonts w:ascii="Segoe UI" w:hAnsi="Segoe UI" w:cs="Segoe UI"/>
+          <w:color w:val="000000"/>
+          <w:sz w:val="28"/>
+          <w:szCs w:val="28"/>
+        </w:rPr>
+        <w:t xml:space="preserve"> use template strings inside string. To use templating, we have to use </w:t>
+      </w:r>
+      <w:proofErr w:type="spellStart"/>
+      <w:r>
+        <w:rPr>
+          <w:rFonts w:ascii="Segoe UI" w:hAnsi="Segoe UI" w:cs="Segoe UI"/>
+          <w:color w:val="000000"/>
+          <w:sz w:val="28"/>
+          <w:szCs w:val="28"/>
+        </w:rPr>
+        <w:t>backtics</w:t>
+      </w:r>
+      <w:proofErr w:type="spellEnd"/>
+      <w:r>
+        <w:rPr>
+          <w:rFonts w:ascii="Segoe UI" w:hAnsi="Segoe UI" w:cs="Segoe UI"/>
+          <w:color w:val="000000"/>
+          <w:sz w:val="28"/>
+          <w:szCs w:val="28"/>
+        </w:rPr>
+        <w:t>.</w:t>
       </w:r>
     </w:p>
     <w:p>
@@ -2570,7 +3406,87 @@
           <w:rFonts w:ascii="Segoe UI" w:hAnsi="Segoe UI" w:cs="Segoe UI"/>
           <w:color w:val="000000"/>
         </w:rPr>
-        <w:t>Style = {{backgroundColor: props.mode === ‘dark’ ? ‘grey’:’white’, color: props.mode === ‘dark’ ? ‘white’:’black’}}</w:t>
+        <w:t>Style = {{</w:t>
+      </w:r>
+      <w:proofErr w:type="spellStart"/>
+      <w:r>
+        <w:rPr>
+          <w:rFonts w:ascii="Segoe UI" w:hAnsi="Segoe UI" w:cs="Segoe UI"/>
+          <w:color w:val="000000"/>
+        </w:rPr>
+        <w:t>backgroundColor</w:t>
+      </w:r>
+      <w:proofErr w:type="spellEnd"/>
+      <w:r>
+        <w:rPr>
+          <w:rFonts w:ascii="Segoe UI" w:hAnsi="Segoe UI" w:cs="Segoe UI"/>
+          <w:color w:val="000000"/>
+        </w:rPr>
+        <w:t xml:space="preserve">: </w:t>
+      </w:r>
+      <w:proofErr w:type="spellStart"/>
+      <w:r>
+        <w:rPr>
+          <w:rFonts w:ascii="Segoe UI" w:hAnsi="Segoe UI" w:cs="Segoe UI"/>
+          <w:color w:val="000000"/>
+        </w:rPr>
+        <w:t>props.mode</w:t>
+      </w:r>
+      <w:proofErr w:type="spellEnd"/>
+      <w:r>
+        <w:rPr>
+          <w:rFonts w:ascii="Segoe UI" w:hAnsi="Segoe UI" w:cs="Segoe UI"/>
+          <w:color w:val="000000"/>
+        </w:rPr>
+        <w:t xml:space="preserve"> === ‘dark’ ? ‘</w:t>
+      </w:r>
+      <w:proofErr w:type="spellStart"/>
+      <w:r>
+        <w:rPr>
+          <w:rFonts w:ascii="Segoe UI" w:hAnsi="Segoe UI" w:cs="Segoe UI"/>
+          <w:color w:val="000000"/>
+        </w:rPr>
+        <w:t>grey’:’white</w:t>
+      </w:r>
+      <w:proofErr w:type="spellEnd"/>
+      <w:r>
+        <w:rPr>
+          <w:rFonts w:ascii="Segoe UI" w:hAnsi="Segoe UI" w:cs="Segoe UI"/>
+          <w:color w:val="000000"/>
+        </w:rPr>
+        <w:t xml:space="preserve">’, color: </w:t>
+      </w:r>
+      <w:proofErr w:type="spellStart"/>
+      <w:r>
+        <w:rPr>
+          <w:rFonts w:ascii="Segoe UI" w:hAnsi="Segoe UI" w:cs="Segoe UI"/>
+          <w:color w:val="000000"/>
+        </w:rPr>
+        <w:t>props.mode</w:t>
+      </w:r>
+      <w:proofErr w:type="spellEnd"/>
+      <w:r>
+        <w:rPr>
+          <w:rFonts w:ascii="Segoe UI" w:hAnsi="Segoe UI" w:cs="Segoe UI"/>
+          <w:color w:val="000000"/>
+        </w:rPr>
+        <w:t xml:space="preserve"> === ‘dark’ ? ‘</w:t>
+      </w:r>
+      <w:proofErr w:type="spellStart"/>
+      <w:r>
+        <w:rPr>
+          <w:rFonts w:ascii="Segoe UI" w:hAnsi="Segoe UI" w:cs="Segoe UI"/>
+          <w:color w:val="000000"/>
+        </w:rPr>
+        <w:t>white’:’black</w:t>
+      </w:r>
+      <w:proofErr w:type="spellEnd"/>
+      <w:r>
+        <w:rPr>
+          <w:rFonts w:ascii="Segoe UI" w:hAnsi="Segoe UI" w:cs="Segoe UI"/>
+          <w:color w:val="000000"/>
+        </w:rPr>
+        <w:t>’}}</w:t>
       </w:r>
     </w:p>
     <w:p>
@@ -2647,6 +3563,7 @@
           <w:szCs w:val="28"/>
         </w:rPr>
       </w:pPr>
+      <w:proofErr w:type="spellStart"/>
       <w:r>
         <w:rPr>
           <w:rFonts w:ascii="Segoe UI" w:hAnsi="Segoe UI" w:cs="Segoe UI"/>
@@ -2656,14 +3573,10 @@
           <w:sz w:val="28"/>
           <w:szCs w:val="28"/>
         </w:rPr>
-        <w:t>npm install react@18 react-dom@18</w:t>
-      </w:r>
-    </w:p>
-    <w:p>
-      <w:pPr>
-        <w:tabs>
-          <w:tab w:val="left" w:pos="3540"/>
-        </w:tabs>
+        <w:t>npm</w:t>
+      </w:r>
+      <w:proofErr w:type="spellEnd"/>
+      <w:r>
         <w:rPr>
           <w:rFonts w:ascii="Segoe UI" w:hAnsi="Segoe UI" w:cs="Segoe UI"/>
           <w:b/>
@@ -2672,8 +3585,14 @@
           <w:sz w:val="28"/>
           <w:szCs w:val="28"/>
         </w:rPr>
-      </w:pPr>
-      <w:r>
+        <w:t xml:space="preserve"> install react@18 react-dom@18</w:t>
+      </w:r>
+    </w:p>
+    <w:p>
+      <w:pPr>
+        <w:tabs>
+          <w:tab w:val="left" w:pos="3540"/>
+        </w:tabs>
         <w:rPr>
           <w:rFonts w:ascii="Segoe UI" w:hAnsi="Segoe UI" w:cs="Segoe UI"/>
           <w:b/>
@@ -2682,14 +3601,8 @@
           <w:sz w:val="28"/>
           <w:szCs w:val="28"/>
         </w:rPr>
-        <w:t>Note that in react 18 we can not use ReactDom.render. (in index.html)</w:t>
-      </w:r>
-    </w:p>
-    <w:p>
-      <w:pPr>
-        <w:tabs>
-          <w:tab w:val="left" w:pos="3540"/>
-        </w:tabs>
+      </w:pPr>
+      <w:r>
         <w:rPr>
           <w:rFonts w:ascii="Segoe UI" w:hAnsi="Segoe UI" w:cs="Segoe UI"/>
           <w:b/>
@@ -2698,7 +3611,9 @@
           <w:sz w:val="28"/>
           <w:szCs w:val="28"/>
         </w:rPr>
-      </w:pPr>
+        <w:t xml:space="preserve">Note that in react 18 we </w:t>
+      </w:r>
+      <w:proofErr w:type="spellStart"/>
       <w:r>
         <w:rPr>
           <w:rFonts w:ascii="Segoe UI" w:hAnsi="Segoe UI" w:cs="Segoe UI"/>
@@ -2708,14 +3623,10 @@
           <w:sz w:val="28"/>
           <w:szCs w:val="28"/>
         </w:rPr>
-        <w:t xml:space="preserve">We can use as following: </w:t>
-      </w:r>
-    </w:p>
-    <w:p>
-      <w:pPr>
-        <w:tabs>
-          <w:tab w:val="left" w:pos="3540"/>
-        </w:tabs>
+        <w:t>can not</w:t>
+      </w:r>
+      <w:proofErr w:type="spellEnd"/>
+      <w:r>
         <w:rPr>
           <w:rFonts w:ascii="Segoe UI" w:hAnsi="Segoe UI" w:cs="Segoe UI"/>
           <w:b/>
@@ -2724,7 +3635,9 @@
           <w:sz w:val="28"/>
           <w:szCs w:val="28"/>
         </w:rPr>
-      </w:pPr>
+        <w:t xml:space="preserve"> use </w:t>
+      </w:r>
+      <w:proofErr w:type="spellStart"/>
       <w:r>
         <w:rPr>
           <w:rFonts w:ascii="Segoe UI" w:hAnsi="Segoe UI" w:cs="Segoe UI"/>
@@ -2734,15 +3647,10 @@
           <w:sz w:val="28"/>
           <w:szCs w:val="28"/>
         </w:rPr>
-        <w:lastRenderedPageBreak/>
-        <w:t>const root = ReactDom.createRoot(document.getelementId(‘root));</w:t>
-      </w:r>
-    </w:p>
-    <w:p>
-      <w:pPr>
-        <w:tabs>
-          <w:tab w:val="left" w:pos="3540"/>
-        </w:tabs>
+        <w:t>ReactDom.render</w:t>
+      </w:r>
+      <w:proofErr w:type="spellEnd"/>
+      <w:r>
         <w:rPr>
           <w:rFonts w:ascii="Segoe UI" w:hAnsi="Segoe UI" w:cs="Segoe UI"/>
           <w:b/>
@@ -2751,8 +3659,14 @@
           <w:sz w:val="28"/>
           <w:szCs w:val="28"/>
         </w:rPr>
-      </w:pPr>
-      <w:r>
+        <w:t>. (in index.html)</w:t>
+      </w:r>
+    </w:p>
+    <w:p>
+      <w:pPr>
+        <w:tabs>
+          <w:tab w:val="left" w:pos="3540"/>
+        </w:tabs>
         <w:rPr>
           <w:rFonts w:ascii="Segoe UI" w:hAnsi="Segoe UI" w:cs="Segoe UI"/>
           <w:b/>
@@ -2761,7 +3675,131 @@
           <w:sz w:val="28"/>
           <w:szCs w:val="28"/>
         </w:rPr>
-        <w:t>root.render(</w:t>
+      </w:pPr>
+      <w:r>
+        <w:rPr>
+          <w:rFonts w:ascii="Segoe UI" w:hAnsi="Segoe UI" w:cs="Segoe UI"/>
+          <w:b/>
+          <w:bCs/>
+          <w:color w:val="000000"/>
+          <w:sz w:val="28"/>
+          <w:szCs w:val="28"/>
+        </w:rPr>
+        <w:t xml:space="preserve">We can use as following: </w:t>
+      </w:r>
+    </w:p>
+    <w:p>
+      <w:pPr>
+        <w:tabs>
+          <w:tab w:val="left" w:pos="3540"/>
+        </w:tabs>
+        <w:rPr>
+          <w:rFonts w:ascii="Segoe UI" w:hAnsi="Segoe UI" w:cs="Segoe UI"/>
+          <w:b/>
+          <w:bCs/>
+          <w:color w:val="000000"/>
+          <w:sz w:val="28"/>
+          <w:szCs w:val="28"/>
+        </w:rPr>
+      </w:pPr>
+      <w:r>
+        <w:rPr>
+          <w:rFonts w:ascii="Segoe UI" w:hAnsi="Segoe UI" w:cs="Segoe UI"/>
+          <w:b/>
+          <w:bCs/>
+          <w:color w:val="000000"/>
+          <w:sz w:val="28"/>
+          <w:szCs w:val="28"/>
+        </w:rPr>
+        <w:lastRenderedPageBreak/>
+        <w:t xml:space="preserve">const root = </w:t>
+      </w:r>
+      <w:proofErr w:type="spellStart"/>
+      <w:r>
+        <w:rPr>
+          <w:rFonts w:ascii="Segoe UI" w:hAnsi="Segoe UI" w:cs="Segoe UI"/>
+          <w:b/>
+          <w:bCs/>
+          <w:color w:val="000000"/>
+          <w:sz w:val="28"/>
+          <w:szCs w:val="28"/>
+        </w:rPr>
+        <w:t>ReactDom.createRoot</w:t>
+      </w:r>
+      <w:proofErr w:type="spellEnd"/>
+      <w:r>
+        <w:rPr>
+          <w:rFonts w:ascii="Segoe UI" w:hAnsi="Segoe UI" w:cs="Segoe UI"/>
+          <w:b/>
+          <w:bCs/>
+          <w:color w:val="000000"/>
+          <w:sz w:val="28"/>
+          <w:szCs w:val="28"/>
+        </w:rPr>
+        <w:t>(</w:t>
+      </w:r>
+      <w:proofErr w:type="spellStart"/>
+      <w:r>
+        <w:rPr>
+          <w:rFonts w:ascii="Segoe UI" w:hAnsi="Segoe UI" w:cs="Segoe UI"/>
+          <w:b/>
+          <w:bCs/>
+          <w:color w:val="000000"/>
+          <w:sz w:val="28"/>
+          <w:szCs w:val="28"/>
+        </w:rPr>
+        <w:t>document.getelementId</w:t>
+      </w:r>
+      <w:proofErr w:type="spellEnd"/>
+      <w:r>
+        <w:rPr>
+          <w:rFonts w:ascii="Segoe UI" w:hAnsi="Segoe UI" w:cs="Segoe UI"/>
+          <w:b/>
+          <w:bCs/>
+          <w:color w:val="000000"/>
+          <w:sz w:val="28"/>
+          <w:szCs w:val="28"/>
+        </w:rPr>
+        <w:t>(‘root));</w:t>
+      </w:r>
+    </w:p>
+    <w:p>
+      <w:pPr>
+        <w:tabs>
+          <w:tab w:val="left" w:pos="3540"/>
+        </w:tabs>
+        <w:rPr>
+          <w:rFonts w:ascii="Segoe UI" w:hAnsi="Segoe UI" w:cs="Segoe UI"/>
+          <w:b/>
+          <w:bCs/>
+          <w:color w:val="000000"/>
+          <w:sz w:val="28"/>
+          <w:szCs w:val="28"/>
+        </w:rPr>
+      </w:pPr>
+      <w:proofErr w:type="spellStart"/>
+      <w:r>
+        <w:rPr>
+          <w:rFonts w:ascii="Segoe UI" w:hAnsi="Segoe UI" w:cs="Segoe UI"/>
+          <w:b/>
+          <w:bCs/>
+          <w:color w:val="000000"/>
+          <w:sz w:val="28"/>
+          <w:szCs w:val="28"/>
+        </w:rPr>
+        <w:t>root.render</w:t>
+      </w:r>
+      <w:proofErr w:type="spellEnd"/>
+      <w:r>
+        <w:rPr>
+          <w:rFonts w:ascii="Segoe UI" w:hAnsi="Segoe UI" w:cs="Segoe UI"/>
+          <w:b/>
+          <w:bCs/>
+          <w:color w:val="000000"/>
+          <w:sz w:val="28"/>
+          <w:szCs w:val="28"/>
+        </w:rPr>
+        <w:t>(</w:t>
       </w:r>
     </w:p>
     <w:p>
@@ -2897,6 +3935,7 @@
           <w:szCs w:val="28"/>
         </w:rPr>
       </w:pPr>
+      <w:proofErr w:type="spellStart"/>
       <w:r>
         <w:rPr>
           <w:rFonts w:ascii="Consolas" w:hAnsi="Consolas"/>
@@ -2905,8 +3944,31 @@
           <w:szCs w:val="21"/>
           <w:shd w:val="clear" w:color="auto" w:fill="1E1E1E"/>
         </w:rPr>
-        <w:t>npm install react-router-dom</w:t>
-      </w:r>
+        <w:t>npm</w:t>
+      </w:r>
+      <w:proofErr w:type="spellEnd"/>
+      <w:r>
+        <w:rPr>
+          <w:rFonts w:ascii="Consolas" w:hAnsi="Consolas"/>
+          <w:color w:val="B6B6B6"/>
+          <w:sz w:val="21"/>
+          <w:szCs w:val="21"/>
+          <w:shd w:val="clear" w:color="auto" w:fill="1E1E1E"/>
+        </w:rPr>
+        <w:t xml:space="preserve"> install react-router-</w:t>
+      </w:r>
+      <w:proofErr w:type="spellStart"/>
+      <w:r>
+        <w:rPr>
+          <w:rFonts w:ascii="Consolas" w:hAnsi="Consolas"/>
+          <w:color w:val="B6B6B6"/>
+          <w:sz w:val="21"/>
+          <w:szCs w:val="21"/>
+          <w:shd w:val="clear" w:color="auto" w:fill="1E1E1E"/>
+        </w:rPr>
+        <w:t>dom</w:t>
+      </w:r>
+      <w:proofErr w:type="spellEnd"/>
     </w:p>
     <w:p>
       <w:pPr>
@@ -2978,7 +4040,27 @@
           <w:sz w:val="21"/>
           <w:szCs w:val="21"/>
         </w:rPr>
-        <w:t xml:space="preserve">  BrowserRouter </w:t>
+        <w:t xml:space="preserve">  </w:t>
+      </w:r>
+      <w:proofErr w:type="spellStart"/>
+      <w:r>
+        <w:rPr>
+          <w:rFonts w:ascii="Consolas" w:eastAsia="Times New Roman" w:hAnsi="Consolas" w:cs="Times New Roman"/>
+          <w:color w:val="D4D4D4"/>
+          <w:sz w:val="21"/>
+          <w:szCs w:val="21"/>
+        </w:rPr>
+        <w:t>BrowserRouter</w:t>
+      </w:r>
+      <w:proofErr w:type="spellEnd"/>
+      <w:r>
+        <w:rPr>
+          <w:rFonts w:ascii="Consolas" w:eastAsia="Times New Roman" w:hAnsi="Consolas" w:cs="Times New Roman"/>
+          <w:color w:val="D4D4D4"/>
+          <w:sz w:val="21"/>
+          <w:szCs w:val="21"/>
+        </w:rPr>
+        <w:t xml:space="preserve"> </w:t>
       </w:r>
       <w:r>
         <w:rPr>
@@ -3107,7 +4189,27 @@
           <w:sz w:val="21"/>
           <w:szCs w:val="21"/>
         </w:rPr>
-        <w:t>"react-router-dom"</w:t>
+        <w:t>"react-router-</w:t>
+      </w:r>
+      <w:proofErr w:type="spellStart"/>
+      <w:r>
+        <w:rPr>
+          <w:rFonts w:ascii="Consolas" w:eastAsia="Times New Roman" w:hAnsi="Consolas" w:cs="Times New Roman"/>
+          <w:color w:val="CE9178"/>
+          <w:sz w:val="21"/>
+          <w:szCs w:val="21"/>
+        </w:rPr>
+        <w:t>dom</w:t>
+      </w:r>
+      <w:proofErr w:type="spellEnd"/>
+      <w:r>
+        <w:rPr>
+          <w:rFonts w:ascii="Consolas" w:eastAsia="Times New Roman" w:hAnsi="Consolas" w:cs="Times New Roman"/>
+          <w:color w:val="CE9178"/>
+          <w:sz w:val="21"/>
+          <w:szCs w:val="21"/>
+        </w:rPr>
+        <w:t>"</w:t>
       </w:r>
       <w:r>
         <w:rPr>
@@ -3256,7 +4358,27 @@
           <w:sz w:val="21"/>
           <w:szCs w:val="21"/>
         </w:rPr>
-        <w:t>"TextUtils"</w:t>
+        <w:t>"</w:t>
+      </w:r>
+      <w:proofErr w:type="spellStart"/>
+      <w:r>
+        <w:rPr>
+          <w:rFonts w:ascii="Consolas" w:eastAsia="Times New Roman" w:hAnsi="Consolas" w:cs="Times New Roman"/>
+          <w:color w:val="CE9178"/>
+          <w:sz w:val="21"/>
+          <w:szCs w:val="21"/>
+        </w:rPr>
+        <w:t>TextUtils</w:t>
+      </w:r>
+      <w:proofErr w:type="spellEnd"/>
+      <w:r>
+        <w:rPr>
+          <w:rFonts w:ascii="Consolas" w:eastAsia="Times New Roman" w:hAnsi="Consolas" w:cs="Times New Roman"/>
+          <w:color w:val="CE9178"/>
+          <w:sz w:val="21"/>
+          <w:szCs w:val="21"/>
+        </w:rPr>
+        <w:t>"</w:t>
       </w:r>
       <w:r>
         <w:rPr>
@@ -3321,6 +4443,7 @@
         </w:rPr>
         <w:t xml:space="preserve"> </w:t>
       </w:r>
+      <w:proofErr w:type="spellStart"/>
       <w:r>
         <w:rPr>
           <w:rFonts w:ascii="Consolas" w:eastAsia="Times New Roman" w:hAnsi="Consolas" w:cs="Times New Roman"/>
@@ -3330,6 +4453,7 @@
         </w:rPr>
         <w:t>toogleMode</w:t>
       </w:r>
+      <w:proofErr w:type="spellEnd"/>
       <w:r>
         <w:rPr>
           <w:rFonts w:ascii="Consolas" w:eastAsia="Times New Roman" w:hAnsi="Consolas" w:cs="Times New Roman"/>
@@ -3348,6 +4472,7 @@
         </w:rPr>
         <w:t>{</w:t>
       </w:r>
+      <w:proofErr w:type="spellStart"/>
       <w:r>
         <w:rPr>
           <w:rFonts w:ascii="Consolas" w:eastAsia="Times New Roman" w:hAnsi="Consolas" w:cs="Times New Roman"/>
@@ -3357,6 +4482,7 @@
         </w:rPr>
         <w:t>tooglemode</w:t>
       </w:r>
+      <w:proofErr w:type="spellEnd"/>
       <w:r>
         <w:rPr>
           <w:rFonts w:ascii="Consolas" w:eastAsia="Times New Roman" w:hAnsi="Consolas" w:cs="Times New Roman"/>
@@ -3375,6 +4501,7 @@
         </w:rPr>
         <w:t xml:space="preserve"> </w:t>
       </w:r>
+      <w:proofErr w:type="spellStart"/>
       <w:r>
         <w:rPr>
           <w:rFonts w:ascii="Consolas" w:eastAsia="Times New Roman" w:hAnsi="Consolas" w:cs="Times New Roman"/>
@@ -3384,6 +4511,7 @@
         </w:rPr>
         <w:t>switchMode</w:t>
       </w:r>
+      <w:proofErr w:type="spellEnd"/>
       <w:r>
         <w:rPr>
           <w:rFonts w:ascii="Consolas" w:eastAsia="Times New Roman" w:hAnsi="Consolas" w:cs="Times New Roman"/>
@@ -3402,6 +4530,7 @@
         </w:rPr>
         <w:t>{</w:t>
       </w:r>
+      <w:proofErr w:type="spellStart"/>
       <w:r>
         <w:rPr>
           <w:rFonts w:ascii="Consolas" w:eastAsia="Times New Roman" w:hAnsi="Consolas" w:cs="Times New Roman"/>
@@ -3411,6 +4540,7 @@
         </w:rPr>
         <w:t>switchMode</w:t>
       </w:r>
+      <w:proofErr w:type="spellEnd"/>
       <w:r>
         <w:rPr>
           <w:rFonts w:ascii="Consolas" w:eastAsia="Times New Roman" w:hAnsi="Consolas" w:cs="Times New Roman"/>
@@ -3664,7 +4794,107 @@
           <w:sz w:val="21"/>
           <w:szCs w:val="21"/>
         </w:rPr>
-        <w:t>/* &lt;Navbar title="TextUtils" mode = {mode} toogleMode={tooglemode} switchMode={switchMode}/&gt; */</w:t>
+        <w:t>/* &lt;Navbar title="</w:t>
+      </w:r>
+      <w:proofErr w:type="spellStart"/>
+      <w:r>
+        <w:rPr>
+          <w:rFonts w:ascii="Consolas" w:eastAsia="Times New Roman" w:hAnsi="Consolas" w:cs="Times New Roman"/>
+          <w:color w:val="6A9955"/>
+          <w:sz w:val="21"/>
+          <w:szCs w:val="21"/>
+        </w:rPr>
+        <w:t>TextUtils</w:t>
+      </w:r>
+      <w:proofErr w:type="spellEnd"/>
+      <w:r>
+        <w:rPr>
+          <w:rFonts w:ascii="Consolas" w:eastAsia="Times New Roman" w:hAnsi="Consolas" w:cs="Times New Roman"/>
+          <w:color w:val="6A9955"/>
+          <w:sz w:val="21"/>
+          <w:szCs w:val="21"/>
+        </w:rPr>
+        <w:t xml:space="preserve">" mode = {mode} </w:t>
+      </w:r>
+      <w:proofErr w:type="spellStart"/>
+      <w:r>
+        <w:rPr>
+          <w:rFonts w:ascii="Consolas" w:eastAsia="Times New Roman" w:hAnsi="Consolas" w:cs="Times New Roman"/>
+          <w:color w:val="6A9955"/>
+          <w:sz w:val="21"/>
+          <w:szCs w:val="21"/>
+        </w:rPr>
+        <w:t>toogleMode</w:t>
+      </w:r>
+      <w:proofErr w:type="spellEnd"/>
+      <w:r>
+        <w:rPr>
+          <w:rFonts w:ascii="Consolas" w:eastAsia="Times New Roman" w:hAnsi="Consolas" w:cs="Times New Roman"/>
+          <w:color w:val="6A9955"/>
+          <w:sz w:val="21"/>
+          <w:szCs w:val="21"/>
+        </w:rPr>
+        <w:t>={</w:t>
+      </w:r>
+      <w:proofErr w:type="spellStart"/>
+      <w:r>
+        <w:rPr>
+          <w:rFonts w:ascii="Consolas" w:eastAsia="Times New Roman" w:hAnsi="Consolas" w:cs="Times New Roman"/>
+          <w:color w:val="6A9955"/>
+          <w:sz w:val="21"/>
+          <w:szCs w:val="21"/>
+        </w:rPr>
+        <w:t>tooglemode</w:t>
+      </w:r>
+      <w:proofErr w:type="spellEnd"/>
+      <w:r>
+        <w:rPr>
+          <w:rFonts w:ascii="Consolas" w:eastAsia="Times New Roman" w:hAnsi="Consolas" w:cs="Times New Roman"/>
+          <w:color w:val="6A9955"/>
+          <w:sz w:val="21"/>
+          <w:szCs w:val="21"/>
+        </w:rPr>
+        <w:t xml:space="preserve">} </w:t>
+      </w:r>
+      <w:proofErr w:type="spellStart"/>
+      <w:r>
+        <w:rPr>
+          <w:rFonts w:ascii="Consolas" w:eastAsia="Times New Roman" w:hAnsi="Consolas" w:cs="Times New Roman"/>
+          <w:color w:val="6A9955"/>
+          <w:sz w:val="21"/>
+          <w:szCs w:val="21"/>
+        </w:rPr>
+        <w:t>switchMode</w:t>
+      </w:r>
+      <w:proofErr w:type="spellEnd"/>
+      <w:r>
+        <w:rPr>
+          <w:rFonts w:ascii="Consolas" w:eastAsia="Times New Roman" w:hAnsi="Consolas" w:cs="Times New Roman"/>
+          <w:color w:val="6A9955"/>
+          <w:sz w:val="21"/>
+          <w:szCs w:val="21"/>
+        </w:rPr>
+        <w:t>={</w:t>
+      </w:r>
+      <w:proofErr w:type="spellStart"/>
+      <w:r>
+        <w:rPr>
+          <w:rFonts w:ascii="Consolas" w:eastAsia="Times New Roman" w:hAnsi="Consolas" w:cs="Times New Roman"/>
+          <w:color w:val="6A9955"/>
+          <w:sz w:val="21"/>
+          <w:szCs w:val="21"/>
+        </w:rPr>
+        <w:t>switchMode</w:t>
+      </w:r>
+      <w:proofErr w:type="spellEnd"/>
+      <w:r>
+        <w:rPr>
+          <w:rFonts w:ascii="Consolas" w:eastAsia="Times New Roman" w:hAnsi="Consolas" w:cs="Times New Roman"/>
+          <w:color w:val="6A9955"/>
+          <w:sz w:val="21"/>
+          <w:szCs w:val="21"/>
+        </w:rPr>
+        <w:t>}/&gt; */</w:t>
       </w:r>
       <w:r>
         <w:rPr>
@@ -3867,6 +5097,7 @@
         </w:rPr>
         <w:t xml:space="preserve"> </w:t>
       </w:r>
+      <w:proofErr w:type="spellStart"/>
       <w:r>
         <w:rPr>
           <w:rFonts w:ascii="Consolas" w:eastAsia="Times New Roman" w:hAnsi="Consolas" w:cs="Times New Roman"/>
@@ -3876,6 +5107,7 @@
         </w:rPr>
         <w:t>showAlert</w:t>
       </w:r>
+      <w:proofErr w:type="spellEnd"/>
       <w:r>
         <w:rPr>
           <w:rFonts w:ascii="Consolas" w:eastAsia="Times New Roman" w:hAnsi="Consolas" w:cs="Times New Roman"/>
@@ -3894,6 +5126,7 @@
         </w:rPr>
         <w:t>{</w:t>
       </w:r>
+      <w:proofErr w:type="spellStart"/>
       <w:r>
         <w:rPr>
           <w:rFonts w:ascii="Consolas" w:eastAsia="Times New Roman" w:hAnsi="Consolas" w:cs="Times New Roman"/>
@@ -3903,6 +5136,7 @@
         </w:rPr>
         <w:t>showAlert</w:t>
       </w:r>
+      <w:proofErr w:type="spellEnd"/>
       <w:r>
         <w:rPr>
           <w:rFonts w:ascii="Consolas" w:eastAsia="Times New Roman" w:hAnsi="Consolas" w:cs="Times New Roman"/>
@@ -4297,7 +5531,27 @@
           <w:sz w:val="28"/>
           <w:szCs w:val="28"/>
         </w:rPr>
-        <w:t xml:space="preserve">Note “exact” keyword also here. This is because react do partial checking for url if we do not use exact keyword. </w:t>
+        <w:t xml:space="preserve">Note “exact” keyword also here. This is because react do partial checking for </w:t>
+      </w:r>
+      <w:proofErr w:type="spellStart"/>
+      <w:r>
+        <w:rPr>
+          <w:rFonts w:ascii="Segoe UI" w:hAnsi="Segoe UI" w:cs="Segoe UI"/>
+          <w:color w:val="000000"/>
+          <w:sz w:val="28"/>
+          <w:szCs w:val="28"/>
+        </w:rPr>
+        <w:t>url</w:t>
+      </w:r>
+      <w:proofErr w:type="spellEnd"/>
+      <w:r>
+        <w:rPr>
+          <w:rFonts w:ascii="Segoe UI" w:hAnsi="Segoe UI" w:cs="Segoe UI"/>
+          <w:color w:val="000000"/>
+          <w:sz w:val="28"/>
+          <w:szCs w:val="28"/>
+        </w:rPr>
+        <w:t xml:space="preserve"> if we do not use exact keyword. </w:t>
       </w:r>
     </w:p>
     <w:p>
@@ -4324,7 +5578,47 @@
           <w:sz w:val="28"/>
           <w:szCs w:val="28"/>
         </w:rPr>
-        <w:t xml:space="preserve">For example there is : /users, and /users/home this two urls. And  now what react will do is if exact is not defined then for users/home it will go for /users inseted, by doing partial checking. So it’s important to use exact keyword here. </w:t>
+        <w:t xml:space="preserve">For example there is : /users, and /users/home this two </w:t>
+      </w:r>
+      <w:proofErr w:type="spellStart"/>
+      <w:r>
+        <w:rPr>
+          <w:rFonts w:ascii="Segoe UI" w:hAnsi="Segoe UI" w:cs="Segoe UI"/>
+          <w:color w:val="000000"/>
+          <w:sz w:val="28"/>
+          <w:szCs w:val="28"/>
+        </w:rPr>
+        <w:t>urls</w:t>
+      </w:r>
+      <w:proofErr w:type="spellEnd"/>
+      <w:r>
+        <w:rPr>
+          <w:rFonts w:ascii="Segoe UI" w:hAnsi="Segoe UI" w:cs="Segoe UI"/>
+          <w:color w:val="000000"/>
+          <w:sz w:val="28"/>
+          <w:szCs w:val="28"/>
+        </w:rPr>
+        <w:t xml:space="preserve">. And  now what react will do is if exact is not defined then for users/home it will go for /users </w:t>
+      </w:r>
+      <w:proofErr w:type="spellStart"/>
+      <w:r>
+        <w:rPr>
+          <w:rFonts w:ascii="Segoe UI" w:hAnsi="Segoe UI" w:cs="Segoe UI"/>
+          <w:color w:val="000000"/>
+          <w:sz w:val="28"/>
+          <w:szCs w:val="28"/>
+        </w:rPr>
+        <w:t>inseted</w:t>
+      </w:r>
+      <w:proofErr w:type="spellEnd"/>
+      <w:r>
+        <w:rPr>
+          <w:rFonts w:ascii="Segoe UI" w:hAnsi="Segoe UI" w:cs="Segoe UI"/>
+          <w:color w:val="000000"/>
+          <w:sz w:val="28"/>
+          <w:szCs w:val="28"/>
+        </w:rPr>
+        <w:t xml:space="preserve">, by doing partial checking. So it’s important to use exact keyword here. </w:t>
       </w:r>
     </w:p>
     <w:p>
@@ -4351,7 +5645,27 @@
           <w:sz w:val="28"/>
           <w:szCs w:val="28"/>
         </w:rPr>
-        <w:t>Now we have to use Link and to instead of a and href.</w:t>
+        <w:t xml:space="preserve">Now we have to use Link and to instead of a and </w:t>
+      </w:r>
+      <w:proofErr w:type="spellStart"/>
+      <w:r>
+        <w:rPr>
+          <w:rFonts w:ascii="Segoe UI" w:hAnsi="Segoe UI" w:cs="Segoe UI"/>
+          <w:color w:val="000000"/>
+          <w:sz w:val="28"/>
+          <w:szCs w:val="28"/>
+        </w:rPr>
+        <w:t>href</w:t>
+      </w:r>
+      <w:proofErr w:type="spellEnd"/>
+      <w:r>
+        <w:rPr>
+          <w:rFonts w:ascii="Segoe UI" w:hAnsi="Segoe UI" w:cs="Segoe UI"/>
+          <w:color w:val="000000"/>
+          <w:sz w:val="28"/>
+          <w:szCs w:val="28"/>
+        </w:rPr>
+        <w:t>.</w:t>
       </w:r>
     </w:p>
     <w:p>
@@ -4424,6 +5738,7 @@
         </w:rPr>
         <w:t xml:space="preserve"> </w:t>
       </w:r>
+      <w:proofErr w:type="spellStart"/>
       <w:r>
         <w:rPr>
           <w:rFonts w:ascii="Consolas" w:eastAsia="Times New Roman" w:hAnsi="Consolas" w:cs="Times New Roman"/>
@@ -4433,6 +5748,7 @@
         </w:rPr>
         <w:t>className</w:t>
       </w:r>
+      <w:proofErr w:type="spellEnd"/>
       <w:r>
         <w:rPr>
           <w:rFonts w:ascii="Consolas" w:eastAsia="Times New Roman" w:hAnsi="Consolas" w:cs="Times New Roman"/>
@@ -4573,24 +5889,1156 @@
     <w:p>
       <w:pPr>
         <w:pStyle w:val="ListParagraph"/>
-        <w:tabs>
-          <w:tab w:val="left" w:pos="3540"/>
-        </w:tabs>
-        <w:rPr>
-          <w:rFonts w:ascii="Segoe UI" w:hAnsi="Segoe UI" w:cs="Segoe UI"/>
-          <w:color w:val="000000"/>
-          <w:sz w:val="28"/>
-          <w:szCs w:val="28"/>
-        </w:rPr>
-      </w:pPr>
-      <w:r>
-        <w:rPr>
-          <w:rFonts w:ascii="Segoe UI" w:hAnsi="Segoe UI" w:cs="Segoe UI"/>
-          <w:color w:val="000000"/>
-          <w:sz w:val="28"/>
-          <w:szCs w:val="28"/>
-        </w:rPr>
-        <w:t>We should know that if we are using link and to then the page will not reloding. We can use a, and href also but the page will reload dur to this, if want reloding then we can use a and href.</w:t>
+        <w:pBdr>
+          <w:bottom w:val="double" w:sz="6" w:space="1" w:color="auto"/>
+        </w:pBdr>
+        <w:tabs>
+          <w:tab w:val="left" w:pos="3540"/>
+        </w:tabs>
+        <w:rPr>
+          <w:rFonts w:ascii="Segoe UI" w:hAnsi="Segoe UI" w:cs="Segoe UI"/>
+          <w:color w:val="000000"/>
+          <w:sz w:val="28"/>
+          <w:szCs w:val="28"/>
+        </w:rPr>
+      </w:pPr>
+      <w:r>
+        <w:rPr>
+          <w:rFonts w:ascii="Segoe UI" w:hAnsi="Segoe UI" w:cs="Segoe UI"/>
+          <w:color w:val="000000"/>
+          <w:sz w:val="28"/>
+          <w:szCs w:val="28"/>
+        </w:rPr>
+        <w:t xml:space="preserve">We should know that if we are using link and to then the page will not </w:t>
+      </w:r>
+      <w:proofErr w:type="spellStart"/>
+      <w:r>
+        <w:rPr>
+          <w:rFonts w:ascii="Segoe UI" w:hAnsi="Segoe UI" w:cs="Segoe UI"/>
+          <w:color w:val="000000"/>
+          <w:sz w:val="28"/>
+          <w:szCs w:val="28"/>
+        </w:rPr>
+        <w:t>reloding</w:t>
+      </w:r>
+      <w:proofErr w:type="spellEnd"/>
+      <w:r>
+        <w:rPr>
+          <w:rFonts w:ascii="Segoe UI" w:hAnsi="Segoe UI" w:cs="Segoe UI"/>
+          <w:color w:val="000000"/>
+          <w:sz w:val="28"/>
+          <w:szCs w:val="28"/>
+        </w:rPr>
+        <w:t xml:space="preserve">. We can use a, and </w:t>
+      </w:r>
+      <w:proofErr w:type="spellStart"/>
+      <w:r>
+        <w:rPr>
+          <w:rFonts w:ascii="Segoe UI" w:hAnsi="Segoe UI" w:cs="Segoe UI"/>
+          <w:color w:val="000000"/>
+          <w:sz w:val="28"/>
+          <w:szCs w:val="28"/>
+        </w:rPr>
+        <w:t>href</w:t>
+      </w:r>
+      <w:proofErr w:type="spellEnd"/>
+      <w:r>
+        <w:rPr>
+          <w:rFonts w:ascii="Segoe UI" w:hAnsi="Segoe UI" w:cs="Segoe UI"/>
+          <w:color w:val="000000"/>
+          <w:sz w:val="28"/>
+          <w:szCs w:val="28"/>
+        </w:rPr>
+        <w:t xml:space="preserve"> also but the page will reload dur to this, if want </w:t>
+      </w:r>
+      <w:proofErr w:type="spellStart"/>
+      <w:r>
+        <w:rPr>
+          <w:rFonts w:ascii="Segoe UI" w:hAnsi="Segoe UI" w:cs="Segoe UI"/>
+          <w:color w:val="000000"/>
+          <w:sz w:val="28"/>
+          <w:szCs w:val="28"/>
+        </w:rPr>
+        <w:t>reloding</w:t>
+      </w:r>
+      <w:proofErr w:type="spellEnd"/>
+      <w:r>
+        <w:rPr>
+          <w:rFonts w:ascii="Segoe UI" w:hAnsi="Segoe UI" w:cs="Segoe UI"/>
+          <w:color w:val="000000"/>
+          <w:sz w:val="28"/>
+          <w:szCs w:val="28"/>
+        </w:rPr>
+        <w:t xml:space="preserve"> then we can use a and </w:t>
+      </w:r>
+      <w:proofErr w:type="spellStart"/>
+      <w:r>
+        <w:rPr>
+          <w:rFonts w:ascii="Segoe UI" w:hAnsi="Segoe UI" w:cs="Segoe UI"/>
+          <w:color w:val="000000"/>
+          <w:sz w:val="28"/>
+          <w:szCs w:val="28"/>
+        </w:rPr>
+        <w:t>href</w:t>
+      </w:r>
+      <w:proofErr w:type="spellEnd"/>
+      <w:r>
+        <w:rPr>
+          <w:rFonts w:ascii="Segoe UI" w:hAnsi="Segoe UI" w:cs="Segoe UI"/>
+          <w:color w:val="000000"/>
+          <w:sz w:val="28"/>
+          <w:szCs w:val="28"/>
+        </w:rPr>
+        <w:t>.</w:t>
+      </w:r>
+    </w:p>
+    <w:p>
+      <w:pPr>
+        <w:pStyle w:val="ListParagraph"/>
+        <w:tabs>
+          <w:tab w:val="left" w:pos="3540"/>
+        </w:tabs>
+        <w:rPr>
+          <w:rFonts w:ascii="Segoe UI" w:hAnsi="Segoe UI" w:cs="Segoe UI"/>
+          <w:color w:val="000000"/>
+          <w:sz w:val="28"/>
+          <w:szCs w:val="28"/>
+        </w:rPr>
+      </w:pPr>
+    </w:p>
+    <w:p>
+      <w:pPr>
+        <w:pStyle w:val="ListParagraph"/>
+        <w:tabs>
+          <w:tab w:val="left" w:pos="3540"/>
+        </w:tabs>
+        <w:rPr>
+          <w:rFonts w:ascii="Segoe UI" w:hAnsi="Segoe UI" w:cs="Segoe UI"/>
+          <w:b/>
+          <w:bCs/>
+          <w:color w:val="000000"/>
+          <w:sz w:val="48"/>
+          <w:szCs w:val="48"/>
+        </w:rPr>
+      </w:pPr>
+      <w:r>
+        <w:rPr>
+          <w:rFonts w:ascii="Segoe UI" w:hAnsi="Segoe UI" w:cs="Segoe UI"/>
+          <w:b/>
+          <w:bCs/>
+          <w:color w:val="000000"/>
+          <w:sz w:val="48"/>
+          <w:szCs w:val="48"/>
+        </w:rPr>
+        <w:t>Tutorial: 20</w:t>
+      </w:r>
+    </w:p>
+    <w:p>
+      <w:pPr>
+        <w:pStyle w:val="ListParagraph"/>
+        <w:tabs>
+          <w:tab w:val="left" w:pos="3540"/>
+        </w:tabs>
+        <w:rPr>
+          <w:rFonts w:ascii="Segoe UI" w:hAnsi="Segoe UI" w:cs="Segoe UI"/>
+          <w:b/>
+          <w:bCs/>
+          <w:color w:val="000000"/>
+          <w:sz w:val="48"/>
+          <w:szCs w:val="48"/>
+        </w:rPr>
+      </w:pPr>
+    </w:p>
+    <w:p>
+      <w:pPr>
+        <w:pStyle w:val="ListParagraph"/>
+        <w:tabs>
+          <w:tab w:val="left" w:pos="3540"/>
+        </w:tabs>
+        <w:rPr>
+          <w:rFonts w:cstheme="minorHAnsi"/>
+          <w:b/>
+          <w:bCs/>
+          <w:color w:val="FF0000"/>
+          <w:sz w:val="32"/>
+          <w:szCs w:val="32"/>
+        </w:rPr>
+      </w:pPr>
+      <w:r>
+        <w:rPr>
+          <w:rFonts w:cstheme="minorHAnsi"/>
+          <w:b/>
+          <w:bCs/>
+          <w:color w:val="FF0000"/>
+          <w:sz w:val="32"/>
+          <w:szCs w:val="32"/>
+        </w:rPr>
+        <w:t xml:space="preserve">Note that </w:t>
+      </w:r>
+      <w:proofErr w:type="spellStart"/>
+      <w:r>
+        <w:rPr>
+          <w:rFonts w:cstheme="minorHAnsi"/>
+          <w:b/>
+          <w:bCs/>
+          <w:color w:val="FF0000"/>
+          <w:sz w:val="32"/>
+          <w:szCs w:val="32"/>
+        </w:rPr>
+        <w:t>OnClick</w:t>
+      </w:r>
+      <w:proofErr w:type="spellEnd"/>
+      <w:r>
+        <w:rPr>
+          <w:rFonts w:cstheme="minorHAnsi"/>
+          <w:b/>
+          <w:bCs/>
+          <w:color w:val="FF0000"/>
+          <w:sz w:val="32"/>
+          <w:szCs w:val="32"/>
+        </w:rPr>
+        <w:t xml:space="preserve"> Function take the arrow function not function calling.</w:t>
+      </w:r>
+    </w:p>
+    <w:p>
+      <w:pPr>
+        <w:pStyle w:val="ListParagraph"/>
+        <w:tabs>
+          <w:tab w:val="left" w:pos="3540"/>
+        </w:tabs>
+        <w:rPr>
+          <w:rFonts w:cstheme="minorHAnsi"/>
+          <w:b/>
+          <w:bCs/>
+          <w:color w:val="000000" w:themeColor="text1"/>
+          <w:sz w:val="32"/>
+          <w:szCs w:val="32"/>
+        </w:rPr>
+      </w:pPr>
+    </w:p>
+    <w:p>
+      <w:pPr>
+        <w:pStyle w:val="ListParagraph"/>
+        <w:tabs>
+          <w:tab w:val="left" w:pos="3540"/>
+        </w:tabs>
+        <w:rPr>
+          <w:rFonts w:cstheme="minorHAnsi"/>
+          <w:color w:val="000000" w:themeColor="text1"/>
+          <w:sz w:val="32"/>
+          <w:szCs w:val="32"/>
+        </w:rPr>
+      </w:pPr>
+      <w:r>
+        <w:rPr>
+          <w:rFonts w:cstheme="minorHAnsi"/>
+          <w:color w:val="000000" w:themeColor="text1"/>
+          <w:sz w:val="32"/>
+          <w:szCs w:val="32"/>
+        </w:rPr>
+        <w:t xml:space="preserve">If we Give function calling then the </w:t>
+      </w:r>
+      <w:proofErr w:type="spellStart"/>
+      <w:r>
+        <w:rPr>
+          <w:rFonts w:cstheme="minorHAnsi"/>
+          <w:color w:val="000000" w:themeColor="text1"/>
+          <w:sz w:val="32"/>
+          <w:szCs w:val="32"/>
+        </w:rPr>
+        <w:t>onClick</w:t>
+      </w:r>
+      <w:proofErr w:type="spellEnd"/>
+      <w:r>
+        <w:rPr>
+          <w:rFonts w:cstheme="minorHAnsi"/>
+          <w:color w:val="000000" w:themeColor="text1"/>
+          <w:sz w:val="32"/>
+          <w:szCs w:val="32"/>
+        </w:rPr>
+        <w:t xml:space="preserve"> will be automatically called infinite loop. </w:t>
+      </w:r>
+    </w:p>
+    <w:p>
+      <w:pPr>
+        <w:pStyle w:val="ListParagraph"/>
+        <w:tabs>
+          <w:tab w:val="left" w:pos="3540"/>
+        </w:tabs>
+        <w:rPr>
+          <w:rFonts w:cstheme="minorHAnsi"/>
+          <w:color w:val="000000" w:themeColor="text1"/>
+          <w:sz w:val="32"/>
+          <w:szCs w:val="32"/>
+        </w:rPr>
+      </w:pPr>
+    </w:p>
+    <w:p>
+      <w:pPr>
+        <w:shd w:val="clear" w:color="auto" w:fill="1E1E1E"/>
+        <w:spacing w:after="0" w:line="285" w:lineRule="atLeast"/>
+        <w:rPr>
+          <w:rFonts w:ascii="Consolas" w:eastAsia="Times New Roman" w:hAnsi="Consolas" w:cs="Times New Roman"/>
+          <w:color w:val="D4D4D4"/>
+          <w:sz w:val="21"/>
+          <w:szCs w:val="21"/>
+        </w:rPr>
+      </w:pPr>
+      <w:r>
+        <w:rPr>
+          <w:rFonts w:ascii="Consolas" w:eastAsia="Times New Roman" w:hAnsi="Consolas" w:cs="Times New Roman"/>
+          <w:color w:val="D4D4D4"/>
+          <w:sz w:val="21"/>
+          <w:szCs w:val="21"/>
+        </w:rPr>
+        <w:t xml:space="preserve">  </w:t>
+      </w:r>
+      <w:r>
+        <w:rPr>
+          <w:rFonts w:ascii="Consolas" w:eastAsia="Times New Roman" w:hAnsi="Consolas" w:cs="Times New Roman"/>
+          <w:color w:val="569CD6"/>
+          <w:sz w:val="21"/>
+          <w:szCs w:val="21"/>
+        </w:rPr>
+        <w:t>{</w:t>
+      </w:r>
+      <w:r>
+        <w:rPr>
+          <w:rFonts w:ascii="Consolas" w:eastAsia="Times New Roman" w:hAnsi="Consolas" w:cs="Times New Roman"/>
+          <w:color w:val="6A9955"/>
+          <w:sz w:val="21"/>
+          <w:szCs w:val="21"/>
+        </w:rPr>
+        <w:t xml:space="preserve">/* This will not work, it will go in </w:t>
+      </w:r>
+      <w:proofErr w:type="spellStart"/>
+      <w:r>
+        <w:rPr>
+          <w:rFonts w:ascii="Consolas" w:eastAsia="Times New Roman" w:hAnsi="Consolas" w:cs="Times New Roman"/>
+          <w:color w:val="6A9955"/>
+          <w:sz w:val="21"/>
+          <w:szCs w:val="21"/>
+        </w:rPr>
+        <w:t>infinit</w:t>
+      </w:r>
+      <w:proofErr w:type="spellEnd"/>
+      <w:r>
+        <w:rPr>
+          <w:rFonts w:ascii="Consolas" w:eastAsia="Times New Roman" w:hAnsi="Consolas" w:cs="Times New Roman"/>
+          <w:color w:val="6A9955"/>
+          <w:sz w:val="21"/>
+          <w:szCs w:val="21"/>
+        </w:rPr>
+        <w:t xml:space="preserve"> loop of a </w:t>
+      </w:r>
+      <w:proofErr w:type="spellStart"/>
+      <w:r>
+        <w:rPr>
+          <w:rFonts w:ascii="Consolas" w:eastAsia="Times New Roman" w:hAnsi="Consolas" w:cs="Times New Roman"/>
+          <w:color w:val="6A9955"/>
+          <w:sz w:val="21"/>
+          <w:szCs w:val="21"/>
+        </w:rPr>
+        <w:t>functon</w:t>
+      </w:r>
+      <w:proofErr w:type="spellEnd"/>
+      <w:r>
+        <w:rPr>
+          <w:rFonts w:ascii="Consolas" w:eastAsia="Times New Roman" w:hAnsi="Consolas" w:cs="Times New Roman"/>
+          <w:color w:val="6A9955"/>
+          <w:sz w:val="21"/>
+          <w:szCs w:val="21"/>
+        </w:rPr>
+        <w:t xml:space="preserve">, Because if you want to pass the parameter to any function on click then you need to make it arrow </w:t>
+      </w:r>
+      <w:proofErr w:type="spellStart"/>
+      <w:r>
+        <w:rPr>
+          <w:rFonts w:ascii="Consolas" w:eastAsia="Times New Roman" w:hAnsi="Consolas" w:cs="Times New Roman"/>
+          <w:color w:val="6A9955"/>
+          <w:sz w:val="21"/>
+          <w:szCs w:val="21"/>
+        </w:rPr>
+        <w:t>fuction</w:t>
+      </w:r>
+      <w:proofErr w:type="spellEnd"/>
+      <w:r>
+        <w:rPr>
+          <w:rFonts w:ascii="Consolas" w:eastAsia="Times New Roman" w:hAnsi="Consolas" w:cs="Times New Roman"/>
+          <w:color w:val="6A9955"/>
+          <w:sz w:val="21"/>
+          <w:szCs w:val="21"/>
+        </w:rPr>
+        <w:t xml:space="preserve"> First.  */</w:t>
+      </w:r>
+      <w:r>
+        <w:rPr>
+          <w:rFonts w:ascii="Consolas" w:eastAsia="Times New Roman" w:hAnsi="Consolas" w:cs="Times New Roman"/>
+          <w:color w:val="569CD6"/>
+          <w:sz w:val="21"/>
+          <w:szCs w:val="21"/>
+        </w:rPr>
+        <w:t>}</w:t>
+      </w:r>
+    </w:p>
+    <w:p>
+      <w:pPr>
+        <w:shd w:val="clear" w:color="auto" w:fill="1E1E1E"/>
+        <w:spacing w:after="0" w:line="285" w:lineRule="atLeast"/>
+        <w:rPr>
+          <w:rFonts w:ascii="Consolas" w:eastAsia="Times New Roman" w:hAnsi="Consolas" w:cs="Times New Roman"/>
+          <w:color w:val="D4D4D4"/>
+          <w:sz w:val="21"/>
+          <w:szCs w:val="21"/>
+        </w:rPr>
+      </w:pPr>
+      <w:r>
+        <w:rPr>
+          <w:rFonts w:ascii="Consolas" w:eastAsia="Times New Roman" w:hAnsi="Consolas" w:cs="Times New Roman"/>
+          <w:color w:val="D4D4D4"/>
+          <w:sz w:val="21"/>
+          <w:szCs w:val="21"/>
+        </w:rPr>
+        <w:t xml:space="preserve">                </w:t>
+      </w:r>
+      <w:r>
+        <w:rPr>
+          <w:rFonts w:ascii="Consolas" w:eastAsia="Times New Roman" w:hAnsi="Consolas" w:cs="Times New Roman"/>
+          <w:color w:val="569CD6"/>
+          <w:sz w:val="21"/>
+          <w:szCs w:val="21"/>
+        </w:rPr>
+        <w:t>{</w:t>
+      </w:r>
+      <w:r>
+        <w:rPr>
+          <w:rFonts w:ascii="Consolas" w:eastAsia="Times New Roman" w:hAnsi="Consolas" w:cs="Times New Roman"/>
+          <w:color w:val="6A9955"/>
+          <w:sz w:val="21"/>
+          <w:szCs w:val="21"/>
+        </w:rPr>
+        <w:t xml:space="preserve">/* </w:t>
+      </w:r>
+      <w:proofErr w:type="spellStart"/>
+      <w:r>
+        <w:rPr>
+          <w:rFonts w:ascii="Consolas" w:eastAsia="Times New Roman" w:hAnsi="Consolas" w:cs="Times New Roman"/>
+          <w:color w:val="6A9955"/>
+          <w:sz w:val="21"/>
+          <w:szCs w:val="21"/>
+        </w:rPr>
+        <w:t>OnClick</w:t>
+      </w:r>
+      <w:proofErr w:type="spellEnd"/>
+      <w:r>
+        <w:rPr>
+          <w:rFonts w:ascii="Consolas" w:eastAsia="Times New Roman" w:hAnsi="Consolas" w:cs="Times New Roman"/>
+          <w:color w:val="6A9955"/>
+          <w:sz w:val="21"/>
+          <w:szCs w:val="21"/>
+        </w:rPr>
+        <w:t xml:space="preserve"> attribute takes </w:t>
+      </w:r>
+      <w:proofErr w:type="spellStart"/>
+      <w:r>
+        <w:rPr>
+          <w:rFonts w:ascii="Consolas" w:eastAsia="Times New Roman" w:hAnsi="Consolas" w:cs="Times New Roman"/>
+          <w:color w:val="6A9955"/>
+          <w:sz w:val="21"/>
+          <w:szCs w:val="21"/>
+        </w:rPr>
+        <w:t>funciton</w:t>
+      </w:r>
+      <w:proofErr w:type="spellEnd"/>
+      <w:r>
+        <w:rPr>
+          <w:rFonts w:ascii="Consolas" w:eastAsia="Times New Roman" w:hAnsi="Consolas" w:cs="Times New Roman"/>
+          <w:color w:val="6A9955"/>
+          <w:sz w:val="21"/>
+          <w:szCs w:val="21"/>
+        </w:rPr>
+        <w:t xml:space="preserve"> as a parameter only. */</w:t>
+      </w:r>
+      <w:r>
+        <w:rPr>
+          <w:rFonts w:ascii="Consolas" w:eastAsia="Times New Roman" w:hAnsi="Consolas" w:cs="Times New Roman"/>
+          <w:color w:val="569CD6"/>
+          <w:sz w:val="21"/>
+          <w:szCs w:val="21"/>
+        </w:rPr>
+        <w:t>}</w:t>
+      </w:r>
+    </w:p>
+    <w:p>
+      <w:pPr>
+        <w:shd w:val="clear" w:color="auto" w:fill="1E1E1E"/>
+        <w:spacing w:after="0" w:line="285" w:lineRule="atLeast"/>
+        <w:rPr>
+          <w:rFonts w:ascii="Consolas" w:eastAsia="Times New Roman" w:hAnsi="Consolas" w:cs="Times New Roman"/>
+          <w:color w:val="D4D4D4"/>
+          <w:sz w:val="21"/>
+          <w:szCs w:val="21"/>
+        </w:rPr>
+      </w:pPr>
+      <w:r>
+        <w:rPr>
+          <w:rFonts w:ascii="Consolas" w:eastAsia="Times New Roman" w:hAnsi="Consolas" w:cs="Times New Roman"/>
+          <w:color w:val="D4D4D4"/>
+          <w:sz w:val="21"/>
+          <w:szCs w:val="21"/>
+        </w:rPr>
+        <w:lastRenderedPageBreak/>
+        <w:t xml:space="preserve">                </w:t>
+      </w:r>
+      <w:r>
+        <w:rPr>
+          <w:rFonts w:ascii="Consolas" w:eastAsia="Times New Roman" w:hAnsi="Consolas" w:cs="Times New Roman"/>
+          <w:color w:val="569CD6"/>
+          <w:sz w:val="21"/>
+          <w:szCs w:val="21"/>
+        </w:rPr>
+        <w:t>{</w:t>
+      </w:r>
+      <w:r>
+        <w:rPr>
+          <w:rFonts w:ascii="Consolas" w:eastAsia="Times New Roman" w:hAnsi="Consolas" w:cs="Times New Roman"/>
+          <w:color w:val="6A9955"/>
+          <w:sz w:val="21"/>
+          <w:szCs w:val="21"/>
+        </w:rPr>
+        <w:t xml:space="preserve">/* &lt;div type="button" </w:t>
+      </w:r>
+      <w:proofErr w:type="spellStart"/>
+      <w:r>
+        <w:rPr>
+          <w:rFonts w:ascii="Consolas" w:eastAsia="Times New Roman" w:hAnsi="Consolas" w:cs="Times New Roman"/>
+          <w:color w:val="6A9955"/>
+          <w:sz w:val="21"/>
+          <w:szCs w:val="21"/>
+        </w:rPr>
+        <w:t>className</w:t>
+      </w:r>
+      <w:proofErr w:type="spellEnd"/>
+      <w:r>
+        <w:rPr>
+          <w:rFonts w:ascii="Consolas" w:eastAsia="Times New Roman" w:hAnsi="Consolas" w:cs="Times New Roman"/>
+          <w:color w:val="6A9955"/>
+          <w:sz w:val="21"/>
+          <w:szCs w:val="21"/>
+        </w:rPr>
+        <w:t>="</w:t>
+      </w:r>
+      <w:proofErr w:type="spellStart"/>
+      <w:r>
+        <w:rPr>
+          <w:rFonts w:ascii="Consolas" w:eastAsia="Times New Roman" w:hAnsi="Consolas" w:cs="Times New Roman"/>
+          <w:color w:val="6A9955"/>
+          <w:sz w:val="21"/>
+          <w:szCs w:val="21"/>
+        </w:rPr>
+        <w:t>bg</w:t>
+      </w:r>
+      <w:proofErr w:type="spellEnd"/>
+      <w:r>
+        <w:rPr>
+          <w:rFonts w:ascii="Consolas" w:eastAsia="Times New Roman" w:hAnsi="Consolas" w:cs="Times New Roman"/>
+          <w:color w:val="6A9955"/>
+          <w:sz w:val="21"/>
+          <w:szCs w:val="21"/>
+        </w:rPr>
+        <w:t xml:space="preserve">-primary border rounded mx-2" </w:t>
+      </w:r>
+      <w:proofErr w:type="spellStart"/>
+      <w:r>
+        <w:rPr>
+          <w:rFonts w:ascii="Consolas" w:eastAsia="Times New Roman" w:hAnsi="Consolas" w:cs="Times New Roman"/>
+          <w:color w:val="6A9955"/>
+          <w:sz w:val="21"/>
+          <w:szCs w:val="21"/>
+        </w:rPr>
+        <w:t>onClick</w:t>
+      </w:r>
+      <w:proofErr w:type="spellEnd"/>
+      <w:r>
+        <w:rPr>
+          <w:rFonts w:ascii="Consolas" w:eastAsia="Times New Roman" w:hAnsi="Consolas" w:cs="Times New Roman"/>
+          <w:color w:val="6A9955"/>
+          <w:sz w:val="21"/>
+          <w:szCs w:val="21"/>
+        </w:rPr>
+        <w:t>={</w:t>
+      </w:r>
+      <w:proofErr w:type="spellStart"/>
+      <w:r>
+        <w:rPr>
+          <w:rFonts w:ascii="Consolas" w:eastAsia="Times New Roman" w:hAnsi="Consolas" w:cs="Times New Roman"/>
+          <w:color w:val="6A9955"/>
+          <w:sz w:val="21"/>
+          <w:szCs w:val="21"/>
+        </w:rPr>
+        <w:t>props.toogleMod</w:t>
+      </w:r>
+      <w:proofErr w:type="spellEnd"/>
+      <w:r>
+        <w:rPr>
+          <w:rFonts w:ascii="Consolas" w:eastAsia="Times New Roman" w:hAnsi="Consolas" w:cs="Times New Roman"/>
+          <w:color w:val="6A9955"/>
+          <w:sz w:val="21"/>
+          <w:szCs w:val="21"/>
+        </w:rPr>
+        <w:t xml:space="preserve">} style={{height: '30px', width:'30px'}}&gt;&lt;/div&gt;  Here on click is </w:t>
+      </w:r>
+      <w:proofErr w:type="spellStart"/>
+      <w:r>
+        <w:rPr>
+          <w:rFonts w:ascii="Consolas" w:eastAsia="Times New Roman" w:hAnsi="Consolas" w:cs="Times New Roman"/>
+          <w:color w:val="6A9955"/>
+          <w:sz w:val="21"/>
+          <w:szCs w:val="21"/>
+        </w:rPr>
+        <w:t>Funciton</w:t>
+      </w:r>
+      <w:proofErr w:type="spellEnd"/>
+      <w:r>
+        <w:rPr>
+          <w:rFonts w:ascii="Consolas" w:eastAsia="Times New Roman" w:hAnsi="Consolas" w:cs="Times New Roman"/>
+          <w:color w:val="6A9955"/>
+          <w:sz w:val="21"/>
+          <w:szCs w:val="21"/>
+        </w:rPr>
+        <w:t xml:space="preserve"> Call */</w:t>
+      </w:r>
+      <w:r>
+        <w:rPr>
+          <w:rFonts w:ascii="Consolas" w:eastAsia="Times New Roman" w:hAnsi="Consolas" w:cs="Times New Roman"/>
+          <w:color w:val="569CD6"/>
+          <w:sz w:val="21"/>
+          <w:szCs w:val="21"/>
+        </w:rPr>
+        <w:t>}</w:t>
+      </w:r>
+    </w:p>
+    <w:p>
+      <w:pPr>
+        <w:shd w:val="clear" w:color="auto" w:fill="1E1E1E"/>
+        <w:spacing w:after="0" w:line="285" w:lineRule="atLeast"/>
+        <w:rPr>
+          <w:rFonts w:ascii="Consolas" w:eastAsia="Times New Roman" w:hAnsi="Consolas" w:cs="Times New Roman"/>
+          <w:color w:val="D4D4D4"/>
+          <w:sz w:val="21"/>
+          <w:szCs w:val="21"/>
+        </w:rPr>
+      </w:pPr>
+      <w:r>
+        <w:rPr>
+          <w:rFonts w:ascii="Consolas" w:eastAsia="Times New Roman" w:hAnsi="Consolas" w:cs="Times New Roman"/>
+          <w:color w:val="D4D4D4"/>
+          <w:sz w:val="21"/>
+          <w:szCs w:val="21"/>
+        </w:rPr>
+        <w:t xml:space="preserve">                </w:t>
+      </w:r>
+      <w:r>
+        <w:rPr>
+          <w:rFonts w:ascii="Consolas" w:eastAsia="Times New Roman" w:hAnsi="Consolas" w:cs="Times New Roman"/>
+          <w:color w:val="569CD6"/>
+          <w:sz w:val="21"/>
+          <w:szCs w:val="21"/>
+        </w:rPr>
+        <w:t>{</w:t>
+      </w:r>
+      <w:r>
+        <w:rPr>
+          <w:rFonts w:ascii="Consolas" w:eastAsia="Times New Roman" w:hAnsi="Consolas" w:cs="Times New Roman"/>
+          <w:color w:val="6A9955"/>
+          <w:sz w:val="21"/>
+          <w:szCs w:val="21"/>
+        </w:rPr>
+        <w:t xml:space="preserve">/* Below we will make the </w:t>
+      </w:r>
+      <w:proofErr w:type="spellStart"/>
+      <w:r>
+        <w:rPr>
+          <w:rFonts w:ascii="Consolas" w:eastAsia="Times New Roman" w:hAnsi="Consolas" w:cs="Times New Roman"/>
+          <w:color w:val="6A9955"/>
+          <w:sz w:val="21"/>
+          <w:szCs w:val="21"/>
+        </w:rPr>
+        <w:t>funciton</w:t>
+      </w:r>
+      <w:proofErr w:type="spellEnd"/>
+      <w:r>
+        <w:rPr>
+          <w:rFonts w:ascii="Consolas" w:eastAsia="Times New Roman" w:hAnsi="Consolas" w:cs="Times New Roman"/>
+          <w:color w:val="6A9955"/>
+          <w:sz w:val="21"/>
+          <w:szCs w:val="21"/>
+        </w:rPr>
+        <w:t xml:space="preserve"> call as a function for onclick  */</w:t>
+      </w:r>
+      <w:r>
+        <w:rPr>
+          <w:rFonts w:ascii="Consolas" w:eastAsia="Times New Roman" w:hAnsi="Consolas" w:cs="Times New Roman"/>
+          <w:color w:val="569CD6"/>
+          <w:sz w:val="21"/>
+          <w:szCs w:val="21"/>
+        </w:rPr>
+        <w:t>}</w:t>
+      </w:r>
+    </w:p>
+    <w:p>
+      <w:pPr>
+        <w:shd w:val="clear" w:color="auto" w:fill="1E1E1E"/>
+        <w:spacing w:after="0" w:line="285" w:lineRule="atLeast"/>
+        <w:rPr>
+          <w:rFonts w:ascii="Consolas" w:eastAsia="Times New Roman" w:hAnsi="Consolas" w:cs="Times New Roman"/>
+          <w:color w:val="D4D4D4"/>
+          <w:sz w:val="21"/>
+          <w:szCs w:val="21"/>
+        </w:rPr>
+      </w:pPr>
+      <w:r>
+        <w:rPr>
+          <w:rFonts w:ascii="Consolas" w:eastAsia="Times New Roman" w:hAnsi="Consolas" w:cs="Times New Roman"/>
+          <w:color w:val="D4D4D4"/>
+          <w:sz w:val="21"/>
+          <w:szCs w:val="21"/>
+        </w:rPr>
+        <w:t xml:space="preserve">                </w:t>
+      </w:r>
+      <w:r>
+        <w:rPr>
+          <w:rFonts w:ascii="Consolas" w:eastAsia="Times New Roman" w:hAnsi="Consolas" w:cs="Times New Roman"/>
+          <w:color w:val="808080"/>
+          <w:sz w:val="21"/>
+          <w:szCs w:val="21"/>
+        </w:rPr>
+        <w:t>&lt;</w:t>
+      </w:r>
+      <w:r>
+        <w:rPr>
+          <w:rFonts w:ascii="Consolas" w:eastAsia="Times New Roman" w:hAnsi="Consolas" w:cs="Times New Roman"/>
+          <w:color w:val="569CD6"/>
+          <w:sz w:val="21"/>
+          <w:szCs w:val="21"/>
+        </w:rPr>
+        <w:t>div</w:t>
+      </w:r>
+      <w:r>
+        <w:rPr>
+          <w:rFonts w:ascii="Consolas" w:eastAsia="Times New Roman" w:hAnsi="Consolas" w:cs="Times New Roman"/>
+          <w:color w:val="D4D4D4"/>
+          <w:sz w:val="21"/>
+          <w:szCs w:val="21"/>
+        </w:rPr>
+        <w:t xml:space="preserve"> </w:t>
+      </w:r>
+      <w:r>
+        <w:rPr>
+          <w:rFonts w:ascii="Consolas" w:eastAsia="Times New Roman" w:hAnsi="Consolas" w:cs="Times New Roman"/>
+          <w:color w:val="9CDCFE"/>
+          <w:sz w:val="21"/>
+          <w:szCs w:val="21"/>
+        </w:rPr>
+        <w:t>type</w:t>
+      </w:r>
+      <w:r>
+        <w:rPr>
+          <w:rFonts w:ascii="Consolas" w:eastAsia="Times New Roman" w:hAnsi="Consolas" w:cs="Times New Roman"/>
+          <w:color w:val="D4D4D4"/>
+          <w:sz w:val="21"/>
+          <w:szCs w:val="21"/>
+        </w:rPr>
+        <w:t>=</w:t>
+      </w:r>
+      <w:r>
+        <w:rPr>
+          <w:rFonts w:ascii="Consolas" w:eastAsia="Times New Roman" w:hAnsi="Consolas" w:cs="Times New Roman"/>
+          <w:color w:val="CE9178"/>
+          <w:sz w:val="21"/>
+          <w:szCs w:val="21"/>
+        </w:rPr>
+        <w:t>"button"</w:t>
+      </w:r>
+      <w:r>
+        <w:rPr>
+          <w:rFonts w:ascii="Consolas" w:eastAsia="Times New Roman" w:hAnsi="Consolas" w:cs="Times New Roman"/>
+          <w:color w:val="D4D4D4"/>
+          <w:sz w:val="21"/>
+          <w:szCs w:val="21"/>
+        </w:rPr>
+        <w:t xml:space="preserve"> </w:t>
+      </w:r>
+      <w:proofErr w:type="spellStart"/>
+      <w:r>
+        <w:rPr>
+          <w:rFonts w:ascii="Consolas" w:eastAsia="Times New Roman" w:hAnsi="Consolas" w:cs="Times New Roman"/>
+          <w:color w:val="9CDCFE"/>
+          <w:sz w:val="21"/>
+          <w:szCs w:val="21"/>
+        </w:rPr>
+        <w:t>className</w:t>
+      </w:r>
+      <w:proofErr w:type="spellEnd"/>
+      <w:r>
+        <w:rPr>
+          <w:rFonts w:ascii="Consolas" w:eastAsia="Times New Roman" w:hAnsi="Consolas" w:cs="Times New Roman"/>
+          <w:color w:val="D4D4D4"/>
+          <w:sz w:val="21"/>
+          <w:szCs w:val="21"/>
+        </w:rPr>
+        <w:t>=</w:t>
+      </w:r>
+      <w:r>
+        <w:rPr>
+          <w:rFonts w:ascii="Consolas" w:eastAsia="Times New Roman" w:hAnsi="Consolas" w:cs="Times New Roman"/>
+          <w:color w:val="CE9178"/>
+          <w:sz w:val="21"/>
+          <w:szCs w:val="21"/>
+        </w:rPr>
+        <w:t>"</w:t>
+      </w:r>
+      <w:proofErr w:type="spellStart"/>
+      <w:r>
+        <w:rPr>
+          <w:rFonts w:ascii="Consolas" w:eastAsia="Times New Roman" w:hAnsi="Consolas" w:cs="Times New Roman"/>
+          <w:color w:val="CE9178"/>
+          <w:sz w:val="21"/>
+          <w:szCs w:val="21"/>
+        </w:rPr>
+        <w:t>bg</w:t>
+      </w:r>
+      <w:proofErr w:type="spellEnd"/>
+      <w:r>
+        <w:rPr>
+          <w:rFonts w:ascii="Consolas" w:eastAsia="Times New Roman" w:hAnsi="Consolas" w:cs="Times New Roman"/>
+          <w:color w:val="CE9178"/>
+          <w:sz w:val="21"/>
+          <w:szCs w:val="21"/>
+        </w:rPr>
+        <w:t>-primary border rounded mx-2"</w:t>
+      </w:r>
+      <w:r>
+        <w:rPr>
+          <w:rFonts w:ascii="Consolas" w:eastAsia="Times New Roman" w:hAnsi="Consolas" w:cs="Times New Roman"/>
+          <w:color w:val="D4D4D4"/>
+          <w:sz w:val="21"/>
+          <w:szCs w:val="21"/>
+        </w:rPr>
+        <w:t xml:space="preserve"> </w:t>
+      </w:r>
+      <w:proofErr w:type="spellStart"/>
+      <w:r>
+        <w:rPr>
+          <w:rFonts w:ascii="Consolas" w:eastAsia="Times New Roman" w:hAnsi="Consolas" w:cs="Times New Roman"/>
+          <w:color w:val="9CDCFE"/>
+          <w:sz w:val="21"/>
+          <w:szCs w:val="21"/>
+        </w:rPr>
+        <w:t>onClick</w:t>
+      </w:r>
+      <w:proofErr w:type="spellEnd"/>
+      <w:r>
+        <w:rPr>
+          <w:rFonts w:ascii="Consolas" w:eastAsia="Times New Roman" w:hAnsi="Consolas" w:cs="Times New Roman"/>
+          <w:color w:val="D4D4D4"/>
+          <w:sz w:val="21"/>
+          <w:szCs w:val="21"/>
+        </w:rPr>
+        <w:t>=</w:t>
+      </w:r>
+      <w:r>
+        <w:rPr>
+          <w:rFonts w:ascii="Consolas" w:eastAsia="Times New Roman" w:hAnsi="Consolas" w:cs="Times New Roman"/>
+          <w:color w:val="569CD6"/>
+          <w:sz w:val="21"/>
+          <w:szCs w:val="21"/>
+        </w:rPr>
+        <w:t>{</w:t>
+      </w:r>
+      <w:r>
+        <w:rPr>
+          <w:rFonts w:ascii="Consolas" w:eastAsia="Times New Roman" w:hAnsi="Consolas" w:cs="Times New Roman"/>
+          <w:color w:val="D4D4D4"/>
+          <w:sz w:val="21"/>
+          <w:szCs w:val="21"/>
+        </w:rPr>
+        <w:t xml:space="preserve">() </w:t>
+      </w:r>
+      <w:r>
+        <w:rPr>
+          <w:rFonts w:ascii="Consolas" w:eastAsia="Times New Roman" w:hAnsi="Consolas" w:cs="Times New Roman"/>
+          <w:color w:val="569CD6"/>
+          <w:sz w:val="21"/>
+          <w:szCs w:val="21"/>
+        </w:rPr>
+        <w:t>=&gt;</w:t>
+      </w:r>
+      <w:r>
+        <w:rPr>
+          <w:rFonts w:ascii="Consolas" w:eastAsia="Times New Roman" w:hAnsi="Consolas" w:cs="Times New Roman"/>
+          <w:color w:val="D4D4D4"/>
+          <w:sz w:val="21"/>
+          <w:szCs w:val="21"/>
+        </w:rPr>
+        <w:t xml:space="preserve"> </w:t>
+      </w:r>
+      <w:proofErr w:type="spellStart"/>
+      <w:r>
+        <w:rPr>
+          <w:rFonts w:ascii="Consolas" w:eastAsia="Times New Roman" w:hAnsi="Consolas" w:cs="Times New Roman"/>
+          <w:color w:val="D4D4D4"/>
+          <w:sz w:val="21"/>
+          <w:szCs w:val="21"/>
+        </w:rPr>
+        <w:t>customTheme</w:t>
+      </w:r>
+      <w:proofErr w:type="spellEnd"/>
+      <w:r>
+        <w:rPr>
+          <w:rFonts w:ascii="Consolas" w:eastAsia="Times New Roman" w:hAnsi="Consolas" w:cs="Times New Roman"/>
+          <w:color w:val="D4D4D4"/>
+          <w:sz w:val="21"/>
+          <w:szCs w:val="21"/>
+        </w:rPr>
+        <w:t>(</w:t>
+      </w:r>
+      <w:r>
+        <w:rPr>
+          <w:rFonts w:ascii="Consolas" w:eastAsia="Times New Roman" w:hAnsi="Consolas" w:cs="Times New Roman"/>
+          <w:color w:val="CE9178"/>
+          <w:sz w:val="21"/>
+          <w:szCs w:val="21"/>
+        </w:rPr>
+        <w:t>'primary'</w:t>
+      </w:r>
+      <w:r>
+        <w:rPr>
+          <w:rFonts w:ascii="Consolas" w:eastAsia="Times New Roman" w:hAnsi="Consolas" w:cs="Times New Roman"/>
+          <w:color w:val="D4D4D4"/>
+          <w:sz w:val="21"/>
+          <w:szCs w:val="21"/>
+        </w:rPr>
+        <w:t>)</w:t>
+      </w:r>
+      <w:r>
+        <w:rPr>
+          <w:rFonts w:ascii="Consolas" w:eastAsia="Times New Roman" w:hAnsi="Consolas" w:cs="Times New Roman"/>
+          <w:color w:val="569CD6"/>
+          <w:sz w:val="21"/>
+          <w:szCs w:val="21"/>
+        </w:rPr>
+        <w:t>}</w:t>
+      </w:r>
+      <w:r>
+        <w:rPr>
+          <w:rFonts w:ascii="Consolas" w:eastAsia="Times New Roman" w:hAnsi="Consolas" w:cs="Times New Roman"/>
+          <w:color w:val="D4D4D4"/>
+          <w:sz w:val="21"/>
+          <w:szCs w:val="21"/>
+        </w:rPr>
+        <w:t xml:space="preserve"> </w:t>
+      </w:r>
+      <w:r>
+        <w:rPr>
+          <w:rFonts w:ascii="Consolas" w:eastAsia="Times New Roman" w:hAnsi="Consolas" w:cs="Times New Roman"/>
+          <w:color w:val="9CDCFE"/>
+          <w:sz w:val="21"/>
+          <w:szCs w:val="21"/>
+        </w:rPr>
+        <w:t>style</w:t>
+      </w:r>
+      <w:r>
+        <w:rPr>
+          <w:rFonts w:ascii="Consolas" w:eastAsia="Times New Roman" w:hAnsi="Consolas" w:cs="Times New Roman"/>
+          <w:color w:val="D4D4D4"/>
+          <w:sz w:val="21"/>
+          <w:szCs w:val="21"/>
+        </w:rPr>
+        <w:t>=</w:t>
+      </w:r>
+      <w:r>
+        <w:rPr>
+          <w:rFonts w:ascii="Consolas" w:eastAsia="Times New Roman" w:hAnsi="Consolas" w:cs="Times New Roman"/>
+          <w:color w:val="569CD6"/>
+          <w:sz w:val="21"/>
+          <w:szCs w:val="21"/>
+        </w:rPr>
+        <w:t>{</w:t>
+      </w:r>
+      <w:r>
+        <w:rPr>
+          <w:rFonts w:ascii="Consolas" w:eastAsia="Times New Roman" w:hAnsi="Consolas" w:cs="Times New Roman"/>
+          <w:color w:val="D4D4D4"/>
+          <w:sz w:val="21"/>
+          <w:szCs w:val="21"/>
+        </w:rPr>
+        <w:t xml:space="preserve">{height: </w:t>
+      </w:r>
+      <w:r>
+        <w:rPr>
+          <w:rFonts w:ascii="Consolas" w:eastAsia="Times New Roman" w:hAnsi="Consolas" w:cs="Times New Roman"/>
+          <w:color w:val="CE9178"/>
+          <w:sz w:val="21"/>
+          <w:szCs w:val="21"/>
+        </w:rPr>
+        <w:t>'30px'</w:t>
+      </w:r>
+      <w:r>
+        <w:rPr>
+          <w:rFonts w:ascii="Consolas" w:eastAsia="Times New Roman" w:hAnsi="Consolas" w:cs="Times New Roman"/>
+          <w:color w:val="D4D4D4"/>
+          <w:sz w:val="21"/>
+          <w:szCs w:val="21"/>
+        </w:rPr>
+        <w:t>, width:</w:t>
+      </w:r>
+      <w:r>
+        <w:rPr>
+          <w:rFonts w:ascii="Consolas" w:eastAsia="Times New Roman" w:hAnsi="Consolas" w:cs="Times New Roman"/>
+          <w:color w:val="CE9178"/>
+          <w:sz w:val="21"/>
+          <w:szCs w:val="21"/>
+        </w:rPr>
+        <w:t>'30px'</w:t>
+      </w:r>
+      <w:r>
+        <w:rPr>
+          <w:rFonts w:ascii="Consolas" w:eastAsia="Times New Roman" w:hAnsi="Consolas" w:cs="Times New Roman"/>
+          <w:color w:val="D4D4D4"/>
+          <w:sz w:val="21"/>
+          <w:szCs w:val="21"/>
+        </w:rPr>
+        <w:t>}</w:t>
+      </w:r>
+      <w:r>
+        <w:rPr>
+          <w:rFonts w:ascii="Consolas" w:eastAsia="Times New Roman" w:hAnsi="Consolas" w:cs="Times New Roman"/>
+          <w:color w:val="569CD6"/>
+          <w:sz w:val="21"/>
+          <w:szCs w:val="21"/>
+        </w:rPr>
+        <w:t>}</w:t>
+      </w:r>
+      <w:r>
+        <w:rPr>
+          <w:rFonts w:ascii="Consolas" w:eastAsia="Times New Roman" w:hAnsi="Consolas" w:cs="Times New Roman"/>
+          <w:color w:val="808080"/>
+          <w:sz w:val="21"/>
+          <w:szCs w:val="21"/>
+        </w:rPr>
+        <w:t>&gt;&lt;/</w:t>
+      </w:r>
+      <w:r>
+        <w:rPr>
+          <w:rFonts w:ascii="Consolas" w:eastAsia="Times New Roman" w:hAnsi="Consolas" w:cs="Times New Roman"/>
+          <w:color w:val="569CD6"/>
+          <w:sz w:val="21"/>
+          <w:szCs w:val="21"/>
+        </w:rPr>
+        <w:t>div</w:t>
+      </w:r>
+      <w:r>
+        <w:rPr>
+          <w:rFonts w:ascii="Consolas" w:eastAsia="Times New Roman" w:hAnsi="Consolas" w:cs="Times New Roman"/>
+          <w:color w:val="808080"/>
+          <w:sz w:val="21"/>
+          <w:szCs w:val="21"/>
+        </w:rPr>
+        <w:t>&gt;</w:t>
+      </w:r>
+      <w:r>
+        <w:rPr>
+          <w:rFonts w:ascii="Consolas" w:eastAsia="Times New Roman" w:hAnsi="Consolas" w:cs="Times New Roman"/>
+          <w:color w:val="D4D4D4"/>
+          <w:sz w:val="21"/>
+          <w:szCs w:val="21"/>
+        </w:rPr>
+        <w:t xml:space="preserve">  </w:t>
+      </w:r>
+      <w:r>
+        <w:rPr>
+          <w:rFonts w:ascii="Consolas" w:eastAsia="Times New Roman" w:hAnsi="Consolas" w:cs="Times New Roman"/>
+          <w:color w:val="569CD6"/>
+          <w:sz w:val="21"/>
+          <w:szCs w:val="21"/>
+        </w:rPr>
+        <w:t>{</w:t>
+      </w:r>
+      <w:r>
+        <w:rPr>
+          <w:rFonts w:ascii="Consolas" w:eastAsia="Times New Roman" w:hAnsi="Consolas" w:cs="Times New Roman"/>
+          <w:color w:val="6A9955"/>
+          <w:sz w:val="21"/>
+          <w:szCs w:val="21"/>
+        </w:rPr>
+        <w:t xml:space="preserve">/*Here on click is </w:t>
+      </w:r>
+      <w:proofErr w:type="spellStart"/>
+      <w:r>
+        <w:rPr>
+          <w:rFonts w:ascii="Consolas" w:eastAsia="Times New Roman" w:hAnsi="Consolas" w:cs="Times New Roman"/>
+          <w:color w:val="6A9955"/>
+          <w:sz w:val="21"/>
+          <w:szCs w:val="21"/>
+        </w:rPr>
+        <w:t>Funciton</w:t>
+      </w:r>
+      <w:proofErr w:type="spellEnd"/>
+      <w:r>
+        <w:rPr>
+          <w:rFonts w:ascii="Consolas" w:eastAsia="Times New Roman" w:hAnsi="Consolas" w:cs="Times New Roman"/>
+          <w:color w:val="6A9955"/>
+          <w:sz w:val="21"/>
+          <w:szCs w:val="21"/>
+        </w:rPr>
+        <w:t xml:space="preserve"> Call*/</w:t>
+      </w:r>
+      <w:r>
+        <w:rPr>
+          <w:rFonts w:ascii="Consolas" w:eastAsia="Times New Roman" w:hAnsi="Consolas" w:cs="Times New Roman"/>
+          <w:color w:val="569CD6"/>
+          <w:sz w:val="21"/>
+          <w:szCs w:val="21"/>
+        </w:rPr>
+        <w:t>}</w:t>
+      </w:r>
+    </w:p>
+    <w:p>
+      <w:pPr>
+        <w:pStyle w:val="ListParagraph"/>
+        <w:tabs>
+          <w:tab w:val="left" w:pos="3540"/>
+        </w:tabs>
+        <w:rPr>
+          <w:rFonts w:cstheme="minorHAnsi"/>
+          <w:color w:val="000000" w:themeColor="text1"/>
+          <w:sz w:val="32"/>
+          <w:szCs w:val="32"/>
+        </w:rPr>
+      </w:pPr>
+    </w:p>
+    <w:p>
+      <w:pPr>
+        <w:pStyle w:val="ListParagraph"/>
+        <w:tabs>
+          <w:tab w:val="left" w:pos="3540"/>
+        </w:tabs>
+        <w:rPr>
+          <w:rFonts w:cstheme="minorHAnsi"/>
+          <w:color w:val="000000" w:themeColor="text1"/>
+          <w:sz w:val="32"/>
+          <w:szCs w:val="32"/>
+        </w:rPr>
+      </w:pPr>
+      <w:r>
+        <w:rPr>
+          <w:rFonts w:cstheme="minorHAnsi"/>
+          <w:color w:val="000000" w:themeColor="text1"/>
+          <w:sz w:val="32"/>
+          <w:szCs w:val="32"/>
+        </w:rPr>
+        <w:t xml:space="preserve">The above is code example. </w:t>
       </w:r>
     </w:p>
     <w:sectPr>

</xml_diff>

<commit_message>
Last commit for this Word counter App
</commit_message>
<xml_diff>
--- a/Code With Harry Tutorials.docx
+++ b/Code With Harry Tutorials.docx
@@ -2808,7 +2808,27 @@
           <w:szCs w:val="26"/>
         </w:rPr>
         <w:lastRenderedPageBreak/>
-        <w:t xml:space="preserve">Noted Point: I have noted that in react also if button type is submit then the page will surly </w:t>
+        <w:t xml:space="preserve">Noted Point: I have noted that in react also if button type is </w:t>
+      </w:r>
+      <w:proofErr w:type="gramStart"/>
+      <w:r>
+        <w:rPr>
+          <w:rFonts w:ascii="Segoe UI" w:hAnsi="Segoe UI" w:cs="Segoe UI"/>
+          <w:color w:val="000000"/>
+          <w:sz w:val="26"/>
+          <w:szCs w:val="26"/>
+        </w:rPr>
+        <w:t>submit</w:t>
+      </w:r>
+      <w:proofErr w:type="gramEnd"/>
+      <w:r>
+        <w:rPr>
+          <w:rFonts w:ascii="Segoe UI" w:hAnsi="Segoe UI" w:cs="Segoe UI"/>
+          <w:color w:val="000000"/>
+          <w:sz w:val="26"/>
+          <w:szCs w:val="26"/>
+        </w:rPr>
+        <w:t xml:space="preserve"> then the page will surly </w:t>
       </w:r>
       <w:proofErr w:type="spellStart"/>
       <w:r>
@@ -2961,7 +2981,27 @@
           <w:sz w:val="26"/>
           <w:szCs w:val="26"/>
         </w:rPr>
-        <w:t xml:space="preserve"> in my react app to add copy functionality.</w:t>
+        <w:t xml:space="preserve"> in </w:t>
+      </w:r>
+      <w:proofErr w:type="gramStart"/>
+      <w:r>
+        <w:rPr>
+          <w:rFonts w:ascii="Segoe UI" w:hAnsi="Segoe UI" w:cs="Segoe UI"/>
+          <w:color w:val="000000"/>
+          <w:sz w:val="26"/>
+          <w:szCs w:val="26"/>
+        </w:rPr>
+        <w:t>my</w:t>
+      </w:r>
+      <w:proofErr w:type="gramEnd"/>
+      <w:r>
+        <w:rPr>
+          <w:rFonts w:ascii="Segoe UI" w:hAnsi="Segoe UI" w:cs="Segoe UI"/>
+          <w:color w:val="000000"/>
+          <w:sz w:val="26"/>
+          <w:szCs w:val="26"/>
+        </w:rPr>
+        <w:t xml:space="preserve"> react app to add copy functionality.</w:t>
       </w:r>
     </w:p>
     <w:p>
@@ -5578,7 +5618,27 @@
           <w:sz w:val="28"/>
           <w:szCs w:val="28"/>
         </w:rPr>
-        <w:t xml:space="preserve">For example there is : /users, and /users/home this two </w:t>
+        <w:t xml:space="preserve">For </w:t>
+      </w:r>
+      <w:proofErr w:type="gramStart"/>
+      <w:r>
+        <w:rPr>
+          <w:rFonts w:ascii="Segoe UI" w:hAnsi="Segoe UI" w:cs="Segoe UI"/>
+          <w:color w:val="000000"/>
+          <w:sz w:val="28"/>
+          <w:szCs w:val="28"/>
+        </w:rPr>
+        <w:t>example</w:t>
+      </w:r>
+      <w:proofErr w:type="gramEnd"/>
+      <w:r>
+        <w:rPr>
+          <w:rFonts w:ascii="Segoe UI" w:hAnsi="Segoe UI" w:cs="Segoe UI"/>
+          <w:color w:val="000000"/>
+          <w:sz w:val="28"/>
+          <w:szCs w:val="28"/>
+        </w:rPr>
+        <w:t xml:space="preserve"> there is : /users, and /users/home this two </w:t>
       </w:r>
       <w:proofErr w:type="spellStart"/>
       <w:r>
@@ -5618,7 +5678,27 @@
           <w:sz w:val="28"/>
           <w:szCs w:val="28"/>
         </w:rPr>
-        <w:t xml:space="preserve">, by doing partial checking. So it’s important to use exact keyword here. </w:t>
+        <w:t xml:space="preserve">, by doing partial checking. </w:t>
+      </w:r>
+      <w:proofErr w:type="gramStart"/>
+      <w:r>
+        <w:rPr>
+          <w:rFonts w:ascii="Segoe UI" w:hAnsi="Segoe UI" w:cs="Segoe UI"/>
+          <w:color w:val="000000"/>
+          <w:sz w:val="28"/>
+          <w:szCs w:val="28"/>
+        </w:rPr>
+        <w:t>So</w:t>
+      </w:r>
+      <w:proofErr w:type="gramEnd"/>
+      <w:r>
+        <w:rPr>
+          <w:rFonts w:ascii="Segoe UI" w:hAnsi="Segoe UI" w:cs="Segoe UI"/>
+          <w:color w:val="000000"/>
+          <w:sz w:val="28"/>
+          <w:szCs w:val="28"/>
+        </w:rPr>
+        <w:t xml:space="preserve"> it’s important to use exact keyword here. </w:t>
       </w:r>
     </w:p>
     <w:p>
@@ -7039,6 +7119,108 @@
           <w:szCs w:val="32"/>
         </w:rPr>
         <w:t xml:space="preserve">The above is code example. </w:t>
+      </w:r>
+    </w:p>
+    <w:p>
+      <w:pPr>
+        <w:pStyle w:val="ListParagraph"/>
+        <w:tabs>
+          <w:tab w:val="left" w:pos="3540"/>
+        </w:tabs>
+        <w:rPr>
+          <w:rFonts w:cstheme="minorHAnsi"/>
+          <w:color w:val="000000" w:themeColor="text1"/>
+          <w:sz w:val="32"/>
+          <w:szCs w:val="32"/>
+        </w:rPr>
+      </w:pPr>
+    </w:p>
+    <w:p>
+      <w:pPr>
+        <w:pStyle w:val="ListParagraph"/>
+        <w:tabs>
+          <w:tab w:val="left" w:pos="3540"/>
+        </w:tabs>
+        <w:rPr>
+          <w:rFonts w:cstheme="minorHAnsi"/>
+          <w:color w:val="000000" w:themeColor="text1"/>
+          <w:sz w:val="32"/>
+          <w:szCs w:val="32"/>
+        </w:rPr>
+      </w:pPr>
+    </w:p>
+    <w:p>
+      <w:pPr>
+        <w:pStyle w:val="ListParagraph"/>
+        <w:tabs>
+          <w:tab w:val="left" w:pos="3540"/>
+        </w:tabs>
+        <w:rPr>
+          <w:rFonts w:cstheme="minorHAnsi"/>
+          <w:color w:val="000000" w:themeColor="text1"/>
+          <w:sz w:val="32"/>
+          <w:szCs w:val="32"/>
+        </w:rPr>
+      </w:pPr>
+    </w:p>
+    <w:p>
+      <w:pPr>
+        <w:pStyle w:val="ListParagraph"/>
+        <w:pBdr>
+          <w:top w:val="double" w:sz="6" w:space="1" w:color="auto"/>
+          <w:bottom w:val="double" w:sz="6" w:space="1" w:color="auto"/>
+        </w:pBdr>
+        <w:tabs>
+          <w:tab w:val="left" w:pos="3540"/>
+        </w:tabs>
+        <w:rPr>
+          <w:rFonts w:cstheme="minorHAnsi"/>
+          <w:color w:val="000000" w:themeColor="text1"/>
+          <w:sz w:val="32"/>
+          <w:szCs w:val="32"/>
+        </w:rPr>
+      </w:pPr>
+    </w:p>
+    <w:p>
+      <w:pPr>
+        <w:pStyle w:val="ListParagraph"/>
+        <w:tabs>
+          <w:tab w:val="left" w:pos="3540"/>
+        </w:tabs>
+        <w:rPr>
+          <w:rFonts w:cstheme="minorHAnsi"/>
+          <w:color w:val="000000" w:themeColor="text1"/>
+          <w:sz w:val="32"/>
+          <w:szCs w:val="32"/>
+        </w:rPr>
+      </w:pPr>
+    </w:p>
+    <w:p>
+      <w:pPr>
+        <w:pStyle w:val="ListParagraph"/>
+        <w:tabs>
+          <w:tab w:val="left" w:pos="3540"/>
+        </w:tabs>
+        <w:jc w:val="center"/>
+        <w:rPr>
+          <w:rFonts w:cstheme="minorHAnsi"/>
+          <w:b/>
+          <w:bCs/>
+          <w:color w:val="000000" w:themeColor="text1"/>
+          <w:sz w:val="52"/>
+          <w:szCs w:val="52"/>
+        </w:rPr>
+      </w:pPr>
+      <w:r>
+        <w:rPr>
+          <w:rFonts w:cstheme="minorHAnsi"/>
+          <w:b/>
+          <w:bCs/>
+          <w:color w:val="000000" w:themeColor="text1"/>
+          <w:sz w:val="52"/>
+          <w:szCs w:val="52"/>
+        </w:rPr>
+        <w:t>Project2</w:t>
       </w:r>
     </w:p>
     <w:sectPr>

</xml_diff>